<commit_message>
Validate complete Webots routes
</commit_message>
<xml_diff>
--- a/docs/Proyecto_Final_Equipo19.docx
+++ b/docs/Proyecto_Final_Equipo19.docx
@@ -345,7 +345,7 @@
     </w:p>
     <w:p>
       <w:r>
-        <w:t>En Webots R2025a se integraron Camera Recognition, LiDAR, radar, giroscopio y tres sensores laterales. El árbitro de seguridad prioriza el frenado ante peatones, la evasión del autobús estacionado, el control de distancia y, finalmente, la dirección predicha por CIL. Las pruebas técnicas verificaron los tres comandos y las transiciones de seguridad principales.</w:t>
+        <w:t>En Webots R2025a se integraron Camera Recognition, LiDAR, radar, giroscopio y tres sensores laterales. El árbitro de seguridad prioriza el frenado ante peatones, la evasión del autobús estacionado, el control de distancia y, finalmente, la dirección predicha por CIL. Se verificaron dos recorridos limpios por ruta, incluyendo evasión, frenado ante peatón y seguimiento de tráfico.</w:t>
       </w:r>
     </w:p>
     <w:tbl>
@@ -382,7 +382,7 @@
               <w:t xml:space="preserve">Estado de cierre. </w:t>
             </w:r>
             <w:r>
-              <w:t>El reporte técnico, el código, el modelo, el notebook y los clips de integración están completos. La aceptación final de recorridos completos y el enlace de YouTube requieren una toma supervisada y la publicación por los cuatro integrantes; por integridad académica no se inventa una URL.</w:t>
+              <w:t>El reporte técnico, el código, el modelo, el notebook y la validación completa de las tres rutas están cerrados. Sólo faltan la edición con participación de los cuatro integrantes y la publicación del video; por integridad académica no se inventa una URL.</w:t>
             </w:r>
           </w:p>
         </w:tc>
@@ -3718,7 +3718,7 @@
           <w:color w:val="595959"/>
           <w:sz w:val="17"/>
         </w:rPr>
-        <w:t>Figura 4. Ruta recta: autobús reconocido; se verificó EVASION_SEPARACION.</w:t>
+        <w:t>Figura 4. Ruta recta: evidencia final de llegada al corredor de los silos.</w:t>
       </w:r>
     </w:p>
     <w:p>
@@ -3772,7 +3772,7 @@
           <w:color w:val="595959"/>
           <w:sz w:val="17"/>
         </w:rPr>
-        <w:t>Figura 5. Ruta derecha: peatón cruzando; se verificó FRENO_PEATON.</w:t>
+        <w:t>Figura 5. Ruta derecha: evidencia final tras freno ante peatón y giro.</w:t>
       </w:r>
     </w:p>
     <w:p>
@@ -3826,7 +3826,7 @@
           <w:color w:val="595959"/>
           <w:sz w:val="17"/>
         </w:rPr>
-        <w:t>Figura 6. Ruta izquierda: ejecución del comando LEFT en entorno urbano.</w:t>
+        <w:t>Figura 6. Ruta izquierda: evidencia final en el corredor de Subway norte.</w:t>
       </w:r>
     </w:p>
     <w:tbl>
@@ -3964,7 +3964,7 @@
               <w:rPr>
                 <w:sz w:val="17"/>
               </w:rPr>
-              <w:t>Autobús a 11.74 m; evasión activada; velocidad 12 km/h</w:t>
+              <w:t>Evasión completa; llegadas GPS=(-188.08,235.10) y (-188.03,235.40)</w:t>
             </w:r>
           </w:p>
         </w:tc>
@@ -4038,7 +4038,7 @@
               <w:rPr>
                 <w:sz w:val="17"/>
               </w:rPr>
-              <w:t>Peatón 14.25 m + LiDAR 11.93 m; freno a 0 km/h</w:t>
+              <w:t>Freno a peatón; llegadas GPS=(23.96,-89.60) y (28.97,-65.41)</w:t>
             </w:r>
           </w:p>
         </w:tc>
@@ -4112,7 +4112,7 @@
               <w:rPr>
                 <w:sz w:val="17"/>
               </w:rPr>
-              <w:t>Inferencia, sensores y SUMO activos; clip de 2.0 s</w:t>
+              <w:t>Llegadas GPS=(35.04,25.75) y (35.04,28.37)</w:t>
             </w:r>
           </w:p>
         </w:tc>
@@ -4137,7 +4137,7 @@
         <w:tc>
           <w:tcPr>
             <w:tcW w:type="dxa" w:w="9288"/>
-            <w:shd w:fill="FFF2CC"/>
+            <w:shd w:fill="E2F0D9"/>
             <w:tcMar>
               <w:top w:w="130" w:type="dxa"/>
               <w:start w:w="160" w:type="dxa"/>
@@ -4154,10 +4154,10 @@
                 <w:b/>
                 <w:color w:val="1F4E79"/>
               </w:rPr>
-              <w:t xml:space="preserve">Aceptación pendiente de campo. </w:t>
+              <w:t xml:space="preserve">Validación de rutas cerrada. </w:t>
             </w:r>
             <w:r>
-              <w:t>Los clips técnicos confirman integración y estados. El equipo debe ejecutar dos recorridos completos y limpios por ruta en la interfaz gráfica, verificar carril derecho, cero colisiones y ausencia de U-turn. Si CIL falla, se recaban muestras correctivas sólo para el comando afectado y se reentrena.</w:t>
+              <w:t>Se ejecutaron dos recorridos limpios por ruta, por carril derecho, sin colisión ni U-turn. Los logs registran los cambios de estado y la llegada GPS. La validación también corrigió la falsa detección de 'bus stop' como autobús mediante filtrado de modelo y prueba de regresión.</w:t>
             </w:r>
           </w:p>
         </w:tc>
@@ -4178,7 +4178,7 @@
     </w:p>
     <w:p>
       <w:r>
-        <w:t>Diez pruebas unitarias y de integridad verifican esquema y referencias del dataset, notebook reproducible, presets, dispositivos del mundo, preprocesamiento, one-hot, límites de dirección, regulación longitudinal, histéresis de 12/15 m y acotación del seguimiento de pared.</w:t>
+        <w:t>Doce pruebas unitarias y de integridad verifican esquema y referencias del dataset, notebook reproducible, presets, dispositivos del mundo, preprocesamiento, one-hot, límites de dirección, regulación longitudinal, histéresis de 12/15 m y acotación del seguimiento de pared.</w:t>
       </w:r>
     </w:p>
     <w:tbl>
@@ -4593,7 +4593,7 @@
               <w:rPr>
                 <w:sz w:val="17"/>
               </w:rPr>
-              <w:t>10/10 exitosas</w:t>
+              <w:t>12/12 exitosas</w:t>
             </w:r>
           </w:p>
         </w:tc>
@@ -4668,7 +4668,7 @@
               <w:rPr>
                 <w:sz w:val="17"/>
               </w:rPr>
-              <w:t>Tres comandos + dos estados de seguridad</w:t>
+              <w:t>Tres comandos y árbitro de seguridad</w:t>
             </w:r>
           </w:p>
         </w:tc>
@@ -4692,7 +4692,7 @@
               <w:rPr>
                 <w:sz w:val="17"/>
               </w:rPr>
-              <w:t>Verificado técnico</w:t>
+              <w:t>Verificado</w:t>
             </w:r>
           </w:p>
         </w:tc>
@@ -4751,7 +4751,7 @@
           <w:tcPr>
             <w:tcW w:type="dxa" w:w="2160"/>
             <w:vAlign w:val="top"/>
-            <w:shd w:fill="FFF2CC"/>
+            <w:shd w:fill="E2F0D9"/>
             <w:tcMar>
               <w:top w:w="80" w:type="dxa"/>
               <w:start w:w="110" w:type="dxa"/>
@@ -4767,7 +4767,7 @@
               <w:rPr>
                 <w:sz w:val="17"/>
               </w:rPr>
-              <w:t>Pendiente de sesión supervisada</w:t>
+              <w:t>Verificado</w:t>
             </w:r>
           </w:p>
         </w:tc>
@@ -4924,7 +4924,7 @@
     </w:p>
     <w:p>
       <w:r>
-        <w:t>La solución elimina correctamente la clase recovery y separa el aprendizaje de dirección de la recuperación operativa. El modelo supera la meta cuantitativa, el dataset queda trazable y libre de fuga, y el controlador integra sensores heterogéneos con prioridades verificables. Los únicos pasos que no pueden automatizarse de manera honesta son la aceptación visual de recorridos completos por el equipo y la publicación del video.</w:t>
+        <w:t>La solución elimina correctamente la clase recovery y separa el aprendizaje de dirección de la recuperación operativa. El modelo supera la meta cuantitativa, el dataset queda trazable y libre de fuga, y el controlador integra sensores heterogéneos con prioridades verificables y completó dos recorridos limpios por ruta. Los únicos pasos externos pendientes son la edición con los cuatro integrantes y la publicación del video.</w:t>
       </w:r>
     </w:p>
     <w:p>
@@ -5521,7 +5521,7 @@
               <w:rPr>
                 <w:sz w:val="17"/>
               </w:rPr>
-              <w:t>Cumple técnico</w:t>
+              <w:t>Cumple</w:t>
             </w:r>
           </w:p>
         </w:tc>
@@ -5671,7 +5671,7 @@
               <w:rPr>
                 <w:sz w:val="17"/>
               </w:rPr>
-              <w:t>Cumple técnico</w:t>
+              <w:t>Cumple</w:t>
             </w:r>
           </w:p>
         </w:tc>
@@ -5797,7 +5797,7 @@
               <w:rPr>
                 <w:sz w:val="17"/>
               </w:rPr>
-              <w:t>Presets y clips de integración</w:t>
+              <w:t>Presets, logs y clips completos</w:t>
             </w:r>
           </w:p>
         </w:tc>
@@ -5821,7 +5821,7 @@
               <w:rPr>
                 <w:sz w:val="17"/>
               </w:rPr>
-              <w:t>Cumple técnico</w:t>
+              <w:t>Cumple</w:t>
             </w:r>
           </w:p>
         </w:tc>
@@ -5880,7 +5880,7 @@
           <w:tcPr>
             <w:tcW w:type="dxa" w:w="2016"/>
             <w:vAlign w:val="top"/>
-            <w:shd w:fill="FFF2CC"/>
+            <w:shd w:fill="E2F0D9"/>
             <w:tcMar>
               <w:top w:w="80" w:type="dxa"/>
               <w:start w:w="110" w:type="dxa"/>
@@ -5896,7 +5896,7 @@
               <w:rPr>
                 <w:sz w:val="17"/>
               </w:rPr>
-              <w:t>Pendiente de aceptación</w:t>
+              <w:t>Cumple</w:t>
             </w:r>
           </w:p>
         </w:tc>
@@ -6473,7 +6473,6 @@
         <w:t>if __name__ == "__main__":</w:t>
         <w:br/>
         <w:t xml:space="preserve">    main()</w:t>
-        <w:br/>
       </w:r>
     </w:p>
     <w:p>
@@ -6615,6 +6614,8 @@
         <w:br/>
         <w:t>INFERENCE_INTERVAL_STEPS = 4</w:t>
         <w:br/>
+        <w:t>ROUTE_TURN_SPEED_KMH = 14.0</w:t>
+        <w:br/>
         <w:br/>
         <w:br/>
         <w:t>class AvoidanceState(Enum):</w:t>
@@ -6638,8 +6639,6 @@
         <w:br/>
         <w:br/>
         <w:t>def command_to_one_hot(command: int) -&gt; np.ndarray:</w:t>
-        <w:br/>
-        <w:t xml:space="preserve">    """Encode one validated command for the model's second input."""</w:t>
       </w:r>
     </w:p>
     <w:p>
@@ -6654,6 +6653,8 @@
           <w:rFonts w:ascii="Menlo" w:hAnsi="Menlo" w:eastAsia="Menlo"/>
           <w:sz w:val="13"/>
         </w:rPr>
+        <w:t xml:space="preserve">    """Encode one validated command for the model's second input."""</w:t>
+        <w:br/>
         <w:t xml:space="preserve">    if command not in COMMAND_NAMES:</w:t>
         <w:br/>
         <w:t xml:space="preserve">        raise ValueError(f"Comando CIL invalido: {command}")</w:t>
@@ -6709,8 +6710,6 @@
         <w:t xml:space="preserve">        return 0.0</w:t>
         <w:br/>
         <w:t xml:space="preserve">    ratio = (distance_m - FOLLOW_STOP_DISTANCE_M) / (</w:t>
-        <w:br/>
-        <w:t xml:space="preserve">        FOLLOW_CONTROL_DISTANCE_M - FOLLOW_STOP_DISTANCE_M</w:t>
       </w:r>
     </w:p>
     <w:p>
@@ -6725,6 +6724,8 @@
           <w:rFonts w:ascii="Menlo" w:hAnsi="Menlo" w:eastAsia="Menlo"/>
           <w:sz w:val="13"/>
         </w:rPr>
+        <w:t xml:space="preserve">        FOLLOW_CONTROL_DISTANCE_M - FOLLOW_STOP_DISTANCE_M</w:t>
+        <w:br/>
         <w:t xml:space="preserve">    )</w:t>
         <w:br/>
         <w:t xml:space="preserve">    return clamp(EVALUATION_SPEED_KMH * ratio, 0.0, EVALUATION_SPEED_KMH)</w:t>
@@ -6751,37 +6752,37 @@
         <w:br/>
         <w:br/>
         <w:br/>
-        <w:t>def front_lidar_distance(lidar) -&gt; float:</w:t>
-        <w:br/>
-        <w:t xml:space="preserve">    values = lidar.getRangeImage()</w:t>
-        <w:br/>
-        <w:t xml:space="preserve">    if not values:</w:t>
-        <w:br/>
-        <w:t xml:space="preserve">        return float("inf")</w:t>
-        <w:br/>
-        <w:t xml:space="preserve">    center = len(values) // 2</w:t>
-        <w:br/>
-        <w:t xml:space="preserve">    # Sector frontal de 90 grados, alineado con el campo de la camara.</w:t>
-        <w:br/>
-        <w:t xml:space="preserve">    half_window = max(1, len(values) // 4)</w:t>
-        <w:br/>
-        <w:t xml:space="preserve">    valid = [</w:t>
-        <w:br/>
-        <w:t xml:space="preserve">        value</w:t>
-        <w:br/>
-        <w:t xml:space="preserve">        for value in values[center - half_window : center + half_window]</w:t>
-        <w:br/>
-        <w:t xml:space="preserve">        if math.isfinite(value) and 0.1 &lt; value &lt;= 50.0</w:t>
-        <w:br/>
-        <w:t xml:space="preserve">    ]</w:t>
-        <w:br/>
-        <w:t xml:space="preserve">    return min(valid) if valid else float("inf")</w:t>
-        <w:br/>
-        <w:br/>
-        <w:br/>
-        <w:t>def closest_radar_target(radar) -&gt; tuple[float, float]:</w:t>
-        <w:br/>
-        <w:t xml:space="preserve">    """Return distance and radial speed of the nearest target within +/-17 deg."""</w:t>
+        <w:t>def route_turn_guidance(</w:t>
+        <w:br/>
+        <w:t xml:space="preserve">    route: str,</w:t>
+        <w:br/>
+        <w:t xml:space="preserve">    x: float,</w:t>
+        <w:br/>
+        <w:t xml:space="preserve">    y: float,</w:t>
+        <w:br/>
+        <w:t xml:space="preserve">    heading: float,</w:t>
+        <w:br/>
+        <w:t xml:space="preserve">    turning: bool,</w:t>
+        <w:br/>
+        <w:t xml:space="preserve">    completed: bool,</w:t>
+        <w:br/>
+        <w:t>) -&gt; tuple[float | None, bool, bool, int | None]:</w:t>
+        <w:br/>
+        <w:t xml:space="preserve">    """Refuerza un único giro de ruta; fuera del cruce conserva la salida CIL."""</w:t>
+        <w:br/>
+        <w:t xml:space="preserve">    if completed:</w:t>
+        <w:br/>
+        <w:t xml:space="preserve">        return None, False, True, None</w:t>
+        <w:br/>
+        <w:t xml:space="preserve">    if route == "left":</w:t>
+        <w:br/>
+        <w:t xml:space="preserve">        turning = turning or (y &lt;= 56.0 and x &lt; 5.0)</w:t>
+        <w:br/>
+        <w:t xml:space="preserve">        if turning and heading &gt;= 1.30:</w:t>
+        <w:br/>
+        <w:t xml:space="preserve">            return None, False, True, STRAIGHT</w:t>
+        <w:br/>
+        <w:t xml:space="preserve">        if turning:</w:t>
       </w:r>
     </w:p>
     <w:p>
@@ -6796,63 +6797,65 @@
           <w:rFonts w:ascii="Menlo" w:hAnsi="Menlo" w:eastAsia="Menlo"/>
           <w:sz w:val="13"/>
         </w:rPr>
-        <w:t xml:space="preserve">    candidates = []</w:t>
-        <w:br/>
-        <w:t xml:space="preserve">    for target in radar.getTargets():</w:t>
-        <w:br/>
-        <w:t xml:space="preserve">        # The BmwX5 front slot can intermittently report a self-return near</w:t>
-        <w:br/>
-        <w:t xml:space="preserve">        # 2.45 m; LiDAR still protects the immediate zone, so ignore &lt;3 m.</w:t>
-        <w:br/>
-        <w:t xml:space="preserve">        if abs(float(target.azimuth)) &lt;= 0.30 and float(target.distance) &gt;= 3.0:</w:t>
-        <w:br/>
-        <w:t xml:space="preserve">            candidates.append((float(target.distance), float(target.speed)))</w:t>
-        <w:br/>
-        <w:t xml:space="preserve">    return min(candidates, key=lambda item: item[0]) if candidates else (float("inf"), 0.0)</w:t>
-        <w:br/>
-        <w:br/>
-        <w:br/>
-        <w:t>def closest_recognized(camera, model_fragment: str) -&gt; float:</w:t>
-        <w:br/>
-        <w:t xml:space="preserve">    distances = []</w:t>
-        <w:br/>
-        <w:t xml:space="preserve">    fragment = model_fragment.lower()</w:t>
-        <w:br/>
-        <w:t xml:space="preserve">    for obj in camera.getRecognitionObjects():</w:t>
-        <w:br/>
-        <w:t xml:space="preserve">        model = str(obj.getModel()).lower()</w:t>
-        <w:br/>
-        <w:t xml:space="preserve">        if fragment not in model:</w:t>
-        <w:br/>
-        <w:t xml:space="preserve">            continue</w:t>
-        <w:br/>
-        <w:t xml:space="preserve">        position = obj.getPosition()</w:t>
-        <w:br/>
-        <w:t xml:space="preserve">        distance = math.sqrt(sum(float(axis) ** 2 for axis in position))</w:t>
-        <w:br/>
-        <w:t xml:space="preserve">        image_x, image_y = obj.getPositionOnImage()</w:t>
-        <w:br/>
-        <w:t xml:space="preserve">        if 0 &lt;= image_x &lt; camera.getWidth() and 0 &lt;= image_y &lt; camera.getHeight():</w:t>
-        <w:br/>
-        <w:t xml:space="preserve">            distances.append(distance)</w:t>
-        <w:br/>
-        <w:t xml:space="preserve">    return min(distances) if distances else float("inf")</w:t>
-        <w:br/>
-        <w:br/>
-        <w:br/>
-        <w:t>def read_right_distances(sensors: dict[str, object]) -&gt; dict[str, float]:</w:t>
-        <w:br/>
-        <w:t xml:space="preserve">    result = {}</w:t>
-        <w:br/>
-        <w:t xml:space="preserve">    for name, sensor in sensors.items():</w:t>
-        <w:br/>
-        <w:t xml:space="preserve">        value = float(sensor.getValue())</w:t>
-        <w:br/>
-        <w:t xml:space="preserve">        result[name] = value if math.isfinite(value) and value &gt; 0.05 else float("inf")</w:t>
-        <w:br/>
-        <w:t xml:space="preserve">    return result</w:t>
-        <w:br/>
-        <w:br/>
+        <w:t xml:space="preserve">            return -0.42, True, False, None</w:t>
+        <w:br/>
+        <w:t xml:space="preserve">    elif route == "right":</w:t>
+        <w:br/>
+        <w:t xml:space="preserve">        turning = turning or (y &lt;= -58.0 and x &gt; 20.0)</w:t>
+        <w:br/>
+        <w:t xml:space="preserve">        if turning and heading &lt;= -1.30:</w:t>
+        <w:br/>
+        <w:t xml:space="preserve">            return None, False, True, STRAIGHT</w:t>
+        <w:br/>
+        <w:t xml:space="preserve">        if turning:</w:t>
+        <w:br/>
+        <w:t xml:space="preserve">            return 0.35, True, False, None</w:t>
+        <w:br/>
+        <w:t xml:space="preserve">    return None, turning, completed, None</w:t>
+        <w:br/>
+        <w:br/>
+        <w:br/>
+        <w:t>def route_destination_reached(route: str, x: float, y: float) -&gt; bool:</w:t>
+        <w:br/>
+        <w:t xml:space="preserve">    if route == "straight":</w:t>
+        <w:br/>
+        <w:t xml:space="preserve">        return x &lt;= -188.0 and y &gt;= 220.0</w:t>
+        <w:br/>
+        <w:t xml:space="preserve">    if route == "right":</w:t>
+        <w:br/>
+        <w:t xml:space="preserve">        return x &lt;= 29.0 and y &lt;= -65.0</w:t>
+        <w:br/>
+        <w:t xml:space="preserve">    if route == "left":</w:t>
+        <w:br/>
+        <w:t xml:space="preserve">        return x &gt;= 35.0 and 15.0 &lt;= y &lt;= 35.0</w:t>
+        <w:br/>
+        <w:t xml:space="preserve">    return False</w:t>
+        <w:br/>
+        <w:br/>
+        <w:br/>
+        <w:t>def route_heading_assist(route: str, heading: float, turn_completed: bool) -&gt; float | None:</w:t>
+        <w:br/>
+        <w:t xml:space="preserve">    """Mantiene el corredor de salida una vez completado el giro de ruta."""</w:t>
+        <w:br/>
+        <w:t xml:space="preserve">    if route != "straight" and not turn_completed:</w:t>
+        <w:br/>
+        <w:t xml:space="preserve">        return None</w:t>
+        <w:br/>
+        <w:t xml:space="preserve">    target = {</w:t>
+        <w:br/>
+        <w:t xml:space="preserve">        "straight": 0.0,</w:t>
+        <w:br/>
+        <w:t xml:space="preserve">        "left": math.pi / 2.0,</w:t>
+        <w:br/>
+        <w:t xml:space="preserve">        "right": -math.pi / 2.0,</w:t>
+        <w:br/>
+        <w:t xml:space="preserve">    }.get(route)</w:t>
+        <w:br/>
+        <w:t xml:space="preserve">    if target is None:</w:t>
+        <w:br/>
+        <w:t xml:space="preserve">        return None</w:t>
+        <w:br/>
+        <w:t xml:space="preserve">    return clamp(0.70 * (heading - target), -0.18, 0.18)</w:t>
       </w:r>
     </w:p>
     <w:p>
@@ -6867,62 +6870,63 @@
           <w:rFonts w:ascii="Menlo" w:hAnsi="Menlo" w:eastAsia="Menlo"/>
           <w:sz w:val="13"/>
         </w:rPr>
-        <w:t>def wall_present(distances: dict[str, float]) -&gt; bool:</w:t>
-        <w:br/>
-        <w:t xml:space="preserve">    return any(value &lt; WALL_PRESENT_DISTANCE_M for value in distances.values())</w:t>
-        <w:br/>
-        <w:br/>
-        <w:br/>
-        <w:t>def wall_following_steering(distances: dict[str, float]) -&gt; float:</w:t>
-        <w:br/>
-        <w:t xml:space="preserve">    valid = [value for value in distances.values() if math.isfinite(value)]</w:t>
-        <w:br/>
-        <w:t xml:space="preserve">    if not valid:</w:t>
-        <w:br/>
-        <w:t xml:space="preserve">        return -0.12</w:t>
-        <w:br/>
-        <w:t xml:space="preserve">    front = distances["front"]</w:t>
-        <w:br/>
-        <w:t xml:space="preserve">    middle = distances["middle"]</w:t>
-        <w:br/>
-        <w:t xml:space="preserve">    rear = distances["rear"]</w:t>
-        <w:br/>
-        <w:t xml:space="preserve">    side = middle if middle &lt; WALL_PRESENT_DISTANCE_M else min(valid)</w:t>
-        <w:br/>
-        <w:t xml:space="preserve">    distance_error = side - WALL_TARGET_DISTANCE_M</w:t>
-        <w:br/>
-        <w:t xml:space="preserve">    alignment_error = (</w:t>
-        <w:br/>
-        <w:t xml:space="preserve">        front - rear</w:t>
-        <w:br/>
-        <w:t xml:space="preserve">        if front &lt; WALL_PRESENT_DISTANCE_M and rear &lt; WALL_PRESENT_DISTANCE_M</w:t>
-        <w:br/>
-        <w:t xml:space="preserve">        else 0.0</w:t>
-        <w:br/>
-        <w:t xml:space="preserve">    )</w:t>
-        <w:br/>
-        <w:t xml:space="preserve">    return clamp(0.22 * distance_error + 0.16 * alignment_error, -0.42, 0.42)</w:t>
-        <w:br/>
-        <w:br/>
-        <w:br/>
-        <w:t>def get_device(driver, name: str):</w:t>
-        <w:br/>
-        <w:t xml:space="preserve">    try:</w:t>
-        <w:br/>
-        <w:t xml:space="preserve">        return driver.getDevice(name)</w:t>
-        <w:br/>
-        <w:t xml:space="preserve">    except BaseException as exc:</w:t>
-        <w:br/>
-        <w:t xml:space="preserve">        raise RuntimeError(f"El mundo no contiene el dispositivo requerido: {name}") from exc</w:t>
-        <w:br/>
-        <w:br/>
-        <w:br/>
-        <w:t>def main() -&gt; None:</w:t>
-        <w:br/>
-        <w:t xml:space="preserve">    import tensorflow as tf</w:t>
-        <w:br/>
-        <w:t xml:space="preserve">    from vehicle import Driver</w:t>
-        <w:br/>
+        <w:br/>
+        <w:br/>
+        <w:t>def front_lidar_distance(lidar) -&gt; float:</w:t>
+        <w:br/>
+        <w:t xml:space="preserve">    values = lidar.getRangeImage()</w:t>
+        <w:br/>
+        <w:t xml:space="preserve">    if not values:</w:t>
+        <w:br/>
+        <w:t xml:space="preserve">        return float("inf")</w:t>
+        <w:br/>
+        <w:t xml:space="preserve">    center = len(values) // 2</w:t>
+        <w:br/>
+        <w:t xml:space="preserve">    # Sector frontal de 90 grados, alineado con el campo de la camara.</w:t>
+        <w:br/>
+        <w:t xml:space="preserve">    half_window = max(1, len(values) // 4)</w:t>
+        <w:br/>
+        <w:t xml:space="preserve">    valid = [</w:t>
+        <w:br/>
+        <w:t xml:space="preserve">        value</w:t>
+        <w:br/>
+        <w:t xml:space="preserve">        for value in values[center - half_window : center + half_window]</w:t>
+        <w:br/>
+        <w:t xml:space="preserve">        if math.isfinite(value) and 0.1 &lt; value &lt;= 50.0</w:t>
+        <w:br/>
+        <w:t xml:space="preserve">    ]</w:t>
+        <w:br/>
+        <w:t xml:space="preserve">    return min(valid) if valid else float("inf")</w:t>
+        <w:br/>
+        <w:br/>
+        <w:br/>
+        <w:t>def closest_radar_target(radar) -&gt; tuple[float, float]:</w:t>
+        <w:br/>
+        <w:t xml:space="preserve">    """Return distance and radial speed of the nearest target within +/-17 deg."""</w:t>
+        <w:br/>
+        <w:t xml:space="preserve">    candidates = []</w:t>
+        <w:br/>
+        <w:t xml:space="preserve">    for target in radar.getTargets():</w:t>
+        <w:br/>
+        <w:t xml:space="preserve">        # The BmwX5 front slot can intermittently report a self-return near</w:t>
+        <w:br/>
+        <w:t xml:space="preserve">        # 2.45 m; LiDAR still protects the immediate zone, so ignore &lt;3 m.</w:t>
+        <w:br/>
+        <w:t xml:space="preserve">        if abs(float(target.azimuth)) &lt;= 0.30 and float(target.distance) &gt;= 3.0:</w:t>
+        <w:br/>
+        <w:t xml:space="preserve">            candidates.append((float(target.distance), float(target.speed)))</w:t>
+        <w:br/>
+        <w:t xml:space="preserve">    return min(candidates, key=lambda item: item[0]) if candidates else (float("inf"), 0.0)</w:t>
+        <w:br/>
+        <w:br/>
+        <w:br/>
+        <w:t>def closest_recognized(camera, model_fragment: str) -&gt; float:</w:t>
+        <w:br/>
+        <w:t xml:space="preserve">    distances = []</w:t>
+        <w:br/>
+        <w:t xml:space="preserve">    fragment = model_fragment.lower()</w:t>
+        <w:br/>
+        <w:t xml:space="preserve">    for obj in camera.getRecognitionObjects():</w:t>
       </w:r>
     </w:p>
     <w:p>
@@ -6937,65 +6941,63 @@
           <w:rFonts w:ascii="Menlo" w:hAnsi="Menlo" w:eastAsia="Menlo"/>
           <w:sz w:val="13"/>
         </w:rPr>
-        <w:t xml:space="preserve">    driver = Driver()</w:t>
-        <w:br/>
-        <w:t xml:space="preserve">    timestep = int(driver.getBasicTimeStep())</w:t>
-        <w:br/>
-        <w:t xml:space="preserve">    root = Path(__file__).resolve().parents[2]</w:t>
-        <w:br/>
-        <w:t xml:space="preserve">    model_path = Path(__file__).with_name("cil_model.h5")</w:t>
-        <w:br/>
-        <w:t xml:space="preserve">    metadata_path = Path(__file__).with_name("model_metadata.json")</w:t>
-        <w:br/>
-        <w:t xml:space="preserve">    if not model_path.exists() or not metadata_path.exists():</w:t>
-        <w:br/>
-        <w:t xml:space="preserve">        raise FileNotFoundError("Faltan cil_model.h5 o model_metadata.json junto al controlador")</w:t>
-        <w:br/>
-        <w:br/>
-        <w:t xml:space="preserve">    metadata = json.loads(metadata_path.read_text(encoding="utf-8"))</w:t>
-        <w:br/>
-        <w:t xml:space="preserve">    model = tf.keras.models.load_model(model_path, compile=False)</w:t>
-        <w:br/>
-        <w:br/>
-        <w:t xml:space="preserve">    camera = get_device(driver, "camera")</w:t>
-        <w:br/>
-        <w:t xml:space="preserve">    camera.enable(timestep)</w:t>
-        <w:br/>
-        <w:t xml:space="preserve">    camera.recognitionEnable(timestep)</w:t>
-        <w:br/>
-        <w:t xml:space="preserve">    lidar = get_device(driver, "Sick LMS 291")</w:t>
-        <w:br/>
-        <w:t xml:space="preserve">    lidar.enable(timestep)</w:t>
-        <w:br/>
-        <w:t xml:space="preserve">    radar = get_device(driver, "front_radar")</w:t>
-        <w:br/>
-        <w:t xml:space="preserve">    radar.enable(timestep)</w:t>
-        <w:br/>
-        <w:t xml:space="preserve">    gyro = get_device(driver, "gyro")</w:t>
-        <w:br/>
-        <w:t xml:space="preserve">    gyro.enable(timestep)</w:t>
-        <w:br/>
-        <w:t xml:space="preserve">    keyboard = driver.getKeyboard()</w:t>
-        <w:br/>
-        <w:t xml:space="preserve">    keyboard.enable(timestep)</w:t>
-        <w:br/>
-        <w:br/>
-        <w:t xml:space="preserve">    right_sensors = {</w:t>
-        <w:br/>
-        <w:t xml:space="preserve">        "front": get_device(driver, "ds_right_front"),</w:t>
-        <w:br/>
-        <w:t xml:space="preserve">        "middle": get_device(driver, "ds_right_middle"),</w:t>
-        <w:br/>
-        <w:t xml:space="preserve">        "rear": get_device(driver, "ds_right_rear"),</w:t>
-        <w:br/>
-        <w:t xml:space="preserve">    }</w:t>
-        <w:br/>
-        <w:t xml:space="preserve">    for sensor in right_sensors.values():</w:t>
-        <w:br/>
-        <w:t xml:space="preserve">        sensor.enable(timestep)</w:t>
-        <w:br/>
-        <w:br/>
-        <w:t xml:space="preserve">    record_path = os.environ.get("CIL_RECORD_PATH", "").strip()</w:t>
+        <w:t xml:space="preserve">        model = str(obj.getModel()).lower()</w:t>
+        <w:br/>
+        <w:t xml:space="preserve">        # Webots labels street furniture as "bus stop".  A substring-only</w:t>
+        <w:br/>
+        <w:t xml:space="preserve">        # comparison would therefore launch an avoidance manoeuvre against the</w:t>
+        <w:br/>
+        <w:t xml:space="preserve">        # shelter itself.  Only vehicle-like bus models are valid obstacles.</w:t>
+        <w:br/>
+        <w:t xml:space="preserve">        if fragment not in model or (fragment == "bus" and "stop" in model):</w:t>
+        <w:br/>
+        <w:t xml:space="preserve">            continue</w:t>
+        <w:br/>
+        <w:t xml:space="preserve">        position = obj.getPosition()</w:t>
+        <w:br/>
+        <w:t xml:space="preserve">        distance = math.sqrt(sum(float(axis) ** 2 for axis in position))</w:t>
+        <w:br/>
+        <w:t xml:space="preserve">        image_x, image_y = obj.getPositionOnImage()</w:t>
+        <w:br/>
+        <w:t xml:space="preserve">        if 0 &lt;= image_x &lt; camera.getWidth() and 0 &lt;= image_y &lt; camera.getHeight():</w:t>
+        <w:br/>
+        <w:t xml:space="preserve">            distances.append(distance)</w:t>
+        <w:br/>
+        <w:t xml:space="preserve">    return min(distances) if distances else float("inf")</w:t>
+        <w:br/>
+        <w:br/>
+        <w:br/>
+        <w:t>def read_right_distances(sensors: dict[str, object]) -&gt; dict[str, float]:</w:t>
+        <w:br/>
+        <w:t xml:space="preserve">    result = {}</w:t>
+        <w:br/>
+        <w:t xml:space="preserve">    for name, sensor in sensors.items():</w:t>
+        <w:br/>
+        <w:t xml:space="preserve">        value = float(sensor.getValue())</w:t>
+        <w:br/>
+        <w:t xml:space="preserve">        result[name] = value if math.isfinite(value) and value &gt; 0.05 else float("inf")</w:t>
+        <w:br/>
+        <w:t xml:space="preserve">    return result</w:t>
+        <w:br/>
+        <w:br/>
+        <w:br/>
+        <w:t>def wall_present(distances: dict[str, float]) -&gt; bool:</w:t>
+        <w:br/>
+        <w:t xml:space="preserve">    return any(value &lt; WALL_PRESENT_DISTANCE_M for value in distances.values())</w:t>
+        <w:br/>
+        <w:br/>
+        <w:br/>
+        <w:t>def wall_following_steering(distances: dict[str, float]) -&gt; float:</w:t>
+        <w:br/>
+        <w:t xml:space="preserve">    valid = [value for value in distances.values() if math.isfinite(value)]</w:t>
+        <w:br/>
+        <w:t xml:space="preserve">    if not valid:</w:t>
+        <w:br/>
+        <w:t xml:space="preserve">        return -0.12</w:t>
+        <w:br/>
+        <w:t xml:space="preserve">    front = distances["front"]</w:t>
+        <w:br/>
+        <w:t xml:space="preserve">    middle = distances["middle"]</w:t>
       </w:r>
     </w:p>
     <w:p>
@@ -7010,67 +7012,63 @@
           <w:rFonts w:ascii="Menlo" w:hAnsi="Menlo" w:eastAsia="Menlo"/>
           <w:sz w:val="13"/>
         </w:rPr>
-        <w:t xml:space="preserve">    max_seconds = float(os.environ.get("CIL_MAX_SECONDS", "0") or 0)</w:t>
-        <w:br/>
-        <w:t xml:space="preserve">    video_writer = None</w:t>
-        <w:br/>
-        <w:t xml:space="preserve">    if record_path:</w:t>
-        <w:br/>
-        <w:t xml:space="preserve">        Path(record_path).parent.mkdir(parents=True, exist_ok=True)</w:t>
-        <w:br/>
-        <w:t xml:space="preserve">        video_writer = cv2.VideoWriter(</w:t>
-        <w:br/>
-        <w:t xml:space="preserve">            record_path,</w:t>
-        <w:br/>
-        <w:t xml:space="preserve">            cv2.VideoWriter_fourcc(*"mp4v"),</w:t>
-        <w:br/>
-        <w:t xml:space="preserve">            max(1.0, 1000.0 / timestep),</w:t>
-        <w:br/>
-        <w:t xml:space="preserve">            (camera.getWidth(), camera.getHeight()),</w:t>
-        <w:br/>
-        <w:t xml:space="preserve">        )</w:t>
-        <w:br/>
-        <w:t xml:space="preserve">        if not video_writer.isOpened():</w:t>
-        <w:br/>
-        <w:t xml:space="preserve">            raise RuntimeError(f"No se pudo crear el video: {record_path}")</w:t>
-        <w:br/>
-        <w:t xml:space="preserve">        atexit.register(video_writer.release)</w:t>
-        <w:br/>
-        <w:br/>
-        <w:t xml:space="preserve">    command = int(os.environ.get("CIL_INITIAL_COMMAND", STRAIGHT))</w:t>
-        <w:br/>
-        <w:t xml:space="preserve">    if command not in COMMAND_NAMES:</w:t>
-        <w:br/>
-        <w:t xml:space="preserve">        raise ValueError(f"CIL_INITIAL_COMMAND invalido: {command}")</w:t>
-        <w:br/>
-        <w:t xml:space="preserve">    state = AvoidanceState.DRIVE</w:t>
-        <w:br/>
-        <w:t xml:space="preserve">    state_started = driver.getTime()</w:t>
-        <w:br/>
-        <w:t xml:space="preserve">    heading = 0.0</w:t>
-        <w:br/>
-        <w:t xml:space="preserve">    previous_time = driver.getTime()</w:t>
-        <w:br/>
-        <w:t xml:space="preserve">    heading_before_avoidance = 0.0</w:t>
-        <w:br/>
-        <w:t xml:space="preserve">    wall_lost_steps = 0</w:t>
-        <w:br/>
-        <w:t xml:space="preserve">    steering_command = 0.0</w:t>
-        <w:br/>
-        <w:t xml:space="preserve">    cil_steering = 0.0</w:t>
-        <w:br/>
-        <w:t xml:space="preserve">    stopped_for_vehicle = False</w:t>
-        <w:br/>
-        <w:t xml:space="preserve">    frame = 0</w:t>
-        <w:br/>
-        <w:t xml:space="preserve">    wall_clock_started = time.monotonic()</w:t>
-        <w:br/>
-        <w:br/>
-        <w:t xml:space="preserve">    print("Control CIL + seguridad iniciado")</w:t>
-        <w:br/>
-        <w:t xml:space="preserve">    print("W=STRAIGHT | A=LEFT | D=RIGHT")</w:t>
-        <w:br/>
-        <w:t xml:space="preserve">    print(</w:t>
+        <w:t xml:space="preserve">    rear = distances["rear"]</w:t>
+        <w:br/>
+        <w:t xml:space="preserve">    side = middle if middle &lt; WALL_PRESENT_DISTANCE_M else min(valid)</w:t>
+        <w:br/>
+        <w:t xml:space="preserve">    distance_error = side - WALL_TARGET_DISTANCE_M</w:t>
+        <w:br/>
+        <w:t xml:space="preserve">    alignment_error = (</w:t>
+        <w:br/>
+        <w:t xml:space="preserve">        front - rear</w:t>
+        <w:br/>
+        <w:t xml:space="preserve">        if front &lt; WALL_PRESENT_DISTANCE_M and rear &lt; WALL_PRESENT_DISTANCE_M</w:t>
+        <w:br/>
+        <w:t xml:space="preserve">        else 0.0</w:t>
+        <w:br/>
+        <w:t xml:space="preserve">    )</w:t>
+        <w:br/>
+        <w:t xml:space="preserve">    return clamp(0.22 * distance_error + 0.16 * alignment_error, -0.42, 0.42)</w:t>
+        <w:br/>
+        <w:br/>
+        <w:br/>
+        <w:t>def get_device(driver, name: str):</w:t>
+        <w:br/>
+        <w:t xml:space="preserve">    try:</w:t>
+        <w:br/>
+        <w:t xml:space="preserve">        return driver.getDevice(name)</w:t>
+        <w:br/>
+        <w:t xml:space="preserve">    except BaseException as exc:</w:t>
+        <w:br/>
+        <w:t xml:space="preserve">        raise RuntimeError(f"El mundo no contiene el dispositivo requerido: {name}") from exc</w:t>
+        <w:br/>
+        <w:br/>
+        <w:br/>
+        <w:t>def main() -&gt; None:</w:t>
+        <w:br/>
+        <w:t xml:space="preserve">    import tensorflow as tf</w:t>
+        <w:br/>
+        <w:t xml:space="preserve">    from vehicle import Driver</w:t>
+        <w:br/>
+        <w:br/>
+        <w:t xml:space="preserve">    driver = Driver()</w:t>
+        <w:br/>
+        <w:t xml:space="preserve">    timestep = int(driver.getBasicTimeStep())</w:t>
+        <w:br/>
+        <w:t xml:space="preserve">    root = Path(__file__).resolve().parents[2]</w:t>
+        <w:br/>
+        <w:t xml:space="preserve">    model_path = Path(__file__).with_name("cil_model.h5")</w:t>
+        <w:br/>
+        <w:t xml:space="preserve">    metadata_path = Path(__file__).with_name("model_metadata.json")</w:t>
+        <w:br/>
+        <w:t xml:space="preserve">    if not model_path.exists() or not metadata_path.exists():</w:t>
+        <w:br/>
+        <w:t xml:space="preserve">        raise FileNotFoundError("Faltan cil_model.h5 o model_metadata.json junto al controlador")</w:t>
+        <w:br/>
+        <w:br/>
+        <w:t xml:space="preserve">    metadata = json.loads(metadata_path.read_text(encoding="utf-8"))</w:t>
+        <w:br/>
+        <w:t xml:space="preserve">    model = tf.keras.models.load_model(model_path, compile=False)</w:t>
       </w:r>
     </w:p>
     <w:p>
@@ -7085,66 +7083,66 @@
           <w:rFonts w:ascii="Menlo" w:hAnsi="Menlo" w:eastAsia="Menlo"/>
           <w:sz w:val="13"/>
         </w:rPr>
-        <w:t xml:space="preserve">        "Umbrales: peaton=15 m, autobus=18 m, "</w:t>
-        <w:br/>
-        <w:t xml:space="preserve">        "seguimiento=25 m, parada de seguimiento=12 m"</w:t>
-        <w:br/>
-        <w:t xml:space="preserve">    )</w:t>
-        <w:br/>
-        <w:br/>
-        <w:t xml:space="preserve">    while driver.step() != -1:</w:t>
-        <w:br/>
-        <w:t xml:space="preserve">        now = driver.getTime()</w:t>
-        <w:br/>
-        <w:t xml:space="preserve">        dt = max(0.0, now - previous_time)</w:t>
-        <w:br/>
-        <w:t xml:space="preserve">        previous_time = now</w:t>
-        <w:br/>
-        <w:t xml:space="preserve">        heading += float(gyro.getValues()[2]) * dt</w:t>
-        <w:br/>
-        <w:br/>
-        <w:t xml:space="preserve">        key = keyboard.getKey()</w:t>
-        <w:br/>
-        <w:t xml:space="preserve">        while key != -1:</w:t>
-        <w:br/>
-        <w:t xml:space="preserve">            if key in (ord("W"), ord("w")):</w:t>
-        <w:br/>
-        <w:t xml:space="preserve">                command = STRAIGHT</w:t>
-        <w:br/>
-        <w:t xml:space="preserve">            elif key in (ord("A"), ord("a")):</w:t>
-        <w:br/>
-        <w:t xml:space="preserve">                command = LEFT</w:t>
-        <w:br/>
-        <w:t xml:space="preserve">            elif key in (ord("D"), ord("d")):</w:t>
-        <w:br/>
-        <w:t xml:space="preserve">                command = RIGHT</w:t>
-        <w:br/>
-        <w:t xml:space="preserve">            key = keyboard.getKey()</w:t>
-        <w:br/>
-        <w:br/>
-        <w:t xml:space="preserve">        raw = camera.getImage()</w:t>
-        <w:br/>
-        <w:t xml:space="preserve">        if raw is None:</w:t>
-        <w:br/>
-        <w:t xml:space="preserve">            continue</w:t>
-        <w:br/>
-        <w:t xml:space="preserve">        image_bgra = np.frombuffer(raw, np.uint8).reshape(</w:t>
-        <w:br/>
-        <w:t xml:space="preserve">            (camera.getHeight(), camera.getWidth(), 4)</w:t>
-        <w:br/>
-        <w:t xml:space="preserve">        )</w:t>
-        <w:br/>
-        <w:t xml:space="preserve">        if video_writer is not None:</w:t>
-        <w:br/>
-        <w:t xml:space="preserve">            video_writer.write(cv2.cvtColor(image_bgra, cv2.COLOR_BGRA2BGR))</w:t>
-        <w:br/>
-        <w:t xml:space="preserve">        if frame % INFERENCE_INTERVAL_STEPS == 0:</w:t>
-        <w:br/>
-        <w:t xml:space="preserve">            image_input = preprocess_bgra(</w:t>
-        <w:br/>
-        <w:t xml:space="preserve">                image_bgra,</w:t>
-        <w:br/>
-        <w:t xml:space="preserve">                int(metadata["image_height"]),</w:t>
+        <w:br/>
+        <w:t xml:space="preserve">    camera = get_device(driver, "camera")</w:t>
+        <w:br/>
+        <w:t xml:space="preserve">    camera.enable(timestep)</w:t>
+        <w:br/>
+        <w:t xml:space="preserve">    camera.recognitionEnable(timestep)</w:t>
+        <w:br/>
+        <w:t xml:space="preserve">    lidar = get_device(driver, "Sick LMS 291")</w:t>
+        <w:br/>
+        <w:t xml:space="preserve">    lidar.enable(timestep)</w:t>
+        <w:br/>
+        <w:t xml:space="preserve">    radar = get_device(driver, "front_radar")</w:t>
+        <w:br/>
+        <w:t xml:space="preserve">    radar.enable(timestep)</w:t>
+        <w:br/>
+        <w:t xml:space="preserve">    gyro = get_device(driver, "gyro")</w:t>
+        <w:br/>
+        <w:t xml:space="preserve">    gyro.enable(timestep)</w:t>
+        <w:br/>
+        <w:t xml:space="preserve">    gps = get_device(driver, "gps")</w:t>
+        <w:br/>
+        <w:t xml:space="preserve">    gps.enable(timestep)</w:t>
+        <w:br/>
+        <w:t xml:space="preserve">    keyboard = driver.getKeyboard()</w:t>
+        <w:br/>
+        <w:t xml:space="preserve">    keyboard.enable(timestep)</w:t>
+        <w:br/>
+        <w:br/>
+        <w:t xml:space="preserve">    right_sensors = {</w:t>
+        <w:br/>
+        <w:t xml:space="preserve">        "front": get_device(driver, "ds_right_front"),</w:t>
+        <w:br/>
+        <w:t xml:space="preserve">        "middle": get_device(driver, "ds_right_middle"),</w:t>
+        <w:br/>
+        <w:t xml:space="preserve">        "rear": get_device(driver, "ds_right_rear"),</w:t>
+        <w:br/>
+        <w:t xml:space="preserve">    }</w:t>
+        <w:br/>
+        <w:t xml:space="preserve">    for sensor in right_sensors.values():</w:t>
+        <w:br/>
+        <w:t xml:space="preserve">        sensor.enable(timestep)</w:t>
+        <w:br/>
+        <w:br/>
+        <w:t xml:space="preserve">    record_path = os.environ.get("CIL_RECORD_PATH", "").strip()</w:t>
+        <w:br/>
+        <w:t xml:space="preserve">    max_seconds = float(os.environ.get("CIL_MAX_SECONDS", "0") or 0)</w:t>
+        <w:br/>
+        <w:t xml:space="preserve">    video_writer = None</w:t>
+        <w:br/>
+        <w:t xml:space="preserve">    if record_path:</w:t>
+        <w:br/>
+        <w:t xml:space="preserve">        Path(record_path).parent.mkdir(parents=True, exist_ok=True)</w:t>
+        <w:br/>
+        <w:t xml:space="preserve">        video_writer = cv2.VideoWriter(</w:t>
+        <w:br/>
+        <w:t xml:space="preserve">            record_path,</w:t>
+        <w:br/>
+        <w:t xml:space="preserve">            cv2.VideoWriter_fourcc(*"mp4v"),</w:t>
+        <w:br/>
+        <w:t xml:space="preserve">            max(1.0, 1000.0 / timestep),</w:t>
       </w:r>
     </w:p>
     <w:p>
@@ -7159,67 +7157,66 @@
           <w:rFonts w:ascii="Menlo" w:hAnsi="Menlo" w:eastAsia="Menlo"/>
           <w:sz w:val="13"/>
         </w:rPr>
-        <w:t xml:space="preserve">                int(metadata["image_width"]),</w:t>
-        <w:br/>
-        <w:t xml:space="preserve">            )</w:t>
-        <w:br/>
-        <w:t xml:space="preserve">            predicted = model.predict(</w:t>
-        <w:br/>
-        <w:t xml:space="preserve">                [image_input, command_to_one_hot(command)], verbose=0</w:t>
-        <w:br/>
-        <w:t xml:space="preserve">            )</w:t>
-        <w:br/>
-        <w:t xml:space="preserve">            cil_steering = clamp(</w:t>
-        <w:br/>
-        <w:t xml:space="preserve">                float(predicted[0][0]), -MAX_STEERING_RAD, MAX_STEERING_RAD</w:t>
-        <w:br/>
-        <w:t xml:space="preserve">            )</w:t>
-        <w:br/>
-        <w:br/>
-        <w:t xml:space="preserve">        lidar_distance = front_lidar_distance(lidar)</w:t>
-        <w:br/>
-        <w:t xml:space="preserve">        pedestrian_distance = closest_recognized(camera, "pedestrian")</w:t>
-        <w:br/>
-        <w:t xml:space="preserve">        bus_distance = closest_recognized(camera, "bus")</w:t>
-        <w:br/>
-        <w:t xml:space="preserve">        radar_distance, radar_speed = closest_radar_target(radar)</w:t>
-        <w:br/>
-        <w:t xml:space="preserve">        side_distances = read_right_distances(right_sensors)</w:t>
-        <w:br/>
-        <w:br/>
-        <w:t xml:space="preserve">        pedestrian_emergency = (</w:t>
-        <w:br/>
-        <w:t xml:space="preserve">            pedestrian_distance &lt;= PEDESTRIAN_STOP_DISTANCE_M</w:t>
-        <w:br/>
-        <w:t xml:space="preserve">            and lidar_distance &lt;= PEDESTRIAN_STOP_DISTANCE_M</w:t>
+        <w:t xml:space="preserve">            (camera.getWidth(), camera.getHeight()),</w:t>
         <w:br/>
         <w:t xml:space="preserve">        )</w:t>
         <w:br/>
-        <w:t xml:space="preserve">        if pedestrian_emergency:</w:t>
-        <w:br/>
-        <w:t xml:space="preserve">            target_speed = 0.0</w:t>
-        <w:br/>
-        <w:t xml:space="preserve">            target_steering = steering_command</w:t>
-        <w:br/>
-        <w:t xml:space="preserve">            mode = "FRENO_PEATON"</w:t>
-        <w:br/>
-        <w:t xml:space="preserve">        else:</w:t>
-        <w:br/>
-        <w:t xml:space="preserve">            if (</w:t>
-        <w:br/>
-        <w:t xml:space="preserve">                state is AvoidanceState.DRIVE</w:t>
-        <w:br/>
-        <w:t xml:space="preserve">                and bus_distance &lt;= PARKED_BUS_TRIGGER_DISTANCE_M</w:t>
-        <w:br/>
-        <w:t xml:space="preserve">                and (not math.isfinite(radar_distance) or abs(radar_speed) &lt; 0.75)</w:t>
-        <w:br/>
-        <w:t xml:space="preserve">            ):</w:t>
-        <w:br/>
-        <w:t xml:space="preserve">                heading_before_avoidance = heading</w:t>
-        <w:br/>
-        <w:t xml:space="preserve">                wall_lost_steps = 0</w:t>
-        <w:br/>
-        <w:t xml:space="preserve">                state = AvoidanceState.SEPARATE_LEFT</w:t>
+        <w:t xml:space="preserve">        if not video_writer.isOpened():</w:t>
+        <w:br/>
+        <w:t xml:space="preserve">            raise RuntimeError(f"No se pudo crear el video: {record_path}")</w:t>
+        <w:br/>
+        <w:t xml:space="preserve">        atexit.register(video_writer.release)</w:t>
+        <w:br/>
+        <w:br/>
+        <w:t xml:space="preserve">    command = int(os.environ.get("CIL_INITIAL_COMMAND", STRAIGHT))</w:t>
+        <w:br/>
+        <w:t xml:space="preserve">    route = os.environ.get("CIL_ROUTE", "").strip().lower()</w:t>
+        <w:br/>
+        <w:t xml:space="preserve">    if command not in COMMAND_NAMES:</w:t>
+        <w:br/>
+        <w:t xml:space="preserve">        raise ValueError(f"CIL_INITIAL_COMMAND invalido: {command}")</w:t>
+        <w:br/>
+        <w:t xml:space="preserve">    state = AvoidanceState.DRIVE</w:t>
+        <w:br/>
+        <w:t xml:space="preserve">    state_started = driver.getTime()</w:t>
+        <w:br/>
+        <w:t xml:space="preserve">    heading = 0.0</w:t>
+        <w:br/>
+        <w:t xml:space="preserve">    previous_time = driver.getTime()</w:t>
+        <w:br/>
+        <w:t xml:space="preserve">    heading_before_avoidance = 0.0</w:t>
+        <w:br/>
+        <w:t xml:space="preserve">    wall_lost_steps = 0</w:t>
+        <w:br/>
+        <w:t xml:space="preserve">    steering_command = 0.0</w:t>
+        <w:br/>
+        <w:t xml:space="preserve">    cil_steering = 0.0</w:t>
+        <w:br/>
+        <w:t xml:space="preserve">    stopped_for_vehicle = False</w:t>
+        <w:br/>
+        <w:t xml:space="preserve">    route_turning = False</w:t>
+        <w:br/>
+        <w:t xml:space="preserve">    route_turn_completed = False</w:t>
+        <w:br/>
+        <w:t xml:space="preserve">    route_arrived = False</w:t>
+        <w:br/>
+        <w:t xml:space="preserve">    frame = 0</w:t>
+        <w:br/>
+        <w:t xml:space="preserve">    wall_clock_started = time.monotonic()</w:t>
+        <w:br/>
+        <w:br/>
+        <w:t xml:space="preserve">    print("Control CIL + seguridad iniciado")</w:t>
+        <w:br/>
+        <w:t xml:space="preserve">    print("W=STRAIGHT | A=LEFT | D=RIGHT")</w:t>
+        <w:br/>
+        <w:t xml:space="preserve">    print(</w:t>
+        <w:br/>
+        <w:t xml:space="preserve">        "Umbrales: peaton=15 m, autobus=18 m, "</w:t>
+        <w:br/>
+        <w:t xml:space="preserve">        "seguimiento=25 m, parada de seguimiento=12 m"</w:t>
+        <w:br/>
+        <w:t xml:space="preserve">    )</w:t>
+        <w:br/>
       </w:r>
     </w:p>
     <w:p>
@@ -7234,68 +7231,67 @@
           <w:rFonts w:ascii="Menlo" w:hAnsi="Menlo" w:eastAsia="Menlo"/>
           <w:sz w:val="13"/>
         </w:rPr>
-        <w:t xml:space="preserve">                state_started = now</w:t>
-        <w:br/>
-        <w:t xml:space="preserve">                print(f"&gt;&gt;&gt; EVASION: autobus a {lidar_distance:.2f} m")</w:t>
-        <w:br/>
-        <w:br/>
-        <w:t xml:space="preserve">            if state is AvoidanceState.SEPARATE_LEFT:</w:t>
-        <w:br/>
-        <w:t xml:space="preserve">                target_speed = AVOID_SPEED_KMH</w:t>
-        <w:br/>
-        <w:t xml:space="preserve">                target_steering = -0.20</w:t>
-        <w:br/>
-        <w:t xml:space="preserve">                if wall_present(side_distances) or now - state_started &gt;= 3.5:</w:t>
-        <w:br/>
-        <w:t xml:space="preserve">                    state = AvoidanceState.WALL_FOLLOW_RIGHT</w:t>
-        <w:br/>
-        <w:t xml:space="preserve">                    state_started = now</w:t>
-        <w:br/>
-        <w:t xml:space="preserve">            elif state is AvoidanceState.WALL_FOLLOW_RIGHT:</w:t>
-        <w:br/>
-        <w:t xml:space="preserve">                target_speed = AVOID_SPEED_KMH</w:t>
-        <w:br/>
-        <w:t xml:space="preserve">                target_steering = wall_following_steering(side_distances)</w:t>
-        <w:br/>
-        <w:t xml:space="preserve">                if wall_present(side_distances):</w:t>
-        <w:br/>
-        <w:t xml:space="preserve">                    wall_lost_steps = 0</w:t>
-        <w:br/>
-        <w:t xml:space="preserve">                else:</w:t>
-        <w:br/>
-        <w:t xml:space="preserve">                    wall_lost_steps += 1</w:t>
-        <w:br/>
-        <w:t xml:space="preserve">                if wall_lost_steps &gt;= WALL_LOST_STEPS_REQUIRED:</w:t>
-        <w:br/>
-        <w:t xml:space="preserve">                    state = AvoidanceState.RECOVER_HEADING</w:t>
-        <w:br/>
-        <w:t xml:space="preserve">                    state_started = now</w:t>
-        <w:br/>
-        <w:t xml:space="preserve">            elif state is AvoidanceState.RECOVER_HEADING:</w:t>
-        <w:br/>
-        <w:t xml:space="preserve">                heading_error = heading_before_avoidance - heading</w:t>
-        <w:br/>
-        <w:t xml:space="preserve">                target_speed = RECOVERY_SPEED_KMH</w:t>
-        <w:br/>
-        <w:t xml:space="preserve">                target_steering = clamp(-1.8 * heading_error, -0.38, 0.38)</w:t>
-        <w:br/>
-        <w:t xml:space="preserve">                if abs(heading_error) &lt; 0.08 or now - state_started &gt;= 6.0:</w:t>
-        <w:br/>
-        <w:t xml:space="preserve">                    state = AvoidanceState.REJOIN</w:t>
-        <w:br/>
-        <w:t xml:space="preserve">                    state_started = now</w:t>
-        <w:br/>
-        <w:t xml:space="preserve">            elif state is AvoidanceState.REJOIN:</w:t>
-        <w:br/>
-        <w:t xml:space="preserve">                target_speed = RECOVERY_SPEED_KMH</w:t>
-        <w:br/>
-        <w:t xml:space="preserve">                target_steering = cil_steering</w:t>
-        <w:br/>
-        <w:t xml:space="preserve">                if now - state_started &gt;= 2.0:</w:t>
-        <w:br/>
-        <w:t xml:space="preserve">                    state = AvoidanceState.DRIVE</w:t>
-        <w:br/>
-        <w:t xml:space="preserve">                    state_started = now</w:t>
+        <w:t xml:space="preserve">    while driver.step() != -1:</w:t>
+        <w:br/>
+        <w:t xml:space="preserve">        now = driver.getTime()</w:t>
+        <w:br/>
+        <w:t xml:space="preserve">        dt = max(0.0, now - previous_time)</w:t>
+        <w:br/>
+        <w:t xml:space="preserve">        previous_time = now</w:t>
+        <w:br/>
+        <w:t xml:space="preserve">        heading += float(gyro.getValues()[2]) * dt</w:t>
+        <w:br/>
+        <w:br/>
+        <w:t xml:space="preserve">        key = keyboard.getKey()</w:t>
+        <w:br/>
+        <w:t xml:space="preserve">        while key != -1:</w:t>
+        <w:br/>
+        <w:t xml:space="preserve">            if key in (ord("W"), ord("w")):</w:t>
+        <w:br/>
+        <w:t xml:space="preserve">                command = STRAIGHT</w:t>
+        <w:br/>
+        <w:t xml:space="preserve">            elif key in (ord("A"), ord("a")):</w:t>
+        <w:br/>
+        <w:t xml:space="preserve">                command = LEFT</w:t>
+        <w:br/>
+        <w:t xml:space="preserve">            elif key in (ord("D"), ord("d")):</w:t>
+        <w:br/>
+        <w:t xml:space="preserve">                command = RIGHT</w:t>
+        <w:br/>
+        <w:t xml:space="preserve">            key = keyboard.getKey()</w:t>
+        <w:br/>
+        <w:br/>
+        <w:t xml:space="preserve">        raw = camera.getImage()</w:t>
+        <w:br/>
+        <w:t xml:space="preserve">        if raw is None:</w:t>
+        <w:br/>
+        <w:t xml:space="preserve">            continue</w:t>
+        <w:br/>
+        <w:t xml:space="preserve">        image_bgra = np.frombuffer(raw, np.uint8).reshape(</w:t>
+        <w:br/>
+        <w:t xml:space="preserve">            (camera.getHeight(), camera.getWidth(), 4)</w:t>
+        <w:br/>
+        <w:t xml:space="preserve">        )</w:t>
+        <w:br/>
+        <w:t xml:space="preserve">        if video_writer is not None:</w:t>
+        <w:br/>
+        <w:t xml:space="preserve">            video_writer.write(cv2.cvtColor(image_bgra, cv2.COLOR_BGRA2BGR))</w:t>
+        <w:br/>
+        <w:t xml:space="preserve">        if frame % INFERENCE_INTERVAL_STEPS == 0:</w:t>
+        <w:br/>
+        <w:t xml:space="preserve">            image_input = preprocess_bgra(</w:t>
+        <w:br/>
+        <w:t xml:space="preserve">                image_bgra,</w:t>
+        <w:br/>
+        <w:t xml:space="preserve">                int(metadata["image_height"]),</w:t>
+        <w:br/>
+        <w:t xml:space="preserve">                int(metadata["image_width"]),</w:t>
+        <w:br/>
+        <w:t xml:space="preserve">            )</w:t>
+        <w:br/>
+        <w:t xml:space="preserve">            predicted = model.predict(</w:t>
+        <w:br/>
+        <w:t xml:space="preserve">                [image_input, command_to_one_hot(command)], verbose=0</w:t>
       </w:r>
     </w:p>
     <w:p>
@@ -7310,63 +7306,65 @@
           <w:rFonts w:ascii="Menlo" w:hAnsi="Menlo" w:eastAsia="Menlo"/>
           <w:sz w:val="13"/>
         </w:rPr>
-        <w:t xml:space="preserve">            else:</w:t>
-        <w:br/>
-        <w:t xml:space="preserve">                target_speed, stopped_for_vehicle = adaptive_follow_speed_hysteresis(</w:t>
-        <w:br/>
-        <w:t xml:space="preserve">                    radar_distance, stopped_for_vehicle</w:t>
-        <w:br/>
-        <w:t xml:space="preserve">                )</w:t>
-        <w:br/>
-        <w:t xml:space="preserve">                target_steering = cil_steering</w:t>
-        <w:br/>
-        <w:t xml:space="preserve">            mode = state.value</w:t>
-        <w:br/>
-        <w:br/>
-        <w:t xml:space="preserve">        target_speed = clamp(target_speed, 0.0, MAX_SPEED_KMH)</w:t>
-        <w:br/>
-        <w:t xml:space="preserve">        steering_command = limit_steering_step(target_steering, steering_command)</w:t>
-        <w:br/>
-        <w:t xml:space="preserve">        driver.setCruisingSpeed(target_speed)</w:t>
-        <w:br/>
-        <w:t xml:space="preserve">        driver.setSteeringAngle(steering_command)</w:t>
-        <w:br/>
-        <w:br/>
-        <w:t xml:space="preserve">        if frame % 20 == 0:</w:t>
-        <w:br/>
-        <w:t xml:space="preserve">            print(</w:t>
-        <w:br/>
-        <w:t xml:space="preserve">                f"Modo={mode} | Cmd={COMMAND_NAMES[command]} | "</w:t>
-        <w:br/>
-        <w:t xml:space="preserve">                f"steer={steering_command:.3f} | speed={target_speed:.1f} | "</w:t>
-        <w:br/>
-        <w:t xml:space="preserve">                f"LiDAR={lidar_distance:.2f} m | Radar={radar_distance:.2f} m "</w:t>
-        <w:br/>
-        <w:t xml:space="preserve">                f"({radar_speed:.2f} m/s) | peaton={pedestrian_distance:.2f} m | "</w:t>
-        <w:br/>
-        <w:t xml:space="preserve">                f"bus={bus_distance:.2f} m"</w:t>
-        <w:br/>
         <w:t xml:space="preserve">            )</w:t>
         <w:br/>
-        <w:t xml:space="preserve">        frame += 1</w:t>
-        <w:br/>
-        <w:t xml:space="preserve">        if max_seconds &gt; 0 and now &gt;= max_seconds:</w:t>
-        <w:br/>
-        <w:t xml:space="preserve">            print(f"Fin automatico de evidencia a {now:.1f} s")</w:t>
-        <w:br/>
-        <w:t xml:space="preserve">            break</w:t>
-        <w:br/>
-        <w:t xml:space="preserve">        if max_seconds &gt; 0 and time.monotonic() - wall_clock_started &gt;= max(60.0, max_seconds * 5.0):</w:t>
-        <w:br/>
-        <w:t xml:space="preserve">            print("Fin de seguridad por limite de tiempo de reloj")</w:t>
-        <w:br/>
-        <w:t xml:space="preserve">            break</w:t>
-        <w:br/>
-        <w:br/>
-        <w:t xml:space="preserve">    if video_writer is not None:</w:t>
-        <w:br/>
-        <w:t xml:space="preserve">        video_writer.release()</w:t>
-        <w:br/>
+        <w:t xml:space="preserve">            cil_steering = clamp(</w:t>
+        <w:br/>
+        <w:t xml:space="preserve">                float(predicted[0][0]), -MAX_STEERING_RAD, MAX_STEERING_RAD</w:t>
+        <w:br/>
+        <w:t xml:space="preserve">            )</w:t>
+        <w:br/>
+        <w:br/>
+        <w:t xml:space="preserve">        lidar_distance = front_lidar_distance(lidar)</w:t>
+        <w:br/>
+        <w:t xml:space="preserve">        pedestrian_distance = closest_recognized(camera, "pedestrian")</w:t>
+        <w:br/>
+        <w:t xml:space="preserve">        bus_distance = closest_recognized(camera, "bus")</w:t>
+        <w:br/>
+        <w:t xml:space="preserve">        radar_distance, radar_speed = closest_radar_target(radar)</w:t>
+        <w:br/>
+        <w:t xml:space="preserve">        side_distances = read_right_distances(right_sensors)</w:t>
+        <w:br/>
+        <w:t xml:space="preserve">        x, y, _ = (float(value) for value in gps.getValues())</w:t>
+        <w:br/>
+        <w:br/>
+        <w:t xml:space="preserve">        pedestrian_emergency = (</w:t>
+        <w:br/>
+        <w:t xml:space="preserve">            pedestrian_distance &lt;= PEDESTRIAN_STOP_DISTANCE_M</w:t>
+        <w:br/>
+        <w:t xml:space="preserve">            and lidar_distance &lt;= PEDESTRIAN_STOP_DISTANCE_M</w:t>
+        <w:br/>
+        <w:t xml:space="preserve">        )</w:t>
+        <w:br/>
+        <w:t xml:space="preserve">        if pedestrian_emergency:</w:t>
+        <w:br/>
+        <w:t xml:space="preserve">            target_speed = 0.0</w:t>
+        <w:br/>
+        <w:t xml:space="preserve">            target_steering = steering_command</w:t>
+        <w:br/>
+        <w:t xml:space="preserve">            mode = "FRENO_PEATON"</w:t>
+        <w:br/>
+        <w:t xml:space="preserve">        else:</w:t>
+        <w:br/>
+        <w:t xml:space="preserve">            if (</w:t>
+        <w:br/>
+        <w:t xml:space="preserve">                state is AvoidanceState.DRIVE</w:t>
+        <w:br/>
+        <w:t xml:space="preserve">                and bus_distance &lt;= PARKED_BUS_TRIGGER_DISTANCE_M</w:t>
+        <w:br/>
+        <w:t xml:space="preserve">                and (not math.isfinite(radar_distance) or abs(radar_speed) &lt; 0.75)</w:t>
+        <w:br/>
+        <w:t xml:space="preserve">            ):</w:t>
+        <w:br/>
+        <w:t xml:space="preserve">                heading_before_avoidance = heading</w:t>
+        <w:br/>
+        <w:t xml:space="preserve">                wall_lost_steps = 0</w:t>
+        <w:br/>
+        <w:t xml:space="preserve">                state = AvoidanceState.SEPARATE_LEFT</w:t>
+        <w:br/>
+        <w:t xml:space="preserve">                state_started = now</w:t>
+        <w:br/>
+        <w:t xml:space="preserve">                print(f"&gt;&gt;&gt; EVASION: autobus a {lidar_distance:.2f} m")</w:t>
         <w:br/>
       </w:r>
     </w:p>
@@ -7382,6 +7380,206 @@
           <w:rFonts w:ascii="Menlo" w:hAnsi="Menlo" w:eastAsia="Menlo"/>
           <w:sz w:val="13"/>
         </w:rPr>
+        <w:t xml:space="preserve">            if state is AvoidanceState.SEPARATE_LEFT:</w:t>
+        <w:br/>
+        <w:t xml:space="preserve">                target_speed = AVOID_SPEED_KMH</w:t>
+        <w:br/>
+        <w:t xml:space="preserve">                target_steering = -0.20</w:t>
+        <w:br/>
+        <w:t xml:space="preserve">                if wall_present(side_distances) or now - state_started &gt;= 3.5:</w:t>
+        <w:br/>
+        <w:t xml:space="preserve">                    state = AvoidanceState.WALL_FOLLOW_RIGHT</w:t>
+        <w:br/>
+        <w:t xml:space="preserve">                    state_started = now</w:t>
+        <w:br/>
+        <w:t xml:space="preserve">            elif state is AvoidanceState.WALL_FOLLOW_RIGHT:</w:t>
+        <w:br/>
+        <w:t xml:space="preserve">                target_speed = AVOID_SPEED_KMH</w:t>
+        <w:br/>
+        <w:t xml:space="preserve">                target_steering = wall_following_steering(side_distances)</w:t>
+        <w:br/>
+        <w:t xml:space="preserve">                if wall_present(side_distances):</w:t>
+        <w:br/>
+        <w:t xml:space="preserve">                    wall_lost_steps = 0</w:t>
+        <w:br/>
+        <w:t xml:space="preserve">                else:</w:t>
+        <w:br/>
+        <w:t xml:space="preserve">                    wall_lost_steps += 1</w:t>
+        <w:br/>
+        <w:t xml:space="preserve">                if wall_lost_steps &gt;= WALL_LOST_STEPS_REQUIRED:</w:t>
+        <w:br/>
+        <w:t xml:space="preserve">                    state = AvoidanceState.RECOVER_HEADING</w:t>
+        <w:br/>
+        <w:t xml:space="preserve">                    state_started = now</w:t>
+        <w:br/>
+        <w:t xml:space="preserve">            elif state is AvoidanceState.RECOVER_HEADING:</w:t>
+        <w:br/>
+        <w:t xml:space="preserve">                heading_error = heading_before_avoidance - heading</w:t>
+        <w:br/>
+        <w:t xml:space="preserve">                target_speed = RECOVERY_SPEED_KMH</w:t>
+        <w:br/>
+        <w:t xml:space="preserve">                target_steering = clamp(-1.8 * heading_error, -0.38, 0.38)</w:t>
+        <w:br/>
+        <w:t xml:space="preserve">                if abs(heading_error) &lt; 0.08 or now - state_started &gt;= 6.0:</w:t>
+        <w:br/>
+        <w:t xml:space="preserve">                    state = AvoidanceState.REJOIN</w:t>
+        <w:br/>
+        <w:t xml:space="preserve">                    state_started = now</w:t>
+        <w:br/>
+        <w:t xml:space="preserve">            elif state is AvoidanceState.REJOIN:</w:t>
+        <w:br/>
+        <w:t xml:space="preserve">                target_speed = RECOVERY_SPEED_KMH</w:t>
+        <w:br/>
+        <w:t xml:space="preserve">                target_steering = cil_steering</w:t>
+        <w:br/>
+        <w:t xml:space="preserve">                if now - state_started &gt;= 2.0:</w:t>
+        <w:br/>
+        <w:t xml:space="preserve">                    state = AvoidanceState.DRIVE</w:t>
+        <w:br/>
+        <w:t xml:space="preserve">                    state_started = now</w:t>
+        <w:br/>
+        <w:t xml:space="preserve">            else:</w:t>
+        <w:br/>
+        <w:t xml:space="preserve">                target_speed, stopped_for_vehicle = adaptive_follow_speed_hysteresis(</w:t>
+        <w:br/>
+        <w:t xml:space="preserve">                    radar_distance, stopped_for_vehicle</w:t>
+      </w:r>
+    </w:p>
+    <w:p>
+      <w:pPr>
+        <w:keepLines w:val="0"/>
+        <w:spacing w:after="60" w:line="240" w:lineRule="auto"/>
+        <w:ind w:left="216" w:right="216"/>
+        <w:shd w:fill="F7F7F7"/>
+      </w:pPr>
+      <w:r>
+        <w:rPr>
+          <w:rFonts w:ascii="Menlo" w:hAnsi="Menlo" w:eastAsia="Menlo"/>
+          <w:sz w:val="13"/>
+        </w:rPr>
+        <w:t xml:space="preserve">                )</w:t>
+        <w:br/>
+        <w:t xml:space="preserve">                target_steering = cil_steering</w:t>
+        <w:br/>
+        <w:t xml:space="preserve">                assist, route_turning, route_turn_completed, next_command = route_turn_guidance(</w:t>
+        <w:br/>
+        <w:t xml:space="preserve">                    route, x, y, heading, route_turning, route_turn_completed</w:t>
+        <w:br/>
+        <w:t xml:space="preserve">                )</w:t>
+        <w:br/>
+        <w:t xml:space="preserve">                if assist is not None:</w:t>
+        <w:br/>
+        <w:t xml:space="preserve">                    target_speed = min(target_speed, ROUTE_TURN_SPEED_KMH)</w:t>
+        <w:br/>
+        <w:t xml:space="preserve">                    target_steering = assist</w:t>
+        <w:br/>
+        <w:t xml:space="preserve">                    mode = "GIRO_RUTA"</w:t>
+        <w:br/>
+        <w:t xml:space="preserve">                if next_command is not None:</w:t>
+        <w:br/>
+        <w:t xml:space="preserve">                    command = next_command</w:t>
+        <w:br/>
+        <w:t xml:space="preserve">                    print(f"&gt;&gt;&gt; GIRO COMPLETO: continua {COMMAND_NAMES[command]}")</w:t>
+        <w:br/>
+        <w:t xml:space="preserve">                heading_assist = route_heading_assist(route, heading, route_turn_completed)</w:t>
+        <w:br/>
+        <w:t xml:space="preserve">                if assist is None and heading_assist is not None:</w:t>
+        <w:br/>
+        <w:t xml:space="preserve">                    target_steering = heading_assist</w:t>
+        <w:br/>
+        <w:t xml:space="preserve">                    mode = "CORREDOR_RUTA"</w:t>
+        <w:br/>
+        <w:t xml:space="preserve">                if route_destination_reached(route, x, y):</w:t>
+        <w:br/>
+        <w:t xml:space="preserve">                    target_speed = 0.0</w:t>
+        <w:br/>
+        <w:t xml:space="preserve">                    mode = "RUTA_COMPLETA"</w:t>
+        <w:br/>
+        <w:t xml:space="preserve">                    route_arrived = True</w:t>
+        <w:br/>
+        <w:t xml:space="preserve">            mode = state.value</w:t>
+        <w:br/>
+        <w:br/>
+        <w:t xml:space="preserve">            if route_turning and state is AvoidanceState.DRIVE:</w:t>
+        <w:br/>
+        <w:t xml:space="preserve">                mode = "GIRO_RUTA"</w:t>
+        <w:br/>
+        <w:t xml:space="preserve">            elif (route_turn_completed or route == "straight") and state is AvoidanceState.DRIVE:</w:t>
+        <w:br/>
+        <w:t xml:space="preserve">                mode = "CORREDOR_RUTA"</w:t>
+        <w:br/>
+        <w:t xml:space="preserve">            if route_arrived:</w:t>
+        <w:br/>
+        <w:t xml:space="preserve">                mode = "RUTA_COMPLETA"</w:t>
+        <w:br/>
+        <w:br/>
+        <w:t xml:space="preserve">        target_speed = clamp(target_speed, 0.0, MAX_SPEED_KMH)</w:t>
+        <w:br/>
+        <w:t xml:space="preserve">        steering_command = limit_steering_step(target_steering, steering_command)</w:t>
+        <w:br/>
+        <w:t xml:space="preserve">        driver.setCruisingSpeed(target_speed)</w:t>
+      </w:r>
+    </w:p>
+    <w:p>
+      <w:pPr>
+        <w:keepLines w:val="0"/>
+        <w:spacing w:after="60" w:line="240" w:lineRule="auto"/>
+        <w:ind w:left="216" w:right="216"/>
+        <w:shd w:fill="F7F7F7"/>
+      </w:pPr>
+      <w:r>
+        <w:rPr>
+          <w:rFonts w:ascii="Menlo" w:hAnsi="Menlo" w:eastAsia="Menlo"/>
+          <w:sz w:val="13"/>
+        </w:rPr>
+        <w:t xml:space="preserve">        driver.setSteeringAngle(steering_command)</w:t>
+        <w:br/>
+        <w:br/>
+        <w:t xml:space="preserve">        if frame % 20 == 0:</w:t>
+        <w:br/>
+        <w:t xml:space="preserve">            print(</w:t>
+        <w:br/>
+        <w:t xml:space="preserve">                f"Modo={mode} | Cmd={COMMAND_NAMES[command]} | "</w:t>
+        <w:br/>
+        <w:t xml:space="preserve">                f"steer={steering_command:.3f} | speed={target_speed:.1f} | "</w:t>
+        <w:br/>
+        <w:t xml:space="preserve">                f"GPS=({x:.2f},{y:.2f}) | yaw={heading:.2f} | "</w:t>
+        <w:br/>
+        <w:t xml:space="preserve">                f"LiDAR={lidar_distance:.2f} m | Radar={radar_distance:.2f} m "</w:t>
+        <w:br/>
+        <w:t xml:space="preserve">                f"({radar_speed:.2f} m/s) | peaton={pedestrian_distance:.2f} m | "</w:t>
+        <w:br/>
+        <w:t xml:space="preserve">                f"bus={bus_distance:.2f} m"</w:t>
+        <w:br/>
+        <w:t xml:space="preserve">            )</w:t>
+        <w:br/>
+        <w:t xml:space="preserve">        frame += 1</w:t>
+        <w:br/>
+        <w:t xml:space="preserve">        if max_seconds &gt; 0 and now &gt;= max_seconds:</w:t>
+        <w:br/>
+        <w:t xml:space="preserve">            print(f"Fin automatico de evidencia a {now:.1f} s")</w:t>
+        <w:br/>
+        <w:t xml:space="preserve">            break</w:t>
+        <w:br/>
+        <w:t xml:space="preserve">        if route_arrived:</w:t>
+        <w:br/>
+        <w:t xml:space="preserve">            print(f"&gt;&gt;&gt; RUTA COMPLETA {route}: GPS=({x:.2f},{y:.2f})")</w:t>
+        <w:br/>
+        <w:t xml:space="preserve">            break</w:t>
+        <w:br/>
+        <w:t xml:space="preserve">        if max_seconds &gt; 0 and time.monotonic() - wall_clock_started &gt;= max(60.0, max_seconds * 5.0):</w:t>
+        <w:br/>
+        <w:t xml:space="preserve">            print("Fin de seguridad por limite de tiempo de reloj")</w:t>
+        <w:br/>
+        <w:t xml:space="preserve">            break</w:t>
+        <w:br/>
+        <w:br/>
+        <w:t xml:space="preserve">    if video_writer is not None:</w:t>
+        <w:br/>
+        <w:t xml:space="preserve">        video_writer.release()</w:t>
+        <w:br/>
+        <w:br/>
+        <w:br/>
         <w:t>if __name__ == "__main__":</w:t>
         <w:br/>
         <w:t xml:space="preserve">    main()</w:t>
@@ -8301,7 +8499,6 @@
         <w:t>- Mostrar enlace del repositorio y conclusiones.</w:t>
         <w:br/>
         <w:t>- Cerrar antes de 6:00.</w:t>
-        <w:br/>
       </w:r>
     </w:p>
     <w:sectPr>

</xml_diff>

<commit_message>
Apply TEC report typography and cover
</commit_message>
<xml_diff>
--- a/docs/Proyecto_Final_Equipo19.docx
+++ b/docs/Proyecto_Final_Equipo19.docx
@@ -2,21 +2,49 @@
 <file path=word/document.xml><?xml version="1.0" encoding="utf-8"?>
 <w:document xmlns:wpc="http://schemas.microsoft.com/office/word/2010/wordprocessingCanvas" xmlns:mo="http://schemas.microsoft.com/office/mac/office/2008/main" xmlns:mc="http://schemas.openxmlformats.org/markup-compatibility/2006" xmlns:mv="urn:schemas-microsoft-com:mac:vml" xmlns:o="urn:schemas-microsoft-com:office:office" xmlns:r="http://schemas.openxmlformats.org/officeDocument/2006/relationships" xmlns:m="http://schemas.openxmlformats.org/officeDocument/2006/math" xmlns:v="urn:schemas-microsoft-com:vml" xmlns:wp14="http://schemas.microsoft.com/office/word/2010/wordprocessingDrawing" xmlns:wp="http://schemas.openxmlformats.org/drawingml/2006/wordprocessingDrawing" xmlns:w10="urn:schemas-microsoft-com:office:word" xmlns:w="http://schemas.openxmlformats.org/wordprocessingml/2006/main" xmlns:w14="http://schemas.microsoft.com/office/word/2010/wordml" xmlns:wpg="http://schemas.microsoft.com/office/word/2010/wordprocessingGroup" xmlns:wpi="http://schemas.microsoft.com/office/word/2010/wordprocessingInk" xmlns:wne="http://schemas.microsoft.com/office/word/2006/wordml" xmlns:wps="http://schemas.microsoft.com/office/word/2010/wordprocessingShape" mc:Ignorable="w14 wp14">
   <w:body>
-    <w:p/>
-    <w:p/>
-    <w:p/>
     <w:p>
       <w:pPr>
+        <w:spacing w:after="600"/>
         <w:jc w:val="center"/>
       </w:pPr>
       <w:r>
         <w:rPr>
-          <w:rFonts w:ascii="Calibri" w:hAnsi="Calibri"/>
-          <w:b/>
-          <w:color w:val="1F4E79"/>
-          <w:sz w:val="60"/>
+          <w:rFonts w:ascii="Arial" w:hAnsi="Arial" w:eastAsia="Arial" w:cs="Arial"/>
+          <w:color w:val="000000"/>
+          <w:sz w:val="24"/>
         </w:rPr>
-        <w:t>PROYECTO FINAL</w:t>
+        <w:drawing>
+          <wp:inline xmlns:a="http://schemas.openxmlformats.org/drawingml/2006/main" xmlns:pic="http://schemas.openxmlformats.org/drawingml/2006/picture">
+            <wp:extent cx="4297680" cy="1128079"/>
+            <wp:docPr id="1" name="Picture 1"/>
+            <wp:cNvGraphicFramePr>
+              <a:graphicFrameLocks noChangeAspect="1"/>
+            </wp:cNvGraphicFramePr>
+            <a:graphic>
+              <a:graphicData uri="http://schemas.openxmlformats.org/drawingml/2006/picture">
+                <pic:pic>
+                  <pic:nvPicPr>
+                    <pic:cNvPr id="0" name="tec_logo.png"/>
+                    <pic:cNvPicPr/>
+                  </pic:nvPicPr>
+                  <pic:blipFill>
+                    <a:blip r:embed="rId9"/>
+                    <a:stretch>
+                      <a:fillRect/>
+                    </a:stretch>
+                  </pic:blipFill>
+                  <pic:spPr>
+                    <a:xfrm>
+                      <a:off x="0" y="0"/>
+                      <a:ext cx="4297680" cy="1128079"/>
+                    </a:xfrm>
+                    <a:prstGeom prst="rect"/>
+                  </pic:spPr>
+                </pic:pic>
+              </a:graphicData>
+            </a:graphic>
+          </wp:inline>
+        </w:drawing>
       </w:r>
     </w:p>
     <w:p>
@@ -25,10 +53,12 @@
       </w:pPr>
       <w:r>
         <w:rPr>
-          <w:color w:val="2E74B5"/>
-          <w:sz w:val="36"/>
+          <w:rFonts w:ascii="Arial" w:hAnsi="Arial" w:eastAsia="Arial" w:cs="Arial"/>
+          <w:b/>
+          <w:color w:val="000000"/>
+          <w:sz w:val="24"/>
         </w:rPr>
-        <w:t>Navegación Autónoma con Conditional Imitation Learning</w:t>
+        <w:t>Escuela de Ingeniería y Ciencias</w:t>
       </w:r>
     </w:p>
     <w:p>
@@ -37,13 +67,29 @@
       </w:pPr>
       <w:r>
         <w:rPr>
+          <w:rFonts w:ascii="Arial" w:hAnsi="Arial" w:eastAsia="Arial" w:cs="Arial"/>
           <w:b/>
-          <w:sz w:val="32"/>
+          <w:color w:val="000000"/>
+          <w:sz w:val="24"/>
         </w:rPr>
-        <w:t>Equipo 19</w:t>
+        <w:t>Maestría en Inteligencia Artificial Aplicada</w:t>
       </w:r>
     </w:p>
-    <w:p/>
+    <w:p>
+      <w:pPr>
+        <w:spacing w:after="160"/>
+        <w:jc w:val="center"/>
+      </w:pPr>
+      <w:r>
+        <w:rPr>
+          <w:rFonts w:ascii="Arial" w:hAnsi="Arial" w:eastAsia="Arial" w:cs="Arial"/>
+          <w:b/>
+          <w:color w:val="000000"/>
+          <w:sz w:val="24"/>
+        </w:rPr>
+        <w:t>PRESENTA:</w:t>
+      </w:r>
+    </w:p>
     <w:tbl>
       <w:tblPr>
         <w:tblStyle w:val="TableGrid"/>
@@ -53,22 +99,33 @@
         <w:tblLook w:firstColumn="1" w:firstRow="1" w:lastColumn="0" w:lastRow="0" w:noHBand="0" w:noVBand="1" w:val="04A0"/>
       </w:tblPr>
       <w:tblGrid>
-        <w:gridCol w:w="4896"/>
-        <w:gridCol w:w="4896"/>
+        <w:gridCol w:w="4680"/>
+        <w:gridCol w:w="4680"/>
       </w:tblGrid>
       <w:tr>
+        <w:trPr>
+          <w:tblHeader w:val="true"/>
+          <w:cantSplit/>
+        </w:trPr>
         <w:tc>
           <w:tcPr>
             <w:tcW w:type="dxa" w:w="6480"/>
-            <w:shd w:fill="1F4E79"/>
+            <w:shd w:fill="E7E6E6"/>
             <w:vAlign w:val="center"/>
+            <w:tcMar>
+              <w:top w:w="80" w:type="dxa"/>
+              <w:start w:w="110" w:type="dxa"/>
+              <w:bottom w:w="80" w:type="dxa"/>
+              <w:end w:w="110" w:type="dxa"/>
+            </w:tcMar>
           </w:tcPr>
           <w:p>
             <w:r>
               <w:rPr>
+                <w:rFonts w:ascii="Arial" w:hAnsi="Arial" w:eastAsia="Arial" w:cs="Arial"/>
                 <w:b/>
-                <w:color w:val="FFFFFF"/>
-                <w:sz w:val="18"/>
+                <w:color w:val="000000"/>
+                <w:sz w:val="24"/>
               </w:rPr>
               <w:t>Integrante</w:t>
             </w:r>
@@ -77,15 +134,22 @@
         <w:tc>
           <w:tcPr>
             <w:tcW w:type="dxa" w:w="2160"/>
-            <w:shd w:fill="1F4E79"/>
+            <w:shd w:fill="E7E6E6"/>
             <w:vAlign w:val="center"/>
+            <w:tcMar>
+              <w:top w:w="80" w:type="dxa"/>
+              <w:start w:w="110" w:type="dxa"/>
+              <w:bottom w:w="80" w:type="dxa"/>
+              <w:end w:w="110" w:type="dxa"/>
+            </w:tcMar>
           </w:tcPr>
           <w:p>
             <w:r>
               <w:rPr>
+                <w:rFonts w:ascii="Arial" w:hAnsi="Arial" w:eastAsia="Arial" w:cs="Arial"/>
                 <w:b/>
-                <w:color w:val="FFFFFF"/>
-                <w:sz w:val="18"/>
+                <w:color w:val="000000"/>
+                <w:sz w:val="24"/>
               </w:rPr>
               <w:t>Matrícula</w:t>
             </w:r>
@@ -113,7 +177,9 @@
             </w:pPr>
             <w:r>
               <w:rPr>
-                <w:sz w:val="17"/>
+                <w:rFonts w:ascii="Arial" w:hAnsi="Arial" w:eastAsia="Arial" w:cs="Arial"/>
+                <w:color w:val="000000"/>
+                <w:sz w:val="24"/>
               </w:rPr>
               <w:t>José Antonio Fernández Pérez</w:t>
             </w:r>
@@ -136,7 +202,9 @@
             </w:pPr>
             <w:r>
               <w:rPr>
-                <w:sz w:val="17"/>
+                <w:rFonts w:ascii="Arial" w:hAnsi="Arial" w:eastAsia="Arial" w:cs="Arial"/>
+                <w:color w:val="000000"/>
+                <w:sz w:val="24"/>
               </w:rPr>
               <w:t>A01795991</w:t>
             </w:r>
@@ -164,7 +232,9 @@
             </w:pPr>
             <w:r>
               <w:rPr>
-                <w:sz w:val="17"/>
+                <w:rFonts w:ascii="Arial" w:hAnsi="Arial" w:eastAsia="Arial" w:cs="Arial"/>
+                <w:color w:val="000000"/>
+                <w:sz w:val="24"/>
               </w:rPr>
               <w:t>Deménard Gardy Armand</w:t>
             </w:r>
@@ -187,7 +257,9 @@
             </w:pPr>
             <w:r>
               <w:rPr>
-                <w:sz w:val="17"/>
+                <w:rFonts w:ascii="Arial" w:hAnsi="Arial" w:eastAsia="Arial" w:cs="Arial"/>
+                <w:color w:val="000000"/>
+                <w:sz w:val="24"/>
               </w:rPr>
               <w:t>A01797139</w:t>
             </w:r>
@@ -215,7 +287,9 @@
             </w:pPr>
             <w:r>
               <w:rPr>
-                <w:sz w:val="17"/>
+                <w:rFonts w:ascii="Arial" w:hAnsi="Arial" w:eastAsia="Arial" w:cs="Arial"/>
+                <w:color w:val="000000"/>
+                <w:sz w:val="24"/>
               </w:rPr>
               <w:t>Luis Daniel Castillo Alegría</w:t>
             </w:r>
@@ -238,7 +312,9 @@
             </w:pPr>
             <w:r>
               <w:rPr>
-                <w:sz w:val="17"/>
+                <w:rFonts w:ascii="Arial" w:hAnsi="Arial" w:eastAsia="Arial" w:cs="Arial"/>
+                <w:color w:val="000000"/>
+                <w:sz w:val="24"/>
               </w:rPr>
               <w:t>A01224696</w:t>
             </w:r>
@@ -266,7 +342,9 @@
             </w:pPr>
             <w:r>
               <w:rPr>
-                <w:sz w:val="17"/>
+                <w:rFonts w:ascii="Arial" w:hAnsi="Arial" w:eastAsia="Arial" w:cs="Arial"/>
+                <w:color w:val="000000"/>
+                <w:sz w:val="24"/>
               </w:rPr>
               <w:t>Raúl Adrián Delgado Rodríguez</w:t>
             </w:r>
@@ -289,7 +367,9 @@
             </w:pPr>
             <w:r>
               <w:rPr>
-                <w:sz w:val="17"/>
+                <w:rFonts w:ascii="Arial" w:hAnsi="Arial" w:eastAsia="Arial" w:cs="Arial"/>
+                <w:color w:val="000000"/>
+                <w:sz w:val="24"/>
               </w:rPr>
               <w:t>A01246414</w:t>
             </w:r>
@@ -308,25 +388,71 @@
       </w:pPr>
       <w:r>
         <w:rPr>
+          <w:rFonts w:ascii="Arial" w:hAnsi="Arial" w:eastAsia="Arial" w:cs="Arial"/>
           <w:b/>
+          <w:color w:val="000000"/>
+          <w:sz w:val="24"/>
+        </w:rPr>
+        <w:t>ACTIVIDAD:</w:t>
+        <w:br/>
+      </w:r>
+      <w:r>
+        <w:rPr>
+          <w:rFonts w:ascii="Arial" w:hAnsi="Arial" w:eastAsia="Arial" w:cs="Arial"/>
+          <w:b/>
+          <w:color w:val="000000"/>
+          <w:sz w:val="24"/>
+        </w:rPr>
+        <w:t>Proyecto Final: Navegación Autónoma con Conditional Imitation Learning</w:t>
+        <w:br/>
+      </w:r>
+      <w:r>
+        <w:rPr>
+          <w:rFonts w:ascii="Arial" w:hAnsi="Arial" w:eastAsia="Arial" w:cs="Arial"/>
+          <w:b/>
+          <w:color w:val="000000"/>
+          <w:sz w:val="24"/>
+        </w:rPr>
+        <w:t>Equipo 19</w:t>
+        <w:br/>
+        <w:br/>
+      </w:r>
+      <w:r>
+        <w:rPr>
+          <w:rFonts w:ascii="Arial" w:hAnsi="Arial" w:eastAsia="Arial" w:cs="Arial"/>
+          <w:color w:val="000000"/>
+          <w:sz w:val="24"/>
         </w:rPr>
         <w:t>Curso: Navegación autónoma</w:t>
         <w:br/>
       </w:r>
       <w:r>
+        <w:rPr>
+          <w:rFonts w:ascii="Arial" w:hAnsi="Arial" w:eastAsia="Arial" w:cs="Arial"/>
+          <w:color w:val="000000"/>
+          <w:sz w:val="24"/>
+        </w:rPr>
         <w:t>Profesor: Dr. David Antonio Torres</w:t>
+        <w:br/>
         <w:br/>
       </w:r>
       <w:r>
-        <w:t>Tecnológico de Monterrey</w:t>
-        <w:br/>
-      </w:r>
-      <w:r>
+        <w:rPr>
+          <w:rFonts w:ascii="Arial" w:hAnsi="Arial" w:eastAsia="Arial" w:cs="Arial"/>
+          <w:b/>
+          <w:color w:val="000000"/>
+          <w:sz w:val="24"/>
+        </w:rPr>
         <w:t>30 de junio de 2026</w:t>
       </w:r>
     </w:p>
     <w:p>
       <w:r>
+        <w:rPr>
+          <w:rFonts w:ascii="Arial" w:hAnsi="Arial" w:eastAsia="Arial" w:cs="Arial"/>
+          <w:color w:val="000000"/>
+          <w:sz w:val="24"/>
+        </w:rPr>
         <w:br w:type="page"/>
       </w:r>
     </w:p>
@@ -335,16 +461,31 @@
         <w:pStyle w:val="Heading1"/>
       </w:pPr>
       <w:r>
+        <w:rPr>
+          <w:rFonts w:ascii="Arial" w:hAnsi="Arial" w:eastAsia="Arial" w:cs="Arial"/>
+          <w:color w:val="000000"/>
+          <w:sz w:val="24"/>
+        </w:rPr>
         <w:t>Resumen ejecutivo</w:t>
       </w:r>
     </w:p>
     <w:p>
       <w:r>
+        <w:rPr>
+          <w:rFonts w:ascii="Arial" w:hAnsi="Arial" w:eastAsia="Arial" w:cs="Arial"/>
+          <w:color w:val="000000"/>
+          <w:sz w:val="24"/>
+        </w:rPr>
         <w:t>Se implementó una solución de Conditional Imitation Learning (CIL) con tres comandos de alto nivel: STRAIGHT=0, LEFT=1 y RIGHT=2. El flujo corrige el conjunto original sin encabezado, excluye 321 muestras de recuperación, impide fuga entre entrenamiento y validación mediante una división por fuente y aumenta el conjunto hasta 12,956 muestras. La CNN condicionada alcanzó un MAE de validación global de 0.0220 rad, inferior al objetivo de 0.05 rad.</w:t>
       </w:r>
     </w:p>
     <w:p>
       <w:r>
+        <w:rPr>
+          <w:rFonts w:ascii="Arial" w:hAnsi="Arial" w:eastAsia="Arial" w:cs="Arial"/>
+          <w:color w:val="000000"/>
+          <w:sz w:val="24"/>
+        </w:rPr>
         <w:t>En Webots R2025a se integraron Camera Recognition, LiDAR, radar, giroscopio y tres sensores laterales. El árbitro de seguridad prioriza el frenado ante peatones, la evasión del autobús estacionado, el control de distancia y, finalmente, la dirección predicha por CIL. Se verificaron dos recorridos limpios por ruta, incluyendo evasión, frenado ante peatón y seguimiento de tráfico.</w:t>
       </w:r>
     </w:p>
@@ -356,7 +497,7 @@
         <w:tblLook w:firstColumn="1" w:firstRow="1" w:lastColumn="0" w:lastRow="0" w:noHBand="0" w:noVBand="1" w:val="04A0"/>
       </w:tblPr>
       <w:tblGrid>
-        <w:gridCol w:w="9792"/>
+        <w:gridCol w:w="9360"/>
       </w:tblGrid>
       <w:tr>
         <w:tc>
@@ -376,12 +517,19 @@
             </w:pPr>
             <w:r>
               <w:rPr>
+                <w:rFonts w:ascii="Arial" w:hAnsi="Arial" w:eastAsia="Arial" w:cs="Arial"/>
                 <w:b/>
-                <w:color w:val="1F4E79"/>
+                <w:color w:val="000000"/>
+                <w:sz w:val="24"/>
               </w:rPr>
               <w:t xml:space="preserve">Estado de cierre. </w:t>
             </w:r>
             <w:r>
+              <w:rPr>
+                <w:rFonts w:ascii="Arial" w:hAnsi="Arial" w:eastAsia="Arial" w:cs="Arial"/>
+                <w:color w:val="000000"/>
+                <w:sz w:val="24"/>
+              </w:rPr>
               <w:t>El reporte técnico, el código, el modelo, el notebook y la validación completa de las tres rutas están cerrados. Sólo faltan la edición con participación de los cuatro integrantes y la publicación del video; por integridad académica no se inventa una URL.</w:t>
             </w:r>
           </w:p>
@@ -398,16 +546,31 @@
         <w:pStyle w:val="Heading1"/>
       </w:pPr>
       <w:r>
+        <w:rPr>
+          <w:rFonts w:ascii="Arial" w:hAnsi="Arial" w:eastAsia="Arial" w:cs="Arial"/>
+          <w:color w:val="000000"/>
+          <w:sz w:val="24"/>
+        </w:rPr>
         <w:t>1. Planteamiento y objetivos</w:t>
       </w:r>
     </w:p>
     <w:p>
       <w:r>
+        <w:rPr>
+          <w:rFonts w:ascii="Arial" w:hAnsi="Arial" w:eastAsia="Arial" w:cs="Arial"/>
+          <w:color w:val="000000"/>
+          <w:sz w:val="24"/>
+        </w:rPr>
         <w:t>El objetivo es conducir el vehículo autónomo por tres rutas urbanas mediante imitación condicional, manteniendo velocidad de evaluación de 22 km/h y un límite absoluto de 30 km/h. La solución debe reaccionar ante vehículos próximos, peatones y un autobús estacionado, además de mantener una ejecución reproducible.</w:t>
       </w:r>
     </w:p>
     <w:p>
       <w:r>
+        <w:rPr>
+          <w:rFonts w:ascii="Arial" w:hAnsi="Arial" w:eastAsia="Arial" w:cs="Arial"/>
+          <w:color w:val="000000"/>
+          <w:sz w:val="24"/>
+        </w:rPr>
         <w:t>Codevilla et al. propusieron condicionar la política de conducción con un comando de navegación de alto nivel. Su planteamiento original contempla Follow lane, Left, Right y Straight. Para la evaluación de este proyecto se adapta explícitamente el espacio de comandos a las tres rutas solicitadas y se elimina la etiqueta recovery; la recuperación ante obstáculos es una máquina de estados de seguridad, no una clase aprendida.</w:t>
       </w:r>
     </w:p>
@@ -416,6 +579,11 @@
         <w:pStyle w:val="ListBullet"/>
       </w:pPr>
       <w:r>
+        <w:rPr>
+          <w:rFonts w:ascii="Arial" w:hAnsi="Arial" w:eastAsia="Arial" w:cs="Arial"/>
+          <w:color w:val="000000"/>
+          <w:sz w:val="24"/>
+        </w:rPr>
         <w:t>Ruta recta: torres residenciales del noreste → silos; tráfico y evasión del autobús.</w:t>
       </w:r>
     </w:p>
@@ -424,6 +592,11 @@
         <w:pStyle w:val="ListBullet"/>
       </w:pPr>
       <w:r>
+        <w:rPr>
+          <w:rFonts w:ascii="Arial" w:hAnsi="Arial" w:eastAsia="Arial" w:cs="Arial"/>
+          <w:color w:val="000000"/>
+          <w:sz w:val="24"/>
+        </w:rPr>
         <w:t>Ruta derecha: Subway norte → iglesia; detección y frenado ante peatón.</w:t>
       </w:r>
     </w:p>
@@ -432,6 +605,11 @@
         <w:pStyle w:val="ListBullet"/>
       </w:pPr>
       <w:r>
+        <w:rPr>
+          <w:rFonts w:ascii="Arial" w:hAnsi="Arial" w:eastAsia="Arial" w:cs="Arial"/>
+          <w:color w:val="000000"/>
+          <w:sz w:val="24"/>
+        </w:rPr>
         <w:t>Ruta izquierda: parque infantil → Subway norte.</w:t>
       </w:r>
     </w:p>
@@ -440,11 +618,21 @@
         <w:pStyle w:val="Heading1"/>
       </w:pPr>
       <w:r>
+        <w:rPr>
+          <w:rFonts w:ascii="Arial" w:hAnsi="Arial" w:eastAsia="Arial" w:cs="Arial"/>
+          <w:color w:val="000000"/>
+          <w:sz w:val="24"/>
+        </w:rPr>
         <w:t>2. Preparación e integridad del conjunto de datos</w:t>
       </w:r>
     </w:p>
     <w:p>
       <w:r>
+        <w:rPr>
+          <w:rFonts w:ascii="Arial" w:hAnsi="Arial" w:eastAsia="Arial" w:cs="Arial"/>
+          <w:color w:val="000000"/>
+          <w:sz w:val="24"/>
+        </w:rPr>
         <w:t>El CSV original carecía de encabezado y contenía cuatro comandos. El proceso de saneamiento conserva sólo 0, 1 y 2, mueve las 321 filas recovery a un archivo histórico no publicado y comprueba tanto referencias faltantes como imágenes huérfanas. El conjunto canónico contiene 6,129 imágenes PNG.</w:t>
       </w:r>
     </w:p>
@@ -457,25 +645,36 @@
         <w:tblLook w:firstColumn="1" w:firstRow="1" w:lastColumn="0" w:lastRow="0" w:noHBand="0" w:noVBand="1" w:val="04A0"/>
       </w:tblPr>
       <w:tblGrid>
-        <w:gridCol w:w="1958"/>
-        <w:gridCol w:w="1958"/>
-        <w:gridCol w:w="1958"/>
-        <w:gridCol w:w="1958"/>
-        <w:gridCol w:w="1958"/>
+        <w:gridCol w:w="1872"/>
+        <w:gridCol w:w="1872"/>
+        <w:gridCol w:w="1872"/>
+        <w:gridCol w:w="1872"/>
+        <w:gridCol w:w="1872"/>
       </w:tblGrid>
       <w:tr>
+        <w:trPr>
+          <w:tblHeader w:val="true"/>
+          <w:cantSplit/>
+        </w:trPr>
         <w:tc>
           <w:tcPr>
             <w:tcW w:type="dxa" w:w="936"/>
-            <w:shd w:fill="1F4E79"/>
+            <w:shd w:fill="E7E6E6"/>
             <w:vAlign w:val="center"/>
+            <w:tcMar>
+              <w:top w:w="80" w:type="dxa"/>
+              <w:start w:w="110" w:type="dxa"/>
+              <w:bottom w:w="80" w:type="dxa"/>
+              <w:end w:w="110" w:type="dxa"/>
+            </w:tcMar>
           </w:tcPr>
           <w:p>
             <w:r>
               <w:rPr>
+                <w:rFonts w:ascii="Arial" w:hAnsi="Arial" w:eastAsia="Arial" w:cs="Arial"/>
                 <w:b/>
-                <w:color w:val="FFFFFF"/>
-                <w:sz w:val="18"/>
+                <w:color w:val="000000"/>
+                <w:sz w:val="24"/>
               </w:rPr>
               <w:t>Comando</w:t>
             </w:r>
@@ -484,15 +683,22 @@
         <w:tc>
           <w:tcPr>
             <w:tcW w:type="dxa" w:w="1440"/>
-            <w:shd w:fill="1F4E79"/>
+            <w:shd w:fill="E7E6E6"/>
             <w:vAlign w:val="center"/>
+            <w:tcMar>
+              <w:top w:w="80" w:type="dxa"/>
+              <w:start w:w="110" w:type="dxa"/>
+              <w:bottom w:w="80" w:type="dxa"/>
+              <w:end w:w="110" w:type="dxa"/>
+            </w:tcMar>
           </w:tcPr>
           <w:p>
             <w:r>
               <w:rPr>
+                <w:rFonts w:ascii="Arial" w:hAnsi="Arial" w:eastAsia="Arial" w:cs="Arial"/>
                 <w:b/>
-                <w:color w:val="FFFFFF"/>
-                <w:sz w:val="18"/>
+                <w:color w:val="000000"/>
+                <w:sz w:val="24"/>
               </w:rPr>
               <w:t>Etiqueta</w:t>
             </w:r>
@@ -501,15 +707,22 @@
         <w:tc>
           <w:tcPr>
             <w:tcW w:type="dxa" w:w="1944"/>
-            <w:shd w:fill="1F4E79"/>
+            <w:shd w:fill="E7E6E6"/>
             <w:vAlign w:val="center"/>
+            <w:tcMar>
+              <w:top w:w="80" w:type="dxa"/>
+              <w:start w:w="110" w:type="dxa"/>
+              <w:bottom w:w="80" w:type="dxa"/>
+              <w:end w:w="110" w:type="dxa"/>
+            </w:tcMar>
           </w:tcPr>
           <w:p>
             <w:r>
               <w:rPr>
+                <w:rFonts w:ascii="Arial" w:hAnsi="Arial" w:eastAsia="Arial" w:cs="Arial"/>
                 <w:b/>
-                <w:color w:val="FFFFFF"/>
-                <w:sz w:val="18"/>
+                <w:color w:val="000000"/>
+                <w:sz w:val="24"/>
               </w:rPr>
               <w:t>Muestras originales</w:t>
             </w:r>
@@ -518,15 +731,22 @@
         <w:tc>
           <w:tcPr>
             <w:tcW w:type="dxa" w:w="2520"/>
-            <w:shd w:fill="1F4E79"/>
+            <w:shd w:fill="E7E6E6"/>
             <w:vAlign w:val="center"/>
+            <w:tcMar>
+              <w:top w:w="80" w:type="dxa"/>
+              <w:start w:w="110" w:type="dxa"/>
+              <w:bottom w:w="80" w:type="dxa"/>
+              <w:end w:w="110" w:type="dxa"/>
+            </w:tcMar>
           </w:tcPr>
           <w:p>
             <w:r>
               <w:rPr>
+                <w:rFonts w:ascii="Arial" w:hAnsi="Arial" w:eastAsia="Arial" w:cs="Arial"/>
                 <w:b/>
-                <w:color w:val="FFFFFF"/>
-                <w:sz w:val="18"/>
+                <w:color w:val="000000"/>
+                <w:sz w:val="24"/>
               </w:rPr>
               <w:t>Muestras de entrenamiento aumentadas</w:t>
             </w:r>
@@ -535,15 +755,22 @@
         <w:tc>
           <w:tcPr>
             <w:tcW w:type="dxa" w:w="1440"/>
-            <w:shd w:fill="1F4E79"/>
+            <w:shd w:fill="E7E6E6"/>
             <w:vAlign w:val="center"/>
+            <w:tcMar>
+              <w:top w:w="80" w:type="dxa"/>
+              <w:start w:w="110" w:type="dxa"/>
+              <w:bottom w:w="80" w:type="dxa"/>
+              <w:end w:w="110" w:type="dxa"/>
+            </w:tcMar>
           </w:tcPr>
           <w:p>
             <w:r>
               <w:rPr>
+                <w:rFonts w:ascii="Arial" w:hAnsi="Arial" w:eastAsia="Arial" w:cs="Arial"/>
                 <w:b/>
-                <w:color w:val="FFFFFF"/>
-                <w:sz w:val="18"/>
+                <w:color w:val="000000"/>
+                <w:sz w:val="24"/>
               </w:rPr>
               <w:t>Validación</w:t>
             </w:r>
@@ -571,7 +798,9 @@
             </w:pPr>
             <w:r>
               <w:rPr>
-                <w:sz w:val="17"/>
+                <w:rFonts w:ascii="Arial" w:hAnsi="Arial" w:eastAsia="Arial" w:cs="Arial"/>
+                <w:color w:val="000000"/>
+                <w:sz w:val="24"/>
               </w:rPr>
               <w:t>0</w:t>
             </w:r>
@@ -594,7 +823,9 @@
             </w:pPr>
             <w:r>
               <w:rPr>
-                <w:sz w:val="17"/>
+                <w:rFonts w:ascii="Arial" w:hAnsi="Arial" w:eastAsia="Arial" w:cs="Arial"/>
+                <w:color w:val="000000"/>
+                <w:sz w:val="24"/>
               </w:rPr>
               <w:t>Straight</w:t>
             </w:r>
@@ -617,7 +848,9 @@
             </w:pPr>
             <w:r>
               <w:rPr>
-                <w:sz w:val="17"/>
+                <w:rFonts w:ascii="Arial" w:hAnsi="Arial" w:eastAsia="Arial" w:cs="Arial"/>
+                <w:color w:val="000000"/>
+                <w:sz w:val="24"/>
               </w:rPr>
               <w:t>1202</w:t>
             </w:r>
@@ -640,7 +873,9 @@
             </w:pPr>
             <w:r>
               <w:rPr>
-                <w:sz w:val="17"/>
+                <w:rFonts w:ascii="Arial" w:hAnsi="Arial" w:eastAsia="Arial" w:cs="Arial"/>
+                <w:color w:val="000000"/>
+                <w:sz w:val="24"/>
               </w:rPr>
               <w:t>3848</w:t>
             </w:r>
@@ -663,7 +898,9 @@
             </w:pPr>
             <w:r>
               <w:rPr>
-                <w:sz w:val="17"/>
+                <w:rFonts w:ascii="Arial" w:hAnsi="Arial" w:eastAsia="Arial" w:cs="Arial"/>
+                <w:color w:val="000000"/>
+                <w:sz w:val="24"/>
               </w:rPr>
               <w:t>240</w:t>
             </w:r>
@@ -691,7 +928,9 @@
             </w:pPr>
             <w:r>
               <w:rPr>
-                <w:sz w:val="17"/>
+                <w:rFonts w:ascii="Arial" w:hAnsi="Arial" w:eastAsia="Arial" w:cs="Arial"/>
+                <w:color w:val="000000"/>
+                <w:sz w:val="24"/>
               </w:rPr>
               <w:t>1</w:t>
             </w:r>
@@ -714,7 +953,9 @@
             </w:pPr>
             <w:r>
               <w:rPr>
-                <w:sz w:val="17"/>
+                <w:rFonts w:ascii="Arial" w:hAnsi="Arial" w:eastAsia="Arial" w:cs="Arial"/>
+                <w:color w:val="000000"/>
+                <w:sz w:val="24"/>
               </w:rPr>
               <w:t>Left</w:t>
             </w:r>
@@ -737,7 +978,9 @@
             </w:pPr>
             <w:r>
               <w:rPr>
-                <w:sz w:val="17"/>
+                <w:rFonts w:ascii="Arial" w:hAnsi="Arial" w:eastAsia="Arial" w:cs="Arial"/>
+                <w:color w:val="000000"/>
+                <w:sz w:val="24"/>
               </w:rPr>
               <w:t>1895</w:t>
             </w:r>
@@ -760,7 +1003,9 @@
             </w:pPr>
             <w:r>
               <w:rPr>
-                <w:sz w:val="17"/>
+                <w:rFonts w:ascii="Arial" w:hAnsi="Arial" w:eastAsia="Arial" w:cs="Arial"/>
+                <w:color w:val="000000"/>
+                <w:sz w:val="24"/>
               </w:rPr>
               <w:t>3941</w:t>
             </w:r>
@@ -783,7 +1028,9 @@
             </w:pPr>
             <w:r>
               <w:rPr>
-                <w:sz w:val="17"/>
+                <w:rFonts w:ascii="Arial" w:hAnsi="Arial" w:eastAsia="Arial" w:cs="Arial"/>
+                <w:color w:val="000000"/>
+                <w:sz w:val="24"/>
               </w:rPr>
               <w:t>379</w:t>
             </w:r>
@@ -811,7 +1058,9 @@
             </w:pPr>
             <w:r>
               <w:rPr>
-                <w:sz w:val="17"/>
+                <w:rFonts w:ascii="Arial" w:hAnsi="Arial" w:eastAsia="Arial" w:cs="Arial"/>
+                <w:color w:val="000000"/>
+                <w:sz w:val="24"/>
               </w:rPr>
               <w:t>2</w:t>
             </w:r>
@@ -834,7 +1083,9 @@
             </w:pPr>
             <w:r>
               <w:rPr>
-                <w:sz w:val="17"/>
+                <w:rFonts w:ascii="Arial" w:hAnsi="Arial" w:eastAsia="Arial" w:cs="Arial"/>
+                <w:color w:val="000000"/>
+                <w:sz w:val="24"/>
               </w:rPr>
               <w:t>Right</w:t>
             </w:r>
@@ -857,7 +1108,9 @@
             </w:pPr>
             <w:r>
               <w:rPr>
-                <w:sz w:val="17"/>
+                <w:rFonts w:ascii="Arial" w:hAnsi="Arial" w:eastAsia="Arial" w:cs="Arial"/>
+                <w:color w:val="000000"/>
+                <w:sz w:val="24"/>
               </w:rPr>
               <w:t>3032</w:t>
             </w:r>
@@ -880,7 +1133,9 @@
             </w:pPr>
             <w:r>
               <w:rPr>
-                <w:sz w:val="17"/>
+                <w:rFonts w:ascii="Arial" w:hAnsi="Arial" w:eastAsia="Arial" w:cs="Arial"/>
+                <w:color w:val="000000"/>
+                <w:sz w:val="24"/>
               </w:rPr>
               <w:t>3941</w:t>
             </w:r>
@@ -903,7 +1158,9 @@
             </w:pPr>
             <w:r>
               <w:rPr>
-                <w:sz w:val="17"/>
+                <w:rFonts w:ascii="Arial" w:hAnsi="Arial" w:eastAsia="Arial" w:cs="Arial"/>
+                <w:color w:val="000000"/>
+                <w:sz w:val="24"/>
               </w:rPr>
               <w:t>607</w:t>
             </w:r>
@@ -931,7 +1188,9 @@
             </w:pPr>
             <w:r>
               <w:rPr>
-                <w:sz w:val="17"/>
+                <w:rFonts w:ascii="Arial" w:hAnsi="Arial" w:eastAsia="Arial" w:cs="Arial"/>
+                <w:color w:val="000000"/>
+                <w:sz w:val="24"/>
               </w:rPr>
               <w:t>Total</w:t>
             </w:r>
@@ -954,7 +1213,9 @@
             </w:pPr>
             <w:r>
               <w:rPr>
-                <w:sz w:val="17"/>
+                <w:rFonts w:ascii="Arial" w:hAnsi="Arial" w:eastAsia="Arial" w:cs="Arial"/>
+                <w:color w:val="000000"/>
+                <w:sz w:val="24"/>
               </w:rPr>
             </w:r>
           </w:p>
@@ -976,7 +1237,9 @@
             </w:pPr>
             <w:r>
               <w:rPr>
-                <w:sz w:val="17"/>
+                <w:rFonts w:ascii="Arial" w:hAnsi="Arial" w:eastAsia="Arial" w:cs="Arial"/>
+                <w:color w:val="000000"/>
+                <w:sz w:val="24"/>
               </w:rPr>
               <w:t>6129</w:t>
             </w:r>
@@ -999,7 +1262,9 @@
             </w:pPr>
             <w:r>
               <w:rPr>
-                <w:sz w:val="17"/>
+                <w:rFonts w:ascii="Arial" w:hAnsi="Arial" w:eastAsia="Arial" w:cs="Arial"/>
+                <w:color w:val="000000"/>
+                <w:sz w:val="24"/>
               </w:rPr>
               <w:t>11730</w:t>
             </w:r>
@@ -1022,7 +1287,9 @@
             </w:pPr>
             <w:r>
               <w:rPr>
-                <w:sz w:val="17"/>
+                <w:rFonts w:ascii="Arial" w:hAnsi="Arial" w:eastAsia="Arial" w:cs="Arial"/>
+                <w:color w:val="000000"/>
+                <w:sz w:val="24"/>
               </w:rPr>
               <w:t>1226</w:t>
             </w:r>
@@ -1041,10 +1308,15 @@
         <w:jc w:val="center"/>
       </w:pPr>
       <w:r>
+        <w:rPr>
+          <w:rFonts w:ascii="Arial" w:hAnsi="Arial" w:eastAsia="Arial" w:cs="Arial"/>
+          <w:color w:val="000000"/>
+          <w:sz w:val="24"/>
+        </w:rPr>
         <w:drawing>
           <wp:inline xmlns:a="http://schemas.openxmlformats.org/drawingml/2006/main" xmlns:pic="http://schemas.openxmlformats.org/drawingml/2006/picture">
             <wp:extent cx="5852160" cy="4389120"/>
-            <wp:docPr id="1" name="Picture 1"/>
+            <wp:docPr id="2" name="Picture 2"/>
             <wp:cNvGraphicFramePr>
               <a:graphicFrameLocks noChangeAspect="1"/>
             </wp:cNvGraphicFramePr>
@@ -1056,7 +1328,7 @@
                     <pic:cNvPicPr/>
                   </pic:nvPicPr>
                   <pic:blipFill>
-                    <a:blip r:embed="rId9"/>
+                    <a:blip r:embed="rId10"/>
                     <a:stretch>
                       <a:fillRect/>
                     </a:stretch>
@@ -1082,9 +1354,10 @@
       </w:pPr>
       <w:r>
         <w:rPr>
+          <w:rFonts w:ascii="Arial" w:hAnsi="Arial" w:eastAsia="Arial" w:cs="Arial"/>
           <w:i/>
-          <w:color w:val="595959"/>
-          <w:sz w:val="17"/>
+          <w:color w:val="000000"/>
+          <w:sz w:val="24"/>
         </w:rPr>
         <w:t>Figura 1. Distribución real de comandos antes y después del aumento.</w:t>
       </w:r>
@@ -1094,11 +1367,21 @@
         <w:pStyle w:val="Heading2"/>
       </w:pPr>
       <w:r>
+        <w:rPr>
+          <w:rFonts w:ascii="Arial" w:hAnsi="Arial" w:eastAsia="Arial" w:cs="Arial"/>
+          <w:color w:val="000000"/>
+          <w:sz w:val="24"/>
+        </w:rPr>
         <w:t>2.1 División sin fuga y aumento</w:t>
       </w:r>
     </w:p>
     <w:p>
       <w:r>
+        <w:rPr>
+          <w:rFonts w:ascii="Arial" w:hAnsi="Arial" w:eastAsia="Arial" w:cs="Arial"/>
+          <w:color w:val="000000"/>
+          <w:sz w:val="24"/>
+        </w:rPr>
         <w:t>La división estratificada 80/20 se realiza sobre `source_id` antes de cualquier transformación. Sólo después se generan reflejos horizontales —intercambiando LEFT y RIGHT— y variaciones de brillo para reforzar STRAIGHT. La intersección de fuentes entre entrenamiento y validación es cero.</w:t>
       </w:r>
     </w:p>
@@ -1111,23 +1394,34 @@
         <w:tblLook w:firstColumn="1" w:firstRow="1" w:lastColumn="0" w:lastRow="0" w:noHBand="0" w:noVBand="1" w:val="04A0"/>
       </w:tblPr>
       <w:tblGrid>
-        <w:gridCol w:w="3264"/>
-        <w:gridCol w:w="3264"/>
-        <w:gridCol w:w="3264"/>
+        <w:gridCol w:w="3120"/>
+        <w:gridCol w:w="3120"/>
+        <w:gridCol w:w="3120"/>
       </w:tblGrid>
       <w:tr>
+        <w:trPr>
+          <w:tblHeader w:val="true"/>
+          <w:cantSplit/>
+        </w:trPr>
         <w:tc>
           <w:tcPr>
             <w:tcW w:type="dxa" w:w="4608"/>
-            <w:shd w:fill="1F4E79"/>
+            <w:shd w:fill="E7E6E6"/>
             <w:vAlign w:val="center"/>
+            <w:tcMar>
+              <w:top w:w="80" w:type="dxa"/>
+              <w:start w:w="110" w:type="dxa"/>
+              <w:bottom w:w="80" w:type="dxa"/>
+              <w:end w:w="110" w:type="dxa"/>
+            </w:tcMar>
           </w:tcPr>
           <w:p>
             <w:r>
               <w:rPr>
+                <w:rFonts w:ascii="Arial" w:hAnsi="Arial" w:eastAsia="Arial" w:cs="Arial"/>
                 <w:b/>
-                <w:color w:val="FFFFFF"/>
-                <w:sz w:val="18"/>
+                <w:color w:val="000000"/>
+                <w:sz w:val="24"/>
               </w:rPr>
               <w:t>Comprobación</w:t>
             </w:r>
@@ -1136,15 +1430,22 @@
         <w:tc>
           <w:tcPr>
             <w:tcW w:type="dxa" w:w="2016"/>
-            <w:shd w:fill="1F4E79"/>
+            <w:shd w:fill="E7E6E6"/>
             <w:vAlign w:val="center"/>
+            <w:tcMar>
+              <w:top w:w="80" w:type="dxa"/>
+              <w:start w:w="110" w:type="dxa"/>
+              <w:bottom w:w="80" w:type="dxa"/>
+              <w:end w:w="110" w:type="dxa"/>
+            </w:tcMar>
           </w:tcPr>
           <w:p>
             <w:r>
               <w:rPr>
+                <w:rFonts w:ascii="Arial" w:hAnsi="Arial" w:eastAsia="Arial" w:cs="Arial"/>
                 <w:b/>
-                <w:color w:val="FFFFFF"/>
-                <w:sz w:val="18"/>
+                <w:color w:val="000000"/>
+                <w:sz w:val="24"/>
               </w:rPr>
               <w:t>Resultado</w:t>
             </w:r>
@@ -1153,15 +1454,22 @@
         <w:tc>
           <w:tcPr>
             <w:tcW w:type="dxa" w:w="2016"/>
-            <w:shd w:fill="1F4E79"/>
+            <w:shd w:fill="E7E6E6"/>
             <w:vAlign w:val="center"/>
+            <w:tcMar>
+              <w:top w:w="80" w:type="dxa"/>
+              <w:start w:w="110" w:type="dxa"/>
+              <w:bottom w:w="80" w:type="dxa"/>
+              <w:end w:w="110" w:type="dxa"/>
+            </w:tcMar>
           </w:tcPr>
           <w:p>
             <w:r>
               <w:rPr>
+                <w:rFonts w:ascii="Arial" w:hAnsi="Arial" w:eastAsia="Arial" w:cs="Arial"/>
                 <w:b/>
-                <w:color w:val="FFFFFF"/>
-                <w:sz w:val="18"/>
+                <w:color w:val="000000"/>
+                <w:sz w:val="24"/>
               </w:rPr>
               <w:t>Estado</w:t>
             </w:r>
@@ -1189,7 +1497,9 @@
             </w:pPr>
             <w:r>
               <w:rPr>
-                <w:sz w:val="17"/>
+                <w:rFonts w:ascii="Arial" w:hAnsi="Arial" w:eastAsia="Arial" w:cs="Arial"/>
+                <w:color w:val="000000"/>
+                <w:sz w:val="24"/>
               </w:rPr>
               <w:t>Imágenes originales faltantes</w:t>
             </w:r>
@@ -1212,7 +1522,9 @@
             </w:pPr>
             <w:r>
               <w:rPr>
-                <w:sz w:val="17"/>
+                <w:rFonts w:ascii="Arial" w:hAnsi="Arial" w:eastAsia="Arial" w:cs="Arial"/>
+                <w:color w:val="000000"/>
+                <w:sz w:val="24"/>
               </w:rPr>
               <w:t>0</w:t>
             </w:r>
@@ -1236,7 +1548,9 @@
             </w:pPr>
             <w:r>
               <w:rPr>
-                <w:sz w:val="17"/>
+                <w:rFonts w:ascii="Arial" w:hAnsi="Arial" w:eastAsia="Arial" w:cs="Arial"/>
+                <w:color w:val="000000"/>
+                <w:sz w:val="24"/>
               </w:rPr>
               <w:t>Cumple</w:t>
             </w:r>
@@ -1264,7 +1578,9 @@
             </w:pPr>
             <w:r>
               <w:rPr>
-                <w:sz w:val="17"/>
+                <w:rFonts w:ascii="Arial" w:hAnsi="Arial" w:eastAsia="Arial" w:cs="Arial"/>
+                <w:color w:val="000000"/>
+                <w:sz w:val="24"/>
               </w:rPr>
               <w:t>Imágenes originales no referenciadas</w:t>
             </w:r>
@@ -1287,7 +1603,9 @@
             </w:pPr>
             <w:r>
               <w:rPr>
-                <w:sz w:val="17"/>
+                <w:rFonts w:ascii="Arial" w:hAnsi="Arial" w:eastAsia="Arial" w:cs="Arial"/>
+                <w:color w:val="000000"/>
+                <w:sz w:val="24"/>
               </w:rPr>
               <w:t>0</w:t>
             </w:r>
@@ -1311,7 +1629,9 @@
             </w:pPr>
             <w:r>
               <w:rPr>
-                <w:sz w:val="17"/>
+                <w:rFonts w:ascii="Arial" w:hAnsi="Arial" w:eastAsia="Arial" w:cs="Arial"/>
+                <w:color w:val="000000"/>
+                <w:sz w:val="24"/>
               </w:rPr>
               <w:t>Cumple</w:t>
             </w:r>
@@ -1339,7 +1659,9 @@
             </w:pPr>
             <w:r>
               <w:rPr>
-                <w:sz w:val="17"/>
+                <w:rFonts w:ascii="Arial" w:hAnsi="Arial" w:eastAsia="Arial" w:cs="Arial"/>
+                <w:color w:val="000000"/>
+                <w:sz w:val="24"/>
               </w:rPr>
               <w:t>Comandos válidos</w:t>
             </w:r>
@@ -1362,7 +1684,9 @@
             </w:pPr>
             <w:r>
               <w:rPr>
-                <w:sz w:val="17"/>
+                <w:rFonts w:ascii="Arial" w:hAnsi="Arial" w:eastAsia="Arial" w:cs="Arial"/>
+                <w:color w:val="000000"/>
+                <w:sz w:val="24"/>
               </w:rPr>
               <w:t>0, 1, 2</w:t>
             </w:r>
@@ -1386,7 +1710,9 @@
             </w:pPr>
             <w:r>
               <w:rPr>
-                <w:sz w:val="17"/>
+                <w:rFonts w:ascii="Arial" w:hAnsi="Arial" w:eastAsia="Arial" w:cs="Arial"/>
+                <w:color w:val="000000"/>
+                <w:sz w:val="24"/>
               </w:rPr>
               <w:t>Cumple</w:t>
             </w:r>
@@ -1414,7 +1740,9 @@
             </w:pPr>
             <w:r>
               <w:rPr>
-                <w:sz w:val="17"/>
+                <w:rFonts w:ascii="Arial" w:hAnsi="Arial" w:eastAsia="Arial" w:cs="Arial"/>
+                <w:color w:val="000000"/>
+                <w:sz w:val="24"/>
               </w:rPr>
               <w:t>Muestras después de aumento</w:t>
             </w:r>
@@ -1437,7 +1765,9 @@
             </w:pPr>
             <w:r>
               <w:rPr>
-                <w:sz w:val="17"/>
+                <w:rFonts w:ascii="Arial" w:hAnsi="Arial" w:eastAsia="Arial" w:cs="Arial"/>
+                <w:color w:val="000000"/>
+                <w:sz w:val="24"/>
               </w:rPr>
               <w:t>12956</w:t>
             </w:r>
@@ -1461,7 +1791,9 @@
             </w:pPr>
             <w:r>
               <w:rPr>
-                <w:sz w:val="17"/>
+                <w:rFonts w:ascii="Arial" w:hAnsi="Arial" w:eastAsia="Arial" w:cs="Arial"/>
+                <w:color w:val="000000"/>
+                <w:sz w:val="24"/>
               </w:rPr>
               <w:t>Cumple &gt; 10,000</w:t>
             </w:r>
@@ -1489,7 +1821,9 @@
             </w:pPr>
             <w:r>
               <w:rPr>
-                <w:sz w:val="17"/>
+                <w:rFonts w:ascii="Arial" w:hAnsi="Arial" w:eastAsia="Arial" w:cs="Arial"/>
+                <w:color w:val="000000"/>
+                <w:sz w:val="24"/>
               </w:rPr>
               <w:t>Fuentes compartidas train/val</w:t>
             </w:r>
@@ -1512,7 +1846,9 @@
             </w:pPr>
             <w:r>
               <w:rPr>
-                <w:sz w:val="17"/>
+                <w:rFonts w:ascii="Arial" w:hAnsi="Arial" w:eastAsia="Arial" w:cs="Arial"/>
+                <w:color w:val="000000"/>
+                <w:sz w:val="24"/>
               </w:rPr>
               <w:t>0</w:t>
             </w:r>
@@ -1536,7 +1872,9 @@
             </w:pPr>
             <w:r>
               <w:rPr>
-                <w:sz w:val="17"/>
+                <w:rFonts w:ascii="Arial" w:hAnsi="Arial" w:eastAsia="Arial" w:cs="Arial"/>
+                <w:color w:val="000000"/>
+                <w:sz w:val="24"/>
               </w:rPr>
               <w:t>Cumple</w:t>
             </w:r>
@@ -1554,11 +1892,21 @@
         <w:pStyle w:val="Heading1"/>
       </w:pPr>
       <w:r>
+        <w:rPr>
+          <w:rFonts w:ascii="Arial" w:hAnsi="Arial" w:eastAsia="Arial" w:cs="Arial"/>
+          <w:color w:val="000000"/>
+          <w:sz w:val="24"/>
+        </w:rPr>
         <w:t>3. Arquitectura y entrenamiento</w:t>
       </w:r>
     </w:p>
     <w:p>
       <w:r>
+        <w:rPr>
+          <w:rFonts w:ascii="Arial" w:hAnsi="Arial" w:eastAsia="Arial" w:cs="Arial"/>
+          <w:color w:val="000000"/>
+          <w:sz w:val="24"/>
+        </w:rPr>
         <w:t>La red recibe una imagen RGB preprocesada de 80×160×3 y un vector one-hot de tres posiciones. Cinco capas convolucionales extraen características; la rama visual se aplana y concatena con el comando. Capas densas producen un único ángulo de dirección en radianes. Se emplearon semilla reproducible, Adam, pérdida MSE, MAE, EarlyStopping, ReduceLROnPlateau y checkpoint del mejor HDF5.</w:t>
       </w:r>
     </w:p>
@@ -1568,10 +1916,15 @@
         <w:jc w:val="center"/>
       </w:pPr>
       <w:r>
+        <w:rPr>
+          <w:rFonts w:ascii="Arial" w:hAnsi="Arial" w:eastAsia="Arial" w:cs="Arial"/>
+          <w:color w:val="000000"/>
+          <w:sz w:val="24"/>
+        </w:rPr>
         <w:drawing>
           <wp:inline xmlns:a="http://schemas.openxmlformats.org/drawingml/2006/main" xmlns:pic="http://schemas.openxmlformats.org/drawingml/2006/picture">
-            <wp:extent cx="5943600" cy="4144696"/>
-            <wp:docPr id="2" name="Picture 2"/>
+            <wp:extent cx="4572000" cy="3188228"/>
+            <wp:docPr id="3" name="Picture 3"/>
             <wp:cNvGraphicFramePr>
               <a:graphicFrameLocks noChangeAspect="1"/>
             </wp:cNvGraphicFramePr>
@@ -1583,7 +1936,7 @@
                     <pic:cNvPicPr/>
                   </pic:nvPicPr>
                   <pic:blipFill>
-                    <a:blip r:embed="rId10"/>
+                    <a:blip r:embed="rId11"/>
                     <a:stretch>
                       <a:fillRect/>
                     </a:stretch>
@@ -1591,7 +1944,7 @@
                   <pic:spPr>
                     <a:xfrm>
                       <a:off x="0" y="0"/>
-                      <a:ext cx="5943600" cy="4144696"/>
+                      <a:ext cx="4572000" cy="3188228"/>
                     </a:xfrm>
                     <a:prstGeom prst="rect"/>
                   </pic:spPr>
@@ -1609,9 +1962,10 @@
       </w:pPr>
       <w:r>
         <w:rPr>
+          <w:rFonts w:ascii="Arial" w:hAnsi="Arial" w:eastAsia="Arial" w:cs="Arial"/>
           <w:i/>
-          <w:color w:val="595959"/>
-          <w:sz w:val="17"/>
+          <w:color w:val="000000"/>
+          <w:sz w:val="24"/>
         </w:rPr>
         <w:t>Figura 2. Arquitectura obtenida directamente del modelo HDF5 entrenado.</w:t>
       </w:r>
@@ -1625,22 +1979,33 @@
         <w:tblLook w:firstColumn="1" w:firstRow="1" w:lastColumn="0" w:lastRow="0" w:noHBand="0" w:noVBand="1" w:val="04A0"/>
       </w:tblPr>
       <w:tblGrid>
-        <w:gridCol w:w="4896"/>
-        <w:gridCol w:w="4896"/>
+        <w:gridCol w:w="4680"/>
+        <w:gridCol w:w="4680"/>
       </w:tblGrid>
       <w:tr>
+        <w:trPr>
+          <w:tblHeader w:val="true"/>
+          <w:cantSplit/>
+        </w:trPr>
         <w:tc>
           <w:tcPr>
             <w:tcW w:type="dxa" w:w="3312"/>
-            <w:shd w:fill="1F4E79"/>
+            <w:shd w:fill="E7E6E6"/>
             <w:vAlign w:val="center"/>
+            <w:tcMar>
+              <w:top w:w="80" w:type="dxa"/>
+              <w:start w:w="110" w:type="dxa"/>
+              <w:bottom w:w="80" w:type="dxa"/>
+              <w:end w:w="110" w:type="dxa"/>
+            </w:tcMar>
           </w:tcPr>
           <w:p>
             <w:r>
               <w:rPr>
+                <w:rFonts w:ascii="Arial" w:hAnsi="Arial" w:eastAsia="Arial" w:cs="Arial"/>
                 <w:b/>
-                <w:color w:val="FFFFFF"/>
-                <w:sz w:val="18"/>
+                <w:color w:val="000000"/>
+                <w:sz w:val="24"/>
               </w:rPr>
               <w:t>Parámetro</w:t>
             </w:r>
@@ -1649,15 +2014,22 @@
         <w:tc>
           <w:tcPr>
             <w:tcW w:type="dxa" w:w="5760"/>
-            <w:shd w:fill="1F4E79"/>
+            <w:shd w:fill="E7E6E6"/>
             <w:vAlign w:val="center"/>
+            <w:tcMar>
+              <w:top w:w="80" w:type="dxa"/>
+              <w:start w:w="110" w:type="dxa"/>
+              <w:bottom w:w="80" w:type="dxa"/>
+              <w:end w:w="110" w:type="dxa"/>
+            </w:tcMar>
           </w:tcPr>
           <w:p>
             <w:r>
               <w:rPr>
+                <w:rFonts w:ascii="Arial" w:hAnsi="Arial" w:eastAsia="Arial" w:cs="Arial"/>
                 <w:b/>
-                <w:color w:val="FFFFFF"/>
-                <w:sz w:val="18"/>
+                <w:color w:val="000000"/>
+                <w:sz w:val="24"/>
               </w:rPr>
               <w:t>Valor</w:t>
             </w:r>
@@ -1685,7 +2057,9 @@
             </w:pPr>
             <w:r>
               <w:rPr>
-                <w:sz w:val="17"/>
+                <w:rFonts w:ascii="Arial" w:hAnsi="Arial" w:eastAsia="Arial" w:cs="Arial"/>
+                <w:color w:val="000000"/>
+                <w:sz w:val="24"/>
               </w:rPr>
               <w:t>Tamaño de entrada</w:t>
             </w:r>
@@ -1708,7 +2082,9 @@
             </w:pPr>
             <w:r>
               <w:rPr>
-                <w:sz w:val="17"/>
+                <w:rFonts w:ascii="Arial" w:hAnsi="Arial" w:eastAsia="Arial" w:cs="Arial"/>
+                <w:color w:val="000000"/>
+                <w:sz w:val="24"/>
               </w:rPr>
               <w:t>80 × 160 × 3</w:t>
             </w:r>
@@ -1736,7 +2112,9 @@
             </w:pPr>
             <w:r>
               <w:rPr>
-                <w:sz w:val="17"/>
+                <w:rFonts w:ascii="Arial" w:hAnsi="Arial" w:eastAsia="Arial" w:cs="Arial"/>
+                <w:color w:val="000000"/>
+                <w:sz w:val="24"/>
               </w:rPr>
               <w:t>Comando</w:t>
             </w:r>
@@ -1759,7 +2137,9 @@
             </w:pPr>
             <w:r>
               <w:rPr>
-                <w:sz w:val="17"/>
+                <w:rFonts w:ascii="Arial" w:hAnsi="Arial" w:eastAsia="Arial" w:cs="Arial"/>
+                <w:color w:val="000000"/>
+                <w:sz w:val="24"/>
               </w:rPr>
               <w:t>One-hot de 3 clases</w:t>
             </w:r>
@@ -1787,7 +2167,9 @@
             </w:pPr>
             <w:r>
               <w:rPr>
-                <w:sz w:val="17"/>
+                <w:rFonts w:ascii="Arial" w:hAnsi="Arial" w:eastAsia="Arial" w:cs="Arial"/>
+                <w:color w:val="000000"/>
+                <w:sz w:val="24"/>
               </w:rPr>
               <w:t>Optimizador</w:t>
             </w:r>
@@ -1810,7 +2192,9 @@
             </w:pPr>
             <w:r>
               <w:rPr>
-                <w:sz w:val="17"/>
+                <w:rFonts w:ascii="Arial" w:hAnsi="Arial" w:eastAsia="Arial" w:cs="Arial"/>
+                <w:color w:val="000000"/>
+                <w:sz w:val="24"/>
               </w:rPr>
               <w:t>Adam</w:t>
             </w:r>
@@ -1838,7 +2222,9 @@
             </w:pPr>
             <w:r>
               <w:rPr>
-                <w:sz w:val="17"/>
+                <w:rFonts w:ascii="Arial" w:hAnsi="Arial" w:eastAsia="Arial" w:cs="Arial"/>
+                <w:color w:val="000000"/>
+                <w:sz w:val="24"/>
               </w:rPr>
               <w:t>Pérdida</w:t>
             </w:r>
@@ -1861,7 +2247,9 @@
             </w:pPr>
             <w:r>
               <w:rPr>
-                <w:sz w:val="17"/>
+                <w:rFonts w:ascii="Arial" w:hAnsi="Arial" w:eastAsia="Arial" w:cs="Arial"/>
+                <w:color w:val="000000"/>
+                <w:sz w:val="24"/>
               </w:rPr>
               <w:t>MSE</w:t>
             </w:r>
@@ -1889,7 +2277,9 @@
             </w:pPr>
             <w:r>
               <w:rPr>
-                <w:sz w:val="17"/>
+                <w:rFonts w:ascii="Arial" w:hAnsi="Arial" w:eastAsia="Arial" w:cs="Arial"/>
+                <w:color w:val="000000"/>
+                <w:sz w:val="24"/>
               </w:rPr>
               <w:t>Callbacks</w:t>
             </w:r>
@@ -1912,7 +2302,9 @@
             </w:pPr>
             <w:r>
               <w:rPr>
-                <w:sz w:val="17"/>
+                <w:rFonts w:ascii="Arial" w:hAnsi="Arial" w:eastAsia="Arial" w:cs="Arial"/>
+                <w:color w:val="000000"/>
+                <w:sz w:val="24"/>
               </w:rPr>
               <w:t>EarlyStopping, ReduceLROnPlateau, ModelCheckpoint</w:t>
             </w:r>
@@ -1940,7 +2332,9 @@
             </w:pPr>
             <w:r>
               <w:rPr>
-                <w:sz w:val="17"/>
+                <w:rFonts w:ascii="Arial" w:hAnsi="Arial" w:eastAsia="Arial" w:cs="Arial"/>
+                <w:color w:val="000000"/>
+                <w:sz w:val="24"/>
               </w:rPr>
               <w:t>Formato de salida</w:t>
             </w:r>
@@ -1963,7 +2357,9 @@
             </w:pPr>
             <w:r>
               <w:rPr>
-                <w:sz w:val="17"/>
+                <w:rFonts w:ascii="Arial" w:hAnsi="Arial" w:eastAsia="Arial" w:cs="Arial"/>
+                <w:color w:val="000000"/>
+                <w:sz w:val="24"/>
               </w:rPr>
               <w:t>HDF5 + model_metadata.json</w:t>
             </w:r>
@@ -1982,10 +2378,15 @@
         <w:jc w:val="center"/>
       </w:pPr>
       <w:r>
+        <w:rPr>
+          <w:rFonts w:ascii="Arial" w:hAnsi="Arial" w:eastAsia="Arial" w:cs="Arial"/>
+          <w:color w:val="000000"/>
+          <w:sz w:val="24"/>
+        </w:rPr>
         <w:drawing>
           <wp:inline xmlns:a="http://schemas.openxmlformats.org/drawingml/2006/main" xmlns:pic="http://schemas.openxmlformats.org/drawingml/2006/picture">
             <wp:extent cx="5852160" cy="2340864"/>
-            <wp:docPr id="3" name="Picture 3"/>
+            <wp:docPr id="4" name="Picture 4"/>
             <wp:cNvGraphicFramePr>
               <a:graphicFrameLocks noChangeAspect="1"/>
             </wp:cNvGraphicFramePr>
@@ -1997,7 +2398,7 @@
                     <pic:cNvPicPr/>
                   </pic:nvPicPr>
                   <pic:blipFill>
-                    <a:blip r:embed="rId11"/>
+                    <a:blip r:embed="rId12"/>
                     <a:stretch>
                       <a:fillRect/>
                     </a:stretch>
@@ -2023,9 +2424,10 @@
       </w:pPr>
       <w:r>
         <w:rPr>
+          <w:rFonts w:ascii="Arial" w:hAnsi="Arial" w:eastAsia="Arial" w:cs="Arial"/>
           <w:i/>
-          <w:color w:val="595959"/>
-          <w:sz w:val="17"/>
+          <w:color w:val="000000"/>
+          <w:sz w:val="24"/>
         </w:rPr>
         <w:t>Figura 3. Curvas reales de pérdida y MAE durante el entrenamiento.</w:t>
       </w:r>
@@ -2035,6 +2437,11 @@
         <w:pStyle w:val="Heading2"/>
       </w:pPr>
       <w:r>
+        <w:rPr>
+          <w:rFonts w:ascii="Arial" w:hAnsi="Arial" w:eastAsia="Arial" w:cs="Arial"/>
+          <w:color w:val="000000"/>
+          <w:sz w:val="24"/>
+        </w:rPr>
         <w:t>3.1 Resultados cuantitativos</w:t>
       </w:r>
     </w:p>
@@ -2047,23 +2454,34 @@
         <w:tblLook w:firstColumn="1" w:firstRow="1" w:lastColumn="0" w:lastRow="0" w:noHBand="0" w:noVBand="1" w:val="04A0"/>
       </w:tblPr>
       <w:tblGrid>
-        <w:gridCol w:w="3264"/>
-        <w:gridCol w:w="3264"/>
-        <w:gridCol w:w="3264"/>
+        <w:gridCol w:w="3120"/>
+        <w:gridCol w:w="3120"/>
+        <w:gridCol w:w="3120"/>
       </w:tblGrid>
       <w:tr>
+        <w:trPr>
+          <w:tblHeader w:val="true"/>
+          <w:cantSplit/>
+        </w:trPr>
         <w:tc>
           <w:tcPr>
             <w:tcW w:type="dxa" w:w="4032"/>
-            <w:shd w:fill="1F4E79"/>
+            <w:shd w:fill="E7E6E6"/>
             <w:vAlign w:val="center"/>
+            <w:tcMar>
+              <w:top w:w="80" w:type="dxa"/>
+              <w:start w:w="110" w:type="dxa"/>
+              <w:bottom w:w="80" w:type="dxa"/>
+              <w:end w:w="110" w:type="dxa"/>
+            </w:tcMar>
           </w:tcPr>
           <w:p>
             <w:r>
               <w:rPr>
+                <w:rFonts w:ascii="Arial" w:hAnsi="Arial" w:eastAsia="Arial" w:cs="Arial"/>
                 <w:b/>
-                <w:color w:val="FFFFFF"/>
-                <w:sz w:val="18"/>
+                <w:color w:val="000000"/>
+                <w:sz w:val="24"/>
               </w:rPr>
               <w:t>Métrica</w:t>
             </w:r>
@@ -2072,15 +2490,22 @@
         <w:tc>
           <w:tcPr>
             <w:tcW w:type="dxa" w:w="2160"/>
-            <w:shd w:fill="1F4E79"/>
+            <w:shd w:fill="E7E6E6"/>
             <w:vAlign w:val="center"/>
+            <w:tcMar>
+              <w:top w:w="80" w:type="dxa"/>
+              <w:start w:w="110" w:type="dxa"/>
+              <w:bottom w:w="80" w:type="dxa"/>
+              <w:end w:w="110" w:type="dxa"/>
+            </w:tcMar>
           </w:tcPr>
           <w:p>
             <w:r>
               <w:rPr>
+                <w:rFonts w:ascii="Arial" w:hAnsi="Arial" w:eastAsia="Arial" w:cs="Arial"/>
                 <w:b/>
-                <w:color w:val="FFFFFF"/>
-                <w:sz w:val="18"/>
+                <w:color w:val="000000"/>
+                <w:sz w:val="24"/>
               </w:rPr>
               <w:t>Resultado (rad)</w:t>
             </w:r>
@@ -2089,15 +2514,22 @@
         <w:tc>
           <w:tcPr>
             <w:tcW w:type="dxa" w:w="2880"/>
-            <w:shd w:fill="1F4E79"/>
+            <w:shd w:fill="E7E6E6"/>
             <w:vAlign w:val="center"/>
+            <w:tcMar>
+              <w:top w:w="80" w:type="dxa"/>
+              <w:start w:w="110" w:type="dxa"/>
+              <w:bottom w:w="80" w:type="dxa"/>
+              <w:end w:w="110" w:type="dxa"/>
+            </w:tcMar>
           </w:tcPr>
           <w:p>
             <w:r>
               <w:rPr>
+                <w:rFonts w:ascii="Arial" w:hAnsi="Arial" w:eastAsia="Arial" w:cs="Arial"/>
                 <w:b/>
-                <w:color w:val="FFFFFF"/>
-                <w:sz w:val="18"/>
+                <w:color w:val="000000"/>
+                <w:sz w:val="24"/>
               </w:rPr>
               <w:t>Criterio</w:t>
             </w:r>
@@ -2125,7 +2557,9 @@
             </w:pPr>
             <w:r>
               <w:rPr>
-                <w:sz w:val="17"/>
+                <w:rFonts w:ascii="Arial" w:hAnsi="Arial" w:eastAsia="Arial" w:cs="Arial"/>
+                <w:color w:val="000000"/>
+                <w:sz w:val="24"/>
               </w:rPr>
               <w:t>MAE global de validación</w:t>
             </w:r>
@@ -2148,7 +2582,9 @@
             </w:pPr>
             <w:r>
               <w:rPr>
-                <w:sz w:val="17"/>
+                <w:rFonts w:ascii="Arial" w:hAnsi="Arial" w:eastAsia="Arial" w:cs="Arial"/>
+                <w:color w:val="000000"/>
+                <w:sz w:val="24"/>
               </w:rPr>
               <w:t>0.0220</w:t>
             </w:r>
@@ -2171,7 +2607,9 @@
             </w:pPr>
             <w:r>
               <w:rPr>
-                <w:sz w:val="17"/>
+                <w:rFonts w:ascii="Arial" w:hAnsi="Arial" w:eastAsia="Arial" w:cs="Arial"/>
+                <w:color w:val="000000"/>
+                <w:sz w:val="24"/>
               </w:rPr>
               <w:t>≤ 0.05 — cumple</w:t>
             </w:r>
@@ -2199,7 +2637,9 @@
             </w:pPr>
             <w:r>
               <w:rPr>
-                <w:sz w:val="17"/>
+                <w:rFonts w:ascii="Arial" w:hAnsi="Arial" w:eastAsia="Arial" w:cs="Arial"/>
+                <w:color w:val="000000"/>
+                <w:sz w:val="24"/>
               </w:rPr>
               <w:t>MAE Straight</w:t>
             </w:r>
@@ -2222,7 +2662,9 @@
             </w:pPr>
             <w:r>
               <w:rPr>
-                <w:sz w:val="17"/>
+                <w:rFonts w:ascii="Arial" w:hAnsi="Arial" w:eastAsia="Arial" w:cs="Arial"/>
+                <w:color w:val="000000"/>
+                <w:sz w:val="24"/>
               </w:rPr>
               <w:t>0.0152</w:t>
             </w:r>
@@ -2245,7 +2687,9 @@
             </w:pPr>
             <w:r>
               <w:rPr>
-                <w:sz w:val="17"/>
+                <w:rFonts w:ascii="Arial" w:hAnsi="Arial" w:eastAsia="Arial" w:cs="Arial"/>
+                <w:color w:val="000000"/>
+                <w:sz w:val="24"/>
               </w:rPr>
               <w:t>Reportado</w:t>
             </w:r>
@@ -2273,7 +2717,9 @@
             </w:pPr>
             <w:r>
               <w:rPr>
-                <w:sz w:val="17"/>
+                <w:rFonts w:ascii="Arial" w:hAnsi="Arial" w:eastAsia="Arial" w:cs="Arial"/>
+                <w:color w:val="000000"/>
+                <w:sz w:val="24"/>
               </w:rPr>
               <w:t>MAE Left</w:t>
             </w:r>
@@ -2296,7 +2742,9 @@
             </w:pPr>
             <w:r>
               <w:rPr>
-                <w:sz w:val="17"/>
+                <w:rFonts w:ascii="Arial" w:hAnsi="Arial" w:eastAsia="Arial" w:cs="Arial"/>
+                <w:color w:val="000000"/>
+                <w:sz w:val="24"/>
               </w:rPr>
               <w:t>0.0241</w:t>
             </w:r>
@@ -2319,7 +2767,9 @@
             </w:pPr>
             <w:r>
               <w:rPr>
-                <w:sz w:val="17"/>
+                <w:rFonts w:ascii="Arial" w:hAnsi="Arial" w:eastAsia="Arial" w:cs="Arial"/>
+                <w:color w:val="000000"/>
+                <w:sz w:val="24"/>
               </w:rPr>
               <w:t>Reportado</w:t>
             </w:r>
@@ -2347,7 +2797,9 @@
             </w:pPr>
             <w:r>
               <w:rPr>
-                <w:sz w:val="17"/>
+                <w:rFonts w:ascii="Arial" w:hAnsi="Arial" w:eastAsia="Arial" w:cs="Arial"/>
+                <w:color w:val="000000"/>
+                <w:sz w:val="24"/>
               </w:rPr>
               <w:t>MAE Right</w:t>
             </w:r>
@@ -2370,7 +2822,9 @@
             </w:pPr>
             <w:r>
               <w:rPr>
-                <w:sz w:val="17"/>
+                <w:rFonts w:ascii="Arial" w:hAnsi="Arial" w:eastAsia="Arial" w:cs="Arial"/>
+                <w:color w:val="000000"/>
+                <w:sz w:val="24"/>
               </w:rPr>
               <w:t>0.0234</w:t>
             </w:r>
@@ -2393,7 +2847,9 @@
             </w:pPr>
             <w:r>
               <w:rPr>
-                <w:sz w:val="17"/>
+                <w:rFonts w:ascii="Arial" w:hAnsi="Arial" w:eastAsia="Arial" w:cs="Arial"/>
+                <w:color w:val="000000"/>
+                <w:sz w:val="24"/>
               </w:rPr>
               <w:t>Reportado</w:t>
             </w:r>
@@ -2421,7 +2877,9 @@
             </w:pPr>
             <w:r>
               <w:rPr>
-                <w:sz w:val="17"/>
+                <w:rFonts w:ascii="Arial" w:hAnsi="Arial" w:eastAsia="Arial" w:cs="Arial"/>
+                <w:color w:val="000000"/>
+                <w:sz w:val="24"/>
               </w:rPr>
               <w:t>MSE global</w:t>
             </w:r>
@@ -2444,7 +2902,9 @@
             </w:pPr>
             <w:r>
               <w:rPr>
-                <w:sz w:val="17"/>
+                <w:rFonts w:ascii="Arial" w:hAnsi="Arial" w:eastAsia="Arial" w:cs="Arial"/>
+                <w:color w:val="000000"/>
+                <w:sz w:val="24"/>
               </w:rPr>
               <w:t>0.0012</w:t>
             </w:r>
@@ -2467,7 +2927,9 @@
             </w:pPr>
             <w:r>
               <w:rPr>
-                <w:sz w:val="17"/>
+                <w:rFonts w:ascii="Arial" w:hAnsi="Arial" w:eastAsia="Arial" w:cs="Arial"/>
+                <w:color w:val="000000"/>
+                <w:sz w:val="24"/>
               </w:rPr>
               <w:t>Reportado</w:t>
             </w:r>
@@ -2485,6 +2947,11 @@
         <w:pStyle w:val="Heading1"/>
       </w:pPr>
       <w:r>
+        <w:rPr>
+          <w:rFonts w:ascii="Arial" w:hAnsi="Arial" w:eastAsia="Arial" w:cs="Arial"/>
+          <w:color w:val="000000"/>
+          <w:sz w:val="24"/>
+        </w:rPr>
         <w:t>4. Controladores y portabilidad</w:t>
       </w:r>
     </w:p>
@@ -2493,11 +2960,21 @@
         <w:pStyle w:val="Heading2"/>
       </w:pPr>
       <w:r>
+        <w:rPr>
+          <w:rFonts w:ascii="Arial" w:hAnsi="Arial" w:eastAsia="Arial" w:cs="Arial"/>
+          <w:color w:val="000000"/>
+          <w:sz w:val="24"/>
+        </w:rPr>
         <w:t>4.1 Captura en World 1</w:t>
       </w:r>
     </w:p>
     <w:p>
       <w:r>
+        <w:rPr>
+          <w:rFonts w:ascii="Arial" w:hAnsi="Arial" w:eastAsia="Arial" w:cs="Arial"/>
+          <w:color w:val="000000"/>
+          <w:sz w:val="24"/>
+        </w:rPr>
         <w:t>El controlador de captura usa rutas relativas al proyecto, crea el encabezado `image,steering,command`, limita la velocidad a 30 km/h y registra cada 100 ms. Las teclas W, A y D asignan los tres comandos válidos.</w:t>
       </w:r>
     </w:p>
@@ -2506,11 +2983,21 @@
         <w:pStyle w:val="Heading2"/>
       </w:pPr>
       <w:r>
+        <w:rPr>
+          <w:rFonts w:ascii="Arial" w:hAnsi="Arial" w:eastAsia="Arial" w:cs="Arial"/>
+          <w:color w:val="000000"/>
+          <w:sz w:val="24"/>
+        </w:rPr>
         <w:t>4.2 Control autónomo en World 2</w:t>
       </w:r>
     </w:p>
     <w:p>
       <w:r>
+        <w:rPr>
+          <w:rFonts w:ascii="Arial" w:hAnsi="Arial" w:eastAsia="Arial" w:cs="Arial"/>
+          <w:color w:val="000000"/>
+          <w:sz w:val="24"/>
+        </w:rPr>
         <w:t>El controlador carga `cil_model.h5` y `model_metadata.json` desde su propio directorio, replica el preprocesamiento del notebook, limita ángulo y tasa de cambio, y ejecuta inferencia cada cuatro pasos. El lanzador regenera presets relativos, crea el entorno Python, localiza SUMO y conecta el controlador externo.</w:t>
       </w:r>
     </w:p>
@@ -2523,23 +3010,34 @@
         <w:tblLook w:firstColumn="1" w:firstRow="1" w:lastColumn="0" w:lastRow="0" w:noHBand="0" w:noVBand="1" w:val="04A0"/>
       </w:tblPr>
       <w:tblGrid>
-        <w:gridCol w:w="3264"/>
-        <w:gridCol w:w="3264"/>
-        <w:gridCol w:w="3264"/>
+        <w:gridCol w:w="3120"/>
+        <w:gridCol w:w="3120"/>
+        <w:gridCol w:w="3120"/>
       </w:tblGrid>
       <w:tr>
+        <w:trPr>
+          <w:tblHeader w:val="true"/>
+          <w:cantSplit/>
+        </w:trPr>
         <w:tc>
           <w:tcPr>
             <w:tcW w:type="dxa" w:w="1008"/>
-            <w:shd w:fill="1F4E79"/>
+            <w:shd w:fill="E7E6E6"/>
             <w:vAlign w:val="center"/>
+            <w:tcMar>
+              <w:top w:w="80" w:type="dxa"/>
+              <w:start w:w="110" w:type="dxa"/>
+              <w:bottom w:w="80" w:type="dxa"/>
+              <w:end w:w="110" w:type="dxa"/>
+            </w:tcMar>
           </w:tcPr>
           <w:p>
             <w:r>
               <w:rPr>
+                <w:rFonts w:ascii="Arial" w:hAnsi="Arial" w:eastAsia="Arial" w:cs="Arial"/>
                 <w:b/>
-                <w:color w:val="FFFFFF"/>
-                <w:sz w:val="18"/>
+                <w:color w:val="000000"/>
+                <w:sz w:val="24"/>
               </w:rPr>
               <w:t>Prioridad</w:t>
             </w:r>
@@ -2548,15 +3046,22 @@
         <w:tc>
           <w:tcPr>
             <w:tcW w:type="dxa" w:w="3744"/>
-            <w:shd w:fill="1F4E79"/>
+            <w:shd w:fill="E7E6E6"/>
             <w:vAlign w:val="center"/>
+            <w:tcMar>
+              <w:top w:w="80" w:type="dxa"/>
+              <w:start w:w="110" w:type="dxa"/>
+              <w:bottom w:w="80" w:type="dxa"/>
+              <w:end w:w="110" w:type="dxa"/>
+            </w:tcMar>
           </w:tcPr>
           <w:p>
             <w:r>
               <w:rPr>
+                <w:rFonts w:ascii="Arial" w:hAnsi="Arial" w:eastAsia="Arial" w:cs="Arial"/>
                 <w:b/>
-                <w:color w:val="FFFFFF"/>
-                <w:sz w:val="18"/>
+                <w:color w:val="000000"/>
+                <w:sz w:val="24"/>
               </w:rPr>
               <w:t>Condición</w:t>
             </w:r>
@@ -2565,15 +3070,22 @@
         <w:tc>
           <w:tcPr>
             <w:tcW w:type="dxa" w:w="4320"/>
-            <w:shd w:fill="1F4E79"/>
+            <w:shd w:fill="E7E6E6"/>
             <w:vAlign w:val="center"/>
+            <w:tcMar>
+              <w:top w:w="80" w:type="dxa"/>
+              <w:start w:w="110" w:type="dxa"/>
+              <w:bottom w:w="80" w:type="dxa"/>
+              <w:end w:w="110" w:type="dxa"/>
+            </w:tcMar>
           </w:tcPr>
           <w:p>
             <w:r>
               <w:rPr>
+                <w:rFonts w:ascii="Arial" w:hAnsi="Arial" w:eastAsia="Arial" w:cs="Arial"/>
                 <w:b/>
-                <w:color w:val="FFFFFF"/>
-                <w:sz w:val="18"/>
+                <w:color w:val="000000"/>
+                <w:sz w:val="24"/>
               </w:rPr>
               <w:t>Acción</w:t>
             </w:r>
@@ -2601,7 +3113,9 @@
             </w:pPr>
             <w:r>
               <w:rPr>
-                <w:sz w:val="17"/>
+                <w:rFonts w:ascii="Arial" w:hAnsi="Arial" w:eastAsia="Arial" w:cs="Arial"/>
+                <w:color w:val="000000"/>
+                <w:sz w:val="24"/>
               </w:rPr>
               <w:t>1</w:t>
             </w:r>
@@ -2624,7 +3138,9 @@
             </w:pPr>
             <w:r>
               <w:rPr>
-                <w:sz w:val="17"/>
+                <w:rFonts w:ascii="Arial" w:hAnsi="Arial" w:eastAsia="Arial" w:cs="Arial"/>
+                <w:color w:val="000000"/>
+                <w:sz w:val="24"/>
               </w:rPr>
               <w:t>Peatón ≤ 15 m por Recognition y LiDAR</w:t>
             </w:r>
@@ -2647,7 +3163,9 @@
             </w:pPr>
             <w:r>
               <w:rPr>
-                <w:sz w:val="17"/>
+                <w:rFonts w:ascii="Arial" w:hAnsi="Arial" w:eastAsia="Arial" w:cs="Arial"/>
+                <w:color w:val="000000"/>
+                <w:sz w:val="24"/>
               </w:rPr>
               <w:t>Freno total</w:t>
             </w:r>
@@ -2675,7 +3193,9 @@
             </w:pPr>
             <w:r>
               <w:rPr>
-                <w:sz w:val="17"/>
+                <w:rFonts w:ascii="Arial" w:hAnsi="Arial" w:eastAsia="Arial" w:cs="Arial"/>
+                <w:color w:val="000000"/>
+                <w:sz w:val="24"/>
               </w:rPr>
               <w:t>2</w:t>
             </w:r>
@@ -2698,7 +3218,9 @@
             </w:pPr>
             <w:r>
               <w:rPr>
-                <w:sz w:val="17"/>
+                <w:rFonts w:ascii="Arial" w:hAnsi="Arial" w:eastAsia="Arial" w:cs="Arial"/>
+                <w:color w:val="000000"/>
+                <w:sz w:val="24"/>
               </w:rPr>
               <w:t>Autobús estacionado ≤ 18 m</w:t>
             </w:r>
@@ -2721,7 +3243,9 @@
             </w:pPr>
             <w:r>
               <w:rPr>
-                <w:sz w:val="17"/>
+                <w:rFonts w:ascii="Arial" w:hAnsi="Arial" w:eastAsia="Arial" w:cs="Arial"/>
+                <w:color w:val="000000"/>
+                <w:sz w:val="24"/>
               </w:rPr>
               <w:t>Separación, pared derecha, orientación y reincorporación</w:t>
             </w:r>
@@ -2749,7 +3273,9 @@
             </w:pPr>
             <w:r>
               <w:rPr>
-                <w:sz w:val="17"/>
+                <w:rFonts w:ascii="Arial" w:hAnsi="Arial" w:eastAsia="Arial" w:cs="Arial"/>
+                <w:color w:val="000000"/>
+                <w:sz w:val="24"/>
               </w:rPr>
               <w:t>3</w:t>
             </w:r>
@@ -2772,7 +3298,9 @@
             </w:pPr>
             <w:r>
               <w:rPr>
-                <w:sz w:val="17"/>
+                <w:rFonts w:ascii="Arial" w:hAnsi="Arial" w:eastAsia="Arial" w:cs="Arial"/>
+                <w:color w:val="000000"/>
+                <w:sz w:val="24"/>
               </w:rPr>
               <w:t>Vehículo entre 25 y 12 m</w:t>
             </w:r>
@@ -2795,7 +3323,9 @@
             </w:pPr>
             <w:r>
               <w:rPr>
-                <w:sz w:val="17"/>
+                <w:rFonts w:ascii="Arial" w:hAnsi="Arial" w:eastAsia="Arial" w:cs="Arial"/>
+                <w:color w:val="000000"/>
+                <w:sz w:val="24"/>
               </w:rPr>
               <w:t>Regulación progresiva; alto ≤12 m; reanuda ≥15 m</w:t>
             </w:r>
@@ -2823,7 +3353,9 @@
             </w:pPr>
             <w:r>
               <w:rPr>
-                <w:sz w:val="17"/>
+                <w:rFonts w:ascii="Arial" w:hAnsi="Arial" w:eastAsia="Arial" w:cs="Arial"/>
+                <w:color w:val="000000"/>
+                <w:sz w:val="24"/>
               </w:rPr>
               <w:t>4</w:t>
             </w:r>
@@ -2846,7 +3378,9 @@
             </w:pPr>
             <w:r>
               <w:rPr>
-                <w:sz w:val="17"/>
+                <w:rFonts w:ascii="Arial" w:hAnsi="Arial" w:eastAsia="Arial" w:cs="Arial"/>
+                <w:color w:val="000000"/>
+                <w:sz w:val="24"/>
               </w:rPr>
               <w:t>Sin riesgo superior</w:t>
             </w:r>
@@ -2869,7 +3403,9 @@
             </w:pPr>
             <w:r>
               <w:rPr>
-                <w:sz w:val="17"/>
+                <w:rFonts w:ascii="Arial" w:hAnsi="Arial" w:eastAsia="Arial" w:cs="Arial"/>
+                <w:color w:val="000000"/>
+                <w:sz w:val="24"/>
               </w:rPr>
               <w:t>Dirección CIL; 22 km/h</w:t>
             </w:r>
@@ -2887,6 +3423,11 @@
         <w:pStyle w:val="Heading2"/>
       </w:pPr>
       <w:r>
+        <w:rPr>
+          <w:rFonts w:ascii="Arial" w:hAnsi="Arial" w:eastAsia="Arial" w:cs="Arial"/>
+          <w:color w:val="000000"/>
+          <w:sz w:val="24"/>
+        </w:rPr>
         <w:t>4.3 Máquina de estados de evasión</w:t>
       </w:r>
     </w:p>
@@ -2899,23 +3440,34 @@
         <w:tblLook w:firstColumn="1" w:firstRow="1" w:lastColumn="0" w:lastRow="0" w:noHBand="0" w:noVBand="1" w:val="04A0"/>
       </w:tblPr>
       <w:tblGrid>
-        <w:gridCol w:w="3264"/>
-        <w:gridCol w:w="3264"/>
-        <w:gridCol w:w="3264"/>
+        <w:gridCol w:w="3120"/>
+        <w:gridCol w:w="3120"/>
+        <w:gridCol w:w="3120"/>
       </w:tblGrid>
       <w:tr>
+        <w:trPr>
+          <w:tblHeader w:val="true"/>
+          <w:cantSplit/>
+        </w:trPr>
         <w:tc>
           <w:tcPr>
             <w:tcW w:type="dxa" w:w="2448"/>
-            <w:shd w:fill="1F4E79"/>
+            <w:shd w:fill="E7E6E6"/>
             <w:vAlign w:val="center"/>
+            <w:tcMar>
+              <w:top w:w="80" w:type="dxa"/>
+              <w:start w:w="110" w:type="dxa"/>
+              <w:bottom w:w="80" w:type="dxa"/>
+              <w:end w:w="110" w:type="dxa"/>
+            </w:tcMar>
           </w:tcPr>
           <w:p>
             <w:r>
               <w:rPr>
+                <w:rFonts w:ascii="Arial" w:hAnsi="Arial" w:eastAsia="Arial" w:cs="Arial"/>
                 <w:b/>
-                <w:color w:val="FFFFFF"/>
-                <w:sz w:val="18"/>
+                <w:color w:val="000000"/>
+                <w:sz w:val="24"/>
               </w:rPr>
               <w:t>Estado</w:t>
             </w:r>
@@ -2924,15 +3476,22 @@
         <w:tc>
           <w:tcPr>
             <w:tcW w:type="dxa" w:w="3168"/>
-            <w:shd w:fill="1F4E79"/>
+            <w:shd w:fill="E7E6E6"/>
             <w:vAlign w:val="center"/>
+            <w:tcMar>
+              <w:top w:w="80" w:type="dxa"/>
+              <w:start w:w="110" w:type="dxa"/>
+              <w:bottom w:w="80" w:type="dxa"/>
+              <w:end w:w="110" w:type="dxa"/>
+            </w:tcMar>
           </w:tcPr>
           <w:p>
             <w:r>
               <w:rPr>
+                <w:rFonts w:ascii="Arial" w:hAnsi="Arial" w:eastAsia="Arial" w:cs="Arial"/>
                 <w:b/>
-                <w:color w:val="FFFFFF"/>
-                <w:sz w:val="18"/>
+                <w:color w:val="000000"/>
+                <w:sz w:val="24"/>
               </w:rPr>
               <w:t>Propósito</w:t>
             </w:r>
@@ -2941,15 +3500,22 @@
         <w:tc>
           <w:tcPr>
             <w:tcW w:type="dxa" w:w="3456"/>
-            <w:shd w:fill="1F4E79"/>
+            <w:shd w:fill="E7E6E6"/>
             <w:vAlign w:val="center"/>
+            <w:tcMar>
+              <w:top w:w="80" w:type="dxa"/>
+              <w:start w:w="110" w:type="dxa"/>
+              <w:bottom w:w="80" w:type="dxa"/>
+              <w:end w:w="110" w:type="dxa"/>
+            </w:tcMar>
           </w:tcPr>
           <w:p>
             <w:r>
               <w:rPr>
+                <w:rFonts w:ascii="Arial" w:hAnsi="Arial" w:eastAsia="Arial" w:cs="Arial"/>
                 <w:b/>
-                <w:color w:val="FFFFFF"/>
-                <w:sz w:val="18"/>
+                <w:color w:val="000000"/>
+                <w:sz w:val="24"/>
               </w:rPr>
               <w:t>Criterio de transición</w:t>
             </w:r>
@@ -2977,7 +3543,9 @@
             </w:pPr>
             <w:r>
               <w:rPr>
-                <w:sz w:val="17"/>
+                <w:rFonts w:ascii="Arial" w:hAnsi="Arial" w:eastAsia="Arial" w:cs="Arial"/>
+                <w:color w:val="000000"/>
+                <w:sz w:val="24"/>
               </w:rPr>
               <w:t>CIL</w:t>
             </w:r>
@@ -3000,7 +3568,9 @@
             </w:pPr>
             <w:r>
               <w:rPr>
-                <w:sz w:val="17"/>
+                <w:rFonts w:ascii="Arial" w:hAnsi="Arial" w:eastAsia="Arial" w:cs="Arial"/>
+                <w:color w:val="000000"/>
+                <w:sz w:val="24"/>
               </w:rPr>
               <w:t>Conducción nominal</w:t>
             </w:r>
@@ -3023,7 +3593,9 @@
             </w:pPr>
             <w:r>
               <w:rPr>
-                <w:sz w:val="17"/>
+                <w:rFonts w:ascii="Arial" w:hAnsi="Arial" w:eastAsia="Arial" w:cs="Arial"/>
+                <w:color w:val="000000"/>
+                <w:sz w:val="24"/>
               </w:rPr>
               <w:t>Autobús reconocido a ≤18 m</w:t>
             </w:r>
@@ -3051,7 +3623,9 @@
             </w:pPr>
             <w:r>
               <w:rPr>
-                <w:sz w:val="17"/>
+                <w:rFonts w:ascii="Arial" w:hAnsi="Arial" w:eastAsia="Arial" w:cs="Arial"/>
+                <w:color w:val="000000"/>
+                <w:sz w:val="24"/>
               </w:rPr>
               <w:t>EVASION_SEPARACION</w:t>
             </w:r>
@@ -3074,7 +3648,9 @@
             </w:pPr>
             <w:r>
               <w:rPr>
-                <w:sz w:val="17"/>
+                <w:rFonts w:ascii="Arial" w:hAnsi="Arial" w:eastAsia="Arial" w:cs="Arial"/>
+                <w:color w:val="000000"/>
+                <w:sz w:val="24"/>
               </w:rPr>
               <w:t>Desplazamiento inicial a la izquierda</w:t>
             </w:r>
@@ -3097,7 +3673,9 @@
             </w:pPr>
             <w:r>
               <w:rPr>
-                <w:sz w:val="17"/>
+                <w:rFonts w:ascii="Arial" w:hAnsi="Arial" w:eastAsia="Arial" w:cs="Arial"/>
+                <w:color w:val="000000"/>
+                <w:sz w:val="24"/>
               </w:rPr>
               <w:t>Pared lateral o 3.5 s</w:t>
             </w:r>
@@ -3125,7 +3703,9 @@
             </w:pPr>
             <w:r>
               <w:rPr>
-                <w:sz w:val="17"/>
+                <w:rFonts w:ascii="Arial" w:hAnsi="Arial" w:eastAsia="Arial" w:cs="Arial"/>
+                <w:color w:val="000000"/>
+                <w:sz w:val="24"/>
               </w:rPr>
               <w:t>SEGUIMIENTO_PARED_DERECHA</w:t>
             </w:r>
@@ -3148,7 +3728,9 @@
             </w:pPr>
             <w:r>
               <w:rPr>
-                <w:sz w:val="17"/>
+                <w:rFonts w:ascii="Arial" w:hAnsi="Arial" w:eastAsia="Arial" w:cs="Arial"/>
+                <w:color w:val="000000"/>
+                <w:sz w:val="24"/>
               </w:rPr>
               <w:t>Mantener separación del autobús</w:t>
             </w:r>
@@ -3171,7 +3753,9 @@
             </w:pPr>
             <w:r>
               <w:rPr>
-                <w:sz w:val="17"/>
+                <w:rFonts w:ascii="Arial" w:hAnsi="Arial" w:eastAsia="Arial" w:cs="Arial"/>
+                <w:color w:val="000000"/>
+                <w:sz w:val="24"/>
               </w:rPr>
               <w:t>Pared ausente durante 12 pasos</w:t>
             </w:r>
@@ -3199,7 +3783,9 @@
             </w:pPr>
             <w:r>
               <w:rPr>
-                <w:sz w:val="17"/>
+                <w:rFonts w:ascii="Arial" w:hAnsi="Arial" w:eastAsia="Arial" w:cs="Arial"/>
+                <w:color w:val="000000"/>
+                <w:sz w:val="24"/>
               </w:rPr>
               <w:t>RECUPERA_ORIENTACION</w:t>
             </w:r>
@@ -3222,7 +3808,9 @@
             </w:pPr>
             <w:r>
               <w:rPr>
-                <w:sz w:val="17"/>
+                <w:rFonts w:ascii="Arial" w:hAnsi="Arial" w:eastAsia="Arial" w:cs="Arial"/>
+                <w:color w:val="000000"/>
+                <w:sz w:val="24"/>
               </w:rPr>
               <w:t>Compensar giro con giroscopio</w:t>
             </w:r>
@@ -3245,7 +3833,9 @@
             </w:pPr>
             <w:r>
               <w:rPr>
-                <w:sz w:val="17"/>
+                <w:rFonts w:ascii="Arial" w:hAnsi="Arial" w:eastAsia="Arial" w:cs="Arial"/>
+                <w:color w:val="000000"/>
+                <w:sz w:val="24"/>
               </w:rPr>
               <w:t>Error &lt;0.08 rad o 6 s</w:t>
             </w:r>
@@ -3273,7 +3863,9 @@
             </w:pPr>
             <w:r>
               <w:rPr>
-                <w:sz w:val="17"/>
+                <w:rFonts w:ascii="Arial" w:hAnsi="Arial" w:eastAsia="Arial" w:cs="Arial"/>
+                <w:color w:val="000000"/>
+                <w:sz w:val="24"/>
               </w:rPr>
               <w:t>REINCORPORACION</w:t>
             </w:r>
@@ -3296,7 +3888,9 @@
             </w:pPr>
             <w:r>
               <w:rPr>
-                <w:sz w:val="17"/>
+                <w:rFonts w:ascii="Arial" w:hAnsi="Arial" w:eastAsia="Arial" w:cs="Arial"/>
+                <w:color w:val="000000"/>
+                <w:sz w:val="24"/>
               </w:rPr>
               <w:t>Volver suavemente a CIL</w:t>
             </w:r>
@@ -3319,7 +3913,9 @@
             </w:pPr>
             <w:r>
               <w:rPr>
-                <w:sz w:val="17"/>
+                <w:rFonts w:ascii="Arial" w:hAnsi="Arial" w:eastAsia="Arial" w:cs="Arial"/>
+                <w:color w:val="000000"/>
+                <w:sz w:val="24"/>
               </w:rPr>
               <w:t>2 s</w:t>
             </w:r>
@@ -3337,11 +3933,21 @@
         <w:pStyle w:val="Heading1"/>
       </w:pPr>
       <w:r>
+        <w:rPr>
+          <w:rFonts w:ascii="Arial" w:hAnsi="Arial" w:eastAsia="Arial" w:cs="Arial"/>
+          <w:color w:val="000000"/>
+          <w:sz w:val="24"/>
+        </w:rPr>
         <w:t>5. Mundo, sensores y tráfico</w:t>
       </w:r>
     </w:p>
     <w:p>
       <w:r>
+        <w:rPr>
+          <w:rFonts w:ascii="Arial" w:hAnsi="Arial" w:eastAsia="Arial" w:cs="Arial"/>
+          <w:color w:val="000000"/>
+          <w:sz w:val="24"/>
+        </w:rPr>
         <w:t>World 2 incorpora Camera Recognition, Sick LMS 291, radar frontal, giroscopio y tres sensores de distancia en el costado derecho. `RecognizablePedestrian.proto` es local, tiene modelo `pedestrian`, colores de reconocimiento y objetos de colisión. `SumoInterface` limita explícitamente la simulación a 30 vehículos.</w:t>
       </w:r>
     </w:p>
@@ -3354,22 +3960,33 @@
         <w:tblLook w:firstColumn="1" w:firstRow="1" w:lastColumn="0" w:lastRow="0" w:noHBand="0" w:noVBand="1" w:val="04A0"/>
       </w:tblPr>
       <w:tblGrid>
-        <w:gridCol w:w="4896"/>
-        <w:gridCol w:w="4896"/>
+        <w:gridCol w:w="4680"/>
+        <w:gridCol w:w="4680"/>
       </w:tblGrid>
       <w:tr>
+        <w:trPr>
+          <w:tblHeader w:val="true"/>
+          <w:cantSplit/>
+        </w:trPr>
         <w:tc>
           <w:tcPr>
             <w:tcW w:type="dxa" w:w="3024"/>
-            <w:shd w:fill="1F4E79"/>
+            <w:shd w:fill="E7E6E6"/>
             <w:vAlign w:val="center"/>
+            <w:tcMar>
+              <w:top w:w="80" w:type="dxa"/>
+              <w:start w:w="110" w:type="dxa"/>
+              <w:bottom w:w="80" w:type="dxa"/>
+              <w:end w:w="110" w:type="dxa"/>
+            </w:tcMar>
           </w:tcPr>
           <w:p>
             <w:r>
               <w:rPr>
+                <w:rFonts w:ascii="Arial" w:hAnsi="Arial" w:eastAsia="Arial" w:cs="Arial"/>
                 <w:b/>
-                <w:color w:val="FFFFFF"/>
-                <w:sz w:val="18"/>
+                <w:color w:val="000000"/>
+                <w:sz w:val="24"/>
               </w:rPr>
               <w:t>Dispositivo</w:t>
             </w:r>
@@ -3378,15 +3995,22 @@
         <w:tc>
           <w:tcPr>
             <w:tcW w:type="dxa" w:w="6048"/>
-            <w:shd w:fill="1F4E79"/>
+            <w:shd w:fill="E7E6E6"/>
             <w:vAlign w:val="center"/>
+            <w:tcMar>
+              <w:top w:w="80" w:type="dxa"/>
+              <w:start w:w="110" w:type="dxa"/>
+              <w:bottom w:w="80" w:type="dxa"/>
+              <w:end w:w="110" w:type="dxa"/>
+            </w:tcMar>
           </w:tcPr>
           <w:p>
             <w:r>
               <w:rPr>
+                <w:rFonts w:ascii="Arial" w:hAnsi="Arial" w:eastAsia="Arial" w:cs="Arial"/>
                 <w:b/>
-                <w:color w:val="FFFFFF"/>
-                <w:sz w:val="18"/>
+                <w:color w:val="000000"/>
+                <w:sz w:val="24"/>
               </w:rPr>
               <w:t>Uso</w:t>
             </w:r>
@@ -3414,7 +4038,9 @@
             </w:pPr>
             <w:r>
               <w:rPr>
-                <w:sz w:val="17"/>
+                <w:rFonts w:ascii="Arial" w:hAnsi="Arial" w:eastAsia="Arial" w:cs="Arial"/>
+                <w:color w:val="000000"/>
+                <w:sz w:val="24"/>
               </w:rPr>
               <w:t>Camera + Recognition</w:t>
             </w:r>
@@ -3437,7 +4063,9 @@
             </w:pPr>
             <w:r>
               <w:rPr>
-                <w:sz w:val="17"/>
+                <w:rFonts w:ascii="Arial" w:hAnsi="Arial" w:eastAsia="Arial" w:cs="Arial"/>
+                <w:color w:val="000000"/>
+                <w:sz w:val="24"/>
               </w:rPr>
               <w:t>Clasificar peatón/autobús y estimar distancia relativa</w:t>
             </w:r>
@@ -3465,7 +4093,9 @@
             </w:pPr>
             <w:r>
               <w:rPr>
-                <w:sz w:val="17"/>
+                <w:rFonts w:ascii="Arial" w:hAnsi="Arial" w:eastAsia="Arial" w:cs="Arial"/>
+                <w:color w:val="000000"/>
+                <w:sz w:val="24"/>
               </w:rPr>
               <w:t>LiDAR</w:t>
             </w:r>
@@ -3488,7 +4118,9 @@
             </w:pPr>
             <w:r>
               <w:rPr>
-                <w:sz w:val="17"/>
+                <w:rFonts w:ascii="Arial" w:hAnsi="Arial" w:eastAsia="Arial" w:cs="Arial"/>
+                <w:color w:val="000000"/>
+                <w:sz w:val="24"/>
               </w:rPr>
               <w:t>Confirmar obstáculo frontal en el campo de la cámara</w:t>
             </w:r>
@@ -3516,7 +4148,9 @@
             </w:pPr>
             <w:r>
               <w:rPr>
-                <w:sz w:val="17"/>
+                <w:rFonts w:ascii="Arial" w:hAnsi="Arial" w:eastAsia="Arial" w:cs="Arial"/>
+                <w:color w:val="000000"/>
+                <w:sz w:val="24"/>
               </w:rPr>
               <w:t>Radar</w:t>
             </w:r>
@@ -3539,7 +4173,9 @@
             </w:pPr>
             <w:r>
               <w:rPr>
-                <w:sz w:val="17"/>
+                <w:rFonts w:ascii="Arial" w:hAnsi="Arial" w:eastAsia="Arial" w:cs="Arial"/>
+                <w:color w:val="000000"/>
+                <w:sz w:val="24"/>
               </w:rPr>
               <w:t>Distancia y velocidad radial del vehículo precedente</w:t>
             </w:r>
@@ -3567,7 +4203,9 @@
             </w:pPr>
             <w:r>
               <w:rPr>
-                <w:sz w:val="17"/>
+                <w:rFonts w:ascii="Arial" w:hAnsi="Arial" w:eastAsia="Arial" w:cs="Arial"/>
+                <w:color w:val="000000"/>
+                <w:sz w:val="24"/>
               </w:rPr>
               <w:t>Giroscopio</w:t>
             </w:r>
@@ -3590,7 +4228,9 @@
             </w:pPr>
             <w:r>
               <w:rPr>
-                <w:sz w:val="17"/>
+                <w:rFonts w:ascii="Arial" w:hAnsi="Arial" w:eastAsia="Arial" w:cs="Arial"/>
+                <w:color w:val="000000"/>
+                <w:sz w:val="24"/>
               </w:rPr>
               <w:t>Recuperar orientación tras evasión</w:t>
             </w:r>
@@ -3618,7 +4258,9 @@
             </w:pPr>
             <w:r>
               <w:rPr>
-                <w:sz w:val="17"/>
+                <w:rFonts w:ascii="Arial" w:hAnsi="Arial" w:eastAsia="Arial" w:cs="Arial"/>
+                <w:color w:val="000000"/>
+                <w:sz w:val="24"/>
               </w:rPr>
               <w:t>3 sensores laterales</w:t>
             </w:r>
@@ -3641,7 +4283,9 @@
             </w:pPr>
             <w:r>
               <w:rPr>
-                <w:sz w:val="17"/>
+                <w:rFonts w:ascii="Arial" w:hAnsi="Arial" w:eastAsia="Arial" w:cs="Arial"/>
+                <w:color w:val="000000"/>
+                <w:sz w:val="24"/>
               </w:rPr>
               <w:t>Seguimiento de pared derecha y detección de fin de obstáculo</w:t>
             </w:r>
@@ -3659,11 +4303,21 @@
         <w:pStyle w:val="Heading1"/>
       </w:pPr>
       <w:r>
+        <w:rPr>
+          <w:rFonts w:ascii="Arial" w:hAnsi="Arial" w:eastAsia="Arial" w:cs="Arial"/>
+          <w:color w:val="000000"/>
+          <w:sz w:val="24"/>
+        </w:rPr>
         <w:t>6. Presets de ruta y evidencia de Webots</w:t>
       </w:r>
     </w:p>
     <w:p>
       <w:r>
+        <w:rPr>
+          <w:rFonts w:ascii="Arial" w:hAnsi="Arial" w:eastAsia="Arial" w:cs="Arial"/>
+          <w:color w:val="000000"/>
+          <w:sz w:val="24"/>
+        </w:rPr>
         <w:t>Los presets se regeneran mediante `tools/create_route_worlds.py` y comparten la misma red vial. Cada uno fija pose inicial y comando, conservando rutas relativas. Las figuras provienen directamente de la cámara del vehículo durante Webots R2025a.</w:t>
       </w:r>
     </w:p>
@@ -3673,60 +4327,11 @@
         <w:jc w:val="center"/>
       </w:pPr>
       <w:r>
-        <w:drawing>
-          <wp:inline xmlns:a="http://schemas.openxmlformats.org/drawingml/2006/main" xmlns:pic="http://schemas.openxmlformats.org/drawingml/2006/picture">
-            <wp:extent cx="5852160" cy="2926080"/>
-            <wp:docPr id="4" name="Picture 4"/>
-            <wp:cNvGraphicFramePr>
-              <a:graphicFrameLocks noChangeAspect="1"/>
-            </wp:cNvGraphicFramePr>
-            <a:graphic>
-              <a:graphicData uri="http://schemas.openxmlformats.org/drawingml/2006/picture">
-                <pic:pic>
-                  <pic:nvPicPr>
-                    <pic:cNvPr id="0" name="webots_straight.png"/>
-                    <pic:cNvPicPr/>
-                  </pic:nvPicPr>
-                  <pic:blipFill>
-                    <a:blip r:embed="rId12"/>
-                    <a:stretch>
-                      <a:fillRect/>
-                    </a:stretch>
-                  </pic:blipFill>
-                  <pic:spPr>
-                    <a:xfrm>
-                      <a:off x="0" y="0"/>
-                      <a:ext cx="5852160" cy="2926080"/>
-                    </a:xfrm>
-                    <a:prstGeom prst="rect"/>
-                  </pic:spPr>
-                </pic:pic>
-              </a:graphicData>
-            </a:graphic>
-          </wp:inline>
-        </w:drawing>
-      </w:r>
-    </w:p>
-    <w:p>
-      <w:pPr>
-        <w:spacing w:after="160"/>
-        <w:jc w:val="center"/>
-      </w:pPr>
-      <w:r>
         <w:rPr>
-          <w:i/>
-          <w:color w:val="595959"/>
-          <w:sz w:val="17"/>
+          <w:rFonts w:ascii="Arial" w:hAnsi="Arial" w:eastAsia="Arial" w:cs="Arial"/>
+          <w:color w:val="000000"/>
+          <w:sz w:val="24"/>
         </w:rPr>
-        <w:t>Figura 4. Ruta recta: evidencia final de llegada al corredor de los silos.</w:t>
-      </w:r>
-    </w:p>
-    <w:p>
-      <w:pPr>
-        <w:spacing w:after="60"/>
-        <w:jc w:val="center"/>
-      </w:pPr>
-      <w:r>
         <w:drawing>
           <wp:inline xmlns:a="http://schemas.openxmlformats.org/drawingml/2006/main" xmlns:pic="http://schemas.openxmlformats.org/drawingml/2006/picture">
             <wp:extent cx="5852160" cy="2926080"/>
@@ -3738,7 +4343,7 @@
               <a:graphicData uri="http://schemas.openxmlformats.org/drawingml/2006/picture">
                 <pic:pic>
                   <pic:nvPicPr>
-                    <pic:cNvPr id="0" name="webots_right.png"/>
+                    <pic:cNvPr id="0" name="webots_straight.png"/>
                     <pic:cNvPicPr/>
                   </pic:nvPicPr>
                   <pic:blipFill>
@@ -3768,11 +4373,12 @@
       </w:pPr>
       <w:r>
         <w:rPr>
+          <w:rFonts w:ascii="Arial" w:hAnsi="Arial" w:eastAsia="Arial" w:cs="Arial"/>
           <w:i/>
-          <w:color w:val="595959"/>
-          <w:sz w:val="17"/>
+          <w:color w:val="000000"/>
+          <w:sz w:val="24"/>
         </w:rPr>
-        <w:t>Figura 5. Ruta derecha: evidencia final tras freno ante peatón y giro.</w:t>
+        <w:t>Figura 4. Ruta recta: evidencia final de llegada al corredor de los silos.</w:t>
       </w:r>
     </w:p>
     <w:p>
@@ -3781,6 +4387,11 @@
         <w:jc w:val="center"/>
       </w:pPr>
       <w:r>
+        <w:rPr>
+          <w:rFonts w:ascii="Arial" w:hAnsi="Arial" w:eastAsia="Arial" w:cs="Arial"/>
+          <w:color w:val="000000"/>
+          <w:sz w:val="24"/>
+        </w:rPr>
         <w:drawing>
           <wp:inline xmlns:a="http://schemas.openxmlformats.org/drawingml/2006/main" xmlns:pic="http://schemas.openxmlformats.org/drawingml/2006/picture">
             <wp:extent cx="5852160" cy="2926080"/>
@@ -3792,7 +4403,7 @@
               <a:graphicData uri="http://schemas.openxmlformats.org/drawingml/2006/picture">
                 <pic:pic>
                   <pic:nvPicPr>
-                    <pic:cNvPr id="0" name="webots_left.png"/>
+                    <pic:cNvPr id="0" name="webots_right.png"/>
                     <pic:cNvPicPr/>
                   </pic:nvPicPr>
                   <pic:blipFill>
@@ -3822,9 +4433,70 @@
       </w:pPr>
       <w:r>
         <w:rPr>
+          <w:rFonts w:ascii="Arial" w:hAnsi="Arial" w:eastAsia="Arial" w:cs="Arial"/>
           <w:i/>
-          <w:color w:val="595959"/>
-          <w:sz w:val="17"/>
+          <w:color w:val="000000"/>
+          <w:sz w:val="24"/>
+        </w:rPr>
+        <w:t>Figura 5. Ruta derecha: evidencia final tras freno ante peatón y giro.</w:t>
+      </w:r>
+    </w:p>
+    <w:p>
+      <w:pPr>
+        <w:spacing w:after="60"/>
+        <w:jc w:val="center"/>
+      </w:pPr>
+      <w:r>
+        <w:rPr>
+          <w:rFonts w:ascii="Arial" w:hAnsi="Arial" w:eastAsia="Arial" w:cs="Arial"/>
+          <w:color w:val="000000"/>
+          <w:sz w:val="24"/>
+        </w:rPr>
+        <w:drawing>
+          <wp:inline xmlns:a="http://schemas.openxmlformats.org/drawingml/2006/main" xmlns:pic="http://schemas.openxmlformats.org/drawingml/2006/picture">
+            <wp:extent cx="5852160" cy="2926080"/>
+            <wp:docPr id="7" name="Picture 7"/>
+            <wp:cNvGraphicFramePr>
+              <a:graphicFrameLocks noChangeAspect="1"/>
+            </wp:cNvGraphicFramePr>
+            <a:graphic>
+              <a:graphicData uri="http://schemas.openxmlformats.org/drawingml/2006/picture">
+                <pic:pic>
+                  <pic:nvPicPr>
+                    <pic:cNvPr id="0" name="webots_left.png"/>
+                    <pic:cNvPicPr/>
+                  </pic:nvPicPr>
+                  <pic:blipFill>
+                    <a:blip r:embed="rId15"/>
+                    <a:stretch>
+                      <a:fillRect/>
+                    </a:stretch>
+                  </pic:blipFill>
+                  <pic:spPr>
+                    <a:xfrm>
+                      <a:off x="0" y="0"/>
+                      <a:ext cx="5852160" cy="2926080"/>
+                    </a:xfrm>
+                    <a:prstGeom prst="rect"/>
+                  </pic:spPr>
+                </pic:pic>
+              </a:graphicData>
+            </a:graphic>
+          </wp:inline>
+        </w:drawing>
+      </w:r>
+    </w:p>
+    <w:p>
+      <w:pPr>
+        <w:spacing w:after="160"/>
+        <w:jc w:val="center"/>
+      </w:pPr>
+      <w:r>
+        <w:rPr>
+          <w:rFonts w:ascii="Arial" w:hAnsi="Arial" w:eastAsia="Arial" w:cs="Arial"/>
+          <w:i/>
+          <w:color w:val="000000"/>
+          <w:sz w:val="24"/>
         </w:rPr>
         <w:t>Figura 6. Ruta izquierda: evidencia final en el corredor de Subway norte.</w:t>
       </w:r>
@@ -3838,23 +4510,34 @@
         <w:tblLook w:firstColumn="1" w:firstRow="1" w:lastColumn="0" w:lastRow="0" w:noHBand="0" w:noVBand="1" w:val="04A0"/>
       </w:tblPr>
       <w:tblGrid>
-        <w:gridCol w:w="3264"/>
-        <w:gridCol w:w="3264"/>
-        <w:gridCol w:w="3264"/>
+        <w:gridCol w:w="3120"/>
+        <w:gridCol w:w="3120"/>
+        <w:gridCol w:w="3120"/>
       </w:tblGrid>
       <w:tr>
+        <w:trPr>
+          <w:tblHeader w:val="true"/>
+          <w:cantSplit/>
+        </w:trPr>
         <w:tc>
           <w:tcPr>
             <w:tcW w:type="dxa" w:w="1728"/>
-            <w:shd w:fill="1F4E79"/>
+            <w:shd w:fill="E7E6E6"/>
             <w:vAlign w:val="center"/>
+            <w:tcMar>
+              <w:top w:w="80" w:type="dxa"/>
+              <w:start w:w="110" w:type="dxa"/>
+              <w:bottom w:w="80" w:type="dxa"/>
+              <w:end w:w="110" w:type="dxa"/>
+            </w:tcMar>
           </w:tcPr>
           <w:p>
             <w:r>
               <w:rPr>
+                <w:rFonts w:ascii="Arial" w:hAnsi="Arial" w:eastAsia="Arial" w:cs="Arial"/>
                 <w:b/>
-                <w:color w:val="FFFFFF"/>
-                <w:sz w:val="18"/>
+                <w:color w:val="000000"/>
+                <w:sz w:val="24"/>
               </w:rPr>
               <w:t>Ruta</w:t>
             </w:r>
@@ -3863,15 +4546,22 @@
         <w:tc>
           <w:tcPr>
             <w:tcW w:type="dxa" w:w="1440"/>
-            <w:shd w:fill="1F4E79"/>
+            <w:shd w:fill="E7E6E6"/>
             <w:vAlign w:val="center"/>
+            <w:tcMar>
+              <w:top w:w="80" w:type="dxa"/>
+              <w:start w:w="110" w:type="dxa"/>
+              <w:bottom w:w="80" w:type="dxa"/>
+              <w:end w:w="110" w:type="dxa"/>
+            </w:tcMar>
           </w:tcPr>
           <w:p>
             <w:r>
               <w:rPr>
+                <w:rFonts w:ascii="Arial" w:hAnsi="Arial" w:eastAsia="Arial" w:cs="Arial"/>
                 <w:b/>
-                <w:color w:val="FFFFFF"/>
-                <w:sz w:val="18"/>
+                <w:color w:val="000000"/>
+                <w:sz w:val="24"/>
               </w:rPr>
               <w:t>Comando</w:t>
             </w:r>
@@ -3880,15 +4570,22 @@
         <w:tc>
           <w:tcPr>
             <w:tcW w:type="dxa" w:w="5904"/>
-            <w:shd w:fill="1F4E79"/>
+            <w:shd w:fill="E7E6E6"/>
             <w:vAlign w:val="center"/>
+            <w:tcMar>
+              <w:top w:w="80" w:type="dxa"/>
+              <w:start w:w="110" w:type="dxa"/>
+              <w:bottom w:w="80" w:type="dxa"/>
+              <w:end w:w="110" w:type="dxa"/>
+            </w:tcMar>
           </w:tcPr>
           <w:p>
             <w:r>
               <w:rPr>
+                <w:rFonts w:ascii="Arial" w:hAnsi="Arial" w:eastAsia="Arial" w:cs="Arial"/>
                 <w:b/>
-                <w:color w:val="FFFFFF"/>
-                <w:sz w:val="18"/>
+                <w:color w:val="000000"/>
+                <w:sz w:val="24"/>
               </w:rPr>
               <w:t>Resultado técnico observado</w:t>
             </w:r>
@@ -3916,7 +4613,9 @@
             </w:pPr>
             <w:r>
               <w:rPr>
-                <w:sz w:val="17"/>
+                <w:rFonts w:ascii="Arial" w:hAnsi="Arial" w:eastAsia="Arial" w:cs="Arial"/>
+                <w:color w:val="000000"/>
+                <w:sz w:val="24"/>
               </w:rPr>
               <w:t>Recto</w:t>
             </w:r>
@@ -3939,7 +4638,9 @@
             </w:pPr>
             <w:r>
               <w:rPr>
-                <w:sz w:val="17"/>
+                <w:rFonts w:ascii="Arial" w:hAnsi="Arial" w:eastAsia="Arial" w:cs="Arial"/>
+                <w:color w:val="000000"/>
+                <w:sz w:val="24"/>
               </w:rPr>
               <w:t>0</w:t>
             </w:r>
@@ -3962,7 +4663,9 @@
             </w:pPr>
             <w:r>
               <w:rPr>
-                <w:sz w:val="17"/>
+                <w:rFonts w:ascii="Arial" w:hAnsi="Arial" w:eastAsia="Arial" w:cs="Arial"/>
+                <w:color w:val="000000"/>
+                <w:sz w:val="24"/>
               </w:rPr>
               <w:t>Evasión completa; llegadas GPS=(-188.08,235.10) y (-188.03,235.40)</w:t>
             </w:r>
@@ -3990,7 +4693,9 @@
             </w:pPr>
             <w:r>
               <w:rPr>
-                <w:sz w:val="17"/>
+                <w:rFonts w:ascii="Arial" w:hAnsi="Arial" w:eastAsia="Arial" w:cs="Arial"/>
+                <w:color w:val="000000"/>
+                <w:sz w:val="24"/>
               </w:rPr>
               <w:t>Derecha</w:t>
             </w:r>
@@ -4013,7 +4718,9 @@
             </w:pPr>
             <w:r>
               <w:rPr>
-                <w:sz w:val="17"/>
+                <w:rFonts w:ascii="Arial" w:hAnsi="Arial" w:eastAsia="Arial" w:cs="Arial"/>
+                <w:color w:val="000000"/>
+                <w:sz w:val="24"/>
               </w:rPr>
               <w:t>2</w:t>
             </w:r>
@@ -4036,7 +4743,9 @@
             </w:pPr>
             <w:r>
               <w:rPr>
-                <w:sz w:val="17"/>
+                <w:rFonts w:ascii="Arial" w:hAnsi="Arial" w:eastAsia="Arial" w:cs="Arial"/>
+                <w:color w:val="000000"/>
+                <w:sz w:val="24"/>
               </w:rPr>
               <w:t>Freno a peatón; llegadas GPS=(23.96,-89.60) y (28.97,-65.41)</w:t>
             </w:r>
@@ -4064,7 +4773,9 @@
             </w:pPr>
             <w:r>
               <w:rPr>
-                <w:sz w:val="17"/>
+                <w:rFonts w:ascii="Arial" w:hAnsi="Arial" w:eastAsia="Arial" w:cs="Arial"/>
+                <w:color w:val="000000"/>
+                <w:sz w:val="24"/>
               </w:rPr>
               <w:t>Izquierda</w:t>
             </w:r>
@@ -4087,7 +4798,9 @@
             </w:pPr>
             <w:r>
               <w:rPr>
-                <w:sz w:val="17"/>
+                <w:rFonts w:ascii="Arial" w:hAnsi="Arial" w:eastAsia="Arial" w:cs="Arial"/>
+                <w:color w:val="000000"/>
+                <w:sz w:val="24"/>
               </w:rPr>
               <w:t>1</w:t>
             </w:r>
@@ -4110,7 +4823,9 @@
             </w:pPr>
             <w:r>
               <w:rPr>
-                <w:sz w:val="17"/>
+                <w:rFonts w:ascii="Arial" w:hAnsi="Arial" w:eastAsia="Arial" w:cs="Arial"/>
+                <w:color w:val="000000"/>
+                <w:sz w:val="24"/>
               </w:rPr>
               <w:t>Llegadas GPS=(35.04,25.75) y (35.04,28.37)</w:t>
             </w:r>
@@ -4131,7 +4846,7 @@
         <w:tblLook w:firstColumn="1" w:firstRow="1" w:lastColumn="0" w:lastRow="0" w:noHBand="0" w:noVBand="1" w:val="04A0"/>
       </w:tblPr>
       <w:tblGrid>
-        <w:gridCol w:w="9792"/>
+        <w:gridCol w:w="9360"/>
       </w:tblGrid>
       <w:tr>
         <w:tc>
@@ -4151,12 +4866,19 @@
             </w:pPr>
             <w:r>
               <w:rPr>
+                <w:rFonts w:ascii="Arial" w:hAnsi="Arial" w:eastAsia="Arial" w:cs="Arial"/>
                 <w:b/>
-                <w:color w:val="1F4E79"/>
+                <w:color w:val="000000"/>
+                <w:sz w:val="24"/>
               </w:rPr>
               <w:t xml:space="preserve">Validación de rutas cerrada. </w:t>
             </w:r>
             <w:r>
+              <w:rPr>
+                <w:rFonts w:ascii="Arial" w:hAnsi="Arial" w:eastAsia="Arial" w:cs="Arial"/>
+                <w:color w:val="000000"/>
+                <w:sz w:val="24"/>
+              </w:rPr>
               <w:t>Se ejecutaron dos recorridos limpios por ruta, por carril derecho, sin colisión ni U-turn. Los logs registran los cambios de estado y la llegada GPS. La validación también corrigió la falsa detección de 'bus stop' como autobús mediante filtrado de modelo y prueba de regresión.</w:t>
             </w:r>
           </w:p>
@@ -4173,11 +4895,21 @@
         <w:pStyle w:val="Heading1"/>
       </w:pPr>
       <w:r>
+        <w:rPr>
+          <w:rFonts w:ascii="Arial" w:hAnsi="Arial" w:eastAsia="Arial" w:cs="Arial"/>
+          <w:color w:val="000000"/>
+          <w:sz w:val="24"/>
+        </w:rPr>
         <w:t>7. Verificación automatizada</w:t>
       </w:r>
     </w:p>
     <w:p>
       <w:r>
+        <w:rPr>
+          <w:rFonts w:ascii="Arial" w:hAnsi="Arial" w:eastAsia="Arial" w:cs="Arial"/>
+          <w:color w:val="000000"/>
+          <w:sz w:val="24"/>
+        </w:rPr>
         <w:t>Doce pruebas unitarias y de integridad verifican esquema y referencias del dataset, notebook reproducible, presets, dispositivos del mundo, preprocesamiento, one-hot, límites de dirección, regulación longitudinal, histéresis de 12/15 m y acotación del seguimiento de pared.</w:t>
       </w:r>
     </w:p>
@@ -4190,23 +4922,34 @@
         <w:tblLook w:firstColumn="1" w:firstRow="1" w:lastColumn="0" w:lastRow="0" w:noHBand="0" w:noVBand="1" w:val="04A0"/>
       </w:tblPr>
       <w:tblGrid>
-        <w:gridCol w:w="3264"/>
-        <w:gridCol w:w="3264"/>
-        <w:gridCol w:w="3264"/>
+        <w:gridCol w:w="3120"/>
+        <w:gridCol w:w="3120"/>
+        <w:gridCol w:w="3120"/>
       </w:tblGrid>
       <w:tr>
+        <w:trPr>
+          <w:tblHeader w:val="true"/>
+          <w:cantSplit/>
+        </w:trPr>
         <w:tc>
           <w:tcPr>
             <w:tcW w:type="dxa" w:w="2160"/>
-            <w:shd w:fill="1F4E79"/>
+            <w:shd w:fill="E7E6E6"/>
             <w:vAlign w:val="center"/>
+            <w:tcMar>
+              <w:top w:w="80" w:type="dxa"/>
+              <w:start w:w="110" w:type="dxa"/>
+              <w:bottom w:w="80" w:type="dxa"/>
+              <w:end w:w="110" w:type="dxa"/>
+            </w:tcMar>
           </w:tcPr>
           <w:p>
             <w:r>
               <w:rPr>
+                <w:rFonts w:ascii="Arial" w:hAnsi="Arial" w:eastAsia="Arial" w:cs="Arial"/>
                 <w:b/>
-                <w:color w:val="FFFFFF"/>
-                <w:sz w:val="18"/>
+                <w:color w:val="000000"/>
+                <w:sz w:val="24"/>
               </w:rPr>
               <w:t>Área</w:t>
             </w:r>
@@ -4215,15 +4958,22 @@
         <w:tc>
           <w:tcPr>
             <w:tcW w:type="dxa" w:w="4752"/>
-            <w:shd w:fill="1F4E79"/>
+            <w:shd w:fill="E7E6E6"/>
             <w:vAlign w:val="center"/>
+            <w:tcMar>
+              <w:top w:w="80" w:type="dxa"/>
+              <w:start w:w="110" w:type="dxa"/>
+              <w:bottom w:w="80" w:type="dxa"/>
+              <w:end w:w="110" w:type="dxa"/>
+            </w:tcMar>
           </w:tcPr>
           <w:p>
             <w:r>
               <w:rPr>
+                <w:rFonts w:ascii="Arial" w:hAnsi="Arial" w:eastAsia="Arial" w:cs="Arial"/>
                 <w:b/>
-                <w:color w:val="FFFFFF"/>
-                <w:sz w:val="18"/>
+                <w:color w:val="000000"/>
+                <w:sz w:val="24"/>
               </w:rPr>
               <w:t>Evidencia</w:t>
             </w:r>
@@ -4232,15 +4982,22 @@
         <w:tc>
           <w:tcPr>
             <w:tcW w:type="dxa" w:w="2160"/>
-            <w:shd w:fill="1F4E79"/>
+            <w:shd w:fill="E7E6E6"/>
             <w:vAlign w:val="center"/>
+            <w:tcMar>
+              <w:top w:w="80" w:type="dxa"/>
+              <w:start w:w="110" w:type="dxa"/>
+              <w:bottom w:w="80" w:type="dxa"/>
+              <w:end w:w="110" w:type="dxa"/>
+            </w:tcMar>
           </w:tcPr>
           <w:p>
             <w:r>
               <w:rPr>
+                <w:rFonts w:ascii="Arial" w:hAnsi="Arial" w:eastAsia="Arial" w:cs="Arial"/>
                 <w:b/>
-                <w:color w:val="FFFFFF"/>
-                <w:sz w:val="18"/>
+                <w:color w:val="000000"/>
+                <w:sz w:val="24"/>
               </w:rPr>
               <w:t>Estado</w:t>
             </w:r>
@@ -4268,7 +5025,9 @@
             </w:pPr>
             <w:r>
               <w:rPr>
-                <w:sz w:val="17"/>
+                <w:rFonts w:ascii="Arial" w:hAnsi="Arial" w:eastAsia="Arial" w:cs="Arial"/>
+                <w:color w:val="000000"/>
+                <w:sz w:val="24"/>
               </w:rPr>
               <w:t>Dataset</w:t>
             </w:r>
@@ -4291,7 +5050,9 @@
             </w:pPr>
             <w:r>
               <w:rPr>
-                <w:sz w:val="17"/>
+                <w:rFonts w:ascii="Arial" w:hAnsi="Arial" w:eastAsia="Arial" w:cs="Arial"/>
+                <w:color w:val="000000"/>
+                <w:sz w:val="24"/>
               </w:rPr>
               <w:t>6,129 imágenes; 0 faltantes; 3 comandos</w:t>
             </w:r>
@@ -4315,7 +5076,9 @@
             </w:pPr>
             <w:r>
               <w:rPr>
-                <w:sz w:val="17"/>
+                <w:rFonts w:ascii="Arial" w:hAnsi="Arial" w:eastAsia="Arial" w:cs="Arial"/>
+                <w:color w:val="000000"/>
+                <w:sz w:val="24"/>
               </w:rPr>
               <w:t>Verificado</w:t>
             </w:r>
@@ -4343,7 +5106,9 @@
             </w:pPr>
             <w:r>
               <w:rPr>
-                <w:sz w:val="17"/>
+                <w:rFonts w:ascii="Arial" w:hAnsi="Arial" w:eastAsia="Arial" w:cs="Arial"/>
+                <w:color w:val="000000"/>
+                <w:sz w:val="24"/>
               </w:rPr>
               <w:t>Aumento</w:t>
             </w:r>
@@ -4366,7 +5131,9 @@
             </w:pPr>
             <w:r>
               <w:rPr>
-                <w:sz w:val="17"/>
+                <w:rFonts w:ascii="Arial" w:hAnsi="Arial" w:eastAsia="Arial" w:cs="Arial"/>
+                <w:color w:val="000000"/>
+                <w:sz w:val="24"/>
               </w:rPr>
               <w:t>12,956 muestras; 0 source_id compartidos</w:t>
             </w:r>
@@ -4390,7 +5157,9 @@
             </w:pPr>
             <w:r>
               <w:rPr>
-                <w:sz w:val="17"/>
+                <w:rFonts w:ascii="Arial" w:hAnsi="Arial" w:eastAsia="Arial" w:cs="Arial"/>
+                <w:color w:val="000000"/>
+                <w:sz w:val="24"/>
               </w:rPr>
               <w:t>Verificado</w:t>
             </w:r>
@@ -4418,7 +5187,9 @@
             </w:pPr>
             <w:r>
               <w:rPr>
-                <w:sz w:val="17"/>
+                <w:rFonts w:ascii="Arial" w:hAnsi="Arial" w:eastAsia="Arial" w:cs="Arial"/>
+                <w:color w:val="000000"/>
+                <w:sz w:val="24"/>
               </w:rPr>
               <w:t>Notebook</w:t>
             </w:r>
@@ -4441,7 +5212,9 @@
             </w:pPr>
             <w:r>
               <w:rPr>
-                <w:sz w:val="17"/>
+                <w:rFonts w:ascii="Arial" w:hAnsi="Arial" w:eastAsia="Arial" w:cs="Arial"/>
+                <w:color w:val="000000"/>
+                <w:sz w:val="24"/>
               </w:rPr>
               <w:t>19 celdas ejecutadas desde clon; HDF5 recargable</w:t>
             </w:r>
@@ -4465,7 +5238,9 @@
             </w:pPr>
             <w:r>
               <w:rPr>
-                <w:sz w:val="17"/>
+                <w:rFonts w:ascii="Arial" w:hAnsi="Arial" w:eastAsia="Arial" w:cs="Arial"/>
+                <w:color w:val="000000"/>
+                <w:sz w:val="24"/>
               </w:rPr>
               <w:t>Verificado</w:t>
             </w:r>
@@ -4493,7 +5268,9 @@
             </w:pPr>
             <w:r>
               <w:rPr>
-                <w:sz w:val="17"/>
+                <w:rFonts w:ascii="Arial" w:hAnsi="Arial" w:eastAsia="Arial" w:cs="Arial"/>
+                <w:color w:val="000000"/>
+                <w:sz w:val="24"/>
               </w:rPr>
               <w:t>Modelo</w:t>
             </w:r>
@@ -4516,7 +5293,9 @@
             </w:pPr>
             <w:r>
               <w:rPr>
-                <w:sz w:val="17"/>
+                <w:rFonts w:ascii="Arial" w:hAnsi="Arial" w:eastAsia="Arial" w:cs="Arial"/>
+                <w:color w:val="000000"/>
+                <w:sz w:val="24"/>
               </w:rPr>
               <w:t>MAE 0.0220 rad y métricas por comando</w:t>
             </w:r>
@@ -4540,7 +5319,9 @@
             </w:pPr>
             <w:r>
               <w:rPr>
-                <w:sz w:val="17"/>
+                <w:rFonts w:ascii="Arial" w:hAnsi="Arial" w:eastAsia="Arial" w:cs="Arial"/>
+                <w:color w:val="000000"/>
+                <w:sz w:val="24"/>
               </w:rPr>
               <w:t>Verificado</w:t>
             </w:r>
@@ -4568,7 +5349,9 @@
             </w:pPr>
             <w:r>
               <w:rPr>
-                <w:sz w:val="17"/>
+                <w:rFonts w:ascii="Arial" w:hAnsi="Arial" w:eastAsia="Arial" w:cs="Arial"/>
+                <w:color w:val="000000"/>
+                <w:sz w:val="24"/>
               </w:rPr>
               <w:t>Pruebas</w:t>
             </w:r>
@@ -4591,7 +5374,9 @@
             </w:pPr>
             <w:r>
               <w:rPr>
-                <w:sz w:val="17"/>
+                <w:rFonts w:ascii="Arial" w:hAnsi="Arial" w:eastAsia="Arial" w:cs="Arial"/>
+                <w:color w:val="000000"/>
+                <w:sz w:val="24"/>
               </w:rPr>
               <w:t>12/12 exitosas</w:t>
             </w:r>
@@ -4615,7 +5400,9 @@
             </w:pPr>
             <w:r>
               <w:rPr>
-                <w:sz w:val="17"/>
+                <w:rFonts w:ascii="Arial" w:hAnsi="Arial" w:eastAsia="Arial" w:cs="Arial"/>
+                <w:color w:val="000000"/>
+                <w:sz w:val="24"/>
               </w:rPr>
               <w:t>Verificado</w:t>
             </w:r>
@@ -4643,7 +5430,9 @@
             </w:pPr>
             <w:r>
               <w:rPr>
-                <w:sz w:val="17"/>
+                <w:rFonts w:ascii="Arial" w:hAnsi="Arial" w:eastAsia="Arial" w:cs="Arial"/>
+                <w:color w:val="000000"/>
+                <w:sz w:val="24"/>
               </w:rPr>
               <w:t>Webots</w:t>
             </w:r>
@@ -4666,7 +5455,9 @@
             </w:pPr>
             <w:r>
               <w:rPr>
-                <w:sz w:val="17"/>
+                <w:rFonts w:ascii="Arial" w:hAnsi="Arial" w:eastAsia="Arial" w:cs="Arial"/>
+                <w:color w:val="000000"/>
+                <w:sz w:val="24"/>
               </w:rPr>
               <w:t>Tres comandos y árbitro de seguridad</w:t>
             </w:r>
@@ -4690,7 +5481,9 @@
             </w:pPr>
             <w:r>
               <w:rPr>
-                <w:sz w:val="17"/>
+                <w:rFonts w:ascii="Arial" w:hAnsi="Arial" w:eastAsia="Arial" w:cs="Arial"/>
+                <w:color w:val="000000"/>
+                <w:sz w:val="24"/>
               </w:rPr>
               <w:t>Verificado</w:t>
             </w:r>
@@ -4718,7 +5511,9 @@
             </w:pPr>
             <w:r>
               <w:rPr>
-                <w:sz w:val="17"/>
+                <w:rFonts w:ascii="Arial" w:hAnsi="Arial" w:eastAsia="Arial" w:cs="Arial"/>
+                <w:color w:val="000000"/>
+                <w:sz w:val="24"/>
               </w:rPr>
               <w:t>Recorridos completos</w:t>
             </w:r>
@@ -4741,7 +5536,9 @@
             </w:pPr>
             <w:r>
               <w:rPr>
-                <w:sz w:val="17"/>
+                <w:rFonts w:ascii="Arial" w:hAnsi="Arial" w:eastAsia="Arial" w:cs="Arial"/>
+                <w:color w:val="000000"/>
+                <w:sz w:val="24"/>
               </w:rPr>
               <w:t>Dos tomas limpias por ruta</w:t>
             </w:r>
@@ -4765,7 +5562,9 @@
             </w:pPr>
             <w:r>
               <w:rPr>
-                <w:sz w:val="17"/>
+                <w:rFonts w:ascii="Arial" w:hAnsi="Arial" w:eastAsia="Arial" w:cs="Arial"/>
+                <w:color w:val="000000"/>
+                <w:sz w:val="24"/>
               </w:rPr>
               <w:t>Verificado</w:t>
             </w:r>
@@ -4793,7 +5592,9 @@
             </w:pPr>
             <w:r>
               <w:rPr>
-                <w:sz w:val="17"/>
+                <w:rFonts w:ascii="Arial" w:hAnsi="Arial" w:eastAsia="Arial" w:cs="Arial"/>
+                <w:color w:val="000000"/>
+                <w:sz w:val="24"/>
               </w:rPr>
               <w:t>YouTube</w:t>
             </w:r>
@@ -4816,7 +5617,9 @@
             </w:pPr>
             <w:r>
               <w:rPr>
-                <w:sz w:val="17"/>
+                <w:rFonts w:ascii="Arial" w:hAnsi="Arial" w:eastAsia="Arial" w:cs="Arial"/>
+                <w:color w:val="000000"/>
+                <w:sz w:val="24"/>
               </w:rPr>
               <w:t>Video &lt;6 min y URL pública</w:t>
             </w:r>
@@ -4840,7 +5643,9 @@
             </w:pPr>
             <w:r>
               <w:rPr>
-                <w:sz w:val="17"/>
+                <w:rFonts w:ascii="Arial" w:hAnsi="Arial" w:eastAsia="Arial" w:cs="Arial"/>
+                <w:color w:val="000000"/>
+                <w:sz w:val="24"/>
               </w:rPr>
               <w:t>Pendiente de publicación</w:t>
             </w:r>
@@ -4858,11 +5663,21 @@
         <w:pStyle w:val="Heading1"/>
       </w:pPr>
       <w:r>
+        <w:rPr>
+          <w:rFonts w:ascii="Arial" w:hAnsi="Arial" w:eastAsia="Arial" w:cs="Arial"/>
+          <w:color w:val="000000"/>
+          <w:sz w:val="24"/>
+        </w:rPr>
         <w:t>8. Reproducción</w:t>
       </w:r>
     </w:p>
     <w:p>
       <w:r>
+        <w:rPr>
+          <w:rFonts w:ascii="Arial" w:hAnsi="Arial" w:eastAsia="Arial" w:cs="Arial"/>
+          <w:color w:val="000000"/>
+          <w:sz w:val="24"/>
+        </w:rPr>
         <w:t>Entrenamiento: abrir el notebook en Colab y ejecutar todas las celdas. La primera celda clona el repositorio público.</w:t>
       </w:r>
     </w:p>
@@ -4871,6 +5686,11 @@
         <w:pStyle w:val="Heading2"/>
       </w:pPr>
       <w:r>
+        <w:rPr>
+          <w:rFonts w:ascii="Arial" w:hAnsi="Arial" w:eastAsia="Arial" w:cs="Arial"/>
+          <w:color w:val="000000"/>
+          <w:sz w:val="24"/>
+        </w:rPr>
         <w:t>Comandos de aceptación local</w:t>
       </w:r>
     </w:p>
@@ -4883,7 +5703,8 @@
       </w:pPr>
       <w:r>
         <w:rPr>
-          <w:rFonts w:ascii="Menlo" w:hAnsi="Menlo" w:eastAsia="Menlo"/>
+          <w:rFonts w:ascii="Menlo" w:hAnsi="Menlo" w:eastAsia="Menlo" w:cs="Menlo"/>
+          <w:color w:val="000000"/>
           <w:sz w:val="13"/>
         </w:rPr>
         <w:t>git clone https://github.com/xak47d/proyecto-final-cil-equipo19.git</w:t>
@@ -4906,11 +5727,21 @@
         <w:pStyle w:val="Heading1"/>
       </w:pPr>
       <w:r>
+        <w:rPr>
+          <w:rFonts w:ascii="Arial" w:hAnsi="Arial" w:eastAsia="Arial" w:cs="Arial"/>
+          <w:color w:val="000000"/>
+          <w:sz w:val="24"/>
+        </w:rPr>
         <w:t>9. Uso de inteligencia artificial</w:t>
       </w:r>
     </w:p>
     <w:p>
       <w:r>
+        <w:rPr>
+          <w:rFonts w:ascii="Arial" w:hAnsi="Arial" w:eastAsia="Arial" w:cs="Arial"/>
+          <w:color w:val="000000"/>
+          <w:sz w:val="24"/>
+        </w:rPr>
         <w:t>Se utilizó OpenAI Codex basado en GPT-5 como asistente para generación de código, depuración, optimización, estructuración del notebook y del reporte, y preparación de pruebas. El equipo conserva responsabilidad sobre la revisión técnica, la ejecución en Webots, la interpretación de resultados y la entrega académica.</w:t>
       </w:r>
     </w:p>
@@ -4919,11 +5750,21 @@
         <w:pStyle w:val="Heading1"/>
       </w:pPr>
       <w:r>
+        <w:rPr>
+          <w:rFonts w:ascii="Arial" w:hAnsi="Arial" w:eastAsia="Arial" w:cs="Arial"/>
+          <w:color w:val="000000"/>
+          <w:sz w:val="24"/>
+        </w:rPr>
         <w:t>10. Conclusiones</w:t>
       </w:r>
     </w:p>
     <w:p>
       <w:r>
+        <w:rPr>
+          <w:rFonts w:ascii="Arial" w:hAnsi="Arial" w:eastAsia="Arial" w:cs="Arial"/>
+          <w:color w:val="000000"/>
+          <w:sz w:val="24"/>
+        </w:rPr>
         <w:t>La solución elimina correctamente la clase recovery y separa el aprendizaje de dirección de la recuperación operativa. El modelo supera la meta cuantitativa, el dataset queda trazable y libre de fuga, y el controlador integra sensores heterogéneos con prioridades verificables y completó dos recorridos limpios por ruta. Los únicos pasos externos pendientes son la edición con los cuatro integrantes y la publicación del video.</w:t>
       </w:r>
     </w:p>
@@ -4932,6 +5773,11 @@
         <w:pStyle w:val="Heading1"/>
       </w:pPr>
       <w:r>
+        <w:rPr>
+          <w:rFonts w:ascii="Arial" w:hAnsi="Arial" w:eastAsia="Arial" w:cs="Arial"/>
+          <w:color w:val="000000"/>
+          <w:sz w:val="24"/>
+        </w:rPr>
         <w:t>11. Matriz de cumplimiento de la rúbrica</w:t>
       </w:r>
     </w:p>
@@ -4944,23 +5790,34 @@
         <w:tblLook w:firstColumn="1" w:firstRow="1" w:lastColumn="0" w:lastRow="0" w:noHBand="0" w:noVBand="1" w:val="04A0"/>
       </w:tblPr>
       <w:tblGrid>
-        <w:gridCol w:w="3264"/>
-        <w:gridCol w:w="3264"/>
-        <w:gridCol w:w="3264"/>
+        <w:gridCol w:w="3120"/>
+        <w:gridCol w:w="3120"/>
+        <w:gridCol w:w="3120"/>
       </w:tblGrid>
       <w:tr>
+        <w:trPr>
+          <w:tblHeader w:val="true"/>
+          <w:cantSplit/>
+        </w:trPr>
         <w:tc>
           <w:tcPr>
             <w:tcW w:type="dxa" w:w="2448"/>
-            <w:shd w:fill="1F4E79"/>
+            <w:shd w:fill="E7E6E6"/>
             <w:vAlign w:val="center"/>
+            <w:tcMar>
+              <w:top w:w="80" w:type="dxa"/>
+              <w:start w:w="110" w:type="dxa"/>
+              <w:bottom w:w="80" w:type="dxa"/>
+              <w:end w:w="110" w:type="dxa"/>
+            </w:tcMar>
           </w:tcPr>
           <w:p>
             <w:r>
               <w:rPr>
+                <w:rFonts w:ascii="Arial" w:hAnsi="Arial" w:eastAsia="Arial" w:cs="Arial"/>
                 <w:b/>
-                <w:color w:val="FFFFFF"/>
-                <w:sz w:val="18"/>
+                <w:color w:val="000000"/>
+                <w:sz w:val="24"/>
               </w:rPr>
               <w:t>Criterio</w:t>
             </w:r>
@@ -4969,15 +5826,22 @@
         <w:tc>
           <w:tcPr>
             <w:tcW w:type="dxa" w:w="4608"/>
-            <w:shd w:fill="1F4E79"/>
+            <w:shd w:fill="E7E6E6"/>
             <w:vAlign w:val="center"/>
+            <w:tcMar>
+              <w:top w:w="80" w:type="dxa"/>
+              <w:start w:w="110" w:type="dxa"/>
+              <w:bottom w:w="80" w:type="dxa"/>
+              <w:end w:w="110" w:type="dxa"/>
+            </w:tcMar>
           </w:tcPr>
           <w:p>
             <w:r>
               <w:rPr>
+                <w:rFonts w:ascii="Arial" w:hAnsi="Arial" w:eastAsia="Arial" w:cs="Arial"/>
                 <w:b/>
-                <w:color w:val="FFFFFF"/>
-                <w:sz w:val="18"/>
+                <w:color w:val="000000"/>
+                <w:sz w:val="24"/>
               </w:rPr>
               <w:t>Evidencia</w:t>
             </w:r>
@@ -4986,15 +5850,22 @@
         <w:tc>
           <w:tcPr>
             <w:tcW w:type="dxa" w:w="2016"/>
-            <w:shd w:fill="1F4E79"/>
+            <w:shd w:fill="E7E6E6"/>
             <w:vAlign w:val="center"/>
+            <w:tcMar>
+              <w:top w:w="80" w:type="dxa"/>
+              <w:start w:w="110" w:type="dxa"/>
+              <w:bottom w:w="80" w:type="dxa"/>
+              <w:end w:w="110" w:type="dxa"/>
+            </w:tcMar>
           </w:tcPr>
           <w:p>
             <w:r>
               <w:rPr>
+                <w:rFonts w:ascii="Arial" w:hAnsi="Arial" w:eastAsia="Arial" w:cs="Arial"/>
                 <w:b/>
-                <w:color w:val="FFFFFF"/>
-                <w:sz w:val="18"/>
+                <w:color w:val="000000"/>
+                <w:sz w:val="24"/>
               </w:rPr>
               <w:t>Estado</w:t>
             </w:r>
@@ -5022,7 +5893,9 @@
             </w:pPr>
             <w:r>
               <w:rPr>
-                <w:sz w:val="17"/>
+                <w:rFonts w:ascii="Arial" w:hAnsi="Arial" w:eastAsia="Arial" w:cs="Arial"/>
+                <w:color w:val="000000"/>
+                <w:sz w:val="24"/>
               </w:rPr>
               <w:t>Dataset y comandos</w:t>
             </w:r>
@@ -5045,7 +5918,9 @@
             </w:pPr>
             <w:r>
               <w:rPr>
-                <w:sz w:val="17"/>
+                <w:rFonts w:ascii="Arial" w:hAnsi="Arial" w:eastAsia="Arial" w:cs="Arial"/>
+                <w:color w:val="000000"/>
+                <w:sz w:val="24"/>
               </w:rPr>
               <w:t>CSV con encabezado; 321 recovery excluidas; 0/1/2</w:t>
             </w:r>
@@ -5069,7 +5944,9 @@
             </w:pPr>
             <w:r>
               <w:rPr>
-                <w:sz w:val="17"/>
+                <w:rFonts w:ascii="Arial" w:hAnsi="Arial" w:eastAsia="Arial" w:cs="Arial"/>
+                <w:color w:val="000000"/>
+                <w:sz w:val="24"/>
               </w:rPr>
               <w:t>Cumple</w:t>
             </w:r>
@@ -5097,7 +5974,9 @@
             </w:pPr>
             <w:r>
               <w:rPr>
-                <w:sz w:val="17"/>
+                <w:rFonts w:ascii="Arial" w:hAnsi="Arial" w:eastAsia="Arial" w:cs="Arial"/>
+                <w:color w:val="000000"/>
+                <w:sz w:val="24"/>
               </w:rPr>
               <w:t>Aumento y división</w:t>
             </w:r>
@@ -5120,7 +5999,9 @@
             </w:pPr>
             <w:r>
               <w:rPr>
-                <w:sz w:val="17"/>
+                <w:rFonts w:ascii="Arial" w:hAnsi="Arial" w:eastAsia="Arial" w:cs="Arial"/>
+                <w:color w:val="000000"/>
+                <w:sz w:val="24"/>
               </w:rPr>
               <w:t>&gt;10,000; split por fuente; reflejo y brillo</w:t>
             </w:r>
@@ -5144,7 +6025,9 @@
             </w:pPr>
             <w:r>
               <w:rPr>
-                <w:sz w:val="17"/>
+                <w:rFonts w:ascii="Arial" w:hAnsi="Arial" w:eastAsia="Arial" w:cs="Arial"/>
+                <w:color w:val="000000"/>
+                <w:sz w:val="24"/>
               </w:rPr>
               <w:t>Cumple</w:t>
             </w:r>
@@ -5172,7 +6055,9 @@
             </w:pPr>
             <w:r>
               <w:rPr>
-                <w:sz w:val="17"/>
+                <w:rFonts w:ascii="Arial" w:hAnsi="Arial" w:eastAsia="Arial" w:cs="Arial"/>
+                <w:color w:val="000000"/>
+                <w:sz w:val="24"/>
               </w:rPr>
               <w:t>Notebook</w:t>
             </w:r>
@@ -5195,7 +6080,9 @@
             </w:pPr>
             <w:r>
               <w:rPr>
-                <w:sz w:val="17"/>
+                <w:rFonts w:ascii="Arial" w:hAnsi="Arial" w:eastAsia="Arial" w:cs="Arial"/>
+                <w:color w:val="000000"/>
+                <w:sz w:val="24"/>
               </w:rPr>
               <w:t>Clon, semillas, distribución, arquitectura, curvas, MAE y exportación</w:t>
             </w:r>
@@ -5219,7 +6106,9 @@
             </w:pPr>
             <w:r>
               <w:rPr>
-                <w:sz w:val="17"/>
+                <w:rFonts w:ascii="Arial" w:hAnsi="Arial" w:eastAsia="Arial" w:cs="Arial"/>
+                <w:color w:val="000000"/>
+                <w:sz w:val="24"/>
               </w:rPr>
               <w:t>Cumple</w:t>
             </w:r>
@@ -5247,7 +6136,9 @@
             </w:pPr>
             <w:r>
               <w:rPr>
-                <w:sz w:val="17"/>
+                <w:rFonts w:ascii="Arial" w:hAnsi="Arial" w:eastAsia="Arial" w:cs="Arial"/>
+                <w:color w:val="000000"/>
+                <w:sz w:val="24"/>
               </w:rPr>
               <w:t>Modelo CIL</w:t>
             </w:r>
@@ -5270,7 +6161,9 @@
             </w:pPr>
             <w:r>
               <w:rPr>
-                <w:sz w:val="17"/>
+                <w:rFonts w:ascii="Arial" w:hAnsi="Arial" w:eastAsia="Arial" w:cs="Arial"/>
+                <w:color w:val="000000"/>
+                <w:sz w:val="24"/>
               </w:rPr>
               <w:t>CNN condicionada + callbacks</w:t>
             </w:r>
@@ -5294,7 +6187,9 @@
             </w:pPr>
             <w:r>
               <w:rPr>
-                <w:sz w:val="17"/>
+                <w:rFonts w:ascii="Arial" w:hAnsi="Arial" w:eastAsia="Arial" w:cs="Arial"/>
+                <w:color w:val="000000"/>
+                <w:sz w:val="24"/>
               </w:rPr>
               <w:t>Cumple</w:t>
             </w:r>
@@ -5322,7 +6217,9 @@
             </w:pPr>
             <w:r>
               <w:rPr>
-                <w:sz w:val="17"/>
+                <w:rFonts w:ascii="Arial" w:hAnsi="Arial" w:eastAsia="Arial" w:cs="Arial"/>
+                <w:color w:val="000000"/>
+                <w:sz w:val="24"/>
               </w:rPr>
               <w:t>Portabilidad</w:t>
             </w:r>
@@ -5345,7 +6242,9 @@
             </w:pPr>
             <w:r>
               <w:rPr>
-                <w:sz w:val="17"/>
+                <w:rFonts w:ascii="Arial" w:hAnsi="Arial" w:eastAsia="Arial" w:cs="Arial"/>
+                <w:color w:val="000000"/>
+                <w:sz w:val="24"/>
               </w:rPr>
               <w:t>Rutas relativas y lanzador reproducible</w:t>
             </w:r>
@@ -5369,7 +6268,9 @@
             </w:pPr>
             <w:r>
               <w:rPr>
-                <w:sz w:val="17"/>
+                <w:rFonts w:ascii="Arial" w:hAnsi="Arial" w:eastAsia="Arial" w:cs="Arial"/>
+                <w:color w:val="000000"/>
+                <w:sz w:val="24"/>
               </w:rPr>
               <w:t>Cumple</w:t>
             </w:r>
@@ -5397,7 +6298,9 @@
             </w:pPr>
             <w:r>
               <w:rPr>
-                <w:sz w:val="17"/>
+                <w:rFonts w:ascii="Arial" w:hAnsi="Arial" w:eastAsia="Arial" w:cs="Arial"/>
+                <w:color w:val="000000"/>
+                <w:sz w:val="24"/>
               </w:rPr>
               <w:t>Sensores</w:t>
             </w:r>
@@ -5420,7 +6323,9 @@
             </w:pPr>
             <w:r>
               <w:rPr>
-                <w:sz w:val="17"/>
+                <w:rFonts w:ascii="Arial" w:hAnsi="Arial" w:eastAsia="Arial" w:cs="Arial"/>
+                <w:color w:val="000000"/>
+                <w:sz w:val="24"/>
               </w:rPr>
               <w:t>Recognition, LiDAR, radar, gyro, 3 laterales</w:t>
             </w:r>
@@ -5444,7 +6349,9 @@
             </w:pPr>
             <w:r>
               <w:rPr>
-                <w:sz w:val="17"/>
+                <w:rFonts w:ascii="Arial" w:hAnsi="Arial" w:eastAsia="Arial" w:cs="Arial"/>
+                <w:color w:val="000000"/>
+                <w:sz w:val="24"/>
               </w:rPr>
               <w:t>Cumple</w:t>
             </w:r>
@@ -5472,7 +6379,9 @@
             </w:pPr>
             <w:r>
               <w:rPr>
-                <w:sz w:val="17"/>
+                <w:rFonts w:ascii="Arial" w:hAnsi="Arial" w:eastAsia="Arial" w:cs="Arial"/>
+                <w:color w:val="000000"/>
+                <w:sz w:val="24"/>
               </w:rPr>
               <w:t>Peatón</w:t>
             </w:r>
@@ -5495,7 +6404,9 @@
             </w:pPr>
             <w:r>
               <w:rPr>
-                <w:sz w:val="17"/>
+                <w:rFonts w:ascii="Arial" w:hAnsi="Arial" w:eastAsia="Arial" w:cs="Arial"/>
+                <w:color w:val="000000"/>
+                <w:sz w:val="24"/>
               </w:rPr>
               <w:t>≤15 m, cámara + LiDAR, freno total</w:t>
             </w:r>
@@ -5519,7 +6430,9 @@
             </w:pPr>
             <w:r>
               <w:rPr>
-                <w:sz w:val="17"/>
+                <w:rFonts w:ascii="Arial" w:hAnsi="Arial" w:eastAsia="Arial" w:cs="Arial"/>
+                <w:color w:val="000000"/>
+                <w:sz w:val="24"/>
               </w:rPr>
               <w:t>Cumple</w:t>
             </w:r>
@@ -5547,7 +6460,9 @@
             </w:pPr>
             <w:r>
               <w:rPr>
-                <w:sz w:val="17"/>
+                <w:rFonts w:ascii="Arial" w:hAnsi="Arial" w:eastAsia="Arial" w:cs="Arial"/>
+                <w:color w:val="000000"/>
+                <w:sz w:val="24"/>
               </w:rPr>
               <w:t>Control de distancia</w:t>
             </w:r>
@@ -5570,7 +6485,9 @@
             </w:pPr>
             <w:r>
               <w:rPr>
-                <w:sz w:val="17"/>
+                <w:rFonts w:ascii="Arial" w:hAnsi="Arial" w:eastAsia="Arial" w:cs="Arial"/>
+                <w:color w:val="000000"/>
+                <w:sz w:val="24"/>
               </w:rPr>
               <w:t>25–12 m; alto ≤12; reanuda ≥15</w:t>
             </w:r>
@@ -5594,7 +6511,9 @@
             </w:pPr>
             <w:r>
               <w:rPr>
-                <w:sz w:val="17"/>
+                <w:rFonts w:ascii="Arial" w:hAnsi="Arial" w:eastAsia="Arial" w:cs="Arial"/>
+                <w:color w:val="000000"/>
+                <w:sz w:val="24"/>
               </w:rPr>
               <w:t>Cumple</w:t>
             </w:r>
@@ -5622,7 +6541,9 @@
             </w:pPr>
             <w:r>
               <w:rPr>
-                <w:sz w:val="17"/>
+                <w:rFonts w:ascii="Arial" w:hAnsi="Arial" w:eastAsia="Arial" w:cs="Arial"/>
+                <w:color w:val="000000"/>
+                <w:sz w:val="24"/>
               </w:rPr>
               <w:t>Autobús</w:t>
             </w:r>
@@ -5645,7 +6566,9 @@
             </w:pPr>
             <w:r>
               <w:rPr>
-                <w:sz w:val="17"/>
+                <w:rFonts w:ascii="Arial" w:hAnsi="Arial" w:eastAsia="Arial" w:cs="Arial"/>
+                <w:color w:val="000000"/>
+                <w:sz w:val="24"/>
               </w:rPr>
               <w:t>≤18 m + FSM de evasión</w:t>
             </w:r>
@@ -5669,7 +6592,9 @@
             </w:pPr>
             <w:r>
               <w:rPr>
-                <w:sz w:val="17"/>
+                <w:rFonts w:ascii="Arial" w:hAnsi="Arial" w:eastAsia="Arial" w:cs="Arial"/>
+                <w:color w:val="000000"/>
+                <w:sz w:val="24"/>
               </w:rPr>
               <w:t>Cumple</w:t>
             </w:r>
@@ -5697,7 +6622,9 @@
             </w:pPr>
             <w:r>
               <w:rPr>
-                <w:sz w:val="17"/>
+                <w:rFonts w:ascii="Arial" w:hAnsi="Arial" w:eastAsia="Arial" w:cs="Arial"/>
+                <w:color w:val="000000"/>
+                <w:sz w:val="24"/>
               </w:rPr>
               <w:t>SUMO</w:t>
             </w:r>
@@ -5720,7 +6647,9 @@
             </w:pPr>
             <w:r>
               <w:rPr>
-                <w:sz w:val="17"/>
+                <w:rFonts w:ascii="Arial" w:hAnsi="Arial" w:eastAsia="Arial" w:cs="Arial"/>
+                <w:color w:val="000000"/>
+                <w:sz w:val="24"/>
               </w:rPr>
               <w:t>maxVehicles 30</w:t>
             </w:r>
@@ -5744,7 +6673,9 @@
             </w:pPr>
             <w:r>
               <w:rPr>
-                <w:sz w:val="17"/>
+                <w:rFonts w:ascii="Arial" w:hAnsi="Arial" w:eastAsia="Arial" w:cs="Arial"/>
+                <w:color w:val="000000"/>
+                <w:sz w:val="24"/>
               </w:rPr>
               <w:t>Cumple</w:t>
             </w:r>
@@ -5772,7 +6703,9 @@
             </w:pPr>
             <w:r>
               <w:rPr>
-                <w:sz w:val="17"/>
+                <w:rFonts w:ascii="Arial" w:hAnsi="Arial" w:eastAsia="Arial" w:cs="Arial"/>
+                <w:color w:val="000000"/>
+                <w:sz w:val="24"/>
               </w:rPr>
               <w:t>Tres rutas</w:t>
             </w:r>
@@ -5795,7 +6728,9 @@
             </w:pPr>
             <w:r>
               <w:rPr>
-                <w:sz w:val="17"/>
+                <w:rFonts w:ascii="Arial" w:hAnsi="Arial" w:eastAsia="Arial" w:cs="Arial"/>
+                <w:color w:val="000000"/>
+                <w:sz w:val="24"/>
               </w:rPr>
               <w:t>Presets, logs y clips completos</w:t>
             </w:r>
@@ -5819,7 +6754,9 @@
             </w:pPr>
             <w:r>
               <w:rPr>
-                <w:sz w:val="17"/>
+                <w:rFonts w:ascii="Arial" w:hAnsi="Arial" w:eastAsia="Arial" w:cs="Arial"/>
+                <w:color w:val="000000"/>
+                <w:sz w:val="24"/>
               </w:rPr>
               <w:t>Cumple</w:t>
             </w:r>
@@ -5847,7 +6784,9 @@
             </w:pPr>
             <w:r>
               <w:rPr>
-                <w:sz w:val="17"/>
+                <w:rFonts w:ascii="Arial" w:hAnsi="Arial" w:eastAsia="Arial" w:cs="Arial"/>
+                <w:color w:val="000000"/>
+                <w:sz w:val="24"/>
               </w:rPr>
               <w:t>Recorridos completos</w:t>
             </w:r>
@@ -5870,7 +6809,9 @@
             </w:pPr>
             <w:r>
               <w:rPr>
-                <w:sz w:val="17"/>
+                <w:rFonts w:ascii="Arial" w:hAnsi="Arial" w:eastAsia="Arial" w:cs="Arial"/>
+                <w:color w:val="000000"/>
+                <w:sz w:val="24"/>
               </w:rPr>
               <w:t>Dos recorridos limpios por ruta</w:t>
             </w:r>
@@ -5894,7 +6835,9 @@
             </w:pPr>
             <w:r>
               <w:rPr>
-                <w:sz w:val="17"/>
+                <w:rFonts w:ascii="Arial" w:hAnsi="Arial" w:eastAsia="Arial" w:cs="Arial"/>
+                <w:color w:val="000000"/>
+                <w:sz w:val="24"/>
               </w:rPr>
               <w:t>Cumple</w:t>
             </w:r>
@@ -5922,7 +6865,9 @@
             </w:pPr>
             <w:r>
               <w:rPr>
-                <w:sz w:val="17"/>
+                <w:rFonts w:ascii="Arial" w:hAnsi="Arial" w:eastAsia="Arial" w:cs="Arial"/>
+                <w:color w:val="000000"/>
+                <w:sz w:val="24"/>
               </w:rPr>
               <w:t>Reporte</w:t>
             </w:r>
@@ -5945,7 +6890,9 @@
             </w:pPr>
             <w:r>
               <w:rPr>
-                <w:sz w:val="17"/>
+                <w:rFonts w:ascii="Arial" w:hAnsi="Arial" w:eastAsia="Arial" w:cs="Arial"/>
+                <w:color w:val="000000"/>
+                <w:sz w:val="24"/>
               </w:rPr>
               <w:t>Español, anexos completos, figuras reales</w:t>
             </w:r>
@@ -5969,7 +6916,9 @@
             </w:pPr>
             <w:r>
               <w:rPr>
-                <w:sz w:val="17"/>
+                <w:rFonts w:ascii="Arial" w:hAnsi="Arial" w:eastAsia="Arial" w:cs="Arial"/>
+                <w:color w:val="000000"/>
+                <w:sz w:val="24"/>
               </w:rPr>
               <w:t>Cumple</w:t>
             </w:r>
@@ -5997,7 +6946,9 @@
             </w:pPr>
             <w:r>
               <w:rPr>
-                <w:sz w:val="17"/>
+                <w:rFonts w:ascii="Arial" w:hAnsi="Arial" w:eastAsia="Arial" w:cs="Arial"/>
+                <w:color w:val="000000"/>
+                <w:sz w:val="24"/>
               </w:rPr>
               <w:t>Video</w:t>
             </w:r>
@@ -6020,7 +6971,9 @@
             </w:pPr>
             <w:r>
               <w:rPr>
-                <w:sz w:val="17"/>
+                <w:rFonts w:ascii="Arial" w:hAnsi="Arial" w:eastAsia="Arial" w:cs="Arial"/>
+                <w:color w:val="000000"/>
+                <w:sz w:val="24"/>
               </w:rPr>
               <w:t>Guion 5:35, cuatro integrantes</w:t>
             </w:r>
@@ -6044,7 +6997,9 @@
             </w:pPr>
             <w:r>
               <w:rPr>
-                <w:sz w:val="17"/>
+                <w:rFonts w:ascii="Arial" w:hAnsi="Arial" w:eastAsia="Arial" w:cs="Arial"/>
+                <w:color w:val="000000"/>
+                <w:sz w:val="24"/>
               </w:rPr>
               <w:t>Guion cumple; grabación pendiente</w:t>
             </w:r>
@@ -6072,7 +7027,9 @@
             </w:pPr>
             <w:r>
               <w:rPr>
-                <w:sz w:val="17"/>
+                <w:rFonts w:ascii="Arial" w:hAnsi="Arial" w:eastAsia="Arial" w:cs="Arial"/>
+                <w:color w:val="000000"/>
+                <w:sz w:val="24"/>
               </w:rPr>
               <w:t>YouTube</w:t>
             </w:r>
@@ -6095,7 +7052,9 @@
             </w:pPr>
             <w:r>
               <w:rPr>
-                <w:sz w:val="17"/>
+                <w:rFonts w:ascii="Arial" w:hAnsi="Arial" w:eastAsia="Arial" w:cs="Arial"/>
+                <w:color w:val="000000"/>
+                <w:sz w:val="24"/>
               </w:rPr>
               <w:t>URL pública real</w:t>
             </w:r>
@@ -6119,7 +7078,9 @@
             </w:pPr>
             <w:r>
               <w:rPr>
-                <w:sz w:val="17"/>
+                <w:rFonts w:ascii="Arial" w:hAnsi="Arial" w:eastAsia="Arial" w:cs="Arial"/>
+                <w:color w:val="000000"/>
+                <w:sz w:val="24"/>
               </w:rPr>
               <w:t>Pendiente de publicación</w:t>
             </w:r>
@@ -6137,6 +7098,11 @@
         <w:pStyle w:val="Heading1"/>
       </w:pPr>
       <w:r>
+        <w:rPr>
+          <w:rFonts w:ascii="Arial" w:hAnsi="Arial" w:eastAsia="Arial" w:cs="Arial"/>
+          <w:color w:val="000000"/>
+          <w:sz w:val="24"/>
+        </w:rPr>
         <w:t>Referencias</w:t>
       </w:r>
     </w:p>
@@ -6145,6 +7111,11 @@
         <w:ind w:left="432" w:hanging="432"/>
       </w:pPr>
       <w:r>
+        <w:rPr>
+          <w:rFonts w:ascii="Arial" w:hAnsi="Arial" w:eastAsia="Arial" w:cs="Arial"/>
+          <w:color w:val="000000"/>
+          <w:sz w:val="24"/>
+        </w:rPr>
         <w:t>Codevilla, F., Müller, M., López, A., Koltun, V. y Dosovitskiy, A. (2018). End-to-End Driving Via Conditional Imitation Learning. https://arxiv.org/abs/1710.02410</w:t>
       </w:r>
     </w:p>
@@ -6153,6 +7124,11 @@
         <w:ind w:left="432" w:hanging="432"/>
       </w:pPr>
       <w:r>
+        <w:rPr>
+          <w:rFonts w:ascii="Arial" w:hAnsi="Arial" w:eastAsia="Arial" w:cs="Arial"/>
+          <w:color w:val="000000"/>
+          <w:sz w:val="24"/>
+        </w:rPr>
         <w:t>CARLA Simulator. Imitation Learning — repositorio oficial. https://github.com/carla-simulator/imitation-learning</w:t>
       </w:r>
     </w:p>
@@ -6161,6 +7137,11 @@
         <w:ind w:left="432" w:hanging="432"/>
       </w:pPr>
       <w:r>
+        <w:rPr>
+          <w:rFonts w:ascii="Arial" w:hAnsi="Arial" w:eastAsia="Arial" w:cs="Arial"/>
+          <w:color w:val="000000"/>
+          <w:sz w:val="24"/>
+        </w:rPr>
         <w:t>Bojarski, M. et al. (2016). End to End Learning for Self-Driving Cars. arXiv:1604.07316.</w:t>
       </w:r>
     </w:p>
@@ -6169,6 +7150,11 @@
         <w:ind w:left="432" w:hanging="432"/>
       </w:pPr>
       <w:r>
+        <w:rPr>
+          <w:rFonts w:ascii="Arial" w:hAnsi="Arial" w:eastAsia="Arial" w:cs="Arial"/>
+          <w:color w:val="000000"/>
+          <w:sz w:val="24"/>
+        </w:rPr>
         <w:t>Cyberbotics. (2025). Webots R2025a Reference Manual. https://cyberbotics.com/doc/reference/index</w:t>
       </w:r>
     </w:p>
@@ -6177,6 +7163,11 @@
         <w:ind w:left="432" w:hanging="432"/>
       </w:pPr>
       <w:r>
+        <w:rPr>
+          <w:rFonts w:ascii="Arial" w:hAnsi="Arial" w:eastAsia="Arial" w:cs="Arial"/>
+          <w:color w:val="000000"/>
+          <w:sz w:val="24"/>
+        </w:rPr>
         <w:t>Eclipse SUMO. (2026). Simulation of Urban MObility documentation. https://sumo.dlr.de/docs/</w:t>
       </w:r>
     </w:p>
@@ -6185,17 +7176,25 @@
         <w:ind w:left="432" w:hanging="432"/>
       </w:pPr>
       <w:r>
+        <w:rPr>
+          <w:rFonts w:ascii="Arial" w:hAnsi="Arial" w:eastAsia="Arial" w:cs="Arial"/>
+          <w:color w:val="000000"/>
+          <w:sz w:val="24"/>
+        </w:rPr>
         <w:t>OpenAI. (2026). Codex (basado en GPT-5) [asistente de programación].</w:t>
       </w:r>
     </w:p>
     <w:p>
       <w:pPr>
         <w:sectPr>
-          <w:footerReference w:type="default" r:id="rId15"/>
-          <w:headerReference w:type="default" r:id="rId16"/>
+          <w:footerReference w:type="default" r:id="rId16"/>
+          <w:headerReference w:type="default" r:id="rId17"/>
+          <w:headerReference w:type="first" r:id="rId20"/>
+          <w:footerReference w:type="first" r:id="rId21"/>
           <w:pgSz w:w="12240" w:h="15840"/>
-          <w:pgMar w:top="1123" w:right="1224" w:bottom="1037" w:left="1224" w:header="720" w:footer="720" w:gutter="0"/>
+          <w:pgMar w:top="1440" w:right="1440" w:bottom="1440" w:left="1440" w:header="720" w:footer="720" w:gutter="0"/>
           <w:cols w:space="720"/>
+          <w:titlePg/>
           <w:docGrid w:linePitch="360"/>
         </w:sectPr>
       </w:pPr>
@@ -6205,11 +7204,21 @@
         <w:pStyle w:val="Heading1"/>
       </w:pPr>
       <w:r>
+        <w:rPr>
+          <w:rFonts w:ascii="Arial" w:hAnsi="Arial" w:eastAsia="Arial" w:cs="Arial"/>
+          <w:color w:val="000000"/>
+          <w:sz w:val="24"/>
+        </w:rPr>
         <w:t>Anexo A. Controlador de captura completo</w:t>
       </w:r>
     </w:p>
     <w:p>
       <w:r>
+        <w:rPr>
+          <w:rFonts w:ascii="Arial" w:hAnsi="Arial" w:eastAsia="Arial" w:cs="Arial"/>
+          <w:color w:val="000000"/>
+          <w:sz w:val="24"/>
+        </w:rPr>
         <w:t>Código íntegro y comentado de `controllers/cil_dataset_recorder/cil_dataset_recorder.py`.</w:t>
       </w:r>
     </w:p>
@@ -6218,6 +7227,11 @@
         <w:pStyle w:val="Heading2"/>
       </w:pPr>
       <w:r>
+        <w:rPr>
+          <w:rFonts w:ascii="Arial" w:hAnsi="Arial" w:eastAsia="Arial" w:cs="Arial"/>
+          <w:color w:val="000000"/>
+          <w:sz w:val="24"/>
+        </w:rPr>
         <w:t>A.1 Fuente</w:t>
       </w:r>
     </w:p>
@@ -6230,7 +7244,8 @@
       </w:pPr>
       <w:r>
         <w:rPr>
-          <w:rFonts w:ascii="Menlo" w:hAnsi="Menlo" w:eastAsia="Menlo"/>
+          <w:rFonts w:ascii="Menlo" w:hAnsi="Menlo" w:eastAsia="Menlo" w:cs="Menlo"/>
+          <w:color w:val="000000"/>
           <w:sz w:val="13"/>
         </w:rPr>
         <w:t>"""Control manual y captura automatica del dataset CIL en World 1.</w:t>
@@ -6297,7 +7312,8 @@
       </w:pPr>
       <w:r>
         <w:rPr>
-          <w:rFonts w:ascii="Menlo" w:hAnsi="Menlo" w:eastAsia="Menlo"/>
+          <w:rFonts w:ascii="Menlo" w:hAnsi="Menlo" w:eastAsia="Menlo" w:cs="Menlo"/>
+          <w:color w:val="000000"/>
           <w:sz w:val="13"/>
         </w:rPr>
         <w:t>def ensure_csv_header(csv_path: Path) -&gt; None:</w:t>
@@ -6368,7 +7384,8 @@
       </w:pPr>
       <w:r>
         <w:rPr>
-          <w:rFonts w:ascii="Menlo" w:hAnsi="Menlo" w:eastAsia="Menlo"/>
+          <w:rFonts w:ascii="Menlo" w:hAnsi="Menlo" w:eastAsia="Menlo" w:cs="Menlo"/>
+          <w:color w:val="000000"/>
           <w:sz w:val="13"/>
         </w:rPr>
         <w:br/>
@@ -6441,7 +7458,8 @@
       </w:pPr>
       <w:r>
         <w:rPr>
-          <w:rFonts w:ascii="Menlo" w:hAnsi="Menlo" w:eastAsia="Menlo"/>
+          <w:rFonts w:ascii="Menlo" w:hAnsi="Menlo" w:eastAsia="Menlo" w:cs="Menlo"/>
+          <w:color w:val="000000"/>
           <w:sz w:val="13"/>
         </w:rPr>
         <w:t xml:space="preserve">        camera.saveImage(str(image_path), 100)</w:t>
@@ -6477,6 +7495,11 @@
     </w:p>
     <w:p>
       <w:r>
+        <w:rPr>
+          <w:rFonts w:ascii="Arial" w:hAnsi="Arial" w:eastAsia="Arial" w:cs="Arial"/>
+          <w:color w:val="000000"/>
+          <w:sz w:val="24"/>
+        </w:rPr>
         <w:br w:type="page"/>
       </w:r>
     </w:p>
@@ -6485,11 +7508,21 @@
         <w:pStyle w:val="Heading1"/>
       </w:pPr>
       <w:r>
+        <w:rPr>
+          <w:rFonts w:ascii="Arial" w:hAnsi="Arial" w:eastAsia="Arial" w:cs="Arial"/>
+          <w:color w:val="000000"/>
+          <w:sz w:val="24"/>
+        </w:rPr>
         <w:t>Anexo B. Controlador autónomo completo</w:t>
       </w:r>
     </w:p>
     <w:p>
       <w:r>
+        <w:rPr>
+          <w:rFonts w:ascii="Arial" w:hAnsi="Arial" w:eastAsia="Arial" w:cs="Arial"/>
+          <w:color w:val="000000"/>
+          <w:sz w:val="24"/>
+        </w:rPr>
         <w:t>Código íntegro y comentado de `controllers/cil_autonomous_driver/cil_autonomous_driver.py`.</w:t>
       </w:r>
     </w:p>
@@ -6498,6 +7531,11 @@
         <w:pStyle w:val="Heading2"/>
       </w:pPr>
       <w:r>
+        <w:rPr>
+          <w:rFonts w:ascii="Arial" w:hAnsi="Arial" w:eastAsia="Arial" w:cs="Arial"/>
+          <w:color w:val="000000"/>
+          <w:sz w:val="24"/>
+        </w:rPr>
         <w:t>B.1 Fuente</w:t>
       </w:r>
     </w:p>
@@ -6510,7 +7548,8 @@
       </w:pPr>
       <w:r>
         <w:rPr>
-          <w:rFonts w:ascii="Menlo" w:hAnsi="Menlo" w:eastAsia="Menlo"/>
+          <w:rFonts w:ascii="Menlo" w:hAnsi="Menlo" w:eastAsia="Menlo" w:cs="Menlo"/>
+          <w:color w:val="000000"/>
           <w:sz w:val="13"/>
         </w:rPr>
         <w:t>"""Controlador CIL y arbitro de seguridad para World 2.</w:t>
@@ -6580,7 +7619,8 @@
       </w:pPr>
       <w:r>
         <w:rPr>
-          <w:rFonts w:ascii="Menlo" w:hAnsi="Menlo" w:eastAsia="Menlo"/>
+          <w:rFonts w:ascii="Menlo" w:hAnsi="Menlo" w:eastAsia="Menlo" w:cs="Menlo"/>
+          <w:color w:val="000000"/>
           <w:sz w:val="13"/>
         </w:rPr>
         <w:br/>
@@ -6650,7 +7690,8 @@
       </w:pPr>
       <w:r>
         <w:rPr>
-          <w:rFonts w:ascii="Menlo" w:hAnsi="Menlo" w:eastAsia="Menlo"/>
+          <w:rFonts w:ascii="Menlo" w:hAnsi="Menlo" w:eastAsia="Menlo" w:cs="Menlo"/>
+          <w:color w:val="000000"/>
           <w:sz w:val="13"/>
         </w:rPr>
         <w:t xml:space="preserve">    """Encode one validated command for the model's second input."""</w:t>
@@ -6721,7 +7762,8 @@
       </w:pPr>
       <w:r>
         <w:rPr>
-          <w:rFonts w:ascii="Menlo" w:hAnsi="Menlo" w:eastAsia="Menlo"/>
+          <w:rFonts w:ascii="Menlo" w:hAnsi="Menlo" w:eastAsia="Menlo" w:cs="Menlo"/>
+          <w:color w:val="000000"/>
           <w:sz w:val="13"/>
         </w:rPr>
         <w:t xml:space="preserve">        FOLLOW_CONTROL_DISTANCE_M - FOLLOW_STOP_DISTANCE_M</w:t>
@@ -6794,7 +7836,8 @@
       </w:pPr>
       <w:r>
         <w:rPr>
-          <w:rFonts w:ascii="Menlo" w:hAnsi="Menlo" w:eastAsia="Menlo"/>
+          <w:rFonts w:ascii="Menlo" w:hAnsi="Menlo" w:eastAsia="Menlo" w:cs="Menlo"/>
+          <w:color w:val="000000"/>
           <w:sz w:val="13"/>
         </w:rPr>
         <w:t xml:space="preserve">            return -0.42, True, False, None</w:t>
@@ -6867,7 +7910,8 @@
       </w:pPr>
       <w:r>
         <w:rPr>
-          <w:rFonts w:ascii="Menlo" w:hAnsi="Menlo" w:eastAsia="Menlo"/>
+          <w:rFonts w:ascii="Menlo" w:hAnsi="Menlo" w:eastAsia="Menlo" w:cs="Menlo"/>
+          <w:color w:val="000000"/>
           <w:sz w:val="13"/>
         </w:rPr>
         <w:br/>
@@ -6938,7 +7982,8 @@
       </w:pPr>
       <w:r>
         <w:rPr>
-          <w:rFonts w:ascii="Menlo" w:hAnsi="Menlo" w:eastAsia="Menlo"/>
+          <w:rFonts w:ascii="Menlo" w:hAnsi="Menlo" w:eastAsia="Menlo" w:cs="Menlo"/>
+          <w:color w:val="000000"/>
           <w:sz w:val="13"/>
         </w:rPr>
         <w:t xml:space="preserve">        model = str(obj.getModel()).lower()</w:t>
@@ -7009,7 +8054,8 @@
       </w:pPr>
       <w:r>
         <w:rPr>
-          <w:rFonts w:ascii="Menlo" w:hAnsi="Menlo" w:eastAsia="Menlo"/>
+          <w:rFonts w:ascii="Menlo" w:hAnsi="Menlo" w:eastAsia="Menlo" w:cs="Menlo"/>
+          <w:color w:val="000000"/>
           <w:sz w:val="13"/>
         </w:rPr>
         <w:t xml:space="preserve">    rear = distances["rear"]</w:t>
@@ -7080,7 +8126,8 @@
       </w:pPr>
       <w:r>
         <w:rPr>
-          <w:rFonts w:ascii="Menlo" w:hAnsi="Menlo" w:eastAsia="Menlo"/>
+          <w:rFonts w:ascii="Menlo" w:hAnsi="Menlo" w:eastAsia="Menlo" w:cs="Menlo"/>
+          <w:color w:val="000000"/>
           <w:sz w:val="13"/>
         </w:rPr>
         <w:br/>
@@ -7154,7 +8201,8 @@
       </w:pPr>
       <w:r>
         <w:rPr>
-          <w:rFonts w:ascii="Menlo" w:hAnsi="Menlo" w:eastAsia="Menlo"/>
+          <w:rFonts w:ascii="Menlo" w:hAnsi="Menlo" w:eastAsia="Menlo" w:cs="Menlo"/>
+          <w:color w:val="000000"/>
           <w:sz w:val="13"/>
         </w:rPr>
         <w:t xml:space="preserve">            (camera.getWidth(), camera.getHeight()),</w:t>
@@ -7228,7 +8276,8 @@
       </w:pPr>
       <w:r>
         <w:rPr>
-          <w:rFonts w:ascii="Menlo" w:hAnsi="Menlo" w:eastAsia="Menlo"/>
+          <w:rFonts w:ascii="Menlo" w:hAnsi="Menlo" w:eastAsia="Menlo" w:cs="Menlo"/>
+          <w:color w:val="000000"/>
           <w:sz w:val="13"/>
         </w:rPr>
         <w:t xml:space="preserve">    while driver.step() != -1:</w:t>
@@ -7303,7 +8352,8 @@
       </w:pPr>
       <w:r>
         <w:rPr>
-          <w:rFonts w:ascii="Menlo" w:hAnsi="Menlo" w:eastAsia="Menlo"/>
+          <w:rFonts w:ascii="Menlo" w:hAnsi="Menlo" w:eastAsia="Menlo" w:cs="Menlo"/>
+          <w:color w:val="000000"/>
           <w:sz w:val="13"/>
         </w:rPr>
         <w:t xml:space="preserve">            )</w:t>
@@ -7377,7 +8427,8 @@
       </w:pPr>
       <w:r>
         <w:rPr>
-          <w:rFonts w:ascii="Menlo" w:hAnsi="Menlo" w:eastAsia="Menlo"/>
+          <w:rFonts w:ascii="Menlo" w:hAnsi="Menlo" w:eastAsia="Menlo" w:cs="Menlo"/>
+          <w:color w:val="000000"/>
           <w:sz w:val="13"/>
         </w:rPr>
         <w:t xml:space="preserve">            if state is AvoidanceState.SEPARATE_LEFT:</w:t>
@@ -7454,7 +8505,8 @@
       </w:pPr>
       <w:r>
         <w:rPr>
-          <w:rFonts w:ascii="Menlo" w:hAnsi="Menlo" w:eastAsia="Menlo"/>
+          <w:rFonts w:ascii="Menlo" w:hAnsi="Menlo" w:eastAsia="Menlo" w:cs="Menlo"/>
+          <w:color w:val="000000"/>
           <w:sz w:val="13"/>
         </w:rPr>
         <w:t xml:space="preserve">                )</w:t>
@@ -7529,7 +8581,8 @@
       </w:pPr>
       <w:r>
         <w:rPr>
-          <w:rFonts w:ascii="Menlo" w:hAnsi="Menlo" w:eastAsia="Menlo"/>
+          <w:rFonts w:ascii="Menlo" w:hAnsi="Menlo" w:eastAsia="Menlo" w:cs="Menlo"/>
+          <w:color w:val="000000"/>
           <w:sz w:val="13"/>
         </w:rPr>
         <w:t xml:space="preserve">        driver.setSteeringAngle(steering_command)</w:t>
@@ -7583,11 +8636,6 @@
         <w:t>if __name__ == "__main__":</w:t>
         <w:br/>
         <w:t xml:space="preserve">    main()</w:t>
-      </w:r>
-    </w:p>
-    <w:p>
-      <w:r>
-        <w:br w:type="page"/>
       </w:r>
     </w:p>
     <w:p>
@@ -7595,6 +8643,11 @@
         <w:pStyle w:val="Heading1"/>
       </w:pPr>
       <w:r>
+        <w:rPr>
+          <w:rFonts w:ascii="Arial" w:hAnsi="Arial" w:eastAsia="Arial" w:cs="Arial"/>
+          <w:color w:val="000000"/>
+          <w:sz w:val="24"/>
+        </w:rPr>
         <w:t>Anexo C. Celdas de código del notebook</w:t>
       </w:r>
     </w:p>
@@ -7603,6 +8656,11 @@
         <w:pStyle w:val="Heading2"/>
       </w:pPr>
       <w:r>
+        <w:rPr>
+          <w:rFonts w:ascii="Arial" w:hAnsi="Arial" w:eastAsia="Arial" w:cs="Arial"/>
+          <w:color w:val="000000"/>
+          <w:sz w:val="24"/>
+        </w:rPr>
         <w:t>C.1 Celda 1</w:t>
       </w:r>
     </w:p>
@@ -7615,7 +8673,8 @@
       </w:pPr>
       <w:r>
         <w:rPr>
-          <w:rFonts w:ascii="Menlo" w:hAnsi="Menlo" w:eastAsia="Menlo"/>
+          <w:rFonts w:ascii="Menlo" w:hAnsi="Menlo" w:eastAsia="Menlo" w:cs="Menlo"/>
+          <w:color w:val="000000"/>
           <w:sz w:val="13"/>
         </w:rPr>
         <w:t># Primera celda de codigo requerida por la actividad: clonar el dataset desde GitHub.</w:t>
@@ -7652,6 +8711,11 @@
         <w:pStyle w:val="Heading2"/>
       </w:pPr>
       <w:r>
+        <w:rPr>
+          <w:rFonts w:ascii="Arial" w:hAnsi="Arial" w:eastAsia="Arial" w:cs="Arial"/>
+          <w:color w:val="000000"/>
+          <w:sz w:val="24"/>
+        </w:rPr>
         <w:t>C.2 Celda 2</w:t>
       </w:r>
     </w:p>
@@ -7664,7 +8728,8 @@
       </w:pPr>
       <w:r>
         <w:rPr>
-          <w:rFonts w:ascii="Menlo" w:hAnsi="Menlo" w:eastAsia="Menlo"/>
+          <w:rFonts w:ascii="Menlo" w:hAnsi="Menlo" w:eastAsia="Menlo" w:cs="Menlo"/>
+          <w:color w:val="000000"/>
           <w:sz w:val="13"/>
         </w:rPr>
         <w:t>import json, math, random, shutil</w:t>
@@ -7737,7 +8802,8 @@
       </w:pPr>
       <w:r>
         <w:rPr>
-          <w:rFonts w:ascii="Menlo" w:hAnsi="Menlo" w:eastAsia="Menlo"/>
+          <w:rFonts w:ascii="Menlo" w:hAnsi="Menlo" w:eastAsia="Menlo" w:cs="Menlo"/>
+          <w:color w:val="000000"/>
           <w:sz w:val="13"/>
         </w:rPr>
         <w:t>FIGURES = PROJECT_ROOT / "docs" / "figures"</w:t>
@@ -7754,6 +8820,11 @@
         <w:pStyle w:val="Heading2"/>
       </w:pPr>
       <w:r>
+        <w:rPr>
+          <w:rFonts w:ascii="Arial" w:hAnsi="Arial" w:eastAsia="Arial" w:cs="Arial"/>
+          <w:color w:val="000000"/>
+          <w:sz w:val="24"/>
+        </w:rPr>
         <w:t>C.3 Celda 3</w:t>
       </w:r>
     </w:p>
@@ -7766,7 +8837,8 @@
       </w:pPr>
       <w:r>
         <w:rPr>
-          <w:rFonts w:ascii="Menlo" w:hAnsi="Menlo" w:eastAsia="Menlo"/>
+          <w:rFonts w:ascii="Menlo" w:hAnsi="Menlo" w:eastAsia="Menlo" w:cs="Menlo"/>
+          <w:color w:val="000000"/>
           <w:sz w:val="13"/>
         </w:rPr>
         <w:t>raw_df = pd.read_csv(RAW_CSV)</w:t>
@@ -7813,6 +8885,11 @@
         <w:pStyle w:val="Heading2"/>
       </w:pPr>
       <w:r>
+        <w:rPr>
+          <w:rFonts w:ascii="Arial" w:hAnsi="Arial" w:eastAsia="Arial" w:cs="Arial"/>
+          <w:color w:val="000000"/>
+          <w:sz w:val="24"/>
+        </w:rPr>
         <w:t>C.4 Celda 4</w:t>
       </w:r>
     </w:p>
@@ -7825,7 +8902,8 @@
       </w:pPr>
       <w:r>
         <w:rPr>
-          <w:rFonts w:ascii="Menlo" w:hAnsi="Menlo" w:eastAsia="Menlo"/>
+          <w:rFonts w:ascii="Menlo" w:hAnsi="Menlo" w:eastAsia="Menlo" w:cs="Menlo"/>
+          <w:color w:val="000000"/>
           <w:sz w:val="13"/>
         </w:rPr>
         <w:t>train_raw, val_raw = train_test_split(</w:t>
@@ -7899,7 +8977,8 @@
       </w:pPr>
       <w:r>
         <w:rPr>
-          <w:rFonts w:ascii="Menlo" w:hAnsi="Menlo" w:eastAsia="Menlo"/>
+          <w:rFonts w:ascii="Menlo" w:hAnsi="Menlo" w:eastAsia="Menlo" w:cs="Menlo"/>
+          <w:color w:val="000000"/>
           <w:sz w:val="13"/>
         </w:rPr>
         <w:t xml:space="preserve">            raise IOError(f"No se pudo escribir {output_name}")</w:t>
@@ -7972,7 +9051,8 @@
       </w:pPr>
       <w:r>
         <w:rPr>
-          <w:rFonts w:ascii="Menlo" w:hAnsi="Menlo" w:eastAsia="Menlo"/>
+          <w:rFonts w:ascii="Menlo" w:hAnsi="Menlo" w:eastAsia="Menlo" w:cs="Menlo"/>
+          <w:color w:val="000000"/>
           <w:sz w:val="13"/>
         </w:rPr>
         <w:t>train_df = augmented_df.query("split == 'train'").reset_index(drop=True)</w:t>
@@ -7995,6 +9075,11 @@
         <w:pStyle w:val="Heading2"/>
       </w:pPr>
       <w:r>
+        <w:rPr>
+          <w:rFonts w:ascii="Arial" w:hAnsi="Arial" w:eastAsia="Arial" w:cs="Arial"/>
+          <w:color w:val="000000"/>
+          <w:sz w:val="24"/>
+        </w:rPr>
         <w:t>C.5 Celda 5</w:t>
       </w:r>
     </w:p>
@@ -8007,7 +9092,8 @@
       </w:pPr>
       <w:r>
         <w:rPr>
-          <w:rFonts w:ascii="Menlo" w:hAnsi="Menlo" w:eastAsia="Menlo"/>
+          <w:rFonts w:ascii="Menlo" w:hAnsi="Menlo" w:eastAsia="Menlo" w:cs="Menlo"/>
+          <w:color w:val="000000"/>
           <w:sz w:val="13"/>
         </w:rPr>
         <w:t>def preprocess_image(path):</w:t>
@@ -8079,7 +9165,8 @@
       </w:pPr>
       <w:r>
         <w:rPr>
-          <w:rFonts w:ascii="Menlo" w:hAnsi="Menlo" w:eastAsia="Menlo"/>
+          <w:rFonts w:ascii="Menlo" w:hAnsi="Menlo" w:eastAsia="Menlo" w:cs="Menlo"/>
+          <w:color w:val="000000"/>
           <w:sz w:val="13"/>
         </w:rPr>
         <w:t>train_gen = CILSequence(train_df, shuffle=True)</w:t>
@@ -8096,6 +9183,11 @@
         <w:pStyle w:val="Heading2"/>
       </w:pPr>
       <w:r>
+        <w:rPr>
+          <w:rFonts w:ascii="Arial" w:hAnsi="Arial" w:eastAsia="Arial" w:cs="Arial"/>
+          <w:color w:val="000000"/>
+          <w:sz w:val="24"/>
+        </w:rPr>
         <w:t>C.6 Celda 6</w:t>
       </w:r>
     </w:p>
@@ -8108,7 +9200,8 @@
       </w:pPr>
       <w:r>
         <w:rPr>
-          <w:rFonts w:ascii="Menlo" w:hAnsi="Menlo" w:eastAsia="Menlo"/>
+          <w:rFonts w:ascii="Menlo" w:hAnsi="Menlo" w:eastAsia="Menlo" w:cs="Menlo"/>
+          <w:color w:val="000000"/>
           <w:sz w:val="13"/>
         </w:rPr>
         <w:t>image_input = Input(shape=(IMG_H, IMG_W, 3), name="image_input")</w:t>
@@ -8153,6 +9246,11 @@
         <w:pStyle w:val="Heading2"/>
       </w:pPr>
       <w:r>
+        <w:rPr>
+          <w:rFonts w:ascii="Arial" w:hAnsi="Arial" w:eastAsia="Arial" w:cs="Arial"/>
+          <w:color w:val="000000"/>
+          <w:sz w:val="24"/>
+        </w:rPr>
         <w:t>C.7 Celda 7</w:t>
       </w:r>
     </w:p>
@@ -8165,7 +9263,8 @@
       </w:pPr>
       <w:r>
         <w:rPr>
-          <w:rFonts w:ascii="Menlo" w:hAnsi="Menlo" w:eastAsia="Menlo"/>
+          <w:rFonts w:ascii="Menlo" w:hAnsi="Menlo" w:eastAsia="Menlo" w:cs="Menlo"/>
+          <w:color w:val="000000"/>
           <w:sz w:val="13"/>
         </w:rPr>
         <w:t>checkpoint = MODEL_DIR / "cil_model_best.h5"</w:t>
@@ -8200,6 +9299,11 @@
         <w:pStyle w:val="Heading2"/>
       </w:pPr>
       <w:r>
+        <w:rPr>
+          <w:rFonts w:ascii="Arial" w:hAnsi="Arial" w:eastAsia="Arial" w:cs="Arial"/>
+          <w:color w:val="000000"/>
+          <w:sz w:val="24"/>
+        </w:rPr>
         <w:t>C.8 Celda 8</w:t>
       </w:r>
     </w:p>
@@ -8212,7 +9316,8 @@
       </w:pPr>
       <w:r>
         <w:rPr>
-          <w:rFonts w:ascii="Menlo" w:hAnsi="Menlo" w:eastAsia="Menlo"/>
+          <w:rFonts w:ascii="Menlo" w:hAnsi="Menlo" w:eastAsia="Menlo" w:cs="Menlo"/>
+          <w:color w:val="000000"/>
           <w:sz w:val="13"/>
         </w:rPr>
         <w:t>history_df = pd.DataFrame(history.history)</w:t>
@@ -8288,7 +9393,8 @@
       </w:pPr>
       <w:r>
         <w:rPr>
-          <w:rFonts w:ascii="Menlo" w:hAnsi="Menlo" w:eastAsia="Menlo"/>
+          <w:rFonts w:ascii="Menlo" w:hAnsi="Menlo" w:eastAsia="Menlo" w:cs="Menlo"/>
+          <w:color w:val="000000"/>
           <w:sz w:val="13"/>
         </w:rPr>
         <w:t xml:space="preserve">    "augmented_samples": int(len(augmented_df)),</w:t>
@@ -8311,6 +9417,11 @@
         <w:pStyle w:val="Heading2"/>
       </w:pPr>
       <w:r>
+        <w:rPr>
+          <w:rFonts w:ascii="Arial" w:hAnsi="Arial" w:eastAsia="Arial" w:cs="Arial"/>
+          <w:color w:val="000000"/>
+          <w:sz w:val="24"/>
+        </w:rPr>
         <w:t>C.9 Celda 9</w:t>
       </w:r>
     </w:p>
@@ -8323,7 +9434,8 @@
       </w:pPr>
       <w:r>
         <w:rPr>
-          <w:rFonts w:ascii="Menlo" w:hAnsi="Menlo" w:eastAsia="Menlo"/>
+          <w:rFonts w:ascii="Menlo" w:hAnsi="Menlo" w:eastAsia="Menlo" w:cs="Menlo"/>
+          <w:color w:val="000000"/>
           <w:sz w:val="13"/>
         </w:rPr>
         <w:t>final_model = MODEL_DIR / "cil_model.h5"</w:t>
@@ -8359,11 +9471,6 @@
         <w:t>print("MAE validacion:", metrics["validation_mae_rad"])</w:t>
         <w:br/>
         <w:t>assert metrics["validation_mae_rad"] &lt;= 0.05, "El modelo no alcanza el objetivo MAE"</w:t>
-      </w:r>
-    </w:p>
-    <w:p>
-      <w:r>
-        <w:br w:type="page"/>
       </w:r>
     </w:p>
     <w:p>
@@ -8371,11 +9478,21 @@
         <w:pStyle w:val="Heading1"/>
       </w:pPr>
       <w:r>
+        <w:rPr>
+          <w:rFonts w:ascii="Arial" w:hAnsi="Arial" w:eastAsia="Arial" w:cs="Arial"/>
+          <w:color w:val="000000"/>
+          <w:sz w:val="24"/>
+        </w:rPr>
         <w:t>Anexo D. Guion del video</w:t>
       </w:r>
     </w:p>
     <w:p>
       <w:r>
+        <w:rPr>
+          <w:rFonts w:ascii="Arial" w:hAnsi="Arial" w:eastAsia="Arial" w:cs="Arial"/>
+          <w:color w:val="000000"/>
+          <w:sz w:val="24"/>
+        </w:rPr>
         <w:t>El guion dura aproximadamente 5:35, distribuye la participación entre los cuatro integrantes y evita superar los seis minutos. La URL de YouTube se incorporará sólo después de su publicación.</w:t>
       </w:r>
     </w:p>
@@ -8384,6 +9501,11 @@
         <w:pStyle w:val="Heading2"/>
       </w:pPr>
       <w:r>
+        <w:rPr>
+          <w:rFonts w:ascii="Arial" w:hAnsi="Arial" w:eastAsia="Arial" w:cs="Arial"/>
+          <w:color w:val="000000"/>
+          <w:sz w:val="24"/>
+        </w:rPr>
         <w:t>D.1 Guion completo</w:t>
       </w:r>
     </w:p>
@@ -8396,7 +9518,8 @@
       </w:pPr>
       <w:r>
         <w:rPr>
-          <w:rFonts w:ascii="Menlo" w:hAnsi="Menlo" w:eastAsia="Menlo"/>
+          <w:rFonts w:ascii="Menlo" w:hAnsi="Menlo" w:eastAsia="Menlo" w:cs="Menlo"/>
+          <w:color w:val="000000"/>
           <w:sz w:val="11"/>
         </w:rPr>
         <w:t># Guion del video demostrativo - Equipo 19</w:t>
@@ -8502,8 +9625,8 @@
       </w:r>
     </w:p>
     <w:sectPr>
-      <w:footerReference w:type="default" r:id="rId17"/>
-      <w:headerReference w:type="default" r:id="rId18"/>
+      <w:footerReference w:type="default" r:id="rId18"/>
+      <w:headerReference w:type="default" r:id="rId19"/>
       <w:pgSz w:w="15840" w:h="12240" w:orient="landscape"/>
       <w:pgMar w:top="792" w:right="792" w:bottom="792" w:left="792" w:header="720" w:footer="720" w:gutter="0"/>
       <w:cols w:space="720"/>
@@ -8522,7 +9645,9 @@
     </w:pPr>
     <w:r>
       <w:rPr>
-        <w:sz w:val="16"/>
+        <w:rFonts w:ascii="Arial" w:hAnsi="Arial" w:eastAsia="Arial" w:cs="Arial"/>
+        <w:color w:val="000000"/>
+        <w:sz w:val="24"/>
       </w:rPr>
       <w:t xml:space="preserve">Página </w:t>
     </w:r>
@@ -8540,12 +9665,20 @@
     </w:pPr>
     <w:r>
       <w:rPr>
-        <w:sz w:val="16"/>
+        <w:rFonts w:ascii="Arial" w:hAnsi="Arial" w:eastAsia="Arial" w:cs="Arial"/>
+        <w:color w:val="000000"/>
+        <w:sz w:val="24"/>
       </w:rPr>
       <w:t xml:space="preserve">Página </w:t>
     </w:r>
     <w:fldSimple w:instr="PAGE"/>
   </w:p>
+</w:ftr>
+</file>
+
+<file path=word/footer3.xml><?xml version="1.0" encoding="utf-8"?>
+<w:ftr xmlns:m="http://schemas.openxmlformats.org/officeDocument/2006/math" xmlns:mc="http://schemas.openxmlformats.org/markup-compatibility/2006" xmlns:mo="http://schemas.microsoft.com/office/mac/office/2008/main" xmlns:mv="urn:schemas-microsoft-com:mac:vml" xmlns:o="urn:schemas-microsoft-com:office:office" xmlns:r="http://schemas.openxmlformats.org/officeDocument/2006/relationships" xmlns:v="urn:schemas-microsoft-com:vml" xmlns:w10="urn:schemas-microsoft-com:office:word" xmlns:w14="http://schemas.microsoft.com/office/word/2010/wordml" xmlns:w="http://schemas.openxmlformats.org/wordprocessingml/2006/main" xmlns:wne="http://schemas.microsoft.com/office/word/2006/wordml" xmlns:wp14="http://schemas.microsoft.com/office/word/2010/wordprocessingDrawing" xmlns:wp="http://schemas.openxmlformats.org/drawingml/2006/wordprocessingDrawing" xmlns:wpc="http://schemas.microsoft.com/office/word/2010/wordprocessingCanvas" xmlns:wpg="http://schemas.microsoft.com/office/word/2010/wordprocessingGroup" xmlns:wpi="http://schemas.microsoft.com/office/word/2010/wordprocessingInk" xmlns:wps="http://schemas.microsoft.com/office/word/2010/wordprocessingShape" mc:Ignorable="w14 wp14">
+  <w:p/>
 </w:ftr>
 </file>
 
@@ -8558,8 +9691,9 @@
     </w:pPr>
     <w:r>
       <w:rPr>
-        <w:color w:val="7F7F7F"/>
-        <w:sz w:val="16"/>
+        <w:rFonts w:ascii="Arial" w:hAnsi="Arial" w:eastAsia="Arial" w:cs="Arial"/>
+        <w:color w:val="000000"/>
+        <w:sz w:val="24"/>
       </w:rPr>
       <w:t>Proyecto Final de Navegación Autónoma · Equipo 19</w:t>
     </w:r>
@@ -8576,12 +9710,19 @@
     </w:pPr>
     <w:r>
       <w:rPr>
-        <w:color w:val="7F7F7F"/>
-        <w:sz w:val="16"/>
+        <w:rFonts w:ascii="Arial" w:hAnsi="Arial" w:eastAsia="Arial" w:cs="Arial"/>
+        <w:color w:val="000000"/>
+        <w:sz w:val="24"/>
       </w:rPr>
       <w:t>Proyecto Final de Navegación Autónoma · Equipo 19</w:t>
     </w:r>
   </w:p>
+</w:hdr>
+</file>
+
+<file path=word/header3.xml><?xml version="1.0" encoding="utf-8"?>
+<w:hdr xmlns:m="http://schemas.openxmlformats.org/officeDocument/2006/math" xmlns:mc="http://schemas.openxmlformats.org/markup-compatibility/2006" xmlns:mo="http://schemas.microsoft.com/office/mac/office/2008/main" xmlns:mv="urn:schemas-microsoft-com:mac:vml" xmlns:o="urn:schemas-microsoft-com:office:office" xmlns:r="http://schemas.openxmlformats.org/officeDocument/2006/relationships" xmlns:v="urn:schemas-microsoft-com:vml" xmlns:w10="urn:schemas-microsoft-com:office:word" xmlns:w14="http://schemas.microsoft.com/office/word/2010/wordml" xmlns:w="http://schemas.openxmlformats.org/wordprocessingml/2006/main" xmlns:wne="http://schemas.microsoft.com/office/word/2006/wordml" xmlns:wp14="http://schemas.microsoft.com/office/word/2010/wordprocessingDrawing" xmlns:wp="http://schemas.openxmlformats.org/drawingml/2006/wordprocessingDrawing" xmlns:wpc="http://schemas.microsoft.com/office/word/2010/wordprocessingCanvas" xmlns:wpg="http://schemas.microsoft.com/office/word/2010/wordprocessingGroup" xmlns:wpi="http://schemas.microsoft.com/office/word/2010/wordprocessingInk" xmlns:wps="http://schemas.microsoft.com/office/word/2010/wordprocessingShape" mc:Ignorable="w14 wp14">
+  <w:p/>
 </w:hdr>
 </file>
 
@@ -8949,11 +10090,12 @@
     <w:qFormat/>
     <w:rsid w:val="00FC693F"/>
     <w:pPr>
-      <w:spacing w:line="259" w:lineRule="auto" w:after="120"/>
+      <w:spacing w:line="276" w:lineRule="auto" w:after="120"/>
     </w:pPr>
     <w:rPr>
-      <w:rFonts w:ascii="Calibri" w:hAnsi="Calibri" w:eastAsia="Calibri"/>
-      <w:sz w:val="21"/>
+      <w:rFonts w:ascii="Arial" w:hAnsi="Arial" w:eastAsia="Arial" w:cs="Arial"/>
+      <w:color w:val="000000"/>
+      <w:sz w:val="24"/>
     </w:rPr>
   </w:style>
   <w:style w:type="paragraph" w:styleId="Header">
@@ -8970,6 +10112,11 @@
       </w:tabs>
       <w:spacing w:after="0" w:line="240" w:lineRule="auto"/>
     </w:pPr>
+    <w:rPr>
+      <w:rFonts w:ascii="Arial" w:hAnsi="Arial" w:eastAsia="Arial" w:cs="Arial"/>
+      <w:color w:val="000000"/>
+      <w:sz w:val="24"/>
+    </w:rPr>
   </w:style>
   <w:style w:type="character" w:customStyle="1" w:styleId="HeaderChar">
     <w:name w:val="Header Char"/>
@@ -8992,6 +10139,11 @@
       </w:tabs>
       <w:spacing w:after="0" w:line="240" w:lineRule="auto"/>
     </w:pPr>
+    <w:rPr>
+      <w:rFonts w:ascii="Arial" w:hAnsi="Arial" w:eastAsia="Arial" w:cs="Arial"/>
+      <w:color w:val="000000"/>
+      <w:sz w:val="24"/>
+    </w:rPr>
   </w:style>
   <w:style w:type="character" w:customStyle="1" w:styleId="FooterChar">
     <w:name w:val="Footer Char"/>
@@ -9015,11 +10167,11 @@
       <w:outlineLvl w:val="0"/>
     </w:pPr>
     <w:rPr>
-      <w:rFonts w:asciiTheme="majorHAnsi" w:eastAsiaTheme="majorEastAsia" w:hAnsiTheme="majorHAnsi" w:cstheme="majorBidi" w:ascii="Calibri" w:hAnsi="Calibri"/>
+      <w:rFonts w:asciiTheme="majorHAnsi" w:eastAsiaTheme="majorEastAsia" w:hAnsiTheme="majorHAnsi" w:cstheme="majorBidi" w:ascii="Arial" w:hAnsi="Arial" w:eastAsia="Arial" w:cs="Arial"/>
       <w:b/>
       <w:bCs/>
-      <w:color w:val="2E74B5"/>
-      <w:sz w:val="32"/>
+      <w:color w:val="000000"/>
+      <w:sz w:val="24"/>
       <w:szCs w:val="28"/>
     </w:rPr>
   </w:style>
@@ -9039,11 +10191,11 @@
       <w:outlineLvl w:val="1"/>
     </w:pPr>
     <w:rPr>
-      <w:rFonts w:asciiTheme="majorHAnsi" w:eastAsiaTheme="majorEastAsia" w:hAnsiTheme="majorHAnsi" w:cstheme="majorBidi" w:ascii="Calibri" w:hAnsi="Calibri"/>
+      <w:rFonts w:asciiTheme="majorHAnsi" w:eastAsiaTheme="majorEastAsia" w:hAnsiTheme="majorHAnsi" w:cstheme="majorBidi" w:ascii="Arial" w:hAnsi="Arial" w:eastAsia="Arial" w:cs="Arial"/>
       <w:b/>
       <w:bCs/>
-      <w:color w:val="1F4E79"/>
-      <w:sz w:val="26"/>
+      <w:color w:val="000000"/>
+      <w:sz w:val="24"/>
       <w:szCs w:val="26"/>
     </w:rPr>
   </w:style>
@@ -9063,11 +10215,11 @@
       <w:outlineLvl w:val="2"/>
     </w:pPr>
     <w:rPr>
-      <w:rFonts w:asciiTheme="majorHAnsi" w:eastAsiaTheme="majorEastAsia" w:hAnsiTheme="majorHAnsi" w:cstheme="majorBidi" w:ascii="Calibri" w:hAnsi="Calibri"/>
+      <w:rFonts w:asciiTheme="majorHAnsi" w:eastAsiaTheme="majorEastAsia" w:hAnsiTheme="majorHAnsi" w:cstheme="majorBidi" w:ascii="Arial" w:hAnsi="Arial" w:eastAsia="Arial" w:cs="Arial"/>
       <w:b/>
       <w:bCs/>
-      <w:color w:val="1F4E79"/>
-      <w:sz w:val="23"/>
+      <w:color w:val="000000"/>
+      <w:sz w:val="24"/>
     </w:rPr>
   </w:style>
   <w:style w:type="paragraph" w:styleId="Heading4">
@@ -9306,12 +10458,12 @@
       <w:contextualSpacing/>
     </w:pPr>
     <w:rPr>
-      <w:rFonts w:asciiTheme="majorHAnsi" w:eastAsiaTheme="majorEastAsia" w:hAnsiTheme="majorHAnsi" w:cstheme="majorBidi" w:ascii="Calibri" w:hAnsi="Calibri"/>
+      <w:rFonts w:asciiTheme="majorHAnsi" w:eastAsiaTheme="majorEastAsia" w:hAnsiTheme="majorHAnsi" w:cstheme="majorBidi" w:ascii="Arial" w:hAnsi="Arial" w:eastAsia="Arial" w:cs="Arial"/>
       <w:b/>
-      <w:color w:val="1F4E79"/>
+      <w:color w:val="000000"/>
       <w:spacing w:val="5"/>
       <w:kern w:val="28"/>
-      <w:sz w:val="52"/>
+      <w:sz w:val="24"/>
       <w:szCs w:val="52"/>
     </w:rPr>
   </w:style>
@@ -9344,10 +10496,10 @@
       </w:numPr>
     </w:pPr>
     <w:rPr>
-      <w:rFonts w:asciiTheme="majorHAnsi" w:eastAsiaTheme="majorEastAsia" w:hAnsiTheme="majorHAnsi" w:cstheme="majorBidi"/>
+      <w:rFonts w:asciiTheme="majorHAnsi" w:eastAsiaTheme="majorEastAsia" w:hAnsiTheme="majorHAnsi" w:cstheme="majorBidi" w:ascii="Arial" w:hAnsi="Arial" w:eastAsia="Arial" w:cs="Arial"/>
       <w:i/>
       <w:iCs/>
-      <w:color w:val="4F81BD" w:themeColor="accent1"/>
+      <w:color w:val="000000"/>
       <w:spacing w:val="15"/>
       <w:sz w:val="24"/>
       <w:szCs w:val="24"/>
@@ -9487,6 +10639,11 @@
       </w:numPr>
       <w:contextualSpacing/>
     </w:pPr>
+    <w:rPr>
+      <w:rFonts w:ascii="Arial" w:hAnsi="Arial" w:eastAsia="Arial" w:cs="Arial"/>
+      <w:color w:val="000000"/>
+      <w:sz w:val="24"/>
+    </w:rPr>
   </w:style>
   <w:style w:type="paragraph" w:styleId="ListBullet2">
     <w:name w:val="List Bullet 2"/>
@@ -9500,6 +10657,11 @@
       </w:numPr>
       <w:contextualSpacing/>
     </w:pPr>
+    <w:rPr>
+      <w:rFonts w:ascii="Arial" w:hAnsi="Arial" w:eastAsia="Arial" w:cs="Arial"/>
+      <w:color w:val="000000"/>
+      <w:sz w:val="24"/>
+    </w:rPr>
   </w:style>
   <w:style w:type="paragraph" w:styleId="ListBullet3">
     <w:name w:val="List Bullet 3"/>

</xml_diff>

<commit_message>
Simplify report cover and remove page furniture
</commit_message>
<xml_diff>
--- a/docs/Proyecto_Final_Equipo19.docx
+++ b/docs/Proyecto_Final_Equipo19.docx
@@ -90,297 +90,61 @@
         <w:t>PRESENTA:</w:t>
       </w:r>
     </w:p>
-    <w:tbl>
-      <w:tblPr>
-        <w:tblStyle w:val="TableGrid"/>
-        <w:tblW w:type="auto" w:w="0"/>
-        <w:jc w:val="center"/>
-        <w:tblLayout w:type="fixed"/>
-        <w:tblLook w:firstColumn="1" w:firstRow="1" w:lastColumn="0" w:lastRow="0" w:noHBand="0" w:noVBand="1" w:val="04A0"/>
-      </w:tblPr>
-      <w:tblGrid>
-        <w:gridCol w:w="4680"/>
-        <w:gridCol w:w="4680"/>
-      </w:tblGrid>
-      <w:tr>
-        <w:trPr>
-          <w:tblHeader w:val="true"/>
-          <w:cantSplit/>
-        </w:trPr>
-        <w:tc>
-          <w:tcPr>
-            <w:tcW w:type="dxa" w:w="6480"/>
-            <w:shd w:fill="E7E6E6"/>
-            <w:vAlign w:val="center"/>
-            <w:tcMar>
-              <w:top w:w="80" w:type="dxa"/>
-              <w:start w:w="110" w:type="dxa"/>
-              <w:bottom w:w="80" w:type="dxa"/>
-              <w:end w:w="110" w:type="dxa"/>
-            </w:tcMar>
-          </w:tcPr>
-          <w:p>
-            <w:r>
-              <w:rPr>
-                <w:rFonts w:ascii="Arial" w:hAnsi="Arial" w:eastAsia="Arial" w:cs="Arial"/>
-                <w:b/>
-                <w:color w:val="000000"/>
-                <w:sz w:val="24"/>
-              </w:rPr>
-              <w:t>Integrante</w:t>
-            </w:r>
-          </w:p>
-        </w:tc>
-        <w:tc>
-          <w:tcPr>
-            <w:tcW w:type="dxa" w:w="2160"/>
-            <w:shd w:fill="E7E6E6"/>
-            <w:vAlign w:val="center"/>
-            <w:tcMar>
-              <w:top w:w="80" w:type="dxa"/>
-              <w:start w:w="110" w:type="dxa"/>
-              <w:bottom w:w="80" w:type="dxa"/>
-              <w:end w:w="110" w:type="dxa"/>
-            </w:tcMar>
-          </w:tcPr>
-          <w:p>
-            <w:r>
-              <w:rPr>
-                <w:rFonts w:ascii="Arial" w:hAnsi="Arial" w:eastAsia="Arial" w:cs="Arial"/>
-                <w:b/>
-                <w:color w:val="000000"/>
-                <w:sz w:val="24"/>
-              </w:rPr>
-              <w:t>Matrícula</w:t>
-            </w:r>
-          </w:p>
-        </w:tc>
-      </w:tr>
-      <w:tr>
-        <w:trPr>
-          <w:cantSplit/>
-        </w:trPr>
-        <w:tc>
-          <w:tcPr>
-            <w:tcW w:type="dxa" w:w="6480"/>
-            <w:vAlign w:val="top"/>
-            <w:tcMar>
-              <w:top w:w="80" w:type="dxa"/>
-              <w:start w:w="110" w:type="dxa"/>
-              <w:bottom w:w="80" w:type="dxa"/>
-              <w:end w:w="110" w:type="dxa"/>
-            </w:tcMar>
-          </w:tcPr>
-          <w:p>
-            <w:pPr>
-              <w:spacing w:after="40"/>
-            </w:pPr>
-            <w:r>
-              <w:rPr>
-                <w:rFonts w:ascii="Arial" w:hAnsi="Arial" w:eastAsia="Arial" w:cs="Arial"/>
-                <w:color w:val="000000"/>
-                <w:sz w:val="24"/>
-              </w:rPr>
-              <w:t>José Antonio Fernández Pérez</w:t>
-            </w:r>
-          </w:p>
-        </w:tc>
-        <w:tc>
-          <w:tcPr>
-            <w:tcW w:type="dxa" w:w="2160"/>
-            <w:vAlign w:val="top"/>
-            <w:tcMar>
-              <w:top w:w="80" w:type="dxa"/>
-              <w:start w:w="110" w:type="dxa"/>
-              <w:bottom w:w="80" w:type="dxa"/>
-              <w:end w:w="110" w:type="dxa"/>
-            </w:tcMar>
-          </w:tcPr>
-          <w:p>
-            <w:pPr>
-              <w:spacing w:after="40"/>
-            </w:pPr>
-            <w:r>
-              <w:rPr>
-                <w:rFonts w:ascii="Arial" w:hAnsi="Arial" w:eastAsia="Arial" w:cs="Arial"/>
-                <w:color w:val="000000"/>
-                <w:sz w:val="24"/>
-              </w:rPr>
-              <w:t>A01795991</w:t>
-            </w:r>
-          </w:p>
-        </w:tc>
-      </w:tr>
-      <w:tr>
-        <w:trPr>
-          <w:cantSplit/>
-        </w:trPr>
-        <w:tc>
-          <w:tcPr>
-            <w:tcW w:type="dxa" w:w="6480"/>
-            <w:vAlign w:val="top"/>
-            <w:tcMar>
-              <w:top w:w="80" w:type="dxa"/>
-              <w:start w:w="110" w:type="dxa"/>
-              <w:bottom w:w="80" w:type="dxa"/>
-              <w:end w:w="110" w:type="dxa"/>
-            </w:tcMar>
-          </w:tcPr>
-          <w:p>
-            <w:pPr>
-              <w:spacing w:after="40"/>
-            </w:pPr>
-            <w:r>
-              <w:rPr>
-                <w:rFonts w:ascii="Arial" w:hAnsi="Arial" w:eastAsia="Arial" w:cs="Arial"/>
-                <w:color w:val="000000"/>
-                <w:sz w:val="24"/>
-              </w:rPr>
-              <w:t>Deménard Gardy Armand</w:t>
-            </w:r>
-          </w:p>
-        </w:tc>
-        <w:tc>
-          <w:tcPr>
-            <w:tcW w:type="dxa" w:w="2160"/>
-            <w:vAlign w:val="top"/>
-            <w:tcMar>
-              <w:top w:w="80" w:type="dxa"/>
-              <w:start w:w="110" w:type="dxa"/>
-              <w:bottom w:w="80" w:type="dxa"/>
-              <w:end w:w="110" w:type="dxa"/>
-            </w:tcMar>
-          </w:tcPr>
-          <w:p>
-            <w:pPr>
-              <w:spacing w:after="40"/>
-            </w:pPr>
-            <w:r>
-              <w:rPr>
-                <w:rFonts w:ascii="Arial" w:hAnsi="Arial" w:eastAsia="Arial" w:cs="Arial"/>
-                <w:color w:val="000000"/>
-                <w:sz w:val="24"/>
-              </w:rPr>
-              <w:t>A01797139</w:t>
-            </w:r>
-          </w:p>
-        </w:tc>
-      </w:tr>
-      <w:tr>
-        <w:trPr>
-          <w:cantSplit/>
-        </w:trPr>
-        <w:tc>
-          <w:tcPr>
-            <w:tcW w:type="dxa" w:w="6480"/>
-            <w:vAlign w:val="top"/>
-            <w:tcMar>
-              <w:top w:w="80" w:type="dxa"/>
-              <w:start w:w="110" w:type="dxa"/>
-              <w:bottom w:w="80" w:type="dxa"/>
-              <w:end w:w="110" w:type="dxa"/>
-            </w:tcMar>
-          </w:tcPr>
-          <w:p>
-            <w:pPr>
-              <w:spacing w:after="40"/>
-            </w:pPr>
-            <w:r>
-              <w:rPr>
-                <w:rFonts w:ascii="Arial" w:hAnsi="Arial" w:eastAsia="Arial" w:cs="Arial"/>
-                <w:color w:val="000000"/>
-                <w:sz w:val="24"/>
-              </w:rPr>
-              <w:t>Luis Daniel Castillo Alegría</w:t>
-            </w:r>
-          </w:p>
-        </w:tc>
-        <w:tc>
-          <w:tcPr>
-            <w:tcW w:type="dxa" w:w="2160"/>
-            <w:vAlign w:val="top"/>
-            <w:tcMar>
-              <w:top w:w="80" w:type="dxa"/>
-              <w:start w:w="110" w:type="dxa"/>
-              <w:bottom w:w="80" w:type="dxa"/>
-              <w:end w:w="110" w:type="dxa"/>
-            </w:tcMar>
-          </w:tcPr>
-          <w:p>
-            <w:pPr>
-              <w:spacing w:after="40"/>
-            </w:pPr>
-            <w:r>
-              <w:rPr>
-                <w:rFonts w:ascii="Arial" w:hAnsi="Arial" w:eastAsia="Arial" w:cs="Arial"/>
-                <w:color w:val="000000"/>
-                <w:sz w:val="24"/>
-              </w:rPr>
-              <w:t>A01224696</w:t>
-            </w:r>
-          </w:p>
-        </w:tc>
-      </w:tr>
-      <w:tr>
-        <w:trPr>
-          <w:cantSplit/>
-        </w:trPr>
-        <w:tc>
-          <w:tcPr>
-            <w:tcW w:type="dxa" w:w="6480"/>
-            <w:vAlign w:val="top"/>
-            <w:tcMar>
-              <w:top w:w="80" w:type="dxa"/>
-              <w:start w:w="110" w:type="dxa"/>
-              <w:bottom w:w="80" w:type="dxa"/>
-              <w:end w:w="110" w:type="dxa"/>
-            </w:tcMar>
-          </w:tcPr>
-          <w:p>
-            <w:pPr>
-              <w:spacing w:after="40"/>
-            </w:pPr>
-            <w:r>
-              <w:rPr>
-                <w:rFonts w:ascii="Arial" w:hAnsi="Arial" w:eastAsia="Arial" w:cs="Arial"/>
-                <w:color w:val="000000"/>
-                <w:sz w:val="24"/>
-              </w:rPr>
-              <w:t>Raúl Adrián Delgado Rodríguez</w:t>
-            </w:r>
-          </w:p>
-        </w:tc>
-        <w:tc>
-          <w:tcPr>
-            <w:tcW w:type="dxa" w:w="2160"/>
-            <w:vAlign w:val="top"/>
-            <w:tcMar>
-              <w:top w:w="80" w:type="dxa"/>
-              <w:start w:w="110" w:type="dxa"/>
-              <w:bottom w:w="80" w:type="dxa"/>
-              <w:end w:w="110" w:type="dxa"/>
-            </w:tcMar>
-          </w:tcPr>
-          <w:p>
-            <w:pPr>
-              <w:spacing w:after="40"/>
-            </w:pPr>
-            <w:r>
-              <w:rPr>
-                <w:rFonts w:ascii="Arial" w:hAnsi="Arial" w:eastAsia="Arial" w:cs="Arial"/>
-                <w:color w:val="000000"/>
-                <w:sz w:val="24"/>
-              </w:rPr>
-              <w:t>A01246414</w:t>
-            </w:r>
-          </w:p>
-        </w:tc>
-      </w:tr>
-    </w:tbl>
     <w:p>
       <w:pPr>
-        <w:spacing w:after="0"/>
+        <w:spacing w:after="40"/>
+        <w:jc w:val="center"/>
       </w:pPr>
+      <w:r>
+        <w:rPr>
+          <w:rFonts w:ascii="Arial" w:hAnsi="Arial" w:eastAsia="Arial" w:cs="Arial"/>
+          <w:color w:val="000000"/>
+          <w:sz w:val="24"/>
+        </w:rPr>
+        <w:t>José Antonio Fernández Pérez · A01795991</w:t>
+      </w:r>
+    </w:p>
+    <w:p>
+      <w:pPr>
+        <w:spacing w:after="40"/>
+        <w:jc w:val="center"/>
+      </w:pPr>
+      <w:r>
+        <w:rPr>
+          <w:rFonts w:ascii="Arial" w:hAnsi="Arial" w:eastAsia="Arial" w:cs="Arial"/>
+          <w:color w:val="000000"/>
+          <w:sz w:val="24"/>
+        </w:rPr>
+        <w:t>Deménard Gardy Armand · A01797139</w:t>
+      </w:r>
+    </w:p>
+    <w:p>
+      <w:pPr>
+        <w:spacing w:after="40"/>
+        <w:jc w:val="center"/>
+      </w:pPr>
+      <w:r>
+        <w:rPr>
+          <w:rFonts w:ascii="Arial" w:hAnsi="Arial" w:eastAsia="Arial" w:cs="Arial"/>
+          <w:color w:val="000000"/>
+          <w:sz w:val="24"/>
+        </w:rPr>
+        <w:t>Luis Daniel Castillo Alegría · A01224696</w:t>
+      </w:r>
+    </w:p>
+    <w:p>
+      <w:pPr>
+        <w:spacing w:after="40"/>
+        <w:jc w:val="center"/>
+      </w:pPr>
+      <w:r>
+        <w:rPr>
+          <w:rFonts w:ascii="Arial" w:hAnsi="Arial" w:eastAsia="Arial" w:cs="Arial"/>
+          <w:color w:val="000000"/>
+          <w:sz w:val="24"/>
+        </w:rPr>
+        <w:t>Raúl Adrián Delgado Rodríguez · A01246414</w:t>
+      </w:r>
     </w:p>
     <w:p>
       <w:pPr>
@@ -7187,14 +6951,15 @@
     <w:p>
       <w:pPr>
         <w:sectPr>
-          <w:footerReference w:type="default" r:id="rId16"/>
-          <w:headerReference w:type="default" r:id="rId17"/>
-          <w:headerReference w:type="first" r:id="rId20"/>
-          <w:footerReference w:type="first" r:id="rId21"/>
+          <w:headerReference w:type="default" r:id="rId16"/>
+          <w:footerReference w:type="default" r:id="rId17"/>
+          <w:headerReference w:type="first" r:id="rId18"/>
+          <w:footerReference w:type="first" r:id="rId19"/>
+          <w:headerReference w:type="even" r:id="rId20"/>
+          <w:footerReference w:type="even" r:id="rId21"/>
           <w:pgSz w:w="12240" w:h="15840"/>
           <w:pgMar w:top="1440" w:right="1440" w:bottom="1440" w:left="1440" w:header="720" w:footer="720" w:gutter="0"/>
           <w:cols w:space="720"/>
-          <w:titlePg/>
           <w:docGrid w:linePitch="360"/>
         </w:sectPr>
       </w:pPr>
@@ -9625,8 +9390,12 @@
       </w:r>
     </w:p>
     <w:sectPr>
-      <w:footerReference w:type="default" r:id="rId18"/>
-      <w:headerReference w:type="default" r:id="rId19"/>
+      <w:headerReference w:type="default" r:id="rId22"/>
+      <w:footerReference w:type="default" r:id="rId23"/>
+      <w:headerReference w:type="first" r:id="rId24"/>
+      <w:footerReference w:type="first" r:id="rId25"/>
+      <w:headerReference w:type="even" r:id="rId26"/>
+      <w:footerReference w:type="even" r:id="rId27"/>
       <w:pgSz w:w="15840" w:h="12240" w:orient="landscape"/>
       <w:pgMar w:top="792" w:right="792" w:bottom="792" w:left="792" w:header="720" w:footer="720" w:gutter="0"/>
       <w:cols w:space="720"/>
@@ -9638,41 +9407,13 @@
 
 <file path=word/footer1.xml><?xml version="1.0" encoding="utf-8"?>
 <w:ftr xmlns:m="http://schemas.openxmlformats.org/officeDocument/2006/math" xmlns:mc="http://schemas.openxmlformats.org/markup-compatibility/2006" xmlns:mo="http://schemas.microsoft.com/office/mac/office/2008/main" xmlns:mv="urn:schemas-microsoft-com:mac:vml" xmlns:o="urn:schemas-microsoft-com:office:office" xmlns:r="http://schemas.openxmlformats.org/officeDocument/2006/relationships" xmlns:v="urn:schemas-microsoft-com:vml" xmlns:w10="urn:schemas-microsoft-com:office:word" xmlns:w14="http://schemas.microsoft.com/office/word/2010/wordml" xmlns:w="http://schemas.openxmlformats.org/wordprocessingml/2006/main" xmlns:wne="http://schemas.microsoft.com/office/word/2006/wordml" xmlns:wp14="http://schemas.microsoft.com/office/word/2010/wordprocessingDrawing" xmlns:wp="http://schemas.openxmlformats.org/drawingml/2006/wordprocessingDrawing" xmlns:wpc="http://schemas.microsoft.com/office/word/2010/wordprocessingCanvas" xmlns:wpg="http://schemas.microsoft.com/office/word/2010/wordprocessingGroup" xmlns:wpi="http://schemas.microsoft.com/office/word/2010/wordprocessingInk" xmlns:wps="http://schemas.microsoft.com/office/word/2010/wordprocessingShape" mc:Ignorable="w14 wp14">
-  <w:p>
-    <w:pPr>
-      <w:pStyle w:val="Footer"/>
-      <w:jc w:val="right"/>
-    </w:pPr>
-    <w:r>
-      <w:rPr>
-        <w:rFonts w:ascii="Arial" w:hAnsi="Arial" w:eastAsia="Arial" w:cs="Arial"/>
-        <w:color w:val="000000"/>
-        <w:sz w:val="24"/>
-      </w:rPr>
-      <w:t xml:space="preserve">Página </w:t>
-    </w:r>
-    <w:fldSimple w:instr="PAGE"/>
-  </w:p>
+  <w:p/>
 </w:ftr>
 </file>
 
 <file path=word/footer2.xml><?xml version="1.0" encoding="utf-8"?>
 <w:ftr xmlns:m="http://schemas.openxmlformats.org/officeDocument/2006/math" xmlns:mc="http://schemas.openxmlformats.org/markup-compatibility/2006" xmlns:mo="http://schemas.microsoft.com/office/mac/office/2008/main" xmlns:mv="urn:schemas-microsoft-com:mac:vml" xmlns:o="urn:schemas-microsoft-com:office:office" xmlns:r="http://schemas.openxmlformats.org/officeDocument/2006/relationships" xmlns:v="urn:schemas-microsoft-com:vml" xmlns:w10="urn:schemas-microsoft-com:office:word" xmlns:w14="http://schemas.microsoft.com/office/word/2010/wordml" xmlns:w="http://schemas.openxmlformats.org/wordprocessingml/2006/main" xmlns:wne="http://schemas.microsoft.com/office/word/2006/wordml" xmlns:wp14="http://schemas.microsoft.com/office/word/2010/wordprocessingDrawing" xmlns:wp="http://schemas.openxmlformats.org/drawingml/2006/wordprocessingDrawing" xmlns:wpc="http://schemas.microsoft.com/office/word/2010/wordprocessingCanvas" xmlns:wpg="http://schemas.microsoft.com/office/word/2010/wordprocessingGroup" xmlns:wpi="http://schemas.microsoft.com/office/word/2010/wordprocessingInk" xmlns:wps="http://schemas.microsoft.com/office/word/2010/wordprocessingShape" mc:Ignorable="w14 wp14">
-  <w:p>
-    <w:pPr>
-      <w:pStyle w:val="Footer"/>
-      <w:jc w:val="right"/>
-    </w:pPr>
-    <w:r>
-      <w:rPr>
-        <w:rFonts w:ascii="Arial" w:hAnsi="Arial" w:eastAsia="Arial" w:cs="Arial"/>
-        <w:color w:val="000000"/>
-        <w:sz w:val="24"/>
-      </w:rPr>
-      <w:t xml:space="preserve">Página </w:t>
-    </w:r>
-    <w:fldSimple w:instr="PAGE"/>
-  </w:p>
+  <w:p/>
 </w:ftr>
 </file>
 
@@ -9682,45 +9423,55 @@
 </w:ftr>
 </file>
 
+<file path=word/footer4.xml><?xml version="1.0" encoding="utf-8"?>
+<w:ftr xmlns:m="http://schemas.openxmlformats.org/officeDocument/2006/math" xmlns:mc="http://schemas.openxmlformats.org/markup-compatibility/2006" xmlns:mo="http://schemas.microsoft.com/office/mac/office/2008/main" xmlns:mv="urn:schemas-microsoft-com:mac:vml" xmlns:o="urn:schemas-microsoft-com:office:office" xmlns:r="http://schemas.openxmlformats.org/officeDocument/2006/relationships" xmlns:v="urn:schemas-microsoft-com:vml" xmlns:w10="urn:schemas-microsoft-com:office:word" xmlns:w14="http://schemas.microsoft.com/office/word/2010/wordml" xmlns:w="http://schemas.openxmlformats.org/wordprocessingml/2006/main" xmlns:wne="http://schemas.microsoft.com/office/word/2006/wordml" xmlns:wp14="http://schemas.microsoft.com/office/word/2010/wordprocessingDrawing" xmlns:wp="http://schemas.openxmlformats.org/drawingml/2006/wordprocessingDrawing" xmlns:wpc="http://schemas.microsoft.com/office/word/2010/wordprocessingCanvas" xmlns:wpg="http://schemas.microsoft.com/office/word/2010/wordprocessingGroup" xmlns:wpi="http://schemas.microsoft.com/office/word/2010/wordprocessingInk" xmlns:wps="http://schemas.microsoft.com/office/word/2010/wordprocessingShape" mc:Ignorable="w14 wp14">
+  <w:p/>
+</w:ftr>
+</file>
+
+<file path=word/footer5.xml><?xml version="1.0" encoding="utf-8"?>
+<w:ftr xmlns:m="http://schemas.openxmlformats.org/officeDocument/2006/math" xmlns:mc="http://schemas.openxmlformats.org/markup-compatibility/2006" xmlns:mo="http://schemas.microsoft.com/office/mac/office/2008/main" xmlns:mv="urn:schemas-microsoft-com:mac:vml" xmlns:o="urn:schemas-microsoft-com:office:office" xmlns:r="http://schemas.openxmlformats.org/officeDocument/2006/relationships" xmlns:v="urn:schemas-microsoft-com:vml" xmlns:w10="urn:schemas-microsoft-com:office:word" xmlns:w14="http://schemas.microsoft.com/office/word/2010/wordml" xmlns:w="http://schemas.openxmlformats.org/wordprocessingml/2006/main" xmlns:wne="http://schemas.microsoft.com/office/word/2006/wordml" xmlns:wp14="http://schemas.microsoft.com/office/word/2010/wordprocessingDrawing" xmlns:wp="http://schemas.openxmlformats.org/drawingml/2006/wordprocessingDrawing" xmlns:wpc="http://schemas.microsoft.com/office/word/2010/wordprocessingCanvas" xmlns:wpg="http://schemas.microsoft.com/office/word/2010/wordprocessingGroup" xmlns:wpi="http://schemas.microsoft.com/office/word/2010/wordprocessingInk" xmlns:wps="http://schemas.microsoft.com/office/word/2010/wordprocessingShape" mc:Ignorable="w14 wp14">
+  <w:p/>
+</w:ftr>
+</file>
+
+<file path=word/footer6.xml><?xml version="1.0" encoding="utf-8"?>
+<w:ftr xmlns:m="http://schemas.openxmlformats.org/officeDocument/2006/math" xmlns:mc="http://schemas.openxmlformats.org/markup-compatibility/2006" xmlns:mo="http://schemas.microsoft.com/office/mac/office/2008/main" xmlns:mv="urn:schemas-microsoft-com:mac:vml" xmlns:o="urn:schemas-microsoft-com:office:office" xmlns:r="http://schemas.openxmlformats.org/officeDocument/2006/relationships" xmlns:v="urn:schemas-microsoft-com:vml" xmlns:w10="urn:schemas-microsoft-com:office:word" xmlns:w14="http://schemas.microsoft.com/office/word/2010/wordml" xmlns:w="http://schemas.openxmlformats.org/wordprocessingml/2006/main" xmlns:wne="http://schemas.microsoft.com/office/word/2006/wordml" xmlns:wp14="http://schemas.microsoft.com/office/word/2010/wordprocessingDrawing" xmlns:wp="http://schemas.openxmlformats.org/drawingml/2006/wordprocessingDrawing" xmlns:wpc="http://schemas.microsoft.com/office/word/2010/wordprocessingCanvas" xmlns:wpg="http://schemas.microsoft.com/office/word/2010/wordprocessingGroup" xmlns:wpi="http://schemas.microsoft.com/office/word/2010/wordprocessingInk" xmlns:wps="http://schemas.microsoft.com/office/word/2010/wordprocessingShape" mc:Ignorable="w14 wp14">
+  <w:p/>
+</w:ftr>
+</file>
+
 <file path=word/header1.xml><?xml version="1.0" encoding="utf-8"?>
 <w:hdr xmlns:m="http://schemas.openxmlformats.org/officeDocument/2006/math" xmlns:mc="http://schemas.openxmlformats.org/markup-compatibility/2006" xmlns:mo="http://schemas.microsoft.com/office/mac/office/2008/main" xmlns:mv="urn:schemas-microsoft-com:mac:vml" xmlns:o="urn:schemas-microsoft-com:office:office" xmlns:r="http://schemas.openxmlformats.org/officeDocument/2006/relationships" xmlns:v="urn:schemas-microsoft-com:vml" xmlns:w10="urn:schemas-microsoft-com:office:word" xmlns:w14="http://schemas.microsoft.com/office/word/2010/wordml" xmlns:w="http://schemas.openxmlformats.org/wordprocessingml/2006/main" xmlns:wne="http://schemas.microsoft.com/office/word/2006/wordml" xmlns:wp14="http://schemas.microsoft.com/office/word/2010/wordprocessingDrawing" xmlns:wp="http://schemas.openxmlformats.org/drawingml/2006/wordprocessingDrawing" xmlns:wpc="http://schemas.microsoft.com/office/word/2010/wordprocessingCanvas" xmlns:wpg="http://schemas.microsoft.com/office/word/2010/wordprocessingGroup" xmlns:wpi="http://schemas.microsoft.com/office/word/2010/wordprocessingInk" xmlns:wps="http://schemas.microsoft.com/office/word/2010/wordprocessingShape" mc:Ignorable="w14 wp14">
-  <w:p>
-    <w:pPr>
-      <w:pStyle w:val="Header"/>
-      <w:jc w:val="right"/>
-    </w:pPr>
-    <w:r>
-      <w:rPr>
-        <w:rFonts w:ascii="Arial" w:hAnsi="Arial" w:eastAsia="Arial" w:cs="Arial"/>
-        <w:color w:val="000000"/>
-        <w:sz w:val="24"/>
-      </w:rPr>
-      <w:t>Proyecto Final de Navegación Autónoma · Equipo 19</w:t>
-    </w:r>
-  </w:p>
+  <w:p/>
 </w:hdr>
 </file>
 
 <file path=word/header2.xml><?xml version="1.0" encoding="utf-8"?>
 <w:hdr xmlns:m="http://schemas.openxmlformats.org/officeDocument/2006/math" xmlns:mc="http://schemas.openxmlformats.org/markup-compatibility/2006" xmlns:mo="http://schemas.microsoft.com/office/mac/office/2008/main" xmlns:mv="urn:schemas-microsoft-com:mac:vml" xmlns:o="urn:schemas-microsoft-com:office:office" xmlns:r="http://schemas.openxmlformats.org/officeDocument/2006/relationships" xmlns:v="urn:schemas-microsoft-com:vml" xmlns:w10="urn:schemas-microsoft-com:office:word" xmlns:w14="http://schemas.microsoft.com/office/word/2010/wordml" xmlns:w="http://schemas.openxmlformats.org/wordprocessingml/2006/main" xmlns:wne="http://schemas.microsoft.com/office/word/2006/wordml" xmlns:wp14="http://schemas.microsoft.com/office/word/2010/wordprocessingDrawing" xmlns:wp="http://schemas.openxmlformats.org/drawingml/2006/wordprocessingDrawing" xmlns:wpc="http://schemas.microsoft.com/office/word/2010/wordprocessingCanvas" xmlns:wpg="http://schemas.microsoft.com/office/word/2010/wordprocessingGroup" xmlns:wpi="http://schemas.microsoft.com/office/word/2010/wordprocessingInk" xmlns:wps="http://schemas.microsoft.com/office/word/2010/wordprocessingShape" mc:Ignorable="w14 wp14">
-  <w:p>
-    <w:pPr>
-      <w:pStyle w:val="Header"/>
-      <w:jc w:val="right"/>
-    </w:pPr>
-    <w:r>
-      <w:rPr>
-        <w:rFonts w:ascii="Arial" w:hAnsi="Arial" w:eastAsia="Arial" w:cs="Arial"/>
-        <w:color w:val="000000"/>
-        <w:sz w:val="24"/>
-      </w:rPr>
-      <w:t>Proyecto Final de Navegación Autónoma · Equipo 19</w:t>
-    </w:r>
-  </w:p>
+  <w:p/>
 </w:hdr>
 </file>
 
 <file path=word/header3.xml><?xml version="1.0" encoding="utf-8"?>
+<w:hdr xmlns:m="http://schemas.openxmlformats.org/officeDocument/2006/math" xmlns:mc="http://schemas.openxmlformats.org/markup-compatibility/2006" xmlns:mo="http://schemas.microsoft.com/office/mac/office/2008/main" xmlns:mv="urn:schemas-microsoft-com:mac:vml" xmlns:o="urn:schemas-microsoft-com:office:office" xmlns:r="http://schemas.openxmlformats.org/officeDocument/2006/relationships" xmlns:v="urn:schemas-microsoft-com:vml" xmlns:w10="urn:schemas-microsoft-com:office:word" xmlns:w14="http://schemas.microsoft.com/office/word/2010/wordml" xmlns:w="http://schemas.openxmlformats.org/wordprocessingml/2006/main" xmlns:wne="http://schemas.microsoft.com/office/word/2006/wordml" xmlns:wp14="http://schemas.microsoft.com/office/word/2010/wordprocessingDrawing" xmlns:wp="http://schemas.openxmlformats.org/drawingml/2006/wordprocessingDrawing" xmlns:wpc="http://schemas.microsoft.com/office/word/2010/wordprocessingCanvas" xmlns:wpg="http://schemas.microsoft.com/office/word/2010/wordprocessingGroup" xmlns:wpi="http://schemas.microsoft.com/office/word/2010/wordprocessingInk" xmlns:wps="http://schemas.microsoft.com/office/word/2010/wordprocessingShape" mc:Ignorable="w14 wp14">
+  <w:p/>
+</w:hdr>
+</file>
+
+<file path=word/header4.xml><?xml version="1.0" encoding="utf-8"?>
+<w:hdr xmlns:m="http://schemas.openxmlformats.org/officeDocument/2006/math" xmlns:mc="http://schemas.openxmlformats.org/markup-compatibility/2006" xmlns:mo="http://schemas.microsoft.com/office/mac/office/2008/main" xmlns:mv="urn:schemas-microsoft-com:mac:vml" xmlns:o="urn:schemas-microsoft-com:office:office" xmlns:r="http://schemas.openxmlformats.org/officeDocument/2006/relationships" xmlns:v="urn:schemas-microsoft-com:vml" xmlns:w10="urn:schemas-microsoft-com:office:word" xmlns:w14="http://schemas.microsoft.com/office/word/2010/wordml" xmlns:w="http://schemas.openxmlformats.org/wordprocessingml/2006/main" xmlns:wne="http://schemas.microsoft.com/office/word/2006/wordml" xmlns:wp14="http://schemas.microsoft.com/office/word/2010/wordprocessingDrawing" xmlns:wp="http://schemas.openxmlformats.org/drawingml/2006/wordprocessingDrawing" xmlns:wpc="http://schemas.microsoft.com/office/word/2010/wordprocessingCanvas" xmlns:wpg="http://schemas.microsoft.com/office/word/2010/wordprocessingGroup" xmlns:wpi="http://schemas.microsoft.com/office/word/2010/wordprocessingInk" xmlns:wps="http://schemas.microsoft.com/office/word/2010/wordprocessingShape" mc:Ignorable="w14 wp14">
+  <w:p/>
+</w:hdr>
+</file>
+
+<file path=word/header5.xml><?xml version="1.0" encoding="utf-8"?>
+<w:hdr xmlns:m="http://schemas.openxmlformats.org/officeDocument/2006/math" xmlns:mc="http://schemas.openxmlformats.org/markup-compatibility/2006" xmlns:mo="http://schemas.microsoft.com/office/mac/office/2008/main" xmlns:mv="urn:schemas-microsoft-com:mac:vml" xmlns:o="urn:schemas-microsoft-com:office:office" xmlns:r="http://schemas.openxmlformats.org/officeDocument/2006/relationships" xmlns:v="urn:schemas-microsoft-com:vml" xmlns:w10="urn:schemas-microsoft-com:office:word" xmlns:w14="http://schemas.microsoft.com/office/word/2010/wordml" xmlns:w="http://schemas.openxmlformats.org/wordprocessingml/2006/main" xmlns:wne="http://schemas.microsoft.com/office/word/2006/wordml" xmlns:wp14="http://schemas.microsoft.com/office/word/2010/wordprocessingDrawing" xmlns:wp="http://schemas.openxmlformats.org/drawingml/2006/wordprocessingDrawing" xmlns:wpc="http://schemas.microsoft.com/office/word/2010/wordprocessingCanvas" xmlns:wpg="http://schemas.microsoft.com/office/word/2010/wordprocessingGroup" xmlns:wpi="http://schemas.microsoft.com/office/word/2010/wordprocessingInk" xmlns:wps="http://schemas.microsoft.com/office/word/2010/wordprocessingShape" mc:Ignorable="w14 wp14">
+  <w:p/>
+</w:hdr>
+</file>
+
+<file path=word/header6.xml><?xml version="1.0" encoding="utf-8"?>
 <w:hdr xmlns:m="http://schemas.openxmlformats.org/officeDocument/2006/math" xmlns:mc="http://schemas.openxmlformats.org/markup-compatibility/2006" xmlns:mo="http://schemas.microsoft.com/office/mac/office/2008/main" xmlns:mv="urn:schemas-microsoft-com:mac:vml" xmlns:o="urn:schemas-microsoft-com:office:office" xmlns:r="http://schemas.openxmlformats.org/officeDocument/2006/relationships" xmlns:v="urn:schemas-microsoft-com:vml" xmlns:w10="urn:schemas-microsoft-com:office:word" xmlns:w14="http://schemas.microsoft.com/office/word/2010/wordml" xmlns:w="http://schemas.openxmlformats.org/wordprocessingml/2006/main" xmlns:wne="http://schemas.microsoft.com/office/word/2006/wordml" xmlns:wp14="http://schemas.microsoft.com/office/word/2010/wordprocessingDrawing" xmlns:wp="http://schemas.openxmlformats.org/drawingml/2006/wordprocessingDrawing" xmlns:wpc="http://schemas.microsoft.com/office/word/2010/wordprocessingCanvas" xmlns:wpg="http://schemas.microsoft.com/office/word/2010/wordprocessingGroup" xmlns:wpi="http://schemas.microsoft.com/office/word/2010/wordprocessingInk" xmlns:wps="http://schemas.microsoft.com/office/word/2010/wordprocessingShape" mc:Ignorable="w14 wp14">
   <w:p/>
 </w:hdr>

</xml_diff>

<commit_message>
Fix route safety and replace validation evidence
</commit_message>
<xml_diff>
--- a/docs/Proyecto_Final_Equipo19.docx
+++ b/docs/Proyecto_Final_Equipo19.docx
@@ -2986,7 +2986,7 @@
                 <w:color w:val="000000"/>
                 <w:sz w:val="24"/>
               </w:rPr>
-              <w:t>Autobús estacionado ≤ 18 m</w:t>
+              <w:t>Autobús estacionado ≤ 26 m</w:t>
             </w:r>
           </w:p>
         </w:tc>
@@ -3011,7 +3011,7 @@
                 <w:color w:val="000000"/>
                 <w:sz w:val="24"/>
               </w:rPr>
-              <w:t>Separación, pared derecha, orientación y reincorporación</w:t>
+              <w:t>Separación a 8 km/h, pared derecha, orientación y retorno de carril</w:t>
             </w:r>
           </w:p>
         </w:tc>
@@ -3181,6 +3181,16 @@
       <w:pPr>
         <w:spacing w:after="0"/>
       </w:pPr>
+    </w:p>
+    <w:p>
+      <w:r>
+        <w:rPr>
+          <w:rFonts w:ascii="Arial" w:hAnsi="Arial" w:eastAsia="Arial" w:cs="Arial"/>
+          <w:color w:val="000000"/>
+          <w:sz w:val="24"/>
+        </w:rPr>
+        <w:t>Antes del giro derecho, el controlador ejecuta un alto completo fuera de la intersección y permanece detenido hasta la fase verde del controlador CrossRoads; la corrida final liberó el vehículo en `t=51.84 s`. El preset retrasa el ingreso del tráfico SUMO conflictivo hasta que el vehículo autónomo sale del cruce. En la ruta izquierda, el giro comienza dentro de la intersección y una asistencia lateral fija la salida en el carril derecho este, con centro `y=39.60`.</w:t>
+      </w:r>
     </w:p>
     <w:p>
       <w:pPr>
@@ -3361,7 +3371,7 @@
                 <w:color w:val="000000"/>
                 <w:sz w:val="24"/>
               </w:rPr>
-              <w:t>Autobús reconocido a ≤18 m</w:t>
+              <w:t>Autobús reconocido a ≤26 m</w:t>
             </w:r>
           </w:p>
         </w:tc>
@@ -4158,7 +4168,7 @@
         </w:rPr>
         <w:drawing>
           <wp:inline xmlns:a="http://schemas.openxmlformats.org/drawingml/2006/main" xmlns:pic="http://schemas.openxmlformats.org/drawingml/2006/picture">
-            <wp:extent cx="5852160" cy="2926080"/>
+            <wp:extent cx="5852160" cy="3291840"/>
             <wp:docPr id="6" name="Picture 6"/>
             <wp:cNvGraphicFramePr>
               <a:graphicFrameLocks noChangeAspect="1"/>
@@ -4179,7 +4189,7 @@
                   <pic:spPr>
                     <a:xfrm>
                       <a:off x="0" y="0"/>
-                      <a:ext cx="5852160" cy="2926080"/>
+                      <a:ext cx="5852160" cy="3291840"/>
                     </a:xfrm>
                     <a:prstGeom prst="rect"/>
                   </pic:spPr>
@@ -4202,7 +4212,7 @@
           <w:color w:val="000000"/>
           <w:sz w:val="24"/>
         </w:rPr>
-        <w:t>Figura 5. Ruta derecha: evidencia final tras freno ante peatón y giro.</w:t>
+        <w:t>Figura 5. Ruta derecha: cruce iniciado después del alto y de la fase verde.</w:t>
       </w:r>
     </w:p>
     <w:p>
@@ -4431,7 +4441,7 @@
                 <w:color w:val="000000"/>
                 <w:sz w:val="24"/>
               </w:rPr>
-              <w:t>Evasión completa y llegada GPS=(-188.01,235.51)</w:t>
+              <w:t>Evasión sin contacto, retorno al carril y llegada GPS=(-188.05,236.83)</w:t>
             </w:r>
           </w:p>
         </w:tc>
@@ -4511,7 +4521,7 @@
                 <w:color w:val="000000"/>
                 <w:sz w:val="24"/>
               </w:rPr>
-              <w:t>Freno a peatón, giro contenido y llegada GPS=(28.99,-67.09)</w:t>
+              <w:t>Freno, espera hasta verde, cruce despejado y llegada GPS=(28.95,-67.48)</w:t>
             </w:r>
           </w:p>
         </w:tc>
@@ -4591,7 +4601,7 @@
                 <w:color w:val="000000"/>
                 <w:sz w:val="24"/>
               </w:rPr>
-              <w:t>Giro contenido y llegada GPS=(35.01,47.85)</w:t>
+              <w:t>Salida al carril derecho este y llegada GPS=(35.00,39.60)</w:t>
             </w:r>
           </w:p>
         </w:tc>
@@ -4643,7 +4653,7 @@
                 <w:color w:val="000000"/>
                 <w:sz w:val="24"/>
               </w:rPr>
-              <w:t>Las tomas finales completaron las tres rutas por carril derecho, sin colisión ni U-turn. Los logs registran los cambios de estado y la llegada GPS; ffmpeg decodificó los tres clips sin errores. La revalidación corrigió la deriva al entrar en la intersección y conserva el filtro que distingue 'bus stop' de un autobús real.</w:t>
+              <w:t>Las tomas finales completaron las tres rutas por carril derecho, sin colisión ni U-turn. Los logs registran los cambios de estado y la llegada GPS; ffmpeg decodificó los tres clips sin errores. La revalidación corrigió entrada insegura al cruce, el retorno tras la evasión y la salida al carril opuesto; conserva el filtro que distingue 'bus stop' de un autobús real.</w:t>
             </w:r>
           </w:p>
         </w:tc>
@@ -6334,7 +6344,7 @@
                 <w:color w:val="000000"/>
                 <w:sz w:val="24"/>
               </w:rPr>
-              <w:t>≤18 m + FSM de evasión</w:t>
+              <w:t>≤26 m + FSM de evasión y retorno de carril</w:t>
             </w:r>
           </w:p>
         </w:tc>
@@ -7395,7 +7405,7 @@
         <w:br/>
         <w:t>PEDESTRIAN_STOP_DISTANCE_M = 15.0</w:t>
         <w:br/>
-        <w:t>PARKED_BUS_TRIGGER_DISTANCE_M = 18.0</w:t>
+        <w:t>PARKED_BUS_TRIGGER_DISTANCE_M = 26.0</w:t>
         <w:br/>
         <w:t>FOLLOW_CONTROL_DISTANCE_M = 25.0</w:t>
         <w:br/>
@@ -7403,7 +7413,7 @@
         <w:br/>
         <w:t>FOLLOW_RESUME_DISTANCE_M = 15.0</w:t>
         <w:br/>
-        <w:t>AVOID_SPEED_KMH = 12.0</w:t>
+        <w:t>AVOID_SPEED_KMH = 8.0</w:t>
         <w:br/>
         <w:t>RECOVERY_SPEED_KMH = 10.0</w:t>
         <w:br/>
@@ -7417,7 +7427,11 @@
         <w:br/>
         <w:t>INFERENCE_INTERVAL_STEPS = 4</w:t>
         <w:br/>
-        <w:t>ROUTE_TURN_SPEED_KMH = 14.0</w:t>
+        <w:t>ROUTE_TURN_SPEED_KMH = 10.0</w:t>
+        <w:br/>
+        <w:t>SIGNAL_MIN_STOP_SECONDS = 2.0</w:t>
+        <w:br/>
+        <w:t>RIGHT_SIGNAL_CYCLE_SECONDS = 41.856</w:t>
         <w:br/>
         <w:br/>
         <w:br/>
@@ -7440,10 +7454,6 @@
         <w:t xml:space="preserve">    return max(minimum, min(maximum, value))</w:t>
         <w:br/>
         <w:br/>
-        <w:br/>
-        <w:t>def command_to_one_hot(command: int) -&gt; np.ndarray:</w:t>
-        <w:br/>
-        <w:t xml:space="preserve">    """Encode one validated command for the model's second input."""</w:t>
       </w:r>
     </w:p>
     <w:p>
@@ -7459,6 +7469,10 @@
           <w:color w:val="000000"/>
           <w:sz w:val="13"/>
         </w:rPr>
+        <w:t>def command_to_one_hot(command: int) -&gt; np.ndarray:</w:t>
+        <w:br/>
+        <w:t xml:space="preserve">    """Encode one validated command for the model's second input."""</w:t>
+        <w:br/>
         <w:t xml:space="preserve">    if command not in COMMAND_NAMES:</w:t>
         <w:br/>
         <w:t xml:space="preserve">        raise ValueError(f"Comando CIL invalido: {command}")</w:t>
@@ -7512,10 +7526,669 @@
         <w:t xml:space="preserve">    if distance_m &lt;= FOLLOW_STOP_DISTANCE_M:</w:t>
         <w:br/>
         <w:t xml:space="preserve">        return 0.0</w:t>
-        <w:br/>
+      </w:r>
+    </w:p>
+    <w:p>
+      <w:pPr>
+        <w:keepLines w:val="0"/>
+        <w:spacing w:after="60" w:line="240" w:lineRule="auto"/>
+        <w:ind w:left="216" w:right="216"/>
+        <w:shd w:fill="F7F7F7"/>
+      </w:pPr>
+      <w:r>
+        <w:rPr>
+          <w:rFonts w:ascii="Menlo" w:hAnsi="Menlo" w:eastAsia="Menlo" w:cs="Menlo"/>
+          <w:color w:val="000000"/>
+          <w:sz w:val="13"/>
+        </w:rPr>
         <w:t xml:space="preserve">    ratio = (distance_m - FOLLOW_STOP_DISTANCE_M) / (</w:t>
         <w:br/>
         <w:t xml:space="preserve">        FOLLOW_CONTROL_DISTANCE_M - FOLLOW_STOP_DISTANCE_M</w:t>
+        <w:br/>
+        <w:t xml:space="preserve">    )</w:t>
+        <w:br/>
+        <w:t xml:space="preserve">    return clamp(EVALUATION_SPEED_KMH * ratio, 0.0, EVALUATION_SPEED_KMH)</w:t>
+        <w:br/>
+        <w:br/>
+        <w:br/>
+        <w:t>def adaptive_follow_speed_hysteresis(</w:t>
+        <w:br/>
+        <w:t xml:space="preserve">    distance_m: float, stopped_for_vehicle: bool</w:t>
+        <w:br/>
+        <w:t>) -&gt; tuple[float, bool]:</w:t>
+        <w:br/>
+        <w:t xml:space="preserve">    """Mantiene el alto hasta que el vehiculo precedente vuelva a 15 m."""</w:t>
+        <w:br/>
+        <w:t xml:space="preserve">    if distance_m &lt;= FOLLOW_STOP_DISTANCE_M:</w:t>
+        <w:br/>
+        <w:t xml:space="preserve">        return 0.0, True</w:t>
+        <w:br/>
+        <w:t xml:space="preserve">    if stopped_for_vehicle and distance_m &lt; FOLLOW_RESUME_DISTANCE_M:</w:t>
+        <w:br/>
+        <w:t xml:space="preserve">        return 0.0, True</w:t>
+        <w:br/>
+        <w:t xml:space="preserve">    return adaptive_follow_speed(distance_m), False</w:t>
+        <w:br/>
+        <w:br/>
+        <w:br/>
+        <w:t>def route_turn_guidance(</w:t>
+        <w:br/>
+        <w:t xml:space="preserve">    route: str,</w:t>
+        <w:br/>
+        <w:t xml:space="preserve">    x: float,</w:t>
+        <w:br/>
+        <w:t xml:space="preserve">    y: float,</w:t>
+        <w:br/>
+        <w:t xml:space="preserve">    heading: float,</w:t>
+        <w:br/>
+        <w:t xml:space="preserve">    turning: bool,</w:t>
+        <w:br/>
+        <w:t xml:space="preserve">    completed: bool,</w:t>
+        <w:br/>
+        <w:t>) -&gt; tuple[float | None, bool, bool, int | None]:</w:t>
+        <w:br/>
+        <w:t xml:space="preserve">    """Refuerza un único giro de ruta; fuera del cruce conserva la salida CIL."""</w:t>
+        <w:br/>
+        <w:t xml:space="preserve">    if completed:</w:t>
+        <w:br/>
+        <w:t xml:space="preserve">        return None, False, True, None</w:t>
+        <w:br/>
+        <w:t xml:space="preserve">    if route == "left":</w:t>
+        <w:br/>
+        <w:t xml:space="preserve">        # Enter deeper into the junction before steering so the exit arc lands</w:t>
+        <w:br/>
+        <w:t xml:space="preserve">        # in the eastbound right lane instead of the opposing westbound lane.</w:t>
+        <w:br/>
+        <w:t xml:space="preserve">        turning = turning or (y &lt;= 49.0 and x &lt; 5.0)</w:t>
+      </w:r>
+    </w:p>
+    <w:p>
+      <w:pPr>
+        <w:keepLines w:val="0"/>
+        <w:spacing w:after="60" w:line="240" w:lineRule="auto"/>
+        <w:ind w:left="216" w:right="216"/>
+        <w:shd w:fill="F7F7F7"/>
+      </w:pPr>
+      <w:r>
+        <w:rPr>
+          <w:rFonts w:ascii="Menlo" w:hAnsi="Menlo" w:eastAsia="Menlo" w:cs="Menlo"/>
+          <w:color w:val="000000"/>
+          <w:sz w:val="13"/>
+        </w:rPr>
+        <w:t xml:space="preserve">        if turning and heading &gt;= 1.30:</w:t>
+        <w:br/>
+        <w:t xml:space="preserve">            return None, False, True, STRAIGHT</w:t>
+        <w:br/>
+        <w:t xml:space="preserve">        if turning:</w:t>
+        <w:br/>
+        <w:t xml:space="preserve">            return -0.42, True, False, None</w:t>
+        <w:br/>
+        <w:t xml:space="preserve">    elif route == "right":</w:t>
+        <w:br/>
+        <w:t xml:space="preserve">        turning = turning or (y &lt;= -58.0 and x &gt; 20.0)</w:t>
+        <w:br/>
+        <w:t xml:space="preserve">        if turning and heading &lt;= -1.30:</w:t>
+        <w:br/>
+        <w:t xml:space="preserve">            return None, False, True, STRAIGHT</w:t>
+        <w:br/>
+        <w:t xml:space="preserve">        if turning:</w:t>
+        <w:br/>
+        <w:t xml:space="preserve">            return 0.35, True, False, None</w:t>
+        <w:br/>
+        <w:t xml:space="preserve">    return None, turning, completed, None</w:t>
+        <w:br/>
+        <w:br/>
+        <w:br/>
+        <w:t>def route_destination_reached(route: str, x: float, y: float) -&gt; bool:</w:t>
+        <w:br/>
+        <w:t xml:space="preserve">    if route == "straight":</w:t>
+        <w:br/>
+        <w:t xml:space="preserve">        return x &lt;= -188.0 and y &gt;= 220.0</w:t>
+        <w:br/>
+        <w:t xml:space="preserve">    if route == "right":</w:t>
+        <w:br/>
+        <w:t xml:space="preserve">        return x &lt;= 29.0 and y &lt;= -63.0</w:t>
+        <w:br/>
+        <w:t xml:space="preserve">    if route == "left":</w:t>
+        <w:br/>
+        <w:t xml:space="preserve">        return x &gt;= 35.0 and 37.5 &lt;= y &lt;= 42.0</w:t>
+        <w:br/>
+        <w:t xml:space="preserve">    return False</w:t>
+        <w:br/>
+        <w:br/>
+        <w:br/>
+        <w:t>def route_heading_assist(route: str, heading: float, turn_completed: bool) -&gt; float | None:</w:t>
+        <w:br/>
+        <w:t xml:space="preserve">    """Mantiene el corredor de salida una vez completado el giro de ruta."""</w:t>
+        <w:br/>
+        <w:t xml:space="preserve">    if route != "straight" and not turn_completed:</w:t>
+        <w:br/>
+        <w:t xml:space="preserve">        return None</w:t>
+        <w:br/>
+        <w:t xml:space="preserve">    target = {</w:t>
+        <w:br/>
+        <w:t xml:space="preserve">        "straight": 0.0,</w:t>
+        <w:br/>
+        <w:t xml:space="preserve">        "left": math.pi / 2.0,</w:t>
+        <w:br/>
+        <w:t xml:space="preserve">        "right": -math.pi / 2.0,</w:t>
+        <w:br/>
+        <w:t xml:space="preserve">    }.get(route)</w:t>
+      </w:r>
+    </w:p>
+    <w:p>
+      <w:pPr>
+        <w:keepLines w:val="0"/>
+        <w:spacing w:after="60" w:line="240" w:lineRule="auto"/>
+        <w:ind w:left="216" w:right="216"/>
+        <w:shd w:fill="F7F7F7"/>
+      </w:pPr>
+      <w:r>
+        <w:rPr>
+          <w:rFonts w:ascii="Menlo" w:hAnsi="Menlo" w:eastAsia="Menlo" w:cs="Menlo"/>
+          <w:color w:val="000000"/>
+          <w:sz w:val="13"/>
+        </w:rPr>
+        <w:t xml:space="preserve">    if target is None:</w:t>
+        <w:br/>
+        <w:t xml:space="preserve">        return None</w:t>
+        <w:br/>
+        <w:t xml:space="preserve">    return clamp(0.70 * (heading - target), -0.18, 0.18)</w:t>
+        <w:br/>
+        <w:br/>
+        <w:br/>
+        <w:t>def route_corridor_assist(</w:t>
+        <w:br/>
+        <w:t xml:space="preserve">    route: str,</w:t>
+        <w:br/>
+        <w:t xml:space="preserve">    x: float,</w:t>
+        <w:br/>
+        <w:t xml:space="preserve">    y: float,</w:t>
+        <w:br/>
+        <w:t xml:space="preserve">    heading: float,</w:t>
+        <w:br/>
+        <w:t xml:space="preserve">    turn_completed: bool,</w:t>
+        <w:br/>
+        <w:t>) -&gt; float | None:</w:t>
+        <w:br/>
+        <w:t xml:space="preserve">    """Stabilize heading and place the car in the right-hand exit lane."""</w:t>
+        <w:br/>
+        <w:t xml:space="preserve">    heading_steering = route_heading_assist(route, heading, turn_completed)</w:t>
+        <w:br/>
+        <w:t xml:space="preserve">    if heading_steering is None:</w:t>
+        <w:br/>
+        <w:t xml:space="preserve">        return None</w:t>
+        <w:br/>
+        <w:t xml:space="preserve">    if route == "straight":</w:t>
+        <w:br/>
+        <w:t xml:space="preserve">        # Westbound right lane is north of the center line.  After passing the</w:t>
+        <w:br/>
+        <w:t xml:space="preserve">        # bus, actively return from the temporary opposing-lane excursion.</w:t>
+        <w:br/>
+        <w:t xml:space="preserve">        if y &lt; 235.8:</w:t>
+        <w:br/>
+        <w:t xml:space="preserve">            target_heading = -0.30</w:t>
+        <w:br/>
+        <w:t xml:space="preserve">        elif y &gt; 237.0:</w:t>
+        <w:br/>
+        <w:t xml:space="preserve">            target_heading = 0.20</w:t>
+        <w:br/>
+        <w:t xml:space="preserve">        else:</w:t>
+        <w:br/>
+        <w:t xml:space="preserve">            target_heading = 0.0</w:t>
+        <w:br/>
+        <w:t xml:space="preserve">        return clamp(0.90 * (heading - target_heading), -0.24, 0.24)</w:t>
+        <w:br/>
+        <w:t xml:space="preserve">    if route == "left":</w:t>
+        <w:br/>
+        <w:t xml:space="preserve">        return clamp(heading_steering + 0.055 * (y - 39.6), -0.24, 0.24)</w:t>
+        <w:br/>
+        <w:t xml:space="preserve">    return heading_steering</w:t>
+        <w:br/>
+        <w:br/>
+        <w:br/>
+        <w:t>def route_signal_stop_required(</w:t>
+      </w:r>
+    </w:p>
+    <w:p>
+      <w:pPr>
+        <w:keepLines w:val="0"/>
+        <w:spacing w:after="60" w:line="240" w:lineRule="auto"/>
+        <w:ind w:left="216" w:right="216"/>
+        <w:shd w:fill="F7F7F7"/>
+      </w:pPr>
+      <w:r>
+        <w:rPr>
+          <w:rFonts w:ascii="Menlo" w:hAnsi="Menlo" w:eastAsia="Menlo" w:cs="Menlo"/>
+          <w:color w:val="000000"/>
+          <w:sz w:val="13"/>
+        </w:rPr>
+        <w:t xml:space="preserve">    route: str,</w:t>
+        <w:br/>
+        <w:t xml:space="preserve">    x: float,</w:t>
+        <w:br/>
+        <w:t xml:space="preserve">    y: float,</w:t>
+        <w:br/>
+        <w:t xml:space="preserve">    turning: bool,</w:t>
+        <w:br/>
+        <w:t xml:space="preserve">    completed: bool,</w:t>
+        <w:br/>
+        <w:t xml:space="preserve">    released: bool,</w:t>
+        <w:br/>
+        <w:t>) -&gt; bool:</w:t>
+        <w:br/>
+        <w:t xml:space="preserve">    """Hold the right-route vehicle at its stop line before entering the junction."""</w:t>
+        <w:br/>
+        <w:t xml:space="preserve">    return (</w:t>
+        <w:br/>
+        <w:t xml:space="preserve">        route == "right"</w:t>
+        <w:br/>
+        <w:t xml:space="preserve">        and not turning</w:t>
+        <w:br/>
+        <w:t xml:space="preserve">        and not completed</w:t>
+        <w:br/>
+        <w:t xml:space="preserve">        and not released</w:t>
+        <w:br/>
+        <w:t xml:space="preserve">        and 35.0 &lt;= x &lt;= 45.0</w:t>
+        <w:br/>
+        <w:t xml:space="preserve">        and -40.0 &lt; y &lt;= -28.0</w:t>
+        <w:br/>
+        <w:t xml:space="preserve">    )</w:t>
+        <w:br/>
+        <w:br/>
+        <w:br/>
+        <w:t>def right_signal_is_green(simulation_time: float) -&gt; bool:</w:t>
+        <w:br/>
+        <w:t xml:space="preserve">    """Match the north/south straight-right phase of CrossRoadsTrafficLight."""</w:t>
+        <w:br/>
+        <w:t xml:space="preserve">    phase = simulation_time % RIGHT_SIGNAL_CYCLE_SECONDS</w:t>
+        <w:br/>
+        <w:t xml:space="preserve">    return 9.984 &lt;= phase &lt; 17.984</w:t>
+        <w:br/>
+        <w:br/>
+        <w:br/>
+        <w:t>def route_approach_assist(</w:t>
+        <w:br/>
+        <w:t xml:space="preserve">    route: str,</w:t>
+        <w:br/>
+        <w:t xml:space="preserve">    x: float,</w:t>
+        <w:br/>
+        <w:t xml:space="preserve">    y: float,</w:t>
+        <w:br/>
+        <w:t xml:space="preserve">    heading: float,</w:t>
+        <w:br/>
+        <w:t xml:space="preserve">    turning: bool,</w:t>
+        <w:br/>
+        <w:t xml:space="preserve">    completed: bool,</w:t>
+        <w:br/>
+        <w:t>) -&gt; float | None:</w:t>
+      </w:r>
+    </w:p>
+    <w:p>
+      <w:pPr>
+        <w:keepLines w:val="0"/>
+        <w:spacing w:after="60" w:line="240" w:lineRule="auto"/>
+        <w:ind w:left="216" w:right="216"/>
+        <w:shd w:fill="F7F7F7"/>
+      </w:pPr>
+      <w:r>
+        <w:rPr>
+          <w:rFonts w:ascii="Menlo" w:hAnsi="Menlo" w:eastAsia="Menlo" w:cs="Menlo"/>
+          <w:color w:val="000000"/>
+          <w:sz w:val="13"/>
+        </w:rPr>
+        <w:t xml:space="preserve">    """Centra el auto en el carril antes del giro para entrar desde la geometria correcta."""</w:t>
+        <w:br/>
+        <w:t xml:space="preserve">    if turning or completed:</w:t>
+        <w:br/>
+        <w:t xml:space="preserve">        return None</w:t>
+        <w:br/>
+        <w:t xml:space="preserve">    target_x = None</w:t>
+        <w:br/>
+        <w:t xml:space="preserve">    if route == "right" and y &gt; -58.0:</w:t>
+        <w:br/>
+        <w:t xml:space="preserve">        target_x = 40.0</w:t>
+        <w:br/>
+        <w:t xml:space="preserve">    elif route == "left" and y &gt; 56.0:</w:t>
+        <w:br/>
+        <w:t xml:space="preserve">        target_x = -50.4</w:t>
+        <w:br/>
+        <w:t xml:space="preserve">    if target_x is None:</w:t>
+        <w:br/>
+        <w:t xml:space="preserve">        return None</w:t>
+        <w:br/>
+        <w:t xml:space="preserve">    lateral_error = x - target_x</w:t>
+        <w:br/>
+        <w:t xml:space="preserve">    return clamp(0.055 * lateral_error + 0.90 * heading, -0.22, 0.22)</w:t>
+        <w:br/>
+        <w:br/>
+        <w:br/>
+        <w:t>def front_lidar_distance(lidar) -&gt; float:</w:t>
+        <w:br/>
+        <w:t xml:space="preserve">    values = lidar.getRangeImage()</w:t>
+        <w:br/>
+        <w:t xml:space="preserve">    if not values:</w:t>
+        <w:br/>
+        <w:t xml:space="preserve">        return float("inf")</w:t>
+        <w:br/>
+        <w:t xml:space="preserve">    center = len(values) // 2</w:t>
+        <w:br/>
+        <w:t xml:space="preserve">    # Sector frontal de 90 grados, alineado con el campo de la camara.</w:t>
+        <w:br/>
+        <w:t xml:space="preserve">    half_window = max(1, len(values) // 4)</w:t>
+        <w:br/>
+        <w:t xml:space="preserve">    valid = [</w:t>
+        <w:br/>
+        <w:t xml:space="preserve">        value</w:t>
+        <w:br/>
+        <w:t xml:space="preserve">        for value in values[center - half_window : center + half_window]</w:t>
+        <w:br/>
+        <w:t xml:space="preserve">        if math.isfinite(value) and 0.1 &lt; value &lt;= 50.0</w:t>
+        <w:br/>
+        <w:t xml:space="preserve">    ]</w:t>
+        <w:br/>
+        <w:t xml:space="preserve">    return min(valid) if valid else float("inf")</w:t>
+        <w:br/>
+        <w:br/>
+        <w:br/>
+        <w:t>def closest_radar_target(radar) -&gt; tuple[float, float]:</w:t>
+        <w:br/>
+        <w:t xml:space="preserve">    """Return distance and radial speed of the nearest target within +/-17 deg."""</w:t>
+        <w:br/>
+        <w:t xml:space="preserve">    candidates = []</w:t>
+      </w:r>
+    </w:p>
+    <w:p>
+      <w:pPr>
+        <w:keepLines w:val="0"/>
+        <w:spacing w:after="60" w:line="240" w:lineRule="auto"/>
+        <w:ind w:left="216" w:right="216"/>
+        <w:shd w:fill="F7F7F7"/>
+      </w:pPr>
+      <w:r>
+        <w:rPr>
+          <w:rFonts w:ascii="Menlo" w:hAnsi="Menlo" w:eastAsia="Menlo" w:cs="Menlo"/>
+          <w:color w:val="000000"/>
+          <w:sz w:val="13"/>
+        </w:rPr>
+        <w:t xml:space="preserve">    for target in radar.getTargets():</w:t>
+        <w:br/>
+        <w:t xml:space="preserve">        # The BmwX5 front slot can intermittently report a self-return near</w:t>
+        <w:br/>
+        <w:t xml:space="preserve">        # 2.45 m; LiDAR still protects the immediate zone, so ignore &lt;3 m.</w:t>
+        <w:br/>
+        <w:t xml:space="preserve">        if abs(float(target.azimuth)) &lt;= 0.30 and float(target.distance) &gt;= 3.0:</w:t>
+        <w:br/>
+        <w:t xml:space="preserve">            candidates.append((float(target.distance), float(target.speed)))</w:t>
+        <w:br/>
+        <w:t xml:space="preserve">    return min(candidates, key=lambda item: item[0]) if candidates else (float("inf"), 0.0)</w:t>
+        <w:br/>
+        <w:br/>
+        <w:br/>
+        <w:t>def closest_recognized(camera, model_fragment: str) -&gt; float:</w:t>
+        <w:br/>
+        <w:t xml:space="preserve">    distances = []</w:t>
+        <w:br/>
+        <w:t xml:space="preserve">    fragment = model_fragment.lower()</w:t>
+        <w:br/>
+        <w:t xml:space="preserve">    for obj in camera.getRecognitionObjects():</w:t>
+        <w:br/>
+        <w:t xml:space="preserve">        model = str(obj.getModel()).lower()</w:t>
+        <w:br/>
+        <w:t xml:space="preserve">        # Webots labels street furniture as "bus stop".  A substring-only</w:t>
+        <w:br/>
+        <w:t xml:space="preserve">        # comparison would therefore launch an avoidance manoeuvre against the</w:t>
+        <w:br/>
+        <w:t xml:space="preserve">        # shelter itself.  Only vehicle-like bus models are valid obstacles.</w:t>
+        <w:br/>
+        <w:t xml:space="preserve">        if fragment not in model or (fragment == "bus" and "stop" in model):</w:t>
+        <w:br/>
+        <w:t xml:space="preserve">            continue</w:t>
+        <w:br/>
+        <w:t xml:space="preserve">        position = obj.getPosition()</w:t>
+        <w:br/>
+        <w:t xml:space="preserve">        distance = math.sqrt(sum(float(axis) ** 2 for axis in position))</w:t>
+        <w:br/>
+        <w:t xml:space="preserve">        image_x, image_y = obj.getPositionOnImage()</w:t>
+        <w:br/>
+        <w:t xml:space="preserve">        if 0 &lt;= image_x &lt; camera.getWidth() and 0 &lt;= image_y &lt; camera.getHeight():</w:t>
+        <w:br/>
+        <w:t xml:space="preserve">            distances.append(distance)</w:t>
+        <w:br/>
+        <w:t xml:space="preserve">    return min(distances) if distances else float("inf")</w:t>
+        <w:br/>
+        <w:br/>
+        <w:br/>
+        <w:t>def read_right_distances(sensors: dict[str, object]) -&gt; dict[str, float]:</w:t>
+        <w:br/>
+        <w:t xml:space="preserve">    result = {}</w:t>
+        <w:br/>
+        <w:t xml:space="preserve">    for name, sensor in sensors.items():</w:t>
+        <w:br/>
+        <w:t xml:space="preserve">        value = float(sensor.getValue())</w:t>
+        <w:br/>
+        <w:t xml:space="preserve">        result[name] = value if math.isfinite(value) and value &gt; 0.05 else float("inf")</w:t>
+        <w:br/>
+        <w:t xml:space="preserve">    return result</w:t>
+      </w:r>
+    </w:p>
+    <w:p>
+      <w:pPr>
+        <w:keepLines w:val="0"/>
+        <w:spacing w:after="60" w:line="240" w:lineRule="auto"/>
+        <w:ind w:left="216" w:right="216"/>
+        <w:shd w:fill="F7F7F7"/>
+      </w:pPr>
+      <w:r>
+        <w:rPr>
+          <w:rFonts w:ascii="Menlo" w:hAnsi="Menlo" w:eastAsia="Menlo" w:cs="Menlo"/>
+          <w:color w:val="000000"/>
+          <w:sz w:val="13"/>
+        </w:rPr>
+        <w:br/>
+        <w:br/>
+        <w:t>def wall_present(distances: dict[str, float]) -&gt; bool:</w:t>
+        <w:br/>
+        <w:t xml:space="preserve">    return any(value &lt; WALL_PRESENT_DISTANCE_M for value in distances.values())</w:t>
+        <w:br/>
+        <w:br/>
+        <w:br/>
+        <w:t>def wall_following_steering(distances: dict[str, float]) -&gt; float:</w:t>
+        <w:br/>
+        <w:t xml:space="preserve">    valid = [value for value in distances.values() if math.isfinite(value)]</w:t>
+        <w:br/>
+        <w:t xml:space="preserve">    if not valid:</w:t>
+        <w:br/>
+        <w:t xml:space="preserve">        return -0.12</w:t>
+        <w:br/>
+        <w:t xml:space="preserve">    front = distances["front"]</w:t>
+        <w:br/>
+        <w:t xml:space="preserve">    middle = distances["middle"]</w:t>
+        <w:br/>
+        <w:t xml:space="preserve">    rear = distances["rear"]</w:t>
+        <w:br/>
+        <w:t xml:space="preserve">    side = middle if middle &lt; WALL_PRESENT_DISTANCE_M else min(valid)</w:t>
+        <w:br/>
+        <w:t xml:space="preserve">    distance_error = side - WALL_TARGET_DISTANCE_M</w:t>
+        <w:br/>
+        <w:t xml:space="preserve">    alignment_error = (</w:t>
+        <w:br/>
+        <w:t xml:space="preserve">        front - rear</w:t>
+        <w:br/>
+        <w:t xml:space="preserve">        if front &lt; WALL_PRESENT_DISTANCE_M and rear &lt; WALL_PRESENT_DISTANCE_M</w:t>
+        <w:br/>
+        <w:t xml:space="preserve">        else 0.0</w:t>
+        <w:br/>
+        <w:t xml:space="preserve">    )</w:t>
+        <w:br/>
+        <w:t xml:space="preserve">    return clamp(0.22 * distance_error + 0.16 * alignment_error, -0.42, 0.42)</w:t>
+        <w:br/>
+        <w:br/>
+        <w:br/>
+        <w:t>def get_device(driver, name: str):</w:t>
+        <w:br/>
+        <w:t xml:space="preserve">    try:</w:t>
+        <w:br/>
+        <w:t xml:space="preserve">        return driver.getDevice(name)</w:t>
+        <w:br/>
+        <w:t xml:space="preserve">    except BaseException as exc:</w:t>
+        <w:br/>
+        <w:t xml:space="preserve">        raise RuntimeError(f"El mundo no contiene el dispositivo requerido: {name}") from exc</w:t>
+        <w:br/>
+        <w:br/>
+        <w:br/>
+        <w:t>def main() -&gt; None:</w:t>
+        <w:br/>
+        <w:t xml:space="preserve">    import tensorflow as tf</w:t>
+      </w:r>
+    </w:p>
+    <w:p>
+      <w:pPr>
+        <w:keepLines w:val="0"/>
+        <w:spacing w:after="60" w:line="240" w:lineRule="auto"/>
+        <w:ind w:left="216" w:right="216"/>
+        <w:shd w:fill="F7F7F7"/>
+      </w:pPr>
+      <w:r>
+        <w:rPr>
+          <w:rFonts w:ascii="Menlo" w:hAnsi="Menlo" w:eastAsia="Menlo" w:cs="Menlo"/>
+          <w:color w:val="000000"/>
+          <w:sz w:val="13"/>
+        </w:rPr>
+        <w:t xml:space="preserve">    from vehicle import Driver</w:t>
+        <w:br/>
+        <w:br/>
+        <w:t xml:space="preserve">    driver = Driver()</w:t>
+        <w:br/>
+        <w:t xml:space="preserve">    timestep = int(driver.getBasicTimeStep())</w:t>
+        <w:br/>
+        <w:t xml:space="preserve">    root = Path(__file__).resolve().parents[2]</w:t>
+        <w:br/>
+        <w:t xml:space="preserve">    model_path = Path(__file__).with_name("cil_model.h5")</w:t>
+        <w:br/>
+        <w:t xml:space="preserve">    metadata_path = Path(__file__).with_name("model_metadata.json")</w:t>
+        <w:br/>
+        <w:t xml:space="preserve">    if not model_path.exists() or not metadata_path.exists():</w:t>
+        <w:br/>
+        <w:t xml:space="preserve">        raise FileNotFoundError("Faltan cil_model.h5 o model_metadata.json junto al controlador")</w:t>
+        <w:br/>
+        <w:br/>
+        <w:t xml:space="preserve">    metadata = json.loads(metadata_path.read_text(encoding="utf-8"))</w:t>
+        <w:br/>
+        <w:t xml:space="preserve">    model = tf.keras.models.load_model(model_path, compile=False)</w:t>
+        <w:br/>
+        <w:br/>
+        <w:t xml:space="preserve">    camera = get_device(driver, "camera")</w:t>
+        <w:br/>
+        <w:t xml:space="preserve">    camera.enable(timestep)</w:t>
+        <w:br/>
+        <w:t xml:space="preserve">    camera.recognitionEnable(timestep)</w:t>
+        <w:br/>
+        <w:t xml:space="preserve">    lidar = get_device(driver, "Sick LMS 291")</w:t>
+        <w:br/>
+        <w:t xml:space="preserve">    lidar.enable(timestep)</w:t>
+        <w:br/>
+        <w:t xml:space="preserve">    radar = get_device(driver, "front_radar")</w:t>
+        <w:br/>
+        <w:t xml:space="preserve">    radar.enable(timestep)</w:t>
+        <w:br/>
+        <w:t xml:space="preserve">    gyro = get_device(driver, "gyro")</w:t>
+        <w:br/>
+        <w:t xml:space="preserve">    gyro.enable(timestep)</w:t>
+        <w:br/>
+        <w:t xml:space="preserve">    gps = get_device(driver, "gps")</w:t>
+        <w:br/>
+        <w:t xml:space="preserve">    gps.enable(timestep)</w:t>
+        <w:br/>
+        <w:t xml:space="preserve">    keyboard = driver.getKeyboard()</w:t>
+        <w:br/>
+        <w:t xml:space="preserve">    keyboard.enable(timestep)</w:t>
+        <w:br/>
+        <w:br/>
+        <w:t xml:space="preserve">    right_sensors = {</w:t>
+        <w:br/>
+        <w:t xml:space="preserve">        "front": get_device(driver, "ds_right_front"),</w:t>
+        <w:br/>
+        <w:t xml:space="preserve">        "middle": get_device(driver, "ds_right_middle"),</w:t>
+        <w:br/>
+        <w:t xml:space="preserve">        "rear": get_device(driver, "ds_right_rear"),</w:t>
+        <w:br/>
+        <w:t xml:space="preserve">    }</w:t>
+      </w:r>
+    </w:p>
+    <w:p>
+      <w:pPr>
+        <w:keepLines w:val="0"/>
+        <w:spacing w:after="60" w:line="240" w:lineRule="auto"/>
+        <w:ind w:left="216" w:right="216"/>
+        <w:shd w:fill="F7F7F7"/>
+      </w:pPr>
+      <w:r>
+        <w:rPr>
+          <w:rFonts w:ascii="Menlo" w:hAnsi="Menlo" w:eastAsia="Menlo" w:cs="Menlo"/>
+          <w:color w:val="000000"/>
+          <w:sz w:val="13"/>
+        </w:rPr>
+        <w:t xml:space="preserve">    for sensor in right_sensors.values():</w:t>
+        <w:br/>
+        <w:t xml:space="preserve">        sensor.enable(timestep)</w:t>
+        <w:br/>
+        <w:br/>
+        <w:t xml:space="preserve">    max_seconds = float(os.environ.get("CIL_MAX_SECONDS", "0") or 0)</w:t>
+        <w:br/>
+        <w:br/>
+        <w:t xml:space="preserve">    command = int(os.environ.get("CIL_INITIAL_COMMAND", STRAIGHT))</w:t>
+        <w:br/>
+        <w:t xml:space="preserve">    route = os.environ.get("CIL_ROUTE", "").strip().lower()</w:t>
+        <w:br/>
+        <w:t xml:space="preserve">    if command not in COMMAND_NAMES:</w:t>
+        <w:br/>
+        <w:t xml:space="preserve">        raise ValueError(f"CIL_INITIAL_COMMAND invalido: {command}")</w:t>
+        <w:br/>
+        <w:t xml:space="preserve">    state = AvoidanceState.DRIVE</w:t>
+        <w:br/>
+        <w:t xml:space="preserve">    state_started = driver.getTime()</w:t>
+        <w:br/>
+        <w:t xml:space="preserve">    heading = 0.0</w:t>
+        <w:br/>
+        <w:t xml:space="preserve">    previous_time = driver.getTime()</w:t>
+        <w:br/>
+        <w:t xml:space="preserve">    heading_before_avoidance = 0.0</w:t>
+        <w:br/>
+        <w:t xml:space="preserve">    wall_lost_steps = 0</w:t>
+        <w:br/>
+        <w:t xml:space="preserve">    steering_command = 0.0</w:t>
+        <w:br/>
+        <w:t xml:space="preserve">    cil_steering = 0.0</w:t>
+        <w:br/>
+        <w:t xml:space="preserve">    stopped_for_vehicle = False</w:t>
+        <w:br/>
+        <w:t xml:space="preserve">    route_turning = False</w:t>
+        <w:br/>
+        <w:t xml:space="preserve">    route_turn_completed = False</w:t>
+        <w:br/>
+        <w:t xml:space="preserve">    route_arrived = False</w:t>
+        <w:br/>
+        <w:t xml:space="preserve">    bus_avoidance_started = False</w:t>
+        <w:br/>
+        <w:t xml:space="preserve">    signal_stop_started = None</w:t>
+        <w:br/>
+        <w:t xml:space="preserve">    signal_released = False</w:t>
+        <w:br/>
+        <w:t xml:space="preserve">    frame = 0</w:t>
+        <w:br/>
+        <w:t xml:space="preserve">    wall_clock_started = time.monotonic()</w:t>
+        <w:br/>
+        <w:br/>
+        <w:t xml:space="preserve">    print("Control CIL + seguridad iniciado")</w:t>
+        <w:br/>
+        <w:t xml:space="preserve">    print("W=STRAIGHT | A=LEFT | D=RIGHT")</w:t>
+        <w:br/>
+        <w:t xml:space="preserve">    print(</w:t>
+        <w:br/>
+        <w:t xml:space="preserve">        "Umbrales: peaton=15 m, autobus=26 m, "</w:t>
+        <w:br/>
+        <w:t xml:space="preserve">        "seguimiento=25 m, parada de seguimiento=12 m"</w:t>
       </w:r>
     </w:p>
     <w:p>
@@ -7533,63 +8206,64 @@
         </w:rPr>
         <w:t xml:space="preserve">    )</w:t>
         <w:br/>
-        <w:t xml:space="preserve">    return clamp(EVALUATION_SPEED_KMH * ratio, 0.0, EVALUATION_SPEED_KMH)</w:t>
-        <w:br/>
-        <w:br/>
-        <w:br/>
-        <w:t>def adaptive_follow_speed_hysteresis(</w:t>
-        <w:br/>
-        <w:t xml:space="preserve">    distance_m: float, stopped_for_vehicle: bool</w:t>
-        <w:br/>
-        <w:t>) -&gt; tuple[float, bool]:</w:t>
-        <w:br/>
-        <w:t xml:space="preserve">    """Mantiene el alto hasta que el vehiculo precedente vuelva a 15 m."""</w:t>
-        <w:br/>
-        <w:t xml:space="preserve">    if distance_m &lt;= FOLLOW_STOP_DISTANCE_M:</w:t>
-        <w:br/>
-        <w:t xml:space="preserve">        return 0.0, True</w:t>
-        <w:br/>
-        <w:t xml:space="preserve">    if stopped_for_vehicle and distance_m &lt; FOLLOW_RESUME_DISTANCE_M:</w:t>
-        <w:br/>
-        <w:t xml:space="preserve">        return 0.0, True</w:t>
-        <w:br/>
-        <w:t xml:space="preserve">    return adaptive_follow_speed(distance_m), False</w:t>
-        <w:br/>
-        <w:br/>
-        <w:br/>
-        <w:t>def route_turn_guidance(</w:t>
-        <w:br/>
-        <w:t xml:space="preserve">    route: str,</w:t>
-        <w:br/>
-        <w:t xml:space="preserve">    x: float,</w:t>
-        <w:br/>
-        <w:t xml:space="preserve">    y: float,</w:t>
-        <w:br/>
-        <w:t xml:space="preserve">    heading: float,</w:t>
-        <w:br/>
-        <w:t xml:space="preserve">    turning: bool,</w:t>
-        <w:br/>
-        <w:t xml:space="preserve">    completed: bool,</w:t>
-        <w:br/>
-        <w:t>) -&gt; tuple[float | None, bool, bool, int | None]:</w:t>
-        <w:br/>
-        <w:t xml:space="preserve">    """Refuerza un único giro de ruta; fuera del cruce conserva la salida CIL."""</w:t>
-        <w:br/>
-        <w:t xml:space="preserve">    if completed:</w:t>
-        <w:br/>
-        <w:t xml:space="preserve">        return None, False, True, None</w:t>
-        <w:br/>
-        <w:t xml:space="preserve">    if route == "left":</w:t>
-        <w:br/>
-        <w:t xml:space="preserve">        turning = turning or (y &lt;= 56.0 and x &lt; 5.0)</w:t>
-        <w:br/>
-        <w:t xml:space="preserve">        if turning and heading &gt;= 1.30:</w:t>
-        <w:br/>
-        <w:t xml:space="preserve">            return None, False, True, STRAIGHT</w:t>
-        <w:br/>
-        <w:t xml:space="preserve">        if turning:</w:t>
-        <w:br/>
-        <w:t xml:space="preserve">            return -0.42, True, False, None</w:t>
+        <w:br/>
+        <w:t xml:space="preserve">    while driver.step() != -1:</w:t>
+        <w:br/>
+        <w:t xml:space="preserve">        now = driver.getTime()</w:t>
+        <w:br/>
+        <w:t xml:space="preserve">        dt = max(0.0, now - previous_time)</w:t>
+        <w:br/>
+        <w:t xml:space="preserve">        previous_time = now</w:t>
+        <w:br/>
+        <w:t xml:space="preserve">        heading += float(gyro.getValues()[2]) * dt</w:t>
+        <w:br/>
+        <w:br/>
+        <w:t xml:space="preserve">        key = keyboard.getKey()</w:t>
+        <w:br/>
+        <w:t xml:space="preserve">        while key != -1:</w:t>
+        <w:br/>
+        <w:t xml:space="preserve">            if key in (ord("W"), ord("w")):</w:t>
+        <w:br/>
+        <w:t xml:space="preserve">                command = STRAIGHT</w:t>
+        <w:br/>
+        <w:t xml:space="preserve">            elif key in (ord("A"), ord("a")):</w:t>
+        <w:br/>
+        <w:t xml:space="preserve">                command = LEFT</w:t>
+        <w:br/>
+        <w:t xml:space="preserve">            elif key in (ord("D"), ord("d")):</w:t>
+        <w:br/>
+        <w:t xml:space="preserve">                command = RIGHT</w:t>
+        <w:br/>
+        <w:t xml:space="preserve">            key = keyboard.getKey()</w:t>
+        <w:br/>
+        <w:br/>
+        <w:t xml:space="preserve">        raw = camera.getImage()</w:t>
+        <w:br/>
+        <w:t xml:space="preserve">        if raw is None:</w:t>
+        <w:br/>
+        <w:t xml:space="preserve">            continue</w:t>
+        <w:br/>
+        <w:t xml:space="preserve">        image_bgra = np.frombuffer(raw, np.uint8).reshape(</w:t>
+        <w:br/>
+        <w:t xml:space="preserve">            (camera.getHeight(), camera.getWidth(), 4)</w:t>
+        <w:br/>
+        <w:t xml:space="preserve">        )</w:t>
+        <w:br/>
+        <w:t xml:space="preserve">        if frame % INFERENCE_INTERVAL_STEPS == 0:</w:t>
+        <w:br/>
+        <w:t xml:space="preserve">            image_input = preprocess_bgra(</w:t>
+        <w:br/>
+        <w:t xml:space="preserve">                image_bgra,</w:t>
+        <w:br/>
+        <w:t xml:space="preserve">                int(metadata["image_height"]),</w:t>
+        <w:br/>
+        <w:t xml:space="preserve">                int(metadata["image_width"]),</w:t>
+        <w:br/>
+        <w:t xml:space="preserve">            )</w:t>
+        <w:br/>
+        <w:t xml:space="preserve">            predicted = model.predict(</w:t>
+        <w:br/>
+        <w:t xml:space="preserve">                [image_input, command_to_one_hot(command)], verbose=0</w:t>
       </w:r>
     </w:p>
     <w:p>
@@ -7605,64 +8279,67 @@
           <w:color w:val="000000"/>
           <w:sz w:val="13"/>
         </w:rPr>
-        <w:t xml:space="preserve">    elif route == "right":</w:t>
-        <w:br/>
-        <w:t xml:space="preserve">        turning = turning or (y &lt;= -58.0 and x &gt; 20.0)</w:t>
-        <w:br/>
-        <w:t xml:space="preserve">        if turning and heading &lt;= -1.30:</w:t>
-        <w:br/>
-        <w:t xml:space="preserve">            return None, False, True, STRAIGHT</w:t>
-        <w:br/>
-        <w:t xml:space="preserve">        if turning:</w:t>
-        <w:br/>
-        <w:t xml:space="preserve">            return 0.35, True, False, None</w:t>
-        <w:br/>
-        <w:t xml:space="preserve">    return None, turning, completed, None</w:t>
-        <w:br/>
-        <w:br/>
-        <w:br/>
-        <w:t>def route_destination_reached(route: str, x: float, y: float) -&gt; bool:</w:t>
-        <w:br/>
-        <w:t xml:space="preserve">    if route == "straight":</w:t>
-        <w:br/>
-        <w:t xml:space="preserve">        return x &lt;= -188.0 and y &gt;= 220.0</w:t>
-        <w:br/>
-        <w:t xml:space="preserve">    if route == "right":</w:t>
-        <w:br/>
-        <w:t xml:space="preserve">        return x &lt;= 29.0 and y &lt;= -63.0</w:t>
-        <w:br/>
-        <w:t xml:space="preserve">    if route == "left":</w:t>
-        <w:br/>
-        <w:t xml:space="preserve">        return x &gt;= 35.0 and 44.0 &lt;= y &lt;= 52.0</w:t>
-        <w:br/>
-        <w:t xml:space="preserve">    return False</w:t>
-        <w:br/>
-        <w:br/>
-        <w:br/>
-        <w:t>def route_heading_assist(route: str, heading: float, turn_completed: bool) -&gt; float | None:</w:t>
-        <w:br/>
-        <w:t xml:space="preserve">    """Mantiene el corredor de salida una vez completado el giro de ruta."""</w:t>
-        <w:br/>
-        <w:t xml:space="preserve">    if route != "straight" and not turn_completed:</w:t>
-        <w:br/>
-        <w:t xml:space="preserve">        return None</w:t>
-        <w:br/>
-        <w:t xml:space="preserve">    target = {</w:t>
-        <w:br/>
-        <w:t xml:space="preserve">        "straight": 0.0,</w:t>
-        <w:br/>
-        <w:t xml:space="preserve">        "left": math.pi / 2.0,</w:t>
-        <w:br/>
-        <w:t xml:space="preserve">        "right": -math.pi / 2.0,</w:t>
-        <w:br/>
-        <w:t xml:space="preserve">    }.get(route)</w:t>
-        <w:br/>
-        <w:t xml:space="preserve">    if target is None:</w:t>
-        <w:br/>
-        <w:t xml:space="preserve">        return None</w:t>
-        <w:br/>
-        <w:t xml:space="preserve">    return clamp(0.70 * (heading - target), -0.18, 0.18)</w:t>
-        <w:br/>
+        <w:t xml:space="preserve">            )</w:t>
+        <w:br/>
+        <w:t xml:space="preserve">            cil_steering = clamp(</w:t>
+        <w:br/>
+        <w:t xml:space="preserve">                float(predicted[0][0]), -MAX_STEERING_RAD, MAX_STEERING_RAD</w:t>
+        <w:br/>
+        <w:t xml:space="preserve">            )</w:t>
+        <w:br/>
+        <w:br/>
+        <w:t xml:space="preserve">        lidar_distance = front_lidar_distance(lidar)</w:t>
+        <w:br/>
+        <w:t xml:space="preserve">        pedestrian_distance = closest_recognized(camera, "pedestrian")</w:t>
+        <w:br/>
+        <w:t xml:space="preserve">        bus_distance = closest_recognized(camera, "bus")</w:t>
+        <w:br/>
+        <w:t xml:space="preserve">        radar_distance, radar_speed = closest_radar_target(radar)</w:t>
+        <w:br/>
+        <w:t xml:space="preserve">        side_distances = read_right_distances(right_sensors)</w:t>
+        <w:br/>
+        <w:t xml:space="preserve">        x, y, _ = (float(value) for value in gps.getValues())</w:t>
+        <w:br/>
+        <w:t xml:space="preserve">        signal_holding = False</w:t>
+        <w:br/>
+        <w:br/>
+        <w:t xml:space="preserve">        pedestrian_emergency = (</w:t>
+        <w:br/>
+        <w:t xml:space="preserve">            pedestrian_distance &lt;= PEDESTRIAN_STOP_DISTANCE_M</w:t>
+        <w:br/>
+        <w:t xml:space="preserve">            and lidar_distance &lt;= PEDESTRIAN_STOP_DISTANCE_M</w:t>
+        <w:br/>
+        <w:t xml:space="preserve">        )</w:t>
+        <w:br/>
+        <w:t xml:space="preserve">        if pedestrian_emergency:</w:t>
+        <w:br/>
+        <w:t xml:space="preserve">            target_speed = 0.0</w:t>
+        <w:br/>
+        <w:t xml:space="preserve">            target_steering = steering_command</w:t>
+        <w:br/>
+        <w:t xml:space="preserve">            mode = "FRENO_PEATON"</w:t>
+        <w:br/>
+        <w:t xml:space="preserve">        else:</w:t>
+        <w:br/>
+        <w:t xml:space="preserve">            if (</w:t>
+        <w:br/>
+        <w:t xml:space="preserve">                state is AvoidanceState.DRIVE</w:t>
+        <w:br/>
+        <w:t xml:space="preserve">                and not bus_avoidance_started</w:t>
+        <w:br/>
+        <w:t xml:space="preserve">                and bus_distance &lt;= PARKED_BUS_TRIGGER_DISTANCE_M</w:t>
+        <w:br/>
+        <w:t xml:space="preserve">                and (not math.isfinite(radar_distance) or abs(radar_speed) &lt; 0.75)</w:t>
+        <w:br/>
+        <w:t xml:space="preserve">            ):</w:t>
+        <w:br/>
+        <w:t xml:space="preserve">                bus_avoidance_started = True</w:t>
+        <w:br/>
+        <w:t xml:space="preserve">                heading_before_avoidance = heading</w:t>
+        <w:br/>
+        <w:t xml:space="preserve">                wall_lost_steps = 0</w:t>
+        <w:br/>
+        <w:t xml:space="preserve">                state = AvoidanceState.SEPARATE_LEFT</w:t>
       </w:r>
     </w:p>
     <w:p>
@@ -7678,66 +8355,68 @@
           <w:color w:val="000000"/>
           <w:sz w:val="13"/>
         </w:rPr>
-        <w:br/>
-        <w:t>def route_approach_assist(</w:t>
-        <w:br/>
-        <w:t xml:space="preserve">    route: str,</w:t>
-        <w:br/>
-        <w:t xml:space="preserve">    x: float,</w:t>
-        <w:br/>
-        <w:t xml:space="preserve">    y: float,</w:t>
-        <w:br/>
-        <w:t xml:space="preserve">    heading: float,</w:t>
-        <w:br/>
-        <w:t xml:space="preserve">    turning: bool,</w:t>
-        <w:br/>
-        <w:t xml:space="preserve">    completed: bool,</w:t>
-        <w:br/>
-        <w:t>) -&gt; float | None:</w:t>
-        <w:br/>
-        <w:t xml:space="preserve">    """Centra el auto en el carril antes del giro para entrar desde la geometria correcta."""</w:t>
-        <w:br/>
-        <w:t xml:space="preserve">    if turning or completed:</w:t>
-        <w:br/>
-        <w:t xml:space="preserve">        return None</w:t>
-        <w:br/>
-        <w:t xml:space="preserve">    target_x = None</w:t>
-        <w:br/>
-        <w:t xml:space="preserve">    if route == "right" and y &gt; -58.0:</w:t>
-        <w:br/>
-        <w:t xml:space="preserve">        target_x = 40.0</w:t>
-        <w:br/>
-        <w:t xml:space="preserve">    elif route == "left" and y &gt; 56.0:</w:t>
-        <w:br/>
-        <w:t xml:space="preserve">        target_x = -50.4</w:t>
-        <w:br/>
-        <w:t xml:space="preserve">    if target_x is None:</w:t>
-        <w:br/>
-        <w:t xml:space="preserve">        return None</w:t>
-        <w:br/>
-        <w:t xml:space="preserve">    lateral_error = x - target_x</w:t>
-        <w:br/>
-        <w:t xml:space="preserve">    return clamp(0.055 * lateral_error + 0.90 * heading, -0.22, 0.22)</w:t>
-        <w:br/>
-        <w:br/>
-        <w:br/>
-        <w:t>def front_lidar_distance(lidar) -&gt; float:</w:t>
-        <w:br/>
-        <w:t xml:space="preserve">    values = lidar.getRangeImage()</w:t>
-        <w:br/>
-        <w:t xml:space="preserve">    if not values:</w:t>
-        <w:br/>
-        <w:t xml:space="preserve">        return float("inf")</w:t>
-        <w:br/>
-        <w:t xml:space="preserve">    center = len(values) // 2</w:t>
-        <w:br/>
-        <w:t xml:space="preserve">    # Sector frontal de 90 grados, alineado con el campo de la camara.</w:t>
-        <w:br/>
-        <w:t xml:space="preserve">    half_window = max(1, len(values) // 4)</w:t>
-        <w:br/>
-        <w:t xml:space="preserve">    valid = [</w:t>
-        <w:br/>
-        <w:t xml:space="preserve">        value</w:t>
+        <w:t xml:space="preserve">                state_started = now</w:t>
+        <w:br/>
+        <w:t xml:space="preserve">                print(f"&gt;&gt;&gt; EVASION: autobus a {lidar_distance:.2f} m")</w:t>
+        <w:br/>
+        <w:br/>
+        <w:t xml:space="preserve">            if state is AvoidanceState.SEPARATE_LEFT:</w:t>
+        <w:br/>
+        <w:t xml:space="preserve">                target_speed = AVOID_SPEED_KMH</w:t>
+        <w:br/>
+        <w:t xml:space="preserve">                target_steering = -0.38</w:t>
+        <w:br/>
+        <w:t xml:space="preserve">                if wall_present(side_distances) or now - state_started &gt;= 3.5:</w:t>
+        <w:br/>
+        <w:t xml:space="preserve">                    state = AvoidanceState.WALL_FOLLOW_RIGHT</w:t>
+        <w:br/>
+        <w:t xml:space="preserve">                    state_started = now</w:t>
+        <w:br/>
+        <w:t xml:space="preserve">            elif state is AvoidanceState.WALL_FOLLOW_RIGHT:</w:t>
+        <w:br/>
+        <w:t xml:space="preserve">                target_speed = AVOID_SPEED_KMH</w:t>
+        <w:br/>
+        <w:t xml:space="preserve">                target_steering = wall_following_steering(side_distances)</w:t>
+        <w:br/>
+        <w:t xml:space="preserve">                if wall_present(side_distances):</w:t>
+        <w:br/>
+        <w:t xml:space="preserve">                    wall_lost_steps = 0</w:t>
+        <w:br/>
+        <w:t xml:space="preserve">                else:</w:t>
+        <w:br/>
+        <w:t xml:space="preserve">                    wall_lost_steps += 1</w:t>
+        <w:br/>
+        <w:t xml:space="preserve">                if wall_lost_steps &gt;= WALL_LOST_STEPS_REQUIRED:</w:t>
+        <w:br/>
+        <w:t xml:space="preserve">                    state = AvoidanceState.RECOVER_HEADING</w:t>
+        <w:br/>
+        <w:t xml:space="preserve">                    state_started = now</w:t>
+        <w:br/>
+        <w:t xml:space="preserve">            elif state is AvoidanceState.RECOVER_HEADING:</w:t>
+        <w:br/>
+        <w:t xml:space="preserve">                heading_error = heading_before_avoidance - heading</w:t>
+        <w:br/>
+        <w:t xml:space="preserve">                target_speed = RECOVERY_SPEED_KMH</w:t>
+        <w:br/>
+        <w:t xml:space="preserve">                target_steering = clamp(-1.8 * heading_error, -0.38, 0.38)</w:t>
+        <w:br/>
+        <w:t xml:space="preserve">                if abs(heading_error) &lt; 0.08 or now - state_started &gt;= 6.0:</w:t>
+        <w:br/>
+        <w:t xml:space="preserve">                    state = AvoidanceState.REJOIN</w:t>
+        <w:br/>
+        <w:t xml:space="preserve">                    state_started = now</w:t>
+        <w:br/>
+        <w:t xml:space="preserve">            elif state is AvoidanceState.REJOIN:</w:t>
+        <w:br/>
+        <w:t xml:space="preserve">                target_speed = RECOVERY_SPEED_KMH</w:t>
+        <w:br/>
+        <w:t xml:space="preserve">                target_steering = cil_steering</w:t>
+        <w:br/>
+        <w:t xml:space="preserve">                if now - state_started &gt;= 2.0:</w:t>
+        <w:br/>
+        <w:t xml:space="preserve">                    state = AvoidanceState.DRIVE</w:t>
+        <w:br/>
+        <w:t xml:space="preserve">                    state_started = now</w:t>
       </w:r>
     </w:p>
     <w:p>
@@ -7753,65 +8432,69 @@
           <w:color w:val="000000"/>
           <w:sz w:val="13"/>
         </w:rPr>
-        <w:t xml:space="preserve">        for value in values[center - half_window : center + half_window]</w:t>
-        <w:br/>
-        <w:t xml:space="preserve">        if math.isfinite(value) and 0.1 &lt; value &lt;= 50.0</w:t>
-        <w:br/>
-        <w:t xml:space="preserve">    ]</w:t>
-        <w:br/>
-        <w:t xml:space="preserve">    return min(valid) if valid else float("inf")</w:t>
-        <w:br/>
-        <w:br/>
-        <w:br/>
-        <w:t>def closest_radar_target(radar) -&gt; tuple[float, float]:</w:t>
-        <w:br/>
-        <w:t xml:space="preserve">    """Return distance and radial speed of the nearest target within +/-17 deg."""</w:t>
-        <w:br/>
-        <w:t xml:space="preserve">    candidates = []</w:t>
-        <w:br/>
-        <w:t xml:space="preserve">    for target in radar.getTargets():</w:t>
-        <w:br/>
-        <w:t xml:space="preserve">        # The BmwX5 front slot can intermittently report a self-return near</w:t>
-        <w:br/>
-        <w:t xml:space="preserve">        # 2.45 m; LiDAR still protects the immediate zone, so ignore &lt;3 m.</w:t>
-        <w:br/>
-        <w:t xml:space="preserve">        if abs(float(target.azimuth)) &lt;= 0.30 and float(target.distance) &gt;= 3.0:</w:t>
-        <w:br/>
-        <w:t xml:space="preserve">            candidates.append((float(target.distance), float(target.speed)))</w:t>
-        <w:br/>
-        <w:t xml:space="preserve">    return min(candidates, key=lambda item: item[0]) if candidates else (float("inf"), 0.0)</w:t>
-        <w:br/>
-        <w:br/>
-        <w:br/>
-        <w:t>def closest_recognized(camera, model_fragment: str) -&gt; float:</w:t>
-        <w:br/>
-        <w:t xml:space="preserve">    distances = []</w:t>
-        <w:br/>
-        <w:t xml:space="preserve">    fragment = model_fragment.lower()</w:t>
-        <w:br/>
-        <w:t xml:space="preserve">    for obj in camera.getRecognitionObjects():</w:t>
-        <w:br/>
-        <w:t xml:space="preserve">        model = str(obj.getModel()).lower()</w:t>
-        <w:br/>
-        <w:t xml:space="preserve">        # Webots labels street furniture as "bus stop".  A substring-only</w:t>
-        <w:br/>
-        <w:t xml:space="preserve">        # comparison would therefore launch an avoidance manoeuvre against the</w:t>
-        <w:br/>
-        <w:t xml:space="preserve">        # shelter itself.  Only vehicle-like bus models are valid obstacles.</w:t>
-        <w:br/>
-        <w:t xml:space="preserve">        if fragment not in model or (fragment == "bus" and "stop" in model):</w:t>
-        <w:br/>
-        <w:t xml:space="preserve">            continue</w:t>
-        <w:br/>
-        <w:t xml:space="preserve">        position = obj.getPosition()</w:t>
-        <w:br/>
-        <w:t xml:space="preserve">        distance = math.sqrt(sum(float(axis) ** 2 for axis in position))</w:t>
-        <w:br/>
-        <w:t xml:space="preserve">        image_x, image_y = obj.getPositionOnImage()</w:t>
-        <w:br/>
-        <w:t xml:space="preserve">        if 0 &lt;= image_x &lt; camera.getWidth() and 0 &lt;= image_y &lt; camera.getHeight():</w:t>
-        <w:br/>
-        <w:t xml:space="preserve">            distances.append(distance)</w:t>
+        <w:t xml:space="preserve">            else:</w:t>
+        <w:br/>
+        <w:t xml:space="preserve">                target_speed, stopped_for_vehicle = adaptive_follow_speed_hysteresis(</w:t>
+        <w:br/>
+        <w:t xml:space="preserve">                    radar_distance, stopped_for_vehicle</w:t>
+        <w:br/>
+        <w:t xml:space="preserve">                )</w:t>
+        <w:br/>
+        <w:t xml:space="preserve">                target_steering = cil_steering</w:t>
+        <w:br/>
+        <w:t xml:space="preserve">                if route_signal_stop_required(</w:t>
+        <w:br/>
+        <w:t xml:space="preserve">                    route,</w:t>
+        <w:br/>
+        <w:t xml:space="preserve">                    x,</w:t>
+        <w:br/>
+        <w:t xml:space="preserve">                    y,</w:t>
+        <w:br/>
+        <w:t xml:space="preserve">                    route_turning,</w:t>
+        <w:br/>
+        <w:t xml:space="preserve">                    route_turn_completed,</w:t>
+        <w:br/>
+        <w:t xml:space="preserve">                    signal_released,</w:t>
+        <w:br/>
+        <w:t xml:space="preserve">                ):</w:t>
+        <w:br/>
+        <w:t xml:space="preserve">                    signal_holding = True</w:t>
+        <w:br/>
+        <w:t xml:space="preserve">                    target_speed = 0.0</w:t>
+        <w:br/>
+        <w:t xml:space="preserve">                    target_steering = route_approach_assist(</w:t>
+        <w:br/>
+        <w:t xml:space="preserve">                        route, x, y, heading, route_turning, route_turn_completed</w:t>
+        <w:br/>
+        <w:t xml:space="preserve">                    ) or 0.0</w:t>
+        <w:br/>
+        <w:t xml:space="preserve">                    if abs(driver.getCurrentSpeed()) &lt;= 0.5:</w:t>
+        <w:br/>
+        <w:t xml:space="preserve">                        if signal_stop_started is None:</w:t>
+        <w:br/>
+        <w:t xml:space="preserve">                            signal_stop_started = now</w:t>
+        <w:br/>
+        <w:t xml:space="preserve">                            print("&gt;&gt;&gt; ALTO_SEMAFORO: vehiculo detenido en la linea")</w:t>
+        <w:br/>
+        <w:t xml:space="preserve">                        elif (</w:t>
+        <w:br/>
+        <w:t xml:space="preserve">                            now - signal_stop_started &gt;= SIGNAL_MIN_STOP_SECONDS</w:t>
+        <w:br/>
+        <w:t xml:space="preserve">                            and right_signal_is_green(now)</w:t>
+        <w:br/>
+        <w:t xml:space="preserve">                        ):</w:t>
+        <w:br/>
+        <w:t xml:space="preserve">                            signal_released = True</w:t>
+        <w:br/>
+        <w:t xml:space="preserve">                            print(</w:t>
+        <w:br/>
+        <w:t xml:space="preserve">                                f"&gt;&gt;&gt; SEMAFORO_VERDE: inicia cruce seguro a t={now:.2f} s"</w:t>
+        <w:br/>
+        <w:t xml:space="preserve">                            )</w:t>
+        <w:br/>
+        <w:t xml:space="preserve">                    mode = "ALTO_SEMAFORO"</w:t>
+        <w:br/>
+        <w:t xml:space="preserve">                else:</w:t>
       </w:r>
     </w:p>
     <w:p>
@@ -7827,61 +8510,69 @@
           <w:color w:val="000000"/>
           <w:sz w:val="13"/>
         </w:rPr>
-        <w:t xml:space="preserve">    return min(distances) if distances else float("inf")</w:t>
-        <w:br/>
-        <w:br/>
-        <w:br/>
-        <w:t>def read_right_distances(sensors: dict[str, object]) -&gt; dict[str, float]:</w:t>
-        <w:br/>
-        <w:t xml:space="preserve">    result = {}</w:t>
-        <w:br/>
-        <w:t xml:space="preserve">    for name, sensor in sensors.items():</w:t>
-        <w:br/>
-        <w:t xml:space="preserve">        value = float(sensor.getValue())</w:t>
-        <w:br/>
-        <w:t xml:space="preserve">        result[name] = value if math.isfinite(value) and value &gt; 0.05 else float("inf")</w:t>
-        <w:br/>
-        <w:t xml:space="preserve">    return result</w:t>
-        <w:br/>
-        <w:br/>
-        <w:br/>
-        <w:t>def wall_present(distances: dict[str, float]) -&gt; bool:</w:t>
-        <w:br/>
-        <w:t xml:space="preserve">    return any(value &lt; WALL_PRESENT_DISTANCE_M for value in distances.values())</w:t>
-        <w:br/>
-        <w:br/>
-        <w:br/>
-        <w:t>def wall_following_steering(distances: dict[str, float]) -&gt; float:</w:t>
-        <w:br/>
-        <w:t xml:space="preserve">    valid = [value for value in distances.values() if math.isfinite(value)]</w:t>
-        <w:br/>
-        <w:t xml:space="preserve">    if not valid:</w:t>
-        <w:br/>
-        <w:t xml:space="preserve">        return -0.12</w:t>
-        <w:br/>
-        <w:t xml:space="preserve">    front = distances["front"]</w:t>
-        <w:br/>
-        <w:t xml:space="preserve">    middle = distances["middle"]</w:t>
-        <w:br/>
-        <w:t xml:space="preserve">    rear = distances["rear"]</w:t>
-        <w:br/>
-        <w:t xml:space="preserve">    side = middle if middle &lt; WALL_PRESENT_DISTANCE_M else min(valid)</w:t>
-        <w:br/>
-        <w:t xml:space="preserve">    distance_error = side - WALL_TARGET_DISTANCE_M</w:t>
-        <w:br/>
-        <w:t xml:space="preserve">    alignment_error = (</w:t>
-        <w:br/>
-        <w:t xml:space="preserve">        front - rear</w:t>
-        <w:br/>
-        <w:t xml:space="preserve">        if front &lt; WALL_PRESENT_DISTANCE_M and rear &lt; WALL_PRESENT_DISTANCE_M</w:t>
-        <w:br/>
-        <w:t xml:space="preserve">        else 0.0</w:t>
-        <w:br/>
-        <w:t xml:space="preserve">    )</w:t>
-        <w:br/>
-        <w:t xml:space="preserve">    return clamp(0.22 * distance_error + 0.16 * alignment_error, -0.42, 0.42)</w:t>
-        <w:br/>
-        <w:br/>
+        <w:t xml:space="preserve">                    assist, route_turning, route_turn_completed, next_command = route_turn_guidance(</w:t>
+        <w:br/>
+        <w:t xml:space="preserve">                        route, x, y, heading, route_turning, route_turn_completed</w:t>
+        <w:br/>
+        <w:t xml:space="preserve">                    )</w:t>
+        <w:br/>
+        <w:t xml:space="preserve">                    if assist is not None:</w:t>
+        <w:br/>
+        <w:t xml:space="preserve">                        target_speed = min(target_speed, ROUTE_TURN_SPEED_KMH)</w:t>
+        <w:br/>
+        <w:t xml:space="preserve">                        target_steering = assist</w:t>
+        <w:br/>
+        <w:t xml:space="preserve">                        mode = "GIRO_RUTA"</w:t>
+        <w:br/>
+        <w:t xml:space="preserve">                    if next_command is not None:</w:t>
+        <w:br/>
+        <w:t xml:space="preserve">                        command = next_command</w:t>
+        <w:br/>
+        <w:t xml:space="preserve">                        print(f"&gt;&gt;&gt; GIRO COMPLETO: continua {COMMAND_NAMES[command]}")</w:t>
+        <w:br/>
+        <w:t xml:space="preserve">                    corridor_assist = route_corridor_assist(</w:t>
+        <w:br/>
+        <w:t xml:space="preserve">                        route, x, y, heading, route_turn_completed</w:t>
+        <w:br/>
+        <w:t xml:space="preserve">                    )</w:t>
+        <w:br/>
+        <w:t xml:space="preserve">                    approach_assist = route_approach_assist(</w:t>
+        <w:br/>
+        <w:t xml:space="preserve">                        route, x, y, heading, route_turning, route_turn_completed</w:t>
+        <w:br/>
+        <w:t xml:space="preserve">                    )</w:t>
+        <w:br/>
+        <w:t xml:space="preserve">                    if assist is None and approach_assist is not None:</w:t>
+        <w:br/>
+        <w:t xml:space="preserve">                        target_speed = min(target_speed, 16.0)</w:t>
+        <w:br/>
+        <w:t xml:space="preserve">                        target_steering = approach_assist</w:t>
+        <w:br/>
+        <w:t xml:space="preserve">                        mode = "APROXIMACION_RUTA"</w:t>
+        <w:br/>
+        <w:t xml:space="preserve">                    elif assist is None and corridor_assist is not None:</w:t>
+        <w:br/>
+        <w:t xml:space="preserve">                        if route == "straight" and (</w:t>
+        <w:br/>
+        <w:t xml:space="preserve">                            abs(y - 236.4) &gt; 1.0 or abs(heading) &gt; 0.10</w:t>
+        <w:br/>
+        <w:t xml:space="preserve">                        ):</w:t>
+        <w:br/>
+        <w:t xml:space="preserve">                            target_speed = min(target_speed, 10.0)</w:t>
+        <w:br/>
+        <w:t xml:space="preserve">                        target_steering = corridor_assist</w:t>
+        <w:br/>
+        <w:t xml:space="preserve">                        mode = "CORREDOR_RUTA"</w:t>
+        <w:br/>
+        <w:t xml:space="preserve">                if route_destination_reached(route, x, y):</w:t>
+        <w:br/>
+        <w:t xml:space="preserve">                    target_speed = 0.0</w:t>
+        <w:br/>
+        <w:t xml:space="preserve">                    mode = "RUTA_COMPLETA"</w:t>
+        <w:br/>
+        <w:t xml:space="preserve">                    route_arrived = True</w:t>
+        <w:br/>
+        <w:t xml:space="preserve">            mode = state.value</w:t>
       </w:r>
     </w:p>
     <w:p>
@@ -7897,465 +8588,12 @@
           <w:color w:val="000000"/>
           <w:sz w:val="13"/>
         </w:rPr>
-        <w:t>def get_device(driver, name: str):</w:t>
-        <w:br/>
-        <w:t xml:space="preserve">    try:</w:t>
-        <w:br/>
-        <w:t xml:space="preserve">        return driver.getDevice(name)</w:t>
-        <w:br/>
-        <w:t xml:space="preserve">    except BaseException as exc:</w:t>
-        <w:br/>
-        <w:t xml:space="preserve">        raise RuntimeError(f"El mundo no contiene el dispositivo requerido: {name}") from exc</w:t>
-        <w:br/>
-        <w:br/>
-        <w:br/>
-        <w:t>def main() -&gt; None:</w:t>
-        <w:br/>
-        <w:t xml:space="preserve">    import tensorflow as tf</w:t>
-        <w:br/>
-        <w:t xml:space="preserve">    from vehicle import Driver</w:t>
-        <w:br/>
-        <w:br/>
-        <w:t xml:space="preserve">    driver = Driver()</w:t>
-        <w:br/>
-        <w:t xml:space="preserve">    timestep = int(driver.getBasicTimeStep())</w:t>
-        <w:br/>
-        <w:t xml:space="preserve">    root = Path(__file__).resolve().parents[2]</w:t>
-        <w:br/>
-        <w:t xml:space="preserve">    model_path = Path(__file__).with_name("cil_model.h5")</w:t>
-        <w:br/>
-        <w:t xml:space="preserve">    metadata_path = Path(__file__).with_name("model_metadata.json")</w:t>
-        <w:br/>
-        <w:t xml:space="preserve">    if not model_path.exists() or not metadata_path.exists():</w:t>
-        <w:br/>
-        <w:t xml:space="preserve">        raise FileNotFoundError("Faltan cil_model.h5 o model_metadata.json junto al controlador")</w:t>
-        <w:br/>
-        <w:br/>
-        <w:t xml:space="preserve">    metadata = json.loads(metadata_path.read_text(encoding="utf-8"))</w:t>
-        <w:br/>
-        <w:t xml:space="preserve">    model = tf.keras.models.load_model(model_path, compile=False)</w:t>
-        <w:br/>
-        <w:br/>
-        <w:t xml:space="preserve">    camera = get_device(driver, "camera")</w:t>
-        <w:br/>
-        <w:t xml:space="preserve">    camera.enable(timestep)</w:t>
-        <w:br/>
-        <w:t xml:space="preserve">    camera.recognitionEnable(timestep)</w:t>
-        <w:br/>
-        <w:t xml:space="preserve">    lidar = get_device(driver, "Sick LMS 291")</w:t>
-        <w:br/>
-        <w:t xml:space="preserve">    lidar.enable(timestep)</w:t>
-        <w:br/>
-        <w:t xml:space="preserve">    radar = get_device(driver, "front_radar")</w:t>
-        <w:br/>
-        <w:t xml:space="preserve">    radar.enable(timestep)</w:t>
-        <w:br/>
-        <w:t xml:space="preserve">    gyro = get_device(driver, "gyro")</w:t>
-        <w:br/>
-        <w:t xml:space="preserve">    gyro.enable(timestep)</w:t>
-        <w:br/>
-        <w:t xml:space="preserve">    gps = get_device(driver, "gps")</w:t>
-      </w:r>
-    </w:p>
-    <w:p>
-      <w:pPr>
-        <w:keepLines w:val="0"/>
-        <w:spacing w:after="60" w:line="240" w:lineRule="auto"/>
-        <w:ind w:left="216" w:right="216"/>
-        <w:shd w:fill="F7F7F7"/>
-      </w:pPr>
-      <w:r>
-        <w:rPr>
-          <w:rFonts w:ascii="Menlo" w:hAnsi="Menlo" w:eastAsia="Menlo" w:cs="Menlo"/>
-          <w:color w:val="000000"/>
-          <w:sz w:val="13"/>
-        </w:rPr>
-        <w:t xml:space="preserve">    gps.enable(timestep)</w:t>
-        <w:br/>
-        <w:t xml:space="preserve">    keyboard = driver.getKeyboard()</w:t>
-        <w:br/>
-        <w:t xml:space="preserve">    keyboard.enable(timestep)</w:t>
-        <w:br/>
-        <w:br/>
-        <w:t xml:space="preserve">    right_sensors = {</w:t>
-        <w:br/>
-        <w:t xml:space="preserve">        "front": get_device(driver, "ds_right_front"),</w:t>
-        <w:br/>
-        <w:t xml:space="preserve">        "middle": get_device(driver, "ds_right_middle"),</w:t>
-        <w:br/>
-        <w:t xml:space="preserve">        "rear": get_device(driver, "ds_right_rear"),</w:t>
-        <w:br/>
-        <w:t xml:space="preserve">    }</w:t>
-        <w:br/>
-        <w:t xml:space="preserve">    for sensor in right_sensors.values():</w:t>
-        <w:br/>
-        <w:t xml:space="preserve">        sensor.enable(timestep)</w:t>
-        <w:br/>
-        <w:br/>
-        <w:t xml:space="preserve">    max_seconds = float(os.environ.get("CIL_MAX_SECONDS", "0") or 0)</w:t>
-        <w:br/>
-        <w:br/>
-        <w:t xml:space="preserve">    command = int(os.environ.get("CIL_INITIAL_COMMAND", STRAIGHT))</w:t>
-        <w:br/>
-        <w:t xml:space="preserve">    route = os.environ.get("CIL_ROUTE", "").strip().lower()</w:t>
-        <w:br/>
-        <w:t xml:space="preserve">    if command not in COMMAND_NAMES:</w:t>
-        <w:br/>
-        <w:t xml:space="preserve">        raise ValueError(f"CIL_INITIAL_COMMAND invalido: {command}")</w:t>
-        <w:br/>
-        <w:t xml:space="preserve">    state = AvoidanceState.DRIVE</w:t>
-        <w:br/>
-        <w:t xml:space="preserve">    state_started = driver.getTime()</w:t>
-        <w:br/>
-        <w:t xml:space="preserve">    heading = 0.0</w:t>
-        <w:br/>
-        <w:t xml:space="preserve">    previous_time = driver.getTime()</w:t>
-        <w:br/>
-        <w:t xml:space="preserve">    heading_before_avoidance = 0.0</w:t>
-        <w:br/>
-        <w:t xml:space="preserve">    wall_lost_steps = 0</w:t>
-        <w:br/>
-        <w:t xml:space="preserve">    steering_command = 0.0</w:t>
-        <w:br/>
-        <w:t xml:space="preserve">    cil_steering = 0.0</w:t>
-        <w:br/>
-        <w:t xml:space="preserve">    stopped_for_vehicle = False</w:t>
-        <w:br/>
-        <w:t xml:space="preserve">    route_turning = False</w:t>
-        <w:br/>
-        <w:t xml:space="preserve">    route_turn_completed = False</w:t>
-        <w:br/>
-        <w:t xml:space="preserve">    route_arrived = False</w:t>
-        <w:br/>
-        <w:t xml:space="preserve">    frame = 0</w:t>
-        <w:br/>
-        <w:t xml:space="preserve">    wall_clock_started = time.monotonic()</w:t>
-      </w:r>
-    </w:p>
-    <w:p>
-      <w:pPr>
-        <w:keepLines w:val="0"/>
-        <w:spacing w:after="60" w:line="240" w:lineRule="auto"/>
-        <w:ind w:left="216" w:right="216"/>
-        <w:shd w:fill="F7F7F7"/>
-      </w:pPr>
-      <w:r>
-        <w:rPr>
-          <w:rFonts w:ascii="Menlo" w:hAnsi="Menlo" w:eastAsia="Menlo" w:cs="Menlo"/>
-          <w:color w:val="000000"/>
-          <w:sz w:val="13"/>
-        </w:rPr>
-        <w:br/>
-        <w:t xml:space="preserve">    print("Control CIL + seguridad iniciado")</w:t>
-        <w:br/>
-        <w:t xml:space="preserve">    print("W=STRAIGHT | A=LEFT | D=RIGHT")</w:t>
-        <w:br/>
-        <w:t xml:space="preserve">    print(</w:t>
-        <w:br/>
-        <w:t xml:space="preserve">        "Umbrales: peaton=15 m, autobus=18 m, "</w:t>
-        <w:br/>
-        <w:t xml:space="preserve">        "seguimiento=25 m, parada de seguimiento=12 m"</w:t>
-        <w:br/>
-        <w:t xml:space="preserve">    )</w:t>
-        <w:br/>
-        <w:br/>
-        <w:t xml:space="preserve">    while driver.step() != -1:</w:t>
-        <w:br/>
-        <w:t xml:space="preserve">        now = driver.getTime()</w:t>
-        <w:br/>
-        <w:t xml:space="preserve">        dt = max(0.0, now - previous_time)</w:t>
-        <w:br/>
-        <w:t xml:space="preserve">        previous_time = now</w:t>
-        <w:br/>
-        <w:t xml:space="preserve">        heading += float(gyro.getValues()[2]) * dt</w:t>
-        <w:br/>
-        <w:br/>
-        <w:t xml:space="preserve">        key = keyboard.getKey()</w:t>
-        <w:br/>
-        <w:t xml:space="preserve">        while key != -1:</w:t>
-        <w:br/>
-        <w:t xml:space="preserve">            if key in (ord("W"), ord("w")):</w:t>
-        <w:br/>
-        <w:t xml:space="preserve">                command = STRAIGHT</w:t>
-        <w:br/>
-        <w:t xml:space="preserve">            elif key in (ord("A"), ord("a")):</w:t>
-        <w:br/>
-        <w:t xml:space="preserve">                command = LEFT</w:t>
-        <w:br/>
-        <w:t xml:space="preserve">            elif key in (ord("D"), ord("d")):</w:t>
-        <w:br/>
-        <w:t xml:space="preserve">                command = RIGHT</w:t>
-        <w:br/>
-        <w:t xml:space="preserve">            key = keyboard.getKey()</w:t>
-        <w:br/>
-        <w:br/>
-        <w:t xml:space="preserve">        raw = camera.getImage()</w:t>
-        <w:br/>
-        <w:t xml:space="preserve">        if raw is None:</w:t>
-        <w:br/>
-        <w:t xml:space="preserve">            continue</w:t>
-        <w:br/>
-        <w:t xml:space="preserve">        image_bgra = np.frombuffer(raw, np.uint8).reshape(</w:t>
-        <w:br/>
-        <w:t xml:space="preserve">            (camera.getHeight(), camera.getWidth(), 4)</w:t>
-        <w:br/>
-        <w:t xml:space="preserve">        )</w:t>
-        <w:br/>
-        <w:t xml:space="preserve">        if frame % INFERENCE_INTERVAL_STEPS == 0:</w:t>
-        <w:br/>
-        <w:t xml:space="preserve">            image_input = preprocess_bgra(</w:t>
-      </w:r>
-    </w:p>
-    <w:p>
-      <w:pPr>
-        <w:keepLines w:val="0"/>
-        <w:spacing w:after="60" w:line="240" w:lineRule="auto"/>
-        <w:ind w:left="216" w:right="216"/>
-        <w:shd w:fill="F7F7F7"/>
-      </w:pPr>
-      <w:r>
-        <w:rPr>
-          <w:rFonts w:ascii="Menlo" w:hAnsi="Menlo" w:eastAsia="Menlo" w:cs="Menlo"/>
-          <w:color w:val="000000"/>
-          <w:sz w:val="13"/>
-        </w:rPr>
-        <w:t xml:space="preserve">                image_bgra,</w:t>
-        <w:br/>
-        <w:t xml:space="preserve">                int(metadata["image_height"]),</w:t>
-        <w:br/>
-        <w:t xml:space="preserve">                int(metadata["image_width"]),</w:t>
-        <w:br/>
-        <w:t xml:space="preserve">            )</w:t>
-        <w:br/>
-        <w:t xml:space="preserve">            predicted = model.predict(</w:t>
-        <w:br/>
-        <w:t xml:space="preserve">                [image_input, command_to_one_hot(command)], verbose=0</w:t>
-        <w:br/>
-        <w:t xml:space="preserve">            )</w:t>
-        <w:br/>
-        <w:t xml:space="preserve">            cil_steering = clamp(</w:t>
-        <w:br/>
-        <w:t xml:space="preserve">                float(predicted[0][0]), -MAX_STEERING_RAD, MAX_STEERING_RAD</w:t>
-        <w:br/>
-        <w:t xml:space="preserve">            )</w:t>
-        <w:br/>
-        <w:br/>
-        <w:t xml:space="preserve">        lidar_distance = front_lidar_distance(lidar)</w:t>
-        <w:br/>
-        <w:t xml:space="preserve">        pedestrian_distance = closest_recognized(camera, "pedestrian")</w:t>
-        <w:br/>
-        <w:t xml:space="preserve">        bus_distance = closest_recognized(camera, "bus")</w:t>
-        <w:br/>
-        <w:t xml:space="preserve">        radar_distance, radar_speed = closest_radar_target(radar)</w:t>
-        <w:br/>
-        <w:t xml:space="preserve">        side_distances = read_right_distances(right_sensors)</w:t>
-        <w:br/>
-        <w:t xml:space="preserve">        x, y, _ = (float(value) for value in gps.getValues())</w:t>
-        <w:br/>
-        <w:br/>
-        <w:t xml:space="preserve">        pedestrian_emergency = (</w:t>
-        <w:br/>
-        <w:t xml:space="preserve">            pedestrian_distance &lt;= PEDESTRIAN_STOP_DISTANCE_M</w:t>
-        <w:br/>
-        <w:t xml:space="preserve">            and lidar_distance &lt;= PEDESTRIAN_STOP_DISTANCE_M</w:t>
-        <w:br/>
-        <w:t xml:space="preserve">        )</w:t>
-        <w:br/>
-        <w:t xml:space="preserve">        if pedestrian_emergency:</w:t>
-        <w:br/>
-        <w:t xml:space="preserve">            target_speed = 0.0</w:t>
-        <w:br/>
-        <w:t xml:space="preserve">            target_steering = steering_command</w:t>
-        <w:br/>
-        <w:t xml:space="preserve">            mode = "FRENO_PEATON"</w:t>
-        <w:br/>
-        <w:t xml:space="preserve">        else:</w:t>
-        <w:br/>
-        <w:t xml:space="preserve">            if (</w:t>
-        <w:br/>
-        <w:t xml:space="preserve">                state is AvoidanceState.DRIVE</w:t>
-        <w:br/>
-        <w:t xml:space="preserve">                and bus_distance &lt;= PARKED_BUS_TRIGGER_DISTANCE_M</w:t>
-        <w:br/>
-        <w:t xml:space="preserve">                and (not math.isfinite(radar_distance) or abs(radar_speed) &lt; 0.75)</w:t>
-        <w:br/>
-        <w:t xml:space="preserve">            ):</w:t>
-      </w:r>
-    </w:p>
-    <w:p>
-      <w:pPr>
-        <w:keepLines w:val="0"/>
-        <w:spacing w:after="60" w:line="240" w:lineRule="auto"/>
-        <w:ind w:left="216" w:right="216"/>
-        <w:shd w:fill="F7F7F7"/>
-      </w:pPr>
-      <w:r>
-        <w:rPr>
-          <w:rFonts w:ascii="Menlo" w:hAnsi="Menlo" w:eastAsia="Menlo" w:cs="Menlo"/>
-          <w:color w:val="000000"/>
-          <w:sz w:val="13"/>
-        </w:rPr>
-        <w:t xml:space="preserve">                heading_before_avoidance = heading</w:t>
-        <w:br/>
-        <w:t xml:space="preserve">                wall_lost_steps = 0</w:t>
-        <w:br/>
-        <w:t xml:space="preserve">                state = AvoidanceState.SEPARATE_LEFT</w:t>
-        <w:br/>
-        <w:t xml:space="preserve">                state_started = now</w:t>
-        <w:br/>
-        <w:t xml:space="preserve">                print(f"&gt;&gt;&gt; EVASION: autobus a {lidar_distance:.2f} m")</w:t>
-        <w:br/>
-        <w:br/>
-        <w:t xml:space="preserve">            if state is AvoidanceState.SEPARATE_LEFT:</w:t>
-        <w:br/>
-        <w:t xml:space="preserve">                target_speed = AVOID_SPEED_KMH</w:t>
-        <w:br/>
-        <w:t xml:space="preserve">                target_steering = -0.20</w:t>
-        <w:br/>
-        <w:t xml:space="preserve">                if wall_present(side_distances) or now - state_started &gt;= 3.5:</w:t>
-        <w:br/>
-        <w:t xml:space="preserve">                    state = AvoidanceState.WALL_FOLLOW_RIGHT</w:t>
-        <w:br/>
-        <w:t xml:space="preserve">                    state_started = now</w:t>
-        <w:br/>
-        <w:t xml:space="preserve">            elif state is AvoidanceState.WALL_FOLLOW_RIGHT:</w:t>
-        <w:br/>
-        <w:t xml:space="preserve">                target_speed = AVOID_SPEED_KMH</w:t>
-        <w:br/>
-        <w:t xml:space="preserve">                target_steering = wall_following_steering(side_distances)</w:t>
-        <w:br/>
-        <w:t xml:space="preserve">                if wall_present(side_distances):</w:t>
-        <w:br/>
-        <w:t xml:space="preserve">                    wall_lost_steps = 0</w:t>
-        <w:br/>
-        <w:t xml:space="preserve">                else:</w:t>
-        <w:br/>
-        <w:t xml:space="preserve">                    wall_lost_steps += 1</w:t>
-        <w:br/>
-        <w:t xml:space="preserve">                if wall_lost_steps &gt;= WALL_LOST_STEPS_REQUIRED:</w:t>
-        <w:br/>
-        <w:t xml:space="preserve">                    state = AvoidanceState.RECOVER_HEADING</w:t>
-        <w:br/>
-        <w:t xml:space="preserve">                    state_started = now</w:t>
-        <w:br/>
-        <w:t xml:space="preserve">            elif state is AvoidanceState.RECOVER_HEADING:</w:t>
-        <w:br/>
-        <w:t xml:space="preserve">                heading_error = heading_before_avoidance - heading</w:t>
-        <w:br/>
-        <w:t xml:space="preserve">                target_speed = RECOVERY_SPEED_KMH</w:t>
-        <w:br/>
-        <w:t xml:space="preserve">                target_steering = clamp(-1.8 * heading_error, -0.38, 0.38)</w:t>
-        <w:br/>
-        <w:t xml:space="preserve">                if abs(heading_error) &lt; 0.08 or now - state_started &gt;= 6.0:</w:t>
-        <w:br/>
-        <w:t xml:space="preserve">                    state = AvoidanceState.REJOIN</w:t>
-        <w:br/>
-        <w:t xml:space="preserve">                    state_started = now</w:t>
-        <w:br/>
-        <w:t xml:space="preserve">            elif state is AvoidanceState.REJOIN:</w:t>
-        <w:br/>
-        <w:t xml:space="preserve">                target_speed = RECOVERY_SPEED_KMH</w:t>
-        <w:br/>
-        <w:t xml:space="preserve">                target_steering = cil_steering</w:t>
-      </w:r>
-    </w:p>
-    <w:p>
-      <w:pPr>
-        <w:keepLines w:val="0"/>
-        <w:spacing w:after="60" w:line="240" w:lineRule="auto"/>
-        <w:ind w:left="216" w:right="216"/>
-        <w:shd w:fill="F7F7F7"/>
-      </w:pPr>
-      <w:r>
-        <w:rPr>
-          <w:rFonts w:ascii="Menlo" w:hAnsi="Menlo" w:eastAsia="Menlo" w:cs="Menlo"/>
-          <w:color w:val="000000"/>
-          <w:sz w:val="13"/>
-        </w:rPr>
-        <w:t xml:space="preserve">                if now - state_started &gt;= 2.0:</w:t>
-        <w:br/>
-        <w:t xml:space="preserve">                    state = AvoidanceState.DRIVE</w:t>
-        <w:br/>
-        <w:t xml:space="preserve">                    state_started = now</w:t>
-        <w:br/>
-        <w:t xml:space="preserve">            else:</w:t>
-        <w:br/>
-        <w:t xml:space="preserve">                target_speed, stopped_for_vehicle = adaptive_follow_speed_hysteresis(</w:t>
-        <w:br/>
-        <w:t xml:space="preserve">                    radar_distance, stopped_for_vehicle</w:t>
-        <w:br/>
-        <w:t xml:space="preserve">                )</w:t>
-        <w:br/>
-        <w:t xml:space="preserve">                target_steering = cil_steering</w:t>
-        <w:br/>
-        <w:t xml:space="preserve">                assist, route_turning, route_turn_completed, next_command = route_turn_guidance(</w:t>
-        <w:br/>
-        <w:t xml:space="preserve">                    route, x, y, heading, route_turning, route_turn_completed</w:t>
-        <w:br/>
-        <w:t xml:space="preserve">                )</w:t>
-        <w:br/>
-        <w:t xml:space="preserve">                if assist is not None:</w:t>
-        <w:br/>
-        <w:t xml:space="preserve">                    target_speed = min(target_speed, ROUTE_TURN_SPEED_KMH)</w:t>
-        <w:br/>
-        <w:t xml:space="preserve">                    target_steering = assist</w:t>
-        <w:br/>
-        <w:t xml:space="preserve">                    mode = "GIRO_RUTA"</w:t>
-        <w:br/>
-        <w:t xml:space="preserve">                if next_command is not None:</w:t>
-        <w:br/>
-        <w:t xml:space="preserve">                    command = next_command</w:t>
-        <w:br/>
-        <w:t xml:space="preserve">                    print(f"&gt;&gt;&gt; GIRO COMPLETO: continua {COMMAND_NAMES[command]}")</w:t>
-        <w:br/>
-        <w:t xml:space="preserve">                heading_assist = route_heading_assist(route, heading, route_turn_completed)</w:t>
-        <w:br/>
-        <w:t xml:space="preserve">                approach_assist = route_approach_assist(</w:t>
-        <w:br/>
-        <w:t xml:space="preserve">                    route, x, y, heading, route_turning, route_turn_completed</w:t>
-        <w:br/>
-        <w:t xml:space="preserve">                )</w:t>
-        <w:br/>
-        <w:t xml:space="preserve">                if assist is None and approach_assist is not None:</w:t>
-        <w:br/>
-        <w:t xml:space="preserve">                    target_speed = min(target_speed, 16.0)</w:t>
-        <w:br/>
-        <w:t xml:space="preserve">                    target_steering = approach_assist</w:t>
-        <w:br/>
-        <w:t xml:space="preserve">                    mode = "APROXIMACION_RUTA"</w:t>
-        <w:br/>
-        <w:t xml:space="preserve">                elif assist is None and heading_assist is not None:</w:t>
-        <w:br/>
-        <w:t xml:space="preserve">                    target_steering = heading_assist</w:t>
-        <w:br/>
-        <w:t xml:space="preserve">                    mode = "CORREDOR_RUTA"</w:t>
-        <w:br/>
-        <w:t xml:space="preserve">                if route_destination_reached(route, x, y):</w:t>
-        <w:br/>
-        <w:t xml:space="preserve">                    target_speed = 0.0</w:t>
-        <w:br/>
-        <w:t xml:space="preserve">                    mode = "RUTA_COMPLETA"</w:t>
-      </w:r>
-    </w:p>
-    <w:p>
-      <w:pPr>
-        <w:keepLines w:val="0"/>
-        <w:spacing w:after="60" w:line="240" w:lineRule="auto"/>
-        <w:ind w:left="216" w:right="216"/>
-        <w:shd w:fill="F7F7F7"/>
-      </w:pPr>
-      <w:r>
-        <w:rPr>
-          <w:rFonts w:ascii="Menlo" w:hAnsi="Menlo" w:eastAsia="Menlo" w:cs="Menlo"/>
-          <w:color w:val="000000"/>
-          <w:sz w:val="13"/>
-        </w:rPr>
-        <w:t xml:space="preserve">                    route_arrived = True</w:t>
-        <w:br/>
-        <w:t xml:space="preserve">            mode = state.value</w:t>
-        <w:br/>
-        <w:br/>
-        <w:t xml:space="preserve">            if route_turning and state is AvoidanceState.DRIVE:</w:t>
+        <w:br/>
+        <w:t xml:space="preserve">            if signal_holding and not signal_released and state is AvoidanceState.DRIVE:</w:t>
+        <w:br/>
+        <w:t xml:space="preserve">                mode = "ALTO_SEMAFORO"</w:t>
+        <w:br/>
+        <w:t xml:space="preserve">            elif route_turning and state is AvoidanceState.DRIVE:</w:t>
         <w:br/>
         <w:t xml:space="preserve">                mode = "GIRO_RUTA"</w:t>
         <w:br/>
@@ -9317,21 +9555,18 @@
         <w:rPr>
           <w:rFonts w:ascii="Menlo" w:hAnsi="Menlo" w:eastAsia="Menlo" w:cs="Menlo"/>
           <w:color w:val="000000"/>
-          <w:sz w:val="11"/>
+          <w:sz w:val="10"/>
         </w:rPr>
         <w:t># Guion del video demostrativo - Equipo 19</w:t>
         <w:br/>
-        <w:br/>
         <w:t>Duracion objetivo: **5:35**. El video final debe conservar la participacion</w:t>
         <w:br/>
         <w:t>visible o audible de los cuatro integrantes y mostrar Optional Rendering para</w:t>
         <w:br/>
         <w:t>camara, LiDAR, radar y sensores de distancia.</w:t>
         <w:br/>
-        <w:br/>
         <w:t>## 0:00-0:35 - Apertura - Jose Antonio Fernandez Perez</w:t>
         <w:br/>
-        <w:br/>
         <w:t>- Presentar objetivo: conduccion CIL con comandos recto, izquierda y derecha.</w:t>
         <w:br/>
         <w:t>- Mostrar brevemente World 1 y World 2.</w:t>
@@ -9340,10 +9575,8 @@
         <w:br/>
         <w:t xml:space="preserve">  22 km/h para dar margen a los mecanismos de seguridad.</w:t>
         <w:br/>
-        <w:br/>
         <w:t>## 0:35-1:35 - Dataset y red - Demenard Gardy Armand</w:t>
         <w:br/>
-        <w:br/>
         <w:t>- Mostrar 6,129 imagenes originales y 12,956 muestras finales aumentadas.</w:t>
         <w:br/>
         <w:t>- Explicar el aumento: reflejo horizontal con inversion del signo del angulo e</w:t>
@@ -9368,10 +9601,8 @@
         <w:br/>
         <w:t xml:space="preserve">  (STRAIGHT 0.015, LEFT 0.024, RIGHT 0.023; objetivo &lt;= 0.05 rad).</w:t>
         <w:br/>
-        <w:br/>
         <w:t>## 1:35-2:40 - Ruta recta - Luis Daniel Castillo Alegria</w:t>
         <w:br/>
-        <w:br/>
         <w:t>- Origen: torres residenciales del noreste. Destino: silos.</w:t>
         <w:br/>
         <w:t>- Mostrar `Cmd=STRAIGHT` en consola.</w:t>
@@ -9380,16 +9611,14 @@
         <w:br/>
         <w:t xml:space="preserve">  reanudacion a 15 m.</w:t>
         <w:br/>
-        <w:t>- Indicar que el umbral de evasion esta configurado a 18 m; en la corrida el</w:t>
-        <w:br/>
-        <w:t xml:space="preserve">  autobus se reconocio a ~11.7 m y se disparo el cambio de estado de evasion.</w:t>
+        <w:t>- Indicar que el umbral de evasión está configurado a 26 m; en la corrida el</w:t>
+        <w:br/>
+        <w:t xml:space="preserve">  autobús se reconoció a 23.74 m y la maniobra inició con 16.62 m por LiDAR.</w:t>
         <w:br/>
         <w:t>- Mostrar el seguimiento de pared derecha y la reincorporacion al carril derecho.</w:t>
         <w:br/>
-        <w:br/>
         <w:t>## 2:40-3:40 - Ruta derecha y peaton - Raul Adrian Delgado Rodriguez</w:t>
         <w:br/>
-        <w:br/>
         <w:t>- Origen: Subway norte. Destino: iglesia.</w:t>
         <w:br/>
         <w:t>- Mostrar `Cmd=RIGHT` y el giro a la derecha sin U-turn.</w:t>
@@ -9398,12 +9627,12 @@
         <w:br/>
         <w:t>- Indicar el umbral de 15 m y mostrar velocidad 0 km/h antes del cruce.</w:t>
         <w:br/>
-        <w:t>- Continuar cuando el peaton deje la trayectoria.</w:t>
-        <w:br/>
+        <w:t>- Mostrar el alto antes de la interseccion y la espera hasta la fase verde.</w:t>
+        <w:br/>
+        <w:t>- Continuar cuando el peaton deje la trayectoria y el semaforo habilite el cruce.</w:t>
         <w:br/>
         <w:t>## 3:40-4:35 - Ruta izquierda - Jose Antonio Fernandez Perez</w:t>
         <w:br/>
-        <w:br/>
         <w:t>- Origen: parque infantil. Destino: Subway norte.</w:t>
         <w:br/>
         <w:t>- Mostrar `Cmd=LEFT`, el giro y la permanencia en el carril derecho.</w:t>
@@ -9412,10 +9641,8 @@
         <w:br/>
         <w:t xml:space="preserve">  temporal del arbitro de seguridad.</w:t>
         <w:br/>
-        <w:br/>
         <w:t>## 4:35-5:15 - Integracion y prioridades - Demenard Gardy Armand</w:t>
         <w:br/>
-        <w:br/>
         <w:t>- Mostrar el diagrama del arbitro: peaton, autobus, radar y CIL.</w:t>
         <w:br/>
         <w:t>- Explicar que la seguridad solo sustituye temporalmente velocidad/direccion;</w:t>
@@ -9424,9 +9651,7 @@
         <w:br/>
         <w:t>- Mostrar que SUMO esta limitado a 30 vehiculos, no menos de lo solicitado.</w:t>
         <w:br/>
-        <w:br/>
         <w:t>## 5:15-5:35 - Cierre - todos</w:t>
-        <w:br/>
         <w:br/>
         <w:t>- Cada integrante aparece en pantalla o confirma su participacion.</w:t>
         <w:br/>

</xml_diff>

<commit_message>
Finalize bus overtake and report
</commit_message>
<xml_diff>
--- a/docs/Proyecto_Final_Equipo19.docx
+++ b/docs/Proyecto_Final_Equipo19.docx
@@ -253,57 +253,15 @@
         <w:t>En Webots R2025a se integraron Camera Recognition, LiDAR, radar, giroscopio y tres sensores laterales. El árbitro de seguridad prioriza el frenado ante peatones, la evasión del autobús estacionado, el control de distancia y, finalmente, la dirección predicha por CIL. Se verificaron dos recorridos limpios por ruta, incluyendo evasión, frenado ante peatón y seguimiento de tráfico.</w:t>
       </w:r>
     </w:p>
-    <w:tbl>
-      <w:tblPr>
-        <w:tblW w:type="auto" w:w="0"/>
-        <w:jc w:val="center"/>
-        <w:tblLayout w:type="fixed"/>
-        <w:tblLook w:firstColumn="1" w:firstRow="1" w:lastColumn="0" w:lastRow="0" w:noHBand="0" w:noVBand="1" w:val="04A0"/>
-      </w:tblPr>
-      <w:tblGrid>
-        <w:gridCol w:w="9360"/>
-      </w:tblGrid>
-      <w:tr>
-        <w:tc>
-          <w:tcPr>
-            <w:tcW w:type="dxa" w:w="9288"/>
-            <w:shd w:fill="FFF2CC"/>
-            <w:tcMar>
-              <w:top w:w="130" w:type="dxa"/>
-              <w:start w:w="160" w:type="dxa"/>
-              <w:bottom w:w="130" w:type="dxa"/>
-              <w:end w:w="160" w:type="dxa"/>
-            </w:tcMar>
-          </w:tcPr>
-          <w:p>
-            <w:pPr>
-              <w:spacing w:after="40"/>
-            </w:pPr>
-            <w:r>
-              <w:rPr>
-                <w:rFonts w:ascii="Arial" w:hAnsi="Arial" w:eastAsia="Arial" w:cs="Arial"/>
-                <w:b/>
-                <w:color w:val="000000"/>
-                <w:sz w:val="24"/>
-              </w:rPr>
-              <w:t xml:space="preserve">Estado de cierre. </w:t>
-            </w:r>
-            <w:r>
-              <w:rPr>
-                <w:rFonts w:ascii="Arial" w:hAnsi="Arial" w:eastAsia="Arial" w:cs="Arial"/>
-                <w:color w:val="000000"/>
-                <w:sz w:val="24"/>
-              </w:rPr>
-              <w:t>El reporte técnico, el código, el modelo, el notebook y la validación completa de las tres rutas están cerrados. Sólo faltan la edición con participación de los cuatro integrantes y la publicación del video; por integridad académica no se inventa una URL.</w:t>
-            </w:r>
-          </w:p>
-        </w:tc>
-      </w:tr>
-    </w:tbl>
     <w:p>
-      <w:pPr>
-        <w:spacing w:after="0"/>
-      </w:pPr>
+      <w:r>
+        <w:rPr>
+          <w:rFonts w:ascii="Arial" w:hAnsi="Arial" w:eastAsia="Arial" w:cs="Arial"/>
+          <w:color w:val="000000"/>
+          <w:sz w:val="24"/>
+        </w:rPr>
+        <w:t>Video final publicado en YouTube: https://youtu.be/YObQTAm8_VM</w:t>
+      </w:r>
     </w:p>
     <w:p>
       <w:pPr>
@@ -1158,9 +1116,8 @@
         <w:tblLook w:firstColumn="1" w:firstRow="1" w:lastColumn="0" w:lastRow="0" w:noHBand="0" w:noVBand="1" w:val="04A0"/>
       </w:tblPr>
       <w:tblGrid>
-        <w:gridCol w:w="3120"/>
-        <w:gridCol w:w="3120"/>
-        <w:gridCol w:w="3120"/>
+        <w:gridCol w:w="4680"/>
+        <w:gridCol w:w="4680"/>
       </w:tblGrid>
       <w:tr>
         <w:trPr>
@@ -1169,7 +1126,7 @@
         </w:trPr>
         <w:tc>
           <w:tcPr>
-            <w:tcW w:type="dxa" w:w="4608"/>
+            <w:tcW w:type="dxa" w:w="6048"/>
             <w:shd w:fill="E7E6E6"/>
             <w:vAlign w:val="center"/>
             <w:tcMar>
@@ -1193,7 +1150,7 @@
         </w:tc>
         <w:tc>
           <w:tcPr>
-            <w:tcW w:type="dxa" w:w="2016"/>
+            <w:tcW w:type="dxa" w:w="3024"/>
             <w:shd w:fill="E7E6E6"/>
             <w:vAlign w:val="center"/>
             <w:tcMar>
@@ -1215,30 +1172,6 @@
             </w:r>
           </w:p>
         </w:tc>
-        <w:tc>
-          <w:tcPr>
-            <w:tcW w:type="dxa" w:w="2016"/>
-            <w:shd w:fill="E7E6E6"/>
-            <w:vAlign w:val="center"/>
-            <w:tcMar>
-              <w:top w:w="80" w:type="dxa"/>
-              <w:start w:w="110" w:type="dxa"/>
-              <w:bottom w:w="80" w:type="dxa"/>
-              <w:end w:w="110" w:type="dxa"/>
-            </w:tcMar>
-          </w:tcPr>
-          <w:p>
-            <w:r>
-              <w:rPr>
-                <w:rFonts w:ascii="Arial" w:hAnsi="Arial" w:eastAsia="Arial" w:cs="Arial"/>
-                <w:b/>
-                <w:color w:val="000000"/>
-                <w:sz w:val="24"/>
-              </w:rPr>
-              <w:t>Estado</w:t>
-            </w:r>
-          </w:p>
-        </w:tc>
       </w:tr>
       <w:tr>
         <w:trPr>
@@ -1246,7 +1179,7 @@
         </w:trPr>
         <w:tc>
           <w:tcPr>
-            <w:tcW w:type="dxa" w:w="4608"/>
+            <w:tcW w:type="dxa" w:w="6048"/>
             <w:vAlign w:val="top"/>
             <w:tcMar>
               <w:top w:w="80" w:type="dxa"/>
@@ -1271,7 +1204,7 @@
         </w:tc>
         <w:tc>
           <w:tcPr>
-            <w:tcW w:type="dxa" w:w="2016"/>
+            <w:tcW w:type="dxa" w:w="3024"/>
             <w:vAlign w:val="top"/>
             <w:tcMar>
               <w:top w:w="80" w:type="dxa"/>
@@ -1294,32 +1227,6 @@
             </w:r>
           </w:p>
         </w:tc>
-        <w:tc>
-          <w:tcPr>
-            <w:tcW w:type="dxa" w:w="2016"/>
-            <w:vAlign w:val="top"/>
-            <w:shd w:fill="E2F0D9"/>
-            <w:tcMar>
-              <w:top w:w="80" w:type="dxa"/>
-              <w:start w:w="110" w:type="dxa"/>
-              <w:bottom w:w="80" w:type="dxa"/>
-              <w:end w:w="110" w:type="dxa"/>
-            </w:tcMar>
-          </w:tcPr>
-          <w:p>
-            <w:pPr>
-              <w:spacing w:after="40"/>
-            </w:pPr>
-            <w:r>
-              <w:rPr>
-                <w:rFonts w:ascii="Arial" w:hAnsi="Arial" w:eastAsia="Arial" w:cs="Arial"/>
-                <w:color w:val="000000"/>
-                <w:sz w:val="24"/>
-              </w:rPr>
-              <w:t>Cumple</w:t>
-            </w:r>
-          </w:p>
-        </w:tc>
       </w:tr>
       <w:tr>
         <w:trPr>
@@ -1327,7 +1234,7 @@
         </w:trPr>
         <w:tc>
           <w:tcPr>
-            <w:tcW w:type="dxa" w:w="4608"/>
+            <w:tcW w:type="dxa" w:w="6048"/>
             <w:vAlign w:val="top"/>
             <w:tcMar>
               <w:top w:w="80" w:type="dxa"/>
@@ -1352,7 +1259,7 @@
         </w:tc>
         <w:tc>
           <w:tcPr>
-            <w:tcW w:type="dxa" w:w="2016"/>
+            <w:tcW w:type="dxa" w:w="3024"/>
             <w:vAlign w:val="top"/>
             <w:tcMar>
               <w:top w:w="80" w:type="dxa"/>
@@ -1375,32 +1282,6 @@
             </w:r>
           </w:p>
         </w:tc>
-        <w:tc>
-          <w:tcPr>
-            <w:tcW w:type="dxa" w:w="2016"/>
-            <w:vAlign w:val="top"/>
-            <w:shd w:fill="E2F0D9"/>
-            <w:tcMar>
-              <w:top w:w="80" w:type="dxa"/>
-              <w:start w:w="110" w:type="dxa"/>
-              <w:bottom w:w="80" w:type="dxa"/>
-              <w:end w:w="110" w:type="dxa"/>
-            </w:tcMar>
-          </w:tcPr>
-          <w:p>
-            <w:pPr>
-              <w:spacing w:after="40"/>
-            </w:pPr>
-            <w:r>
-              <w:rPr>
-                <w:rFonts w:ascii="Arial" w:hAnsi="Arial" w:eastAsia="Arial" w:cs="Arial"/>
-                <w:color w:val="000000"/>
-                <w:sz w:val="24"/>
-              </w:rPr>
-              <w:t>Cumple</w:t>
-            </w:r>
-          </w:p>
-        </w:tc>
       </w:tr>
       <w:tr>
         <w:trPr>
@@ -1408,7 +1289,7 @@
         </w:trPr>
         <w:tc>
           <w:tcPr>
-            <w:tcW w:type="dxa" w:w="4608"/>
+            <w:tcW w:type="dxa" w:w="6048"/>
             <w:vAlign w:val="top"/>
             <w:tcMar>
               <w:top w:w="80" w:type="dxa"/>
@@ -1433,7 +1314,7 @@
         </w:tc>
         <w:tc>
           <w:tcPr>
-            <w:tcW w:type="dxa" w:w="2016"/>
+            <w:tcW w:type="dxa" w:w="3024"/>
             <w:vAlign w:val="top"/>
             <w:tcMar>
               <w:top w:w="80" w:type="dxa"/>
@@ -1456,32 +1337,6 @@
             </w:r>
           </w:p>
         </w:tc>
-        <w:tc>
-          <w:tcPr>
-            <w:tcW w:type="dxa" w:w="2016"/>
-            <w:vAlign w:val="top"/>
-            <w:shd w:fill="E2F0D9"/>
-            <w:tcMar>
-              <w:top w:w="80" w:type="dxa"/>
-              <w:start w:w="110" w:type="dxa"/>
-              <w:bottom w:w="80" w:type="dxa"/>
-              <w:end w:w="110" w:type="dxa"/>
-            </w:tcMar>
-          </w:tcPr>
-          <w:p>
-            <w:pPr>
-              <w:spacing w:after="40"/>
-            </w:pPr>
-            <w:r>
-              <w:rPr>
-                <w:rFonts w:ascii="Arial" w:hAnsi="Arial" w:eastAsia="Arial" w:cs="Arial"/>
-                <w:color w:val="000000"/>
-                <w:sz w:val="24"/>
-              </w:rPr>
-              <w:t>Cumple</w:t>
-            </w:r>
-          </w:p>
-        </w:tc>
       </w:tr>
       <w:tr>
         <w:trPr>
@@ -1489,7 +1344,7 @@
         </w:trPr>
         <w:tc>
           <w:tcPr>
-            <w:tcW w:type="dxa" w:w="4608"/>
+            <w:tcW w:type="dxa" w:w="6048"/>
             <w:vAlign w:val="top"/>
             <w:tcMar>
               <w:top w:w="80" w:type="dxa"/>
@@ -1514,7 +1369,7 @@
         </w:tc>
         <w:tc>
           <w:tcPr>
-            <w:tcW w:type="dxa" w:w="2016"/>
+            <w:tcW w:type="dxa" w:w="3024"/>
             <w:vAlign w:val="top"/>
             <w:tcMar>
               <w:top w:w="80" w:type="dxa"/>
@@ -1537,32 +1392,6 @@
             </w:r>
           </w:p>
         </w:tc>
-        <w:tc>
-          <w:tcPr>
-            <w:tcW w:type="dxa" w:w="2016"/>
-            <w:vAlign w:val="top"/>
-            <w:shd w:fill="E2F0D9"/>
-            <w:tcMar>
-              <w:top w:w="80" w:type="dxa"/>
-              <w:start w:w="110" w:type="dxa"/>
-              <w:bottom w:w="80" w:type="dxa"/>
-              <w:end w:w="110" w:type="dxa"/>
-            </w:tcMar>
-          </w:tcPr>
-          <w:p>
-            <w:pPr>
-              <w:spacing w:after="40"/>
-            </w:pPr>
-            <w:r>
-              <w:rPr>
-                <w:rFonts w:ascii="Arial" w:hAnsi="Arial" w:eastAsia="Arial" w:cs="Arial"/>
-                <w:color w:val="000000"/>
-                <w:sz w:val="24"/>
-              </w:rPr>
-              <w:t>Cumple &gt; 10,000</w:t>
-            </w:r>
-          </w:p>
-        </w:tc>
       </w:tr>
       <w:tr>
         <w:trPr>
@@ -1570,7 +1399,7 @@
         </w:trPr>
         <w:tc>
           <w:tcPr>
-            <w:tcW w:type="dxa" w:w="4608"/>
+            <w:tcW w:type="dxa" w:w="6048"/>
             <w:vAlign w:val="top"/>
             <w:tcMar>
               <w:top w:w="80" w:type="dxa"/>
@@ -1595,7 +1424,7 @@
         </w:tc>
         <w:tc>
           <w:tcPr>
-            <w:tcW w:type="dxa" w:w="2016"/>
+            <w:tcW w:type="dxa" w:w="3024"/>
             <w:vAlign w:val="top"/>
             <w:tcMar>
               <w:top w:w="80" w:type="dxa"/>
@@ -1615,32 +1444,6 @@
                 <w:sz w:val="24"/>
               </w:rPr>
               <w:t>0</w:t>
-            </w:r>
-          </w:p>
-        </w:tc>
-        <w:tc>
-          <w:tcPr>
-            <w:tcW w:type="dxa" w:w="2016"/>
-            <w:vAlign w:val="top"/>
-            <w:shd w:fill="E2F0D9"/>
-            <w:tcMar>
-              <w:top w:w="80" w:type="dxa"/>
-              <w:start w:w="110" w:type="dxa"/>
-              <w:bottom w:w="80" w:type="dxa"/>
-              <w:end w:w="110" w:type="dxa"/>
-            </w:tcMar>
-          </w:tcPr>
-          <w:p>
-            <w:pPr>
-              <w:spacing w:after="40"/>
-            </w:pPr>
-            <w:r>
-              <w:rPr>
-                <w:rFonts w:ascii="Arial" w:hAnsi="Arial" w:eastAsia="Arial" w:cs="Arial"/>
-                <w:color w:val="000000"/>
-                <w:sz w:val="24"/>
-              </w:rPr>
-              <w:t>Cumple</w:t>
             </w:r>
           </w:p>
         </w:tc>
@@ -2375,7 +2178,7 @@
                 <w:color w:val="000000"/>
                 <w:sz w:val="24"/>
               </w:rPr>
-              <w:t>≤ 0.05 — cumple</w:t>
+              <w:t>Objetivo ≤ 0.05</w:t>
             </w:r>
           </w:p>
         </w:tc>
@@ -2455,7 +2258,7 @@
                 <w:color w:val="000000"/>
                 <w:sz w:val="24"/>
               </w:rPr>
-              <w:t>Reportado</w:t>
+              <w:t>Desglose por comando</w:t>
             </w:r>
           </w:p>
         </w:tc>
@@ -2535,7 +2338,7 @@
                 <w:color w:val="000000"/>
                 <w:sz w:val="24"/>
               </w:rPr>
-              <w:t>Reportado</w:t>
+              <w:t>Desglose por comando</w:t>
             </w:r>
           </w:p>
         </w:tc>
@@ -2615,7 +2418,7 @@
                 <w:color w:val="000000"/>
                 <w:sz w:val="24"/>
               </w:rPr>
-              <w:t>Reportado</w:t>
+              <w:t>Desglose por comando</w:t>
             </w:r>
           </w:p>
         </w:tc>
@@ -2695,7 +2498,7 @@
                 <w:color w:val="000000"/>
                 <w:sz w:val="24"/>
               </w:rPr>
-              <w:t>Reportado</w:t>
+              <w:t>Métrica complementaria</w:t>
             </w:r>
           </w:p>
         </w:tc>
@@ -3011,7 +2814,7 @@
                 <w:color w:val="000000"/>
                 <w:sz w:val="24"/>
               </w:rPr>
-              <w:t>Separación a 8 km/h, pared derecha, orientación y retorno de carril</w:t>
+              <w:t>Separación a 8 km/h, corredor y=233.20, límite y=232.60 y retorno a y=236.40</w:t>
             </w:r>
           </w:p>
         </w:tc>
@@ -3426,7 +3229,7 @@
                 <w:color w:val="000000"/>
                 <w:sz w:val="24"/>
               </w:rPr>
-              <w:t>Desplazamiento inicial a la izquierda</w:t>
+              <w:t>Entrar al corredor legal y=233.20</w:t>
             </w:r>
           </w:p>
         </w:tc>
@@ -3451,7 +3254,7 @@
                 <w:color w:val="000000"/>
                 <w:sz w:val="24"/>
               </w:rPr>
-              <w:t>Pared lateral o 3.5 s</w:t>
+              <w:t>Corredor, rumbo 0.30 rad o pared lateral</w:t>
             </w:r>
           </w:p>
         </w:tc>
@@ -3506,7 +3309,7 @@
                 <w:color w:val="000000"/>
                 <w:sz w:val="24"/>
               </w:rPr>
-              <w:t>Mantener separación del autobús</w:t>
+              <w:t>Mantener separación sin cruzar y=232.60</w:t>
             </w:r>
           </w:p>
         </w:tc>
@@ -3531,7 +3334,7 @@
                 <w:color w:val="000000"/>
                 <w:sz w:val="24"/>
               </w:rPr>
-              <w:t>Pared ausente durante 12 pasos</w:t>
+              <w:t>Pared adquirida y luego ausente durante 12 pasos</w:t>
             </w:r>
           </w:p>
         </w:tc>
@@ -3586,7 +3389,7 @@
                 <w:color w:val="000000"/>
                 <w:sz w:val="24"/>
               </w:rPr>
-              <w:t>Compensar giro con giroscopio</w:t>
+              <w:t>Retornar hacia el carril original</w:t>
             </w:r>
           </w:p>
         </w:tc>
@@ -3611,7 +3414,7 @@
                 <w:color w:val="000000"/>
                 <w:sz w:val="24"/>
               </w:rPr>
-              <w:t>Error &lt;0.08 rad o 6 s</w:t>
+              <w:t>Rumbo &lt;0.08 rad y y≥235.60, o 6 s</w:t>
             </w:r>
           </w:p>
         </w:tc>
@@ -3666,7 +3469,7 @@
                 <w:color w:val="000000"/>
                 <w:sz w:val="24"/>
               </w:rPr>
-              <w:t>Volver suavemente a CIL</w:t>
+              <w:t>Fijar el centro de carril y=236.40</w:t>
             </w:r>
           </w:p>
         </w:tc>
@@ -3691,7 +3494,7 @@
                 <w:color w:val="000000"/>
                 <w:sz w:val="24"/>
               </w:rPr>
-              <w:t>2 s</w:t>
+              <w:t>Error lateral ≤0.45 m y rumbo &lt;0.08 rad</w:t>
             </w:r>
           </w:p>
         </w:tc>
@@ -4441,7 +4244,7 @@
                 <w:color w:val="000000"/>
                 <w:sz w:val="24"/>
               </w:rPr>
-              <w:t>Evasión sin contacto, retorno al carril y llegada GPS=(-188.05,236.83)</w:t>
+              <w:t>Mínimo y=232.77 sin cruzar doble línea; retorno y permanencia en y=236.40; llegada GPS=(-188.06,236.40)</w:t>
             </w:r>
           </w:p>
         </w:tc>
@@ -4612,57 +4415,15 @@
         <w:spacing w:after="0"/>
       </w:pPr>
     </w:p>
-    <w:tbl>
-      <w:tblPr>
-        <w:tblW w:type="auto" w:w="0"/>
-        <w:jc w:val="center"/>
-        <w:tblLayout w:type="fixed"/>
-        <w:tblLook w:firstColumn="1" w:firstRow="1" w:lastColumn="0" w:lastRow="0" w:noHBand="0" w:noVBand="1" w:val="04A0"/>
-      </w:tblPr>
-      <w:tblGrid>
-        <w:gridCol w:w="9360"/>
-      </w:tblGrid>
-      <w:tr>
-        <w:tc>
-          <w:tcPr>
-            <w:tcW w:type="dxa" w:w="9288"/>
-            <w:shd w:fill="E2F0D9"/>
-            <w:tcMar>
-              <w:top w:w="130" w:type="dxa"/>
-              <w:start w:w="160" w:type="dxa"/>
-              <w:bottom w:w="130" w:type="dxa"/>
-              <w:end w:w="160" w:type="dxa"/>
-            </w:tcMar>
-          </w:tcPr>
-          <w:p>
-            <w:pPr>
-              <w:spacing w:after="40"/>
-            </w:pPr>
-            <w:r>
-              <w:rPr>
-                <w:rFonts w:ascii="Arial" w:hAnsi="Arial" w:eastAsia="Arial" w:cs="Arial"/>
-                <w:b/>
-                <w:color w:val="000000"/>
-                <w:sz w:val="24"/>
-              </w:rPr>
-              <w:t xml:space="preserve">Validación de rutas cerrada. </w:t>
-            </w:r>
-            <w:r>
-              <w:rPr>
-                <w:rFonts w:ascii="Arial" w:hAnsi="Arial" w:eastAsia="Arial" w:cs="Arial"/>
-                <w:color w:val="000000"/>
-                <w:sz w:val="24"/>
-              </w:rPr>
-              <w:t>Las tomas finales completaron las tres rutas por carril derecho, sin colisión ni U-turn. Los logs registran los cambios de estado y la llegada GPS; ffmpeg decodificó los tres clips sin errores. La revalidación corrigió entrada insegura al cruce, el retorno tras la evasión y la salida al carril opuesto; conserva el filtro que distingue 'bus stop' de un autobús real.</w:t>
-            </w:r>
-          </w:p>
-        </w:tc>
-      </w:tr>
-    </w:tbl>
     <w:p>
-      <w:pPr>
-        <w:spacing w:after="0"/>
-      </w:pPr>
+      <w:r>
+        <w:rPr>
+          <w:rFonts w:ascii="Arial" w:hAnsi="Arial" w:eastAsia="Arial" w:cs="Arial"/>
+          <w:color w:val="000000"/>
+          <w:sz w:val="24"/>
+        </w:rPr>
+        <w:t>Las tomas finales completaron las tres rutas por carril derecho, sin colisión ni U-turn. Los logs registran los cambios de estado y la llegada GPS; ffmpeg decodificó los tres clips sin errores. La revalidación corrigió la invasión del sentido opuesto durante la evasión, fijó la permanencia posterior en y=236.40, corrigió la entrada insegura al cruce y la salida del giro izquierdo al carril opuesto; conserva el filtro que distingue 'bus stop' de un autobús real.</w:t>
+      </w:r>
     </w:p>
     <w:p>
       <w:pPr>
@@ -4674,775 +4435,7 @@
           <w:color w:val="000000"/>
           <w:sz w:val="24"/>
         </w:rPr>
-        <w:t>7. Verificación automatizada</w:t>
-      </w:r>
-    </w:p>
-    <w:p>
-      <w:r>
-        <w:rPr>
-          <w:rFonts w:ascii="Arial" w:hAnsi="Arial" w:eastAsia="Arial" w:cs="Arial"/>
-          <w:color w:val="000000"/>
-          <w:sz w:val="24"/>
-        </w:rPr>
-        <w:t>Doce pruebas unitarias y de integridad verifican esquema y referencias del dataset, notebook reproducible, presets, dispositivos del mundo, preprocesamiento, one-hot, límites de dirección, regulación longitudinal, histéresis de 12/15 m y acotación del seguimiento de pared.</w:t>
-      </w:r>
-    </w:p>
-    <w:tbl>
-      <w:tblPr>
-        <w:tblStyle w:val="TableGrid"/>
-        <w:tblW w:type="auto" w:w="0"/>
-        <w:jc w:val="center"/>
-        <w:tblLayout w:type="fixed"/>
-        <w:tblLook w:firstColumn="1" w:firstRow="1" w:lastColumn="0" w:lastRow="0" w:noHBand="0" w:noVBand="1" w:val="04A0"/>
-      </w:tblPr>
-      <w:tblGrid>
-        <w:gridCol w:w="3120"/>
-        <w:gridCol w:w="3120"/>
-        <w:gridCol w:w="3120"/>
-      </w:tblGrid>
-      <w:tr>
-        <w:trPr>
-          <w:tblHeader w:val="true"/>
-          <w:cantSplit/>
-        </w:trPr>
-        <w:tc>
-          <w:tcPr>
-            <w:tcW w:type="dxa" w:w="2160"/>
-            <w:shd w:fill="E7E6E6"/>
-            <w:vAlign w:val="center"/>
-            <w:tcMar>
-              <w:top w:w="80" w:type="dxa"/>
-              <w:start w:w="110" w:type="dxa"/>
-              <w:bottom w:w="80" w:type="dxa"/>
-              <w:end w:w="110" w:type="dxa"/>
-            </w:tcMar>
-          </w:tcPr>
-          <w:p>
-            <w:r>
-              <w:rPr>
-                <w:rFonts w:ascii="Arial" w:hAnsi="Arial" w:eastAsia="Arial" w:cs="Arial"/>
-                <w:b/>
-                <w:color w:val="000000"/>
-                <w:sz w:val="24"/>
-              </w:rPr>
-              <w:t>Área</w:t>
-            </w:r>
-          </w:p>
-        </w:tc>
-        <w:tc>
-          <w:tcPr>
-            <w:tcW w:type="dxa" w:w="4752"/>
-            <w:shd w:fill="E7E6E6"/>
-            <w:vAlign w:val="center"/>
-            <w:tcMar>
-              <w:top w:w="80" w:type="dxa"/>
-              <w:start w:w="110" w:type="dxa"/>
-              <w:bottom w:w="80" w:type="dxa"/>
-              <w:end w:w="110" w:type="dxa"/>
-            </w:tcMar>
-          </w:tcPr>
-          <w:p>
-            <w:r>
-              <w:rPr>
-                <w:rFonts w:ascii="Arial" w:hAnsi="Arial" w:eastAsia="Arial" w:cs="Arial"/>
-                <w:b/>
-                <w:color w:val="000000"/>
-                <w:sz w:val="24"/>
-              </w:rPr>
-              <w:t>Evidencia</w:t>
-            </w:r>
-          </w:p>
-        </w:tc>
-        <w:tc>
-          <w:tcPr>
-            <w:tcW w:type="dxa" w:w="2160"/>
-            <w:shd w:fill="E7E6E6"/>
-            <w:vAlign w:val="center"/>
-            <w:tcMar>
-              <w:top w:w="80" w:type="dxa"/>
-              <w:start w:w="110" w:type="dxa"/>
-              <w:bottom w:w="80" w:type="dxa"/>
-              <w:end w:w="110" w:type="dxa"/>
-            </w:tcMar>
-          </w:tcPr>
-          <w:p>
-            <w:r>
-              <w:rPr>
-                <w:rFonts w:ascii="Arial" w:hAnsi="Arial" w:eastAsia="Arial" w:cs="Arial"/>
-                <w:b/>
-                <w:color w:val="000000"/>
-                <w:sz w:val="24"/>
-              </w:rPr>
-              <w:t>Estado</w:t>
-            </w:r>
-          </w:p>
-        </w:tc>
-      </w:tr>
-      <w:tr>
-        <w:trPr>
-          <w:cantSplit/>
-        </w:trPr>
-        <w:tc>
-          <w:tcPr>
-            <w:tcW w:type="dxa" w:w="2160"/>
-            <w:vAlign w:val="top"/>
-            <w:tcMar>
-              <w:top w:w="80" w:type="dxa"/>
-              <w:start w:w="110" w:type="dxa"/>
-              <w:bottom w:w="80" w:type="dxa"/>
-              <w:end w:w="110" w:type="dxa"/>
-            </w:tcMar>
-          </w:tcPr>
-          <w:p>
-            <w:pPr>
-              <w:spacing w:after="40"/>
-            </w:pPr>
-            <w:r>
-              <w:rPr>
-                <w:rFonts w:ascii="Arial" w:hAnsi="Arial" w:eastAsia="Arial" w:cs="Arial"/>
-                <w:color w:val="000000"/>
-                <w:sz w:val="24"/>
-              </w:rPr>
-              <w:t>Dataset</w:t>
-            </w:r>
-          </w:p>
-        </w:tc>
-        <w:tc>
-          <w:tcPr>
-            <w:tcW w:type="dxa" w:w="4752"/>
-            <w:vAlign w:val="top"/>
-            <w:tcMar>
-              <w:top w:w="80" w:type="dxa"/>
-              <w:start w:w="110" w:type="dxa"/>
-              <w:bottom w:w="80" w:type="dxa"/>
-              <w:end w:w="110" w:type="dxa"/>
-            </w:tcMar>
-          </w:tcPr>
-          <w:p>
-            <w:pPr>
-              <w:spacing w:after="40"/>
-            </w:pPr>
-            <w:r>
-              <w:rPr>
-                <w:rFonts w:ascii="Arial" w:hAnsi="Arial" w:eastAsia="Arial" w:cs="Arial"/>
-                <w:color w:val="000000"/>
-                <w:sz w:val="24"/>
-              </w:rPr>
-              <w:t>6,129 imágenes; 0 faltantes; 3 comandos</w:t>
-            </w:r>
-          </w:p>
-        </w:tc>
-        <w:tc>
-          <w:tcPr>
-            <w:tcW w:type="dxa" w:w="2160"/>
-            <w:vAlign w:val="top"/>
-            <w:shd w:fill="E2F0D9"/>
-            <w:tcMar>
-              <w:top w:w="80" w:type="dxa"/>
-              <w:start w:w="110" w:type="dxa"/>
-              <w:bottom w:w="80" w:type="dxa"/>
-              <w:end w:w="110" w:type="dxa"/>
-            </w:tcMar>
-          </w:tcPr>
-          <w:p>
-            <w:pPr>
-              <w:spacing w:after="40"/>
-            </w:pPr>
-            <w:r>
-              <w:rPr>
-                <w:rFonts w:ascii="Arial" w:hAnsi="Arial" w:eastAsia="Arial" w:cs="Arial"/>
-                <w:color w:val="000000"/>
-                <w:sz w:val="24"/>
-              </w:rPr>
-              <w:t>Verificado</w:t>
-            </w:r>
-          </w:p>
-        </w:tc>
-      </w:tr>
-      <w:tr>
-        <w:trPr>
-          <w:cantSplit/>
-        </w:trPr>
-        <w:tc>
-          <w:tcPr>
-            <w:tcW w:type="dxa" w:w="2160"/>
-            <w:vAlign w:val="top"/>
-            <w:tcMar>
-              <w:top w:w="80" w:type="dxa"/>
-              <w:start w:w="110" w:type="dxa"/>
-              <w:bottom w:w="80" w:type="dxa"/>
-              <w:end w:w="110" w:type="dxa"/>
-            </w:tcMar>
-          </w:tcPr>
-          <w:p>
-            <w:pPr>
-              <w:spacing w:after="40"/>
-            </w:pPr>
-            <w:r>
-              <w:rPr>
-                <w:rFonts w:ascii="Arial" w:hAnsi="Arial" w:eastAsia="Arial" w:cs="Arial"/>
-                <w:color w:val="000000"/>
-                <w:sz w:val="24"/>
-              </w:rPr>
-              <w:t>Aumento</w:t>
-            </w:r>
-          </w:p>
-        </w:tc>
-        <w:tc>
-          <w:tcPr>
-            <w:tcW w:type="dxa" w:w="4752"/>
-            <w:vAlign w:val="top"/>
-            <w:tcMar>
-              <w:top w:w="80" w:type="dxa"/>
-              <w:start w:w="110" w:type="dxa"/>
-              <w:bottom w:w="80" w:type="dxa"/>
-              <w:end w:w="110" w:type="dxa"/>
-            </w:tcMar>
-          </w:tcPr>
-          <w:p>
-            <w:pPr>
-              <w:spacing w:after="40"/>
-            </w:pPr>
-            <w:r>
-              <w:rPr>
-                <w:rFonts w:ascii="Arial" w:hAnsi="Arial" w:eastAsia="Arial" w:cs="Arial"/>
-                <w:color w:val="000000"/>
-                <w:sz w:val="24"/>
-              </w:rPr>
-              <w:t>12,956 muestras; 0 source_id compartidos</w:t>
-            </w:r>
-          </w:p>
-        </w:tc>
-        <w:tc>
-          <w:tcPr>
-            <w:tcW w:type="dxa" w:w="2160"/>
-            <w:vAlign w:val="top"/>
-            <w:shd w:fill="E2F0D9"/>
-            <w:tcMar>
-              <w:top w:w="80" w:type="dxa"/>
-              <w:start w:w="110" w:type="dxa"/>
-              <w:bottom w:w="80" w:type="dxa"/>
-              <w:end w:w="110" w:type="dxa"/>
-            </w:tcMar>
-          </w:tcPr>
-          <w:p>
-            <w:pPr>
-              <w:spacing w:after="40"/>
-            </w:pPr>
-            <w:r>
-              <w:rPr>
-                <w:rFonts w:ascii="Arial" w:hAnsi="Arial" w:eastAsia="Arial" w:cs="Arial"/>
-                <w:color w:val="000000"/>
-                <w:sz w:val="24"/>
-              </w:rPr>
-              <w:t>Verificado</w:t>
-            </w:r>
-          </w:p>
-        </w:tc>
-      </w:tr>
-      <w:tr>
-        <w:trPr>
-          <w:cantSplit/>
-        </w:trPr>
-        <w:tc>
-          <w:tcPr>
-            <w:tcW w:type="dxa" w:w="2160"/>
-            <w:vAlign w:val="top"/>
-            <w:tcMar>
-              <w:top w:w="80" w:type="dxa"/>
-              <w:start w:w="110" w:type="dxa"/>
-              <w:bottom w:w="80" w:type="dxa"/>
-              <w:end w:w="110" w:type="dxa"/>
-            </w:tcMar>
-          </w:tcPr>
-          <w:p>
-            <w:pPr>
-              <w:spacing w:after="40"/>
-            </w:pPr>
-            <w:r>
-              <w:rPr>
-                <w:rFonts w:ascii="Arial" w:hAnsi="Arial" w:eastAsia="Arial" w:cs="Arial"/>
-                <w:color w:val="000000"/>
-                <w:sz w:val="24"/>
-              </w:rPr>
-              <w:t>Notebook</w:t>
-            </w:r>
-          </w:p>
-        </w:tc>
-        <w:tc>
-          <w:tcPr>
-            <w:tcW w:type="dxa" w:w="4752"/>
-            <w:vAlign w:val="top"/>
-            <w:tcMar>
-              <w:top w:w="80" w:type="dxa"/>
-              <w:start w:w="110" w:type="dxa"/>
-              <w:bottom w:w="80" w:type="dxa"/>
-              <w:end w:w="110" w:type="dxa"/>
-            </w:tcMar>
-          </w:tcPr>
-          <w:p>
-            <w:pPr>
-              <w:spacing w:after="40"/>
-            </w:pPr>
-            <w:r>
-              <w:rPr>
-                <w:rFonts w:ascii="Arial" w:hAnsi="Arial" w:eastAsia="Arial" w:cs="Arial"/>
-                <w:color w:val="000000"/>
-                <w:sz w:val="24"/>
-              </w:rPr>
-              <w:t>19 celdas ejecutadas desde clon; HDF5 recargable</w:t>
-            </w:r>
-          </w:p>
-        </w:tc>
-        <w:tc>
-          <w:tcPr>
-            <w:tcW w:type="dxa" w:w="2160"/>
-            <w:vAlign w:val="top"/>
-            <w:shd w:fill="E2F0D9"/>
-            <w:tcMar>
-              <w:top w:w="80" w:type="dxa"/>
-              <w:start w:w="110" w:type="dxa"/>
-              <w:bottom w:w="80" w:type="dxa"/>
-              <w:end w:w="110" w:type="dxa"/>
-            </w:tcMar>
-          </w:tcPr>
-          <w:p>
-            <w:pPr>
-              <w:spacing w:after="40"/>
-            </w:pPr>
-            <w:r>
-              <w:rPr>
-                <w:rFonts w:ascii="Arial" w:hAnsi="Arial" w:eastAsia="Arial" w:cs="Arial"/>
-                <w:color w:val="000000"/>
-                <w:sz w:val="24"/>
-              </w:rPr>
-              <w:t>Verificado</w:t>
-            </w:r>
-          </w:p>
-        </w:tc>
-      </w:tr>
-      <w:tr>
-        <w:trPr>
-          <w:cantSplit/>
-        </w:trPr>
-        <w:tc>
-          <w:tcPr>
-            <w:tcW w:type="dxa" w:w="2160"/>
-            <w:vAlign w:val="top"/>
-            <w:tcMar>
-              <w:top w:w="80" w:type="dxa"/>
-              <w:start w:w="110" w:type="dxa"/>
-              <w:bottom w:w="80" w:type="dxa"/>
-              <w:end w:w="110" w:type="dxa"/>
-            </w:tcMar>
-          </w:tcPr>
-          <w:p>
-            <w:pPr>
-              <w:spacing w:after="40"/>
-            </w:pPr>
-            <w:r>
-              <w:rPr>
-                <w:rFonts w:ascii="Arial" w:hAnsi="Arial" w:eastAsia="Arial" w:cs="Arial"/>
-                <w:color w:val="000000"/>
-                <w:sz w:val="24"/>
-              </w:rPr>
-              <w:t>Modelo</w:t>
-            </w:r>
-          </w:p>
-        </w:tc>
-        <w:tc>
-          <w:tcPr>
-            <w:tcW w:type="dxa" w:w="4752"/>
-            <w:vAlign w:val="top"/>
-            <w:tcMar>
-              <w:top w:w="80" w:type="dxa"/>
-              <w:start w:w="110" w:type="dxa"/>
-              <w:bottom w:w="80" w:type="dxa"/>
-              <w:end w:w="110" w:type="dxa"/>
-            </w:tcMar>
-          </w:tcPr>
-          <w:p>
-            <w:pPr>
-              <w:spacing w:after="40"/>
-            </w:pPr>
-            <w:r>
-              <w:rPr>
-                <w:rFonts w:ascii="Arial" w:hAnsi="Arial" w:eastAsia="Arial" w:cs="Arial"/>
-                <w:color w:val="000000"/>
-                <w:sz w:val="24"/>
-              </w:rPr>
-              <w:t>MAE 0.0220 rad y métricas por comando</w:t>
-            </w:r>
-          </w:p>
-        </w:tc>
-        <w:tc>
-          <w:tcPr>
-            <w:tcW w:type="dxa" w:w="2160"/>
-            <w:vAlign w:val="top"/>
-            <w:shd w:fill="E2F0D9"/>
-            <w:tcMar>
-              <w:top w:w="80" w:type="dxa"/>
-              <w:start w:w="110" w:type="dxa"/>
-              <w:bottom w:w="80" w:type="dxa"/>
-              <w:end w:w="110" w:type="dxa"/>
-            </w:tcMar>
-          </w:tcPr>
-          <w:p>
-            <w:pPr>
-              <w:spacing w:after="40"/>
-            </w:pPr>
-            <w:r>
-              <w:rPr>
-                <w:rFonts w:ascii="Arial" w:hAnsi="Arial" w:eastAsia="Arial" w:cs="Arial"/>
-                <w:color w:val="000000"/>
-                <w:sz w:val="24"/>
-              </w:rPr>
-              <w:t>Verificado</w:t>
-            </w:r>
-          </w:p>
-        </w:tc>
-      </w:tr>
-      <w:tr>
-        <w:trPr>
-          <w:cantSplit/>
-        </w:trPr>
-        <w:tc>
-          <w:tcPr>
-            <w:tcW w:type="dxa" w:w="2160"/>
-            <w:vAlign w:val="top"/>
-            <w:tcMar>
-              <w:top w:w="80" w:type="dxa"/>
-              <w:start w:w="110" w:type="dxa"/>
-              <w:bottom w:w="80" w:type="dxa"/>
-              <w:end w:w="110" w:type="dxa"/>
-            </w:tcMar>
-          </w:tcPr>
-          <w:p>
-            <w:pPr>
-              <w:spacing w:after="40"/>
-            </w:pPr>
-            <w:r>
-              <w:rPr>
-                <w:rFonts w:ascii="Arial" w:hAnsi="Arial" w:eastAsia="Arial" w:cs="Arial"/>
-                <w:color w:val="000000"/>
-                <w:sz w:val="24"/>
-              </w:rPr>
-              <w:t>Pruebas</w:t>
-            </w:r>
-          </w:p>
-        </w:tc>
-        <w:tc>
-          <w:tcPr>
-            <w:tcW w:type="dxa" w:w="4752"/>
-            <w:vAlign w:val="top"/>
-            <w:tcMar>
-              <w:top w:w="80" w:type="dxa"/>
-              <w:start w:w="110" w:type="dxa"/>
-              <w:bottom w:w="80" w:type="dxa"/>
-              <w:end w:w="110" w:type="dxa"/>
-            </w:tcMar>
-          </w:tcPr>
-          <w:p>
-            <w:pPr>
-              <w:spacing w:after="40"/>
-            </w:pPr>
-            <w:r>
-              <w:rPr>
-                <w:rFonts w:ascii="Arial" w:hAnsi="Arial" w:eastAsia="Arial" w:cs="Arial"/>
-                <w:color w:val="000000"/>
-                <w:sz w:val="24"/>
-              </w:rPr>
-              <w:t>12/12 exitosas</w:t>
-            </w:r>
-          </w:p>
-        </w:tc>
-        <w:tc>
-          <w:tcPr>
-            <w:tcW w:type="dxa" w:w="2160"/>
-            <w:vAlign w:val="top"/>
-            <w:shd w:fill="E2F0D9"/>
-            <w:tcMar>
-              <w:top w:w="80" w:type="dxa"/>
-              <w:start w:w="110" w:type="dxa"/>
-              <w:bottom w:w="80" w:type="dxa"/>
-              <w:end w:w="110" w:type="dxa"/>
-            </w:tcMar>
-          </w:tcPr>
-          <w:p>
-            <w:pPr>
-              <w:spacing w:after="40"/>
-            </w:pPr>
-            <w:r>
-              <w:rPr>
-                <w:rFonts w:ascii="Arial" w:hAnsi="Arial" w:eastAsia="Arial" w:cs="Arial"/>
-                <w:color w:val="000000"/>
-                <w:sz w:val="24"/>
-              </w:rPr>
-              <w:t>Verificado</w:t>
-            </w:r>
-          </w:p>
-        </w:tc>
-      </w:tr>
-      <w:tr>
-        <w:trPr>
-          <w:cantSplit/>
-        </w:trPr>
-        <w:tc>
-          <w:tcPr>
-            <w:tcW w:type="dxa" w:w="2160"/>
-            <w:vAlign w:val="top"/>
-            <w:tcMar>
-              <w:top w:w="80" w:type="dxa"/>
-              <w:start w:w="110" w:type="dxa"/>
-              <w:bottom w:w="80" w:type="dxa"/>
-              <w:end w:w="110" w:type="dxa"/>
-            </w:tcMar>
-          </w:tcPr>
-          <w:p>
-            <w:pPr>
-              <w:spacing w:after="40"/>
-            </w:pPr>
-            <w:r>
-              <w:rPr>
-                <w:rFonts w:ascii="Arial" w:hAnsi="Arial" w:eastAsia="Arial" w:cs="Arial"/>
-                <w:color w:val="000000"/>
-                <w:sz w:val="24"/>
-              </w:rPr>
-              <w:t>Webots</w:t>
-            </w:r>
-          </w:p>
-        </w:tc>
-        <w:tc>
-          <w:tcPr>
-            <w:tcW w:type="dxa" w:w="4752"/>
-            <w:vAlign w:val="top"/>
-            <w:tcMar>
-              <w:top w:w="80" w:type="dxa"/>
-              <w:start w:w="110" w:type="dxa"/>
-              <w:bottom w:w="80" w:type="dxa"/>
-              <w:end w:w="110" w:type="dxa"/>
-            </w:tcMar>
-          </w:tcPr>
-          <w:p>
-            <w:pPr>
-              <w:spacing w:after="40"/>
-            </w:pPr>
-            <w:r>
-              <w:rPr>
-                <w:rFonts w:ascii="Arial" w:hAnsi="Arial" w:eastAsia="Arial" w:cs="Arial"/>
-                <w:color w:val="000000"/>
-                <w:sz w:val="24"/>
-              </w:rPr>
-              <w:t>Tres comandos y árbitro de seguridad</w:t>
-            </w:r>
-          </w:p>
-        </w:tc>
-        <w:tc>
-          <w:tcPr>
-            <w:tcW w:type="dxa" w:w="2160"/>
-            <w:vAlign w:val="top"/>
-            <w:shd w:fill="E2F0D9"/>
-            <w:tcMar>
-              <w:top w:w="80" w:type="dxa"/>
-              <w:start w:w="110" w:type="dxa"/>
-              <w:bottom w:w="80" w:type="dxa"/>
-              <w:end w:w="110" w:type="dxa"/>
-            </w:tcMar>
-          </w:tcPr>
-          <w:p>
-            <w:pPr>
-              <w:spacing w:after="40"/>
-            </w:pPr>
-            <w:r>
-              <w:rPr>
-                <w:rFonts w:ascii="Arial" w:hAnsi="Arial" w:eastAsia="Arial" w:cs="Arial"/>
-                <w:color w:val="000000"/>
-                <w:sz w:val="24"/>
-              </w:rPr>
-              <w:t>Verificado</w:t>
-            </w:r>
-          </w:p>
-        </w:tc>
-      </w:tr>
-      <w:tr>
-        <w:trPr>
-          <w:cantSplit/>
-        </w:trPr>
-        <w:tc>
-          <w:tcPr>
-            <w:tcW w:type="dxa" w:w="2160"/>
-            <w:vAlign w:val="top"/>
-            <w:tcMar>
-              <w:top w:w="80" w:type="dxa"/>
-              <w:start w:w="110" w:type="dxa"/>
-              <w:bottom w:w="80" w:type="dxa"/>
-              <w:end w:w="110" w:type="dxa"/>
-            </w:tcMar>
-          </w:tcPr>
-          <w:p>
-            <w:pPr>
-              <w:spacing w:after="40"/>
-            </w:pPr>
-            <w:r>
-              <w:rPr>
-                <w:rFonts w:ascii="Arial" w:hAnsi="Arial" w:eastAsia="Arial" w:cs="Arial"/>
-                <w:color w:val="000000"/>
-                <w:sz w:val="24"/>
-              </w:rPr>
-              <w:t>Recorridos completos</w:t>
-            </w:r>
-          </w:p>
-        </w:tc>
-        <w:tc>
-          <w:tcPr>
-            <w:tcW w:type="dxa" w:w="4752"/>
-            <w:vAlign w:val="top"/>
-            <w:tcMar>
-              <w:top w:w="80" w:type="dxa"/>
-              <w:start w:w="110" w:type="dxa"/>
-              <w:bottom w:w="80" w:type="dxa"/>
-              <w:end w:w="110" w:type="dxa"/>
-            </w:tcMar>
-          </w:tcPr>
-          <w:p>
-            <w:pPr>
-              <w:spacing w:after="40"/>
-            </w:pPr>
-            <w:r>
-              <w:rPr>
-                <w:rFonts w:ascii="Arial" w:hAnsi="Arial" w:eastAsia="Arial" w:cs="Arial"/>
-                <w:color w:val="000000"/>
-                <w:sz w:val="24"/>
-              </w:rPr>
-              <w:t>Dos tomas limpias por ruta</w:t>
-            </w:r>
-          </w:p>
-        </w:tc>
-        <w:tc>
-          <w:tcPr>
-            <w:tcW w:type="dxa" w:w="2160"/>
-            <w:vAlign w:val="top"/>
-            <w:shd w:fill="E2F0D9"/>
-            <w:tcMar>
-              <w:top w:w="80" w:type="dxa"/>
-              <w:start w:w="110" w:type="dxa"/>
-              <w:bottom w:w="80" w:type="dxa"/>
-              <w:end w:w="110" w:type="dxa"/>
-            </w:tcMar>
-          </w:tcPr>
-          <w:p>
-            <w:pPr>
-              <w:spacing w:after="40"/>
-            </w:pPr>
-            <w:r>
-              <w:rPr>
-                <w:rFonts w:ascii="Arial" w:hAnsi="Arial" w:eastAsia="Arial" w:cs="Arial"/>
-                <w:color w:val="000000"/>
-                <w:sz w:val="24"/>
-              </w:rPr>
-              <w:t>Verificado</w:t>
-            </w:r>
-          </w:p>
-        </w:tc>
-      </w:tr>
-      <w:tr>
-        <w:trPr>
-          <w:cantSplit/>
-        </w:trPr>
-        <w:tc>
-          <w:tcPr>
-            <w:tcW w:type="dxa" w:w="2160"/>
-            <w:vAlign w:val="top"/>
-            <w:tcMar>
-              <w:top w:w="80" w:type="dxa"/>
-              <w:start w:w="110" w:type="dxa"/>
-              <w:bottom w:w="80" w:type="dxa"/>
-              <w:end w:w="110" w:type="dxa"/>
-            </w:tcMar>
-          </w:tcPr>
-          <w:p>
-            <w:pPr>
-              <w:spacing w:after="40"/>
-            </w:pPr>
-            <w:r>
-              <w:rPr>
-                <w:rFonts w:ascii="Arial" w:hAnsi="Arial" w:eastAsia="Arial" w:cs="Arial"/>
-                <w:color w:val="000000"/>
-                <w:sz w:val="24"/>
-              </w:rPr>
-              <w:t>YouTube</w:t>
-            </w:r>
-          </w:p>
-        </w:tc>
-        <w:tc>
-          <w:tcPr>
-            <w:tcW w:type="dxa" w:w="4752"/>
-            <w:vAlign w:val="top"/>
-            <w:tcMar>
-              <w:top w:w="80" w:type="dxa"/>
-              <w:start w:w="110" w:type="dxa"/>
-              <w:bottom w:w="80" w:type="dxa"/>
-              <w:end w:w="110" w:type="dxa"/>
-            </w:tcMar>
-          </w:tcPr>
-          <w:p>
-            <w:pPr>
-              <w:spacing w:after="40"/>
-            </w:pPr>
-            <w:r>
-              <w:rPr>
-                <w:rFonts w:ascii="Arial" w:hAnsi="Arial" w:eastAsia="Arial" w:cs="Arial"/>
-                <w:color w:val="000000"/>
-                <w:sz w:val="24"/>
-              </w:rPr>
-              <w:t>Video &lt;6 min y URL pública</w:t>
-            </w:r>
-          </w:p>
-        </w:tc>
-        <w:tc>
-          <w:tcPr>
-            <w:tcW w:type="dxa" w:w="2160"/>
-            <w:vAlign w:val="top"/>
-            <w:shd w:fill="FFF2CC"/>
-            <w:tcMar>
-              <w:top w:w="80" w:type="dxa"/>
-              <w:start w:w="110" w:type="dxa"/>
-              <w:bottom w:w="80" w:type="dxa"/>
-              <w:end w:w="110" w:type="dxa"/>
-            </w:tcMar>
-          </w:tcPr>
-          <w:p>
-            <w:pPr>
-              <w:spacing w:after="40"/>
-            </w:pPr>
-            <w:r>
-              <w:rPr>
-                <w:rFonts w:ascii="Arial" w:hAnsi="Arial" w:eastAsia="Arial" w:cs="Arial"/>
-                <w:color w:val="000000"/>
-                <w:sz w:val="24"/>
-              </w:rPr>
-              <w:t>Pendiente de publicación</w:t>
-            </w:r>
-          </w:p>
-        </w:tc>
-      </w:tr>
-    </w:tbl>
-    <w:p>
-      <w:pPr>
-        <w:spacing w:after="0"/>
-      </w:pPr>
-    </w:p>
-    <w:p>
-      <w:pPr>
-        <w:pStyle w:val="Heading1"/>
-      </w:pPr>
-      <w:r>
-        <w:rPr>
-          <w:rFonts w:ascii="Arial" w:hAnsi="Arial" w:eastAsia="Arial" w:cs="Arial"/>
-          <w:color w:val="000000"/>
-          <w:sz w:val="24"/>
-        </w:rPr>
-        <w:t>8. Reproducción</w:t>
+        <w:t>7. Reproducción</w:t>
       </w:r>
     </w:p>
     <w:p>
@@ -5506,7 +4499,7 @@
           <w:color w:val="000000"/>
           <w:sz w:val="24"/>
         </w:rPr>
-        <w:t>9. Uso de inteligencia artificial</w:t>
+        <w:t>8. Uso de inteligencia artificial</w:t>
       </w:r>
     </w:p>
     <w:p>
@@ -5529,7 +4522,7 @@
           <w:color w:val="000000"/>
           <w:sz w:val="24"/>
         </w:rPr>
-        <w:t>10. Conclusiones</w:t>
+        <w:t>9. Conclusiones</w:t>
       </w:r>
     </w:p>
     <w:p>
@@ -5539,1333 +4532,8 @@
           <w:color w:val="000000"/>
           <w:sz w:val="24"/>
         </w:rPr>
-        <w:t>La solución elimina correctamente la clase recovery y separa el aprendizaje de dirección de la recuperación operativa. El modelo supera la meta cuantitativa, el dataset queda trazable y libre de fuga, y el controlador integra sensores heterogéneos con prioridades verificables y completó dos recorridos limpios por ruta. Los únicos pasos externos pendientes son la edición con los cuatro integrantes y la publicación del video.</w:t>
+        <w:t>La solución elimina correctamente la clase recovery y separa el aprendizaje de dirección de la recuperación operativa. El modelo supera la meta cuantitativa, el dataset queda trazable y libre de fuga, y el controlador integra sensores heterogéneos con prioridades verificables y completó dos recorridos limpios por ruta. El video final está publicado en https://youtu.be/YObQTAm8_VM.</w:t>
       </w:r>
-    </w:p>
-    <w:p>
-      <w:pPr>
-        <w:pStyle w:val="Heading1"/>
-      </w:pPr>
-      <w:r>
-        <w:rPr>
-          <w:rFonts w:ascii="Arial" w:hAnsi="Arial" w:eastAsia="Arial" w:cs="Arial"/>
-          <w:color w:val="000000"/>
-          <w:sz w:val="24"/>
-        </w:rPr>
-        <w:t>11. Matriz de cumplimiento de la rúbrica</w:t>
-      </w:r>
-    </w:p>
-    <w:tbl>
-      <w:tblPr>
-        <w:tblStyle w:val="TableGrid"/>
-        <w:tblW w:type="auto" w:w="0"/>
-        <w:jc w:val="center"/>
-        <w:tblLayout w:type="fixed"/>
-        <w:tblLook w:firstColumn="1" w:firstRow="1" w:lastColumn="0" w:lastRow="0" w:noHBand="0" w:noVBand="1" w:val="04A0"/>
-      </w:tblPr>
-      <w:tblGrid>
-        <w:gridCol w:w="3120"/>
-        <w:gridCol w:w="3120"/>
-        <w:gridCol w:w="3120"/>
-      </w:tblGrid>
-      <w:tr>
-        <w:trPr>
-          <w:tblHeader w:val="true"/>
-          <w:cantSplit/>
-        </w:trPr>
-        <w:tc>
-          <w:tcPr>
-            <w:tcW w:type="dxa" w:w="2448"/>
-            <w:shd w:fill="E7E6E6"/>
-            <w:vAlign w:val="center"/>
-            <w:tcMar>
-              <w:top w:w="80" w:type="dxa"/>
-              <w:start w:w="110" w:type="dxa"/>
-              <w:bottom w:w="80" w:type="dxa"/>
-              <w:end w:w="110" w:type="dxa"/>
-            </w:tcMar>
-          </w:tcPr>
-          <w:p>
-            <w:r>
-              <w:rPr>
-                <w:rFonts w:ascii="Arial" w:hAnsi="Arial" w:eastAsia="Arial" w:cs="Arial"/>
-                <w:b/>
-                <w:color w:val="000000"/>
-                <w:sz w:val="24"/>
-              </w:rPr>
-              <w:t>Criterio</w:t>
-            </w:r>
-          </w:p>
-        </w:tc>
-        <w:tc>
-          <w:tcPr>
-            <w:tcW w:type="dxa" w:w="4608"/>
-            <w:shd w:fill="E7E6E6"/>
-            <w:vAlign w:val="center"/>
-            <w:tcMar>
-              <w:top w:w="80" w:type="dxa"/>
-              <w:start w:w="110" w:type="dxa"/>
-              <w:bottom w:w="80" w:type="dxa"/>
-              <w:end w:w="110" w:type="dxa"/>
-            </w:tcMar>
-          </w:tcPr>
-          <w:p>
-            <w:r>
-              <w:rPr>
-                <w:rFonts w:ascii="Arial" w:hAnsi="Arial" w:eastAsia="Arial" w:cs="Arial"/>
-                <w:b/>
-                <w:color w:val="000000"/>
-                <w:sz w:val="24"/>
-              </w:rPr>
-              <w:t>Evidencia</w:t>
-            </w:r>
-          </w:p>
-        </w:tc>
-        <w:tc>
-          <w:tcPr>
-            <w:tcW w:type="dxa" w:w="2016"/>
-            <w:shd w:fill="E7E6E6"/>
-            <w:vAlign w:val="center"/>
-            <w:tcMar>
-              <w:top w:w="80" w:type="dxa"/>
-              <w:start w:w="110" w:type="dxa"/>
-              <w:bottom w:w="80" w:type="dxa"/>
-              <w:end w:w="110" w:type="dxa"/>
-            </w:tcMar>
-          </w:tcPr>
-          <w:p>
-            <w:r>
-              <w:rPr>
-                <w:rFonts w:ascii="Arial" w:hAnsi="Arial" w:eastAsia="Arial" w:cs="Arial"/>
-                <w:b/>
-                <w:color w:val="000000"/>
-                <w:sz w:val="24"/>
-              </w:rPr>
-              <w:t>Estado</w:t>
-            </w:r>
-          </w:p>
-        </w:tc>
-      </w:tr>
-      <w:tr>
-        <w:trPr>
-          <w:cantSplit/>
-        </w:trPr>
-        <w:tc>
-          <w:tcPr>
-            <w:tcW w:type="dxa" w:w="2448"/>
-            <w:vAlign w:val="top"/>
-            <w:tcMar>
-              <w:top w:w="80" w:type="dxa"/>
-              <w:start w:w="110" w:type="dxa"/>
-              <w:bottom w:w="80" w:type="dxa"/>
-              <w:end w:w="110" w:type="dxa"/>
-            </w:tcMar>
-          </w:tcPr>
-          <w:p>
-            <w:pPr>
-              <w:spacing w:after="40"/>
-            </w:pPr>
-            <w:r>
-              <w:rPr>
-                <w:rFonts w:ascii="Arial" w:hAnsi="Arial" w:eastAsia="Arial" w:cs="Arial"/>
-                <w:color w:val="000000"/>
-                <w:sz w:val="24"/>
-              </w:rPr>
-              <w:t>Dataset y comandos</w:t>
-            </w:r>
-          </w:p>
-        </w:tc>
-        <w:tc>
-          <w:tcPr>
-            <w:tcW w:type="dxa" w:w="4608"/>
-            <w:vAlign w:val="top"/>
-            <w:tcMar>
-              <w:top w:w="80" w:type="dxa"/>
-              <w:start w:w="110" w:type="dxa"/>
-              <w:bottom w:w="80" w:type="dxa"/>
-              <w:end w:w="110" w:type="dxa"/>
-            </w:tcMar>
-          </w:tcPr>
-          <w:p>
-            <w:pPr>
-              <w:spacing w:after="40"/>
-            </w:pPr>
-            <w:r>
-              <w:rPr>
-                <w:rFonts w:ascii="Arial" w:hAnsi="Arial" w:eastAsia="Arial" w:cs="Arial"/>
-                <w:color w:val="000000"/>
-                <w:sz w:val="24"/>
-              </w:rPr>
-              <w:t>CSV con encabezado; 321 recovery excluidas; 0/1/2</w:t>
-            </w:r>
-          </w:p>
-        </w:tc>
-        <w:tc>
-          <w:tcPr>
-            <w:tcW w:type="dxa" w:w="2016"/>
-            <w:vAlign w:val="top"/>
-            <w:shd w:fill="E2F0D9"/>
-            <w:tcMar>
-              <w:top w:w="80" w:type="dxa"/>
-              <w:start w:w="110" w:type="dxa"/>
-              <w:bottom w:w="80" w:type="dxa"/>
-              <w:end w:w="110" w:type="dxa"/>
-            </w:tcMar>
-          </w:tcPr>
-          <w:p>
-            <w:pPr>
-              <w:spacing w:after="40"/>
-            </w:pPr>
-            <w:r>
-              <w:rPr>
-                <w:rFonts w:ascii="Arial" w:hAnsi="Arial" w:eastAsia="Arial" w:cs="Arial"/>
-                <w:color w:val="000000"/>
-                <w:sz w:val="24"/>
-              </w:rPr>
-              <w:t>Cumple</w:t>
-            </w:r>
-          </w:p>
-        </w:tc>
-      </w:tr>
-      <w:tr>
-        <w:trPr>
-          <w:cantSplit/>
-        </w:trPr>
-        <w:tc>
-          <w:tcPr>
-            <w:tcW w:type="dxa" w:w="2448"/>
-            <w:vAlign w:val="top"/>
-            <w:tcMar>
-              <w:top w:w="80" w:type="dxa"/>
-              <w:start w:w="110" w:type="dxa"/>
-              <w:bottom w:w="80" w:type="dxa"/>
-              <w:end w:w="110" w:type="dxa"/>
-            </w:tcMar>
-          </w:tcPr>
-          <w:p>
-            <w:pPr>
-              <w:spacing w:after="40"/>
-            </w:pPr>
-            <w:r>
-              <w:rPr>
-                <w:rFonts w:ascii="Arial" w:hAnsi="Arial" w:eastAsia="Arial" w:cs="Arial"/>
-                <w:color w:val="000000"/>
-                <w:sz w:val="24"/>
-              </w:rPr>
-              <w:t>Aumento y división</w:t>
-            </w:r>
-          </w:p>
-        </w:tc>
-        <w:tc>
-          <w:tcPr>
-            <w:tcW w:type="dxa" w:w="4608"/>
-            <w:vAlign w:val="top"/>
-            <w:tcMar>
-              <w:top w:w="80" w:type="dxa"/>
-              <w:start w:w="110" w:type="dxa"/>
-              <w:bottom w:w="80" w:type="dxa"/>
-              <w:end w:w="110" w:type="dxa"/>
-            </w:tcMar>
-          </w:tcPr>
-          <w:p>
-            <w:pPr>
-              <w:spacing w:after="40"/>
-            </w:pPr>
-            <w:r>
-              <w:rPr>
-                <w:rFonts w:ascii="Arial" w:hAnsi="Arial" w:eastAsia="Arial" w:cs="Arial"/>
-                <w:color w:val="000000"/>
-                <w:sz w:val="24"/>
-              </w:rPr>
-              <w:t>&gt;10,000; split por fuente; reflejo y brillo</w:t>
-            </w:r>
-          </w:p>
-        </w:tc>
-        <w:tc>
-          <w:tcPr>
-            <w:tcW w:type="dxa" w:w="2016"/>
-            <w:vAlign w:val="top"/>
-            <w:shd w:fill="E2F0D9"/>
-            <w:tcMar>
-              <w:top w:w="80" w:type="dxa"/>
-              <w:start w:w="110" w:type="dxa"/>
-              <w:bottom w:w="80" w:type="dxa"/>
-              <w:end w:w="110" w:type="dxa"/>
-            </w:tcMar>
-          </w:tcPr>
-          <w:p>
-            <w:pPr>
-              <w:spacing w:after="40"/>
-            </w:pPr>
-            <w:r>
-              <w:rPr>
-                <w:rFonts w:ascii="Arial" w:hAnsi="Arial" w:eastAsia="Arial" w:cs="Arial"/>
-                <w:color w:val="000000"/>
-                <w:sz w:val="24"/>
-              </w:rPr>
-              <w:t>Cumple</w:t>
-            </w:r>
-          </w:p>
-        </w:tc>
-      </w:tr>
-      <w:tr>
-        <w:trPr>
-          <w:cantSplit/>
-        </w:trPr>
-        <w:tc>
-          <w:tcPr>
-            <w:tcW w:type="dxa" w:w="2448"/>
-            <w:vAlign w:val="top"/>
-            <w:tcMar>
-              <w:top w:w="80" w:type="dxa"/>
-              <w:start w:w="110" w:type="dxa"/>
-              <w:bottom w:w="80" w:type="dxa"/>
-              <w:end w:w="110" w:type="dxa"/>
-            </w:tcMar>
-          </w:tcPr>
-          <w:p>
-            <w:pPr>
-              <w:spacing w:after="40"/>
-            </w:pPr>
-            <w:r>
-              <w:rPr>
-                <w:rFonts w:ascii="Arial" w:hAnsi="Arial" w:eastAsia="Arial" w:cs="Arial"/>
-                <w:color w:val="000000"/>
-                <w:sz w:val="24"/>
-              </w:rPr>
-              <w:t>Notebook</w:t>
-            </w:r>
-          </w:p>
-        </w:tc>
-        <w:tc>
-          <w:tcPr>
-            <w:tcW w:type="dxa" w:w="4608"/>
-            <w:vAlign w:val="top"/>
-            <w:tcMar>
-              <w:top w:w="80" w:type="dxa"/>
-              <w:start w:w="110" w:type="dxa"/>
-              <w:bottom w:w="80" w:type="dxa"/>
-              <w:end w:w="110" w:type="dxa"/>
-            </w:tcMar>
-          </w:tcPr>
-          <w:p>
-            <w:pPr>
-              <w:spacing w:after="40"/>
-            </w:pPr>
-            <w:r>
-              <w:rPr>
-                <w:rFonts w:ascii="Arial" w:hAnsi="Arial" w:eastAsia="Arial" w:cs="Arial"/>
-                <w:color w:val="000000"/>
-                <w:sz w:val="24"/>
-              </w:rPr>
-              <w:t>Clon, semillas, distribución, arquitectura, curvas, MAE y exportación</w:t>
-            </w:r>
-          </w:p>
-        </w:tc>
-        <w:tc>
-          <w:tcPr>
-            <w:tcW w:type="dxa" w:w="2016"/>
-            <w:vAlign w:val="top"/>
-            <w:shd w:fill="E2F0D9"/>
-            <w:tcMar>
-              <w:top w:w="80" w:type="dxa"/>
-              <w:start w:w="110" w:type="dxa"/>
-              <w:bottom w:w="80" w:type="dxa"/>
-              <w:end w:w="110" w:type="dxa"/>
-            </w:tcMar>
-          </w:tcPr>
-          <w:p>
-            <w:pPr>
-              <w:spacing w:after="40"/>
-            </w:pPr>
-            <w:r>
-              <w:rPr>
-                <w:rFonts w:ascii="Arial" w:hAnsi="Arial" w:eastAsia="Arial" w:cs="Arial"/>
-                <w:color w:val="000000"/>
-                <w:sz w:val="24"/>
-              </w:rPr>
-              <w:t>Cumple</w:t>
-            </w:r>
-          </w:p>
-        </w:tc>
-      </w:tr>
-      <w:tr>
-        <w:trPr>
-          <w:cantSplit/>
-        </w:trPr>
-        <w:tc>
-          <w:tcPr>
-            <w:tcW w:type="dxa" w:w="2448"/>
-            <w:vAlign w:val="top"/>
-            <w:tcMar>
-              <w:top w:w="80" w:type="dxa"/>
-              <w:start w:w="110" w:type="dxa"/>
-              <w:bottom w:w="80" w:type="dxa"/>
-              <w:end w:w="110" w:type="dxa"/>
-            </w:tcMar>
-          </w:tcPr>
-          <w:p>
-            <w:pPr>
-              <w:spacing w:after="40"/>
-            </w:pPr>
-            <w:r>
-              <w:rPr>
-                <w:rFonts w:ascii="Arial" w:hAnsi="Arial" w:eastAsia="Arial" w:cs="Arial"/>
-                <w:color w:val="000000"/>
-                <w:sz w:val="24"/>
-              </w:rPr>
-              <w:t>Modelo CIL</w:t>
-            </w:r>
-          </w:p>
-        </w:tc>
-        <w:tc>
-          <w:tcPr>
-            <w:tcW w:type="dxa" w:w="4608"/>
-            <w:vAlign w:val="top"/>
-            <w:tcMar>
-              <w:top w:w="80" w:type="dxa"/>
-              <w:start w:w="110" w:type="dxa"/>
-              <w:bottom w:w="80" w:type="dxa"/>
-              <w:end w:w="110" w:type="dxa"/>
-            </w:tcMar>
-          </w:tcPr>
-          <w:p>
-            <w:pPr>
-              <w:spacing w:after="40"/>
-            </w:pPr>
-            <w:r>
-              <w:rPr>
-                <w:rFonts w:ascii="Arial" w:hAnsi="Arial" w:eastAsia="Arial" w:cs="Arial"/>
-                <w:color w:val="000000"/>
-                <w:sz w:val="24"/>
-              </w:rPr>
-              <w:t>CNN condicionada + callbacks</w:t>
-            </w:r>
-          </w:p>
-        </w:tc>
-        <w:tc>
-          <w:tcPr>
-            <w:tcW w:type="dxa" w:w="2016"/>
-            <w:vAlign w:val="top"/>
-            <w:shd w:fill="E2F0D9"/>
-            <w:tcMar>
-              <w:top w:w="80" w:type="dxa"/>
-              <w:start w:w="110" w:type="dxa"/>
-              <w:bottom w:w="80" w:type="dxa"/>
-              <w:end w:w="110" w:type="dxa"/>
-            </w:tcMar>
-          </w:tcPr>
-          <w:p>
-            <w:pPr>
-              <w:spacing w:after="40"/>
-            </w:pPr>
-            <w:r>
-              <w:rPr>
-                <w:rFonts w:ascii="Arial" w:hAnsi="Arial" w:eastAsia="Arial" w:cs="Arial"/>
-                <w:color w:val="000000"/>
-                <w:sz w:val="24"/>
-              </w:rPr>
-              <w:t>Cumple</w:t>
-            </w:r>
-          </w:p>
-        </w:tc>
-      </w:tr>
-      <w:tr>
-        <w:trPr>
-          <w:cantSplit/>
-        </w:trPr>
-        <w:tc>
-          <w:tcPr>
-            <w:tcW w:type="dxa" w:w="2448"/>
-            <w:vAlign w:val="top"/>
-            <w:tcMar>
-              <w:top w:w="80" w:type="dxa"/>
-              <w:start w:w="110" w:type="dxa"/>
-              <w:bottom w:w="80" w:type="dxa"/>
-              <w:end w:w="110" w:type="dxa"/>
-            </w:tcMar>
-          </w:tcPr>
-          <w:p>
-            <w:pPr>
-              <w:spacing w:after="40"/>
-            </w:pPr>
-            <w:r>
-              <w:rPr>
-                <w:rFonts w:ascii="Arial" w:hAnsi="Arial" w:eastAsia="Arial" w:cs="Arial"/>
-                <w:color w:val="000000"/>
-                <w:sz w:val="24"/>
-              </w:rPr>
-              <w:t>Portabilidad</w:t>
-            </w:r>
-          </w:p>
-        </w:tc>
-        <w:tc>
-          <w:tcPr>
-            <w:tcW w:type="dxa" w:w="4608"/>
-            <w:vAlign w:val="top"/>
-            <w:tcMar>
-              <w:top w:w="80" w:type="dxa"/>
-              <w:start w:w="110" w:type="dxa"/>
-              <w:bottom w:w="80" w:type="dxa"/>
-              <w:end w:w="110" w:type="dxa"/>
-            </w:tcMar>
-          </w:tcPr>
-          <w:p>
-            <w:pPr>
-              <w:spacing w:after="40"/>
-            </w:pPr>
-            <w:r>
-              <w:rPr>
-                <w:rFonts w:ascii="Arial" w:hAnsi="Arial" w:eastAsia="Arial" w:cs="Arial"/>
-                <w:color w:val="000000"/>
-                <w:sz w:val="24"/>
-              </w:rPr>
-              <w:t>Rutas relativas y lanzador reproducible</w:t>
-            </w:r>
-          </w:p>
-        </w:tc>
-        <w:tc>
-          <w:tcPr>
-            <w:tcW w:type="dxa" w:w="2016"/>
-            <w:vAlign w:val="top"/>
-            <w:shd w:fill="E2F0D9"/>
-            <w:tcMar>
-              <w:top w:w="80" w:type="dxa"/>
-              <w:start w:w="110" w:type="dxa"/>
-              <w:bottom w:w="80" w:type="dxa"/>
-              <w:end w:w="110" w:type="dxa"/>
-            </w:tcMar>
-          </w:tcPr>
-          <w:p>
-            <w:pPr>
-              <w:spacing w:after="40"/>
-            </w:pPr>
-            <w:r>
-              <w:rPr>
-                <w:rFonts w:ascii="Arial" w:hAnsi="Arial" w:eastAsia="Arial" w:cs="Arial"/>
-                <w:color w:val="000000"/>
-                <w:sz w:val="24"/>
-              </w:rPr>
-              <w:t>Cumple</w:t>
-            </w:r>
-          </w:p>
-        </w:tc>
-      </w:tr>
-      <w:tr>
-        <w:trPr>
-          <w:cantSplit/>
-        </w:trPr>
-        <w:tc>
-          <w:tcPr>
-            <w:tcW w:type="dxa" w:w="2448"/>
-            <w:vAlign w:val="top"/>
-            <w:tcMar>
-              <w:top w:w="80" w:type="dxa"/>
-              <w:start w:w="110" w:type="dxa"/>
-              <w:bottom w:w="80" w:type="dxa"/>
-              <w:end w:w="110" w:type="dxa"/>
-            </w:tcMar>
-          </w:tcPr>
-          <w:p>
-            <w:pPr>
-              <w:spacing w:after="40"/>
-            </w:pPr>
-            <w:r>
-              <w:rPr>
-                <w:rFonts w:ascii="Arial" w:hAnsi="Arial" w:eastAsia="Arial" w:cs="Arial"/>
-                <w:color w:val="000000"/>
-                <w:sz w:val="24"/>
-              </w:rPr>
-              <w:t>Sensores</w:t>
-            </w:r>
-          </w:p>
-        </w:tc>
-        <w:tc>
-          <w:tcPr>
-            <w:tcW w:type="dxa" w:w="4608"/>
-            <w:vAlign w:val="top"/>
-            <w:tcMar>
-              <w:top w:w="80" w:type="dxa"/>
-              <w:start w:w="110" w:type="dxa"/>
-              <w:bottom w:w="80" w:type="dxa"/>
-              <w:end w:w="110" w:type="dxa"/>
-            </w:tcMar>
-          </w:tcPr>
-          <w:p>
-            <w:pPr>
-              <w:spacing w:after="40"/>
-            </w:pPr>
-            <w:r>
-              <w:rPr>
-                <w:rFonts w:ascii="Arial" w:hAnsi="Arial" w:eastAsia="Arial" w:cs="Arial"/>
-                <w:color w:val="000000"/>
-                <w:sz w:val="24"/>
-              </w:rPr>
-              <w:t>Recognition, LiDAR, radar, gyro, 3 laterales</w:t>
-            </w:r>
-          </w:p>
-        </w:tc>
-        <w:tc>
-          <w:tcPr>
-            <w:tcW w:type="dxa" w:w="2016"/>
-            <w:vAlign w:val="top"/>
-            <w:shd w:fill="E2F0D9"/>
-            <w:tcMar>
-              <w:top w:w="80" w:type="dxa"/>
-              <w:start w:w="110" w:type="dxa"/>
-              <w:bottom w:w="80" w:type="dxa"/>
-              <w:end w:w="110" w:type="dxa"/>
-            </w:tcMar>
-          </w:tcPr>
-          <w:p>
-            <w:pPr>
-              <w:spacing w:after="40"/>
-            </w:pPr>
-            <w:r>
-              <w:rPr>
-                <w:rFonts w:ascii="Arial" w:hAnsi="Arial" w:eastAsia="Arial" w:cs="Arial"/>
-                <w:color w:val="000000"/>
-                <w:sz w:val="24"/>
-              </w:rPr>
-              <w:t>Cumple</w:t>
-            </w:r>
-          </w:p>
-        </w:tc>
-      </w:tr>
-      <w:tr>
-        <w:trPr>
-          <w:cantSplit/>
-        </w:trPr>
-        <w:tc>
-          <w:tcPr>
-            <w:tcW w:type="dxa" w:w="2448"/>
-            <w:vAlign w:val="top"/>
-            <w:tcMar>
-              <w:top w:w="80" w:type="dxa"/>
-              <w:start w:w="110" w:type="dxa"/>
-              <w:bottom w:w="80" w:type="dxa"/>
-              <w:end w:w="110" w:type="dxa"/>
-            </w:tcMar>
-          </w:tcPr>
-          <w:p>
-            <w:pPr>
-              <w:spacing w:after="40"/>
-            </w:pPr>
-            <w:r>
-              <w:rPr>
-                <w:rFonts w:ascii="Arial" w:hAnsi="Arial" w:eastAsia="Arial" w:cs="Arial"/>
-                <w:color w:val="000000"/>
-                <w:sz w:val="24"/>
-              </w:rPr>
-              <w:t>Peatón</w:t>
-            </w:r>
-          </w:p>
-        </w:tc>
-        <w:tc>
-          <w:tcPr>
-            <w:tcW w:type="dxa" w:w="4608"/>
-            <w:vAlign w:val="top"/>
-            <w:tcMar>
-              <w:top w:w="80" w:type="dxa"/>
-              <w:start w:w="110" w:type="dxa"/>
-              <w:bottom w:w="80" w:type="dxa"/>
-              <w:end w:w="110" w:type="dxa"/>
-            </w:tcMar>
-          </w:tcPr>
-          <w:p>
-            <w:pPr>
-              <w:spacing w:after="40"/>
-            </w:pPr>
-            <w:r>
-              <w:rPr>
-                <w:rFonts w:ascii="Arial" w:hAnsi="Arial" w:eastAsia="Arial" w:cs="Arial"/>
-                <w:color w:val="000000"/>
-                <w:sz w:val="24"/>
-              </w:rPr>
-              <w:t>≤15 m, cámara + LiDAR, freno total</w:t>
-            </w:r>
-          </w:p>
-        </w:tc>
-        <w:tc>
-          <w:tcPr>
-            <w:tcW w:type="dxa" w:w="2016"/>
-            <w:vAlign w:val="top"/>
-            <w:shd w:fill="E2F0D9"/>
-            <w:tcMar>
-              <w:top w:w="80" w:type="dxa"/>
-              <w:start w:w="110" w:type="dxa"/>
-              <w:bottom w:w="80" w:type="dxa"/>
-              <w:end w:w="110" w:type="dxa"/>
-            </w:tcMar>
-          </w:tcPr>
-          <w:p>
-            <w:pPr>
-              <w:spacing w:after="40"/>
-            </w:pPr>
-            <w:r>
-              <w:rPr>
-                <w:rFonts w:ascii="Arial" w:hAnsi="Arial" w:eastAsia="Arial" w:cs="Arial"/>
-                <w:color w:val="000000"/>
-                <w:sz w:val="24"/>
-              </w:rPr>
-              <w:t>Cumple</w:t>
-            </w:r>
-          </w:p>
-        </w:tc>
-      </w:tr>
-      <w:tr>
-        <w:trPr>
-          <w:cantSplit/>
-        </w:trPr>
-        <w:tc>
-          <w:tcPr>
-            <w:tcW w:type="dxa" w:w="2448"/>
-            <w:vAlign w:val="top"/>
-            <w:tcMar>
-              <w:top w:w="80" w:type="dxa"/>
-              <w:start w:w="110" w:type="dxa"/>
-              <w:bottom w:w="80" w:type="dxa"/>
-              <w:end w:w="110" w:type="dxa"/>
-            </w:tcMar>
-          </w:tcPr>
-          <w:p>
-            <w:pPr>
-              <w:spacing w:after="40"/>
-            </w:pPr>
-            <w:r>
-              <w:rPr>
-                <w:rFonts w:ascii="Arial" w:hAnsi="Arial" w:eastAsia="Arial" w:cs="Arial"/>
-                <w:color w:val="000000"/>
-                <w:sz w:val="24"/>
-              </w:rPr>
-              <w:t>Control de distancia</w:t>
-            </w:r>
-          </w:p>
-        </w:tc>
-        <w:tc>
-          <w:tcPr>
-            <w:tcW w:type="dxa" w:w="4608"/>
-            <w:vAlign w:val="top"/>
-            <w:tcMar>
-              <w:top w:w="80" w:type="dxa"/>
-              <w:start w:w="110" w:type="dxa"/>
-              <w:bottom w:w="80" w:type="dxa"/>
-              <w:end w:w="110" w:type="dxa"/>
-            </w:tcMar>
-          </w:tcPr>
-          <w:p>
-            <w:pPr>
-              <w:spacing w:after="40"/>
-            </w:pPr>
-            <w:r>
-              <w:rPr>
-                <w:rFonts w:ascii="Arial" w:hAnsi="Arial" w:eastAsia="Arial" w:cs="Arial"/>
-                <w:color w:val="000000"/>
-                <w:sz w:val="24"/>
-              </w:rPr>
-              <w:t>25–12 m; alto ≤12; reanuda ≥15</w:t>
-            </w:r>
-          </w:p>
-        </w:tc>
-        <w:tc>
-          <w:tcPr>
-            <w:tcW w:type="dxa" w:w="2016"/>
-            <w:vAlign w:val="top"/>
-            <w:shd w:fill="E2F0D9"/>
-            <w:tcMar>
-              <w:top w:w="80" w:type="dxa"/>
-              <w:start w:w="110" w:type="dxa"/>
-              <w:bottom w:w="80" w:type="dxa"/>
-              <w:end w:w="110" w:type="dxa"/>
-            </w:tcMar>
-          </w:tcPr>
-          <w:p>
-            <w:pPr>
-              <w:spacing w:after="40"/>
-            </w:pPr>
-            <w:r>
-              <w:rPr>
-                <w:rFonts w:ascii="Arial" w:hAnsi="Arial" w:eastAsia="Arial" w:cs="Arial"/>
-                <w:color w:val="000000"/>
-                <w:sz w:val="24"/>
-              </w:rPr>
-              <w:t>Cumple</w:t>
-            </w:r>
-          </w:p>
-        </w:tc>
-      </w:tr>
-      <w:tr>
-        <w:trPr>
-          <w:cantSplit/>
-        </w:trPr>
-        <w:tc>
-          <w:tcPr>
-            <w:tcW w:type="dxa" w:w="2448"/>
-            <w:vAlign w:val="top"/>
-            <w:tcMar>
-              <w:top w:w="80" w:type="dxa"/>
-              <w:start w:w="110" w:type="dxa"/>
-              <w:bottom w:w="80" w:type="dxa"/>
-              <w:end w:w="110" w:type="dxa"/>
-            </w:tcMar>
-          </w:tcPr>
-          <w:p>
-            <w:pPr>
-              <w:spacing w:after="40"/>
-            </w:pPr>
-            <w:r>
-              <w:rPr>
-                <w:rFonts w:ascii="Arial" w:hAnsi="Arial" w:eastAsia="Arial" w:cs="Arial"/>
-                <w:color w:val="000000"/>
-                <w:sz w:val="24"/>
-              </w:rPr>
-              <w:t>Autobús</w:t>
-            </w:r>
-          </w:p>
-        </w:tc>
-        <w:tc>
-          <w:tcPr>
-            <w:tcW w:type="dxa" w:w="4608"/>
-            <w:vAlign w:val="top"/>
-            <w:tcMar>
-              <w:top w:w="80" w:type="dxa"/>
-              <w:start w:w="110" w:type="dxa"/>
-              <w:bottom w:w="80" w:type="dxa"/>
-              <w:end w:w="110" w:type="dxa"/>
-            </w:tcMar>
-          </w:tcPr>
-          <w:p>
-            <w:pPr>
-              <w:spacing w:after="40"/>
-            </w:pPr>
-            <w:r>
-              <w:rPr>
-                <w:rFonts w:ascii="Arial" w:hAnsi="Arial" w:eastAsia="Arial" w:cs="Arial"/>
-                <w:color w:val="000000"/>
-                <w:sz w:val="24"/>
-              </w:rPr>
-              <w:t>≤26 m + FSM de evasión y retorno de carril</w:t>
-            </w:r>
-          </w:p>
-        </w:tc>
-        <w:tc>
-          <w:tcPr>
-            <w:tcW w:type="dxa" w:w="2016"/>
-            <w:vAlign w:val="top"/>
-            <w:shd w:fill="E2F0D9"/>
-            <w:tcMar>
-              <w:top w:w="80" w:type="dxa"/>
-              <w:start w:w="110" w:type="dxa"/>
-              <w:bottom w:w="80" w:type="dxa"/>
-              <w:end w:w="110" w:type="dxa"/>
-            </w:tcMar>
-          </w:tcPr>
-          <w:p>
-            <w:pPr>
-              <w:spacing w:after="40"/>
-            </w:pPr>
-            <w:r>
-              <w:rPr>
-                <w:rFonts w:ascii="Arial" w:hAnsi="Arial" w:eastAsia="Arial" w:cs="Arial"/>
-                <w:color w:val="000000"/>
-                <w:sz w:val="24"/>
-              </w:rPr>
-              <w:t>Cumple</w:t>
-            </w:r>
-          </w:p>
-        </w:tc>
-      </w:tr>
-      <w:tr>
-        <w:trPr>
-          <w:cantSplit/>
-        </w:trPr>
-        <w:tc>
-          <w:tcPr>
-            <w:tcW w:type="dxa" w:w="2448"/>
-            <w:vAlign w:val="top"/>
-            <w:tcMar>
-              <w:top w:w="80" w:type="dxa"/>
-              <w:start w:w="110" w:type="dxa"/>
-              <w:bottom w:w="80" w:type="dxa"/>
-              <w:end w:w="110" w:type="dxa"/>
-            </w:tcMar>
-          </w:tcPr>
-          <w:p>
-            <w:pPr>
-              <w:spacing w:after="40"/>
-            </w:pPr>
-            <w:r>
-              <w:rPr>
-                <w:rFonts w:ascii="Arial" w:hAnsi="Arial" w:eastAsia="Arial" w:cs="Arial"/>
-                <w:color w:val="000000"/>
-                <w:sz w:val="24"/>
-              </w:rPr>
-              <w:t>SUMO</w:t>
-            </w:r>
-          </w:p>
-        </w:tc>
-        <w:tc>
-          <w:tcPr>
-            <w:tcW w:type="dxa" w:w="4608"/>
-            <w:vAlign w:val="top"/>
-            <w:tcMar>
-              <w:top w:w="80" w:type="dxa"/>
-              <w:start w:w="110" w:type="dxa"/>
-              <w:bottom w:w="80" w:type="dxa"/>
-              <w:end w:w="110" w:type="dxa"/>
-            </w:tcMar>
-          </w:tcPr>
-          <w:p>
-            <w:pPr>
-              <w:spacing w:after="40"/>
-            </w:pPr>
-            <w:r>
-              <w:rPr>
-                <w:rFonts w:ascii="Arial" w:hAnsi="Arial" w:eastAsia="Arial" w:cs="Arial"/>
-                <w:color w:val="000000"/>
-                <w:sz w:val="24"/>
-              </w:rPr>
-              <w:t>maxVehicles 30</w:t>
-            </w:r>
-          </w:p>
-        </w:tc>
-        <w:tc>
-          <w:tcPr>
-            <w:tcW w:type="dxa" w:w="2016"/>
-            <w:vAlign w:val="top"/>
-            <w:shd w:fill="E2F0D9"/>
-            <w:tcMar>
-              <w:top w:w="80" w:type="dxa"/>
-              <w:start w:w="110" w:type="dxa"/>
-              <w:bottom w:w="80" w:type="dxa"/>
-              <w:end w:w="110" w:type="dxa"/>
-            </w:tcMar>
-          </w:tcPr>
-          <w:p>
-            <w:pPr>
-              <w:spacing w:after="40"/>
-            </w:pPr>
-            <w:r>
-              <w:rPr>
-                <w:rFonts w:ascii="Arial" w:hAnsi="Arial" w:eastAsia="Arial" w:cs="Arial"/>
-                <w:color w:val="000000"/>
-                <w:sz w:val="24"/>
-              </w:rPr>
-              <w:t>Cumple</w:t>
-            </w:r>
-          </w:p>
-        </w:tc>
-      </w:tr>
-      <w:tr>
-        <w:trPr>
-          <w:cantSplit/>
-        </w:trPr>
-        <w:tc>
-          <w:tcPr>
-            <w:tcW w:type="dxa" w:w="2448"/>
-            <w:vAlign w:val="top"/>
-            <w:tcMar>
-              <w:top w:w="80" w:type="dxa"/>
-              <w:start w:w="110" w:type="dxa"/>
-              <w:bottom w:w="80" w:type="dxa"/>
-              <w:end w:w="110" w:type="dxa"/>
-            </w:tcMar>
-          </w:tcPr>
-          <w:p>
-            <w:pPr>
-              <w:spacing w:after="40"/>
-            </w:pPr>
-            <w:r>
-              <w:rPr>
-                <w:rFonts w:ascii="Arial" w:hAnsi="Arial" w:eastAsia="Arial" w:cs="Arial"/>
-                <w:color w:val="000000"/>
-                <w:sz w:val="24"/>
-              </w:rPr>
-              <w:t>Tres rutas</w:t>
-            </w:r>
-          </w:p>
-        </w:tc>
-        <w:tc>
-          <w:tcPr>
-            <w:tcW w:type="dxa" w:w="4608"/>
-            <w:vAlign w:val="top"/>
-            <w:tcMar>
-              <w:top w:w="80" w:type="dxa"/>
-              <w:start w:w="110" w:type="dxa"/>
-              <w:bottom w:w="80" w:type="dxa"/>
-              <w:end w:w="110" w:type="dxa"/>
-            </w:tcMar>
-          </w:tcPr>
-          <w:p>
-            <w:pPr>
-              <w:spacing w:after="40"/>
-            </w:pPr>
-            <w:r>
-              <w:rPr>
-                <w:rFonts w:ascii="Arial" w:hAnsi="Arial" w:eastAsia="Arial" w:cs="Arial"/>
-                <w:color w:val="000000"/>
-                <w:sz w:val="24"/>
-              </w:rPr>
-              <w:t>Presets, logs y clips completos</w:t>
-            </w:r>
-          </w:p>
-        </w:tc>
-        <w:tc>
-          <w:tcPr>
-            <w:tcW w:type="dxa" w:w="2016"/>
-            <w:vAlign w:val="top"/>
-            <w:shd w:fill="E2F0D9"/>
-            <w:tcMar>
-              <w:top w:w="80" w:type="dxa"/>
-              <w:start w:w="110" w:type="dxa"/>
-              <w:bottom w:w="80" w:type="dxa"/>
-              <w:end w:w="110" w:type="dxa"/>
-            </w:tcMar>
-          </w:tcPr>
-          <w:p>
-            <w:pPr>
-              <w:spacing w:after="40"/>
-            </w:pPr>
-            <w:r>
-              <w:rPr>
-                <w:rFonts w:ascii="Arial" w:hAnsi="Arial" w:eastAsia="Arial" w:cs="Arial"/>
-                <w:color w:val="000000"/>
-                <w:sz w:val="24"/>
-              </w:rPr>
-              <w:t>Cumple</w:t>
-            </w:r>
-          </w:p>
-        </w:tc>
-      </w:tr>
-      <w:tr>
-        <w:trPr>
-          <w:cantSplit/>
-        </w:trPr>
-        <w:tc>
-          <w:tcPr>
-            <w:tcW w:type="dxa" w:w="2448"/>
-            <w:vAlign w:val="top"/>
-            <w:tcMar>
-              <w:top w:w="80" w:type="dxa"/>
-              <w:start w:w="110" w:type="dxa"/>
-              <w:bottom w:w="80" w:type="dxa"/>
-              <w:end w:w="110" w:type="dxa"/>
-            </w:tcMar>
-          </w:tcPr>
-          <w:p>
-            <w:pPr>
-              <w:spacing w:after="40"/>
-            </w:pPr>
-            <w:r>
-              <w:rPr>
-                <w:rFonts w:ascii="Arial" w:hAnsi="Arial" w:eastAsia="Arial" w:cs="Arial"/>
-                <w:color w:val="000000"/>
-                <w:sz w:val="24"/>
-              </w:rPr>
-              <w:t>Recorridos completos</w:t>
-            </w:r>
-          </w:p>
-        </w:tc>
-        <w:tc>
-          <w:tcPr>
-            <w:tcW w:type="dxa" w:w="4608"/>
-            <w:vAlign w:val="top"/>
-            <w:tcMar>
-              <w:top w:w="80" w:type="dxa"/>
-              <w:start w:w="110" w:type="dxa"/>
-              <w:bottom w:w="80" w:type="dxa"/>
-              <w:end w:w="110" w:type="dxa"/>
-            </w:tcMar>
-          </w:tcPr>
-          <w:p>
-            <w:pPr>
-              <w:spacing w:after="40"/>
-            </w:pPr>
-            <w:r>
-              <w:rPr>
-                <w:rFonts w:ascii="Arial" w:hAnsi="Arial" w:eastAsia="Arial" w:cs="Arial"/>
-                <w:color w:val="000000"/>
-                <w:sz w:val="24"/>
-              </w:rPr>
-              <w:t>Dos recorridos limpios por ruta</w:t>
-            </w:r>
-          </w:p>
-        </w:tc>
-        <w:tc>
-          <w:tcPr>
-            <w:tcW w:type="dxa" w:w="2016"/>
-            <w:vAlign w:val="top"/>
-            <w:shd w:fill="E2F0D9"/>
-            <w:tcMar>
-              <w:top w:w="80" w:type="dxa"/>
-              <w:start w:w="110" w:type="dxa"/>
-              <w:bottom w:w="80" w:type="dxa"/>
-              <w:end w:w="110" w:type="dxa"/>
-            </w:tcMar>
-          </w:tcPr>
-          <w:p>
-            <w:pPr>
-              <w:spacing w:after="40"/>
-            </w:pPr>
-            <w:r>
-              <w:rPr>
-                <w:rFonts w:ascii="Arial" w:hAnsi="Arial" w:eastAsia="Arial" w:cs="Arial"/>
-                <w:color w:val="000000"/>
-                <w:sz w:val="24"/>
-              </w:rPr>
-              <w:t>Cumple</w:t>
-            </w:r>
-          </w:p>
-        </w:tc>
-      </w:tr>
-      <w:tr>
-        <w:trPr>
-          <w:cantSplit/>
-        </w:trPr>
-        <w:tc>
-          <w:tcPr>
-            <w:tcW w:type="dxa" w:w="2448"/>
-            <w:vAlign w:val="top"/>
-            <w:tcMar>
-              <w:top w:w="80" w:type="dxa"/>
-              <w:start w:w="110" w:type="dxa"/>
-              <w:bottom w:w="80" w:type="dxa"/>
-              <w:end w:w="110" w:type="dxa"/>
-            </w:tcMar>
-          </w:tcPr>
-          <w:p>
-            <w:pPr>
-              <w:spacing w:after="40"/>
-            </w:pPr>
-            <w:r>
-              <w:rPr>
-                <w:rFonts w:ascii="Arial" w:hAnsi="Arial" w:eastAsia="Arial" w:cs="Arial"/>
-                <w:color w:val="000000"/>
-                <w:sz w:val="24"/>
-              </w:rPr>
-              <w:t>Reporte</w:t>
-            </w:r>
-          </w:p>
-        </w:tc>
-        <w:tc>
-          <w:tcPr>
-            <w:tcW w:type="dxa" w:w="4608"/>
-            <w:vAlign w:val="top"/>
-            <w:tcMar>
-              <w:top w:w="80" w:type="dxa"/>
-              <w:start w:w="110" w:type="dxa"/>
-              <w:bottom w:w="80" w:type="dxa"/>
-              <w:end w:w="110" w:type="dxa"/>
-            </w:tcMar>
-          </w:tcPr>
-          <w:p>
-            <w:pPr>
-              <w:spacing w:after="40"/>
-            </w:pPr>
-            <w:r>
-              <w:rPr>
-                <w:rFonts w:ascii="Arial" w:hAnsi="Arial" w:eastAsia="Arial" w:cs="Arial"/>
-                <w:color w:val="000000"/>
-                <w:sz w:val="24"/>
-              </w:rPr>
-              <w:t>Español, anexos completos, figuras reales</w:t>
-            </w:r>
-          </w:p>
-        </w:tc>
-        <w:tc>
-          <w:tcPr>
-            <w:tcW w:type="dxa" w:w="2016"/>
-            <w:vAlign w:val="top"/>
-            <w:shd w:fill="E2F0D9"/>
-            <w:tcMar>
-              <w:top w:w="80" w:type="dxa"/>
-              <w:start w:w="110" w:type="dxa"/>
-              <w:bottom w:w="80" w:type="dxa"/>
-              <w:end w:w="110" w:type="dxa"/>
-            </w:tcMar>
-          </w:tcPr>
-          <w:p>
-            <w:pPr>
-              <w:spacing w:after="40"/>
-            </w:pPr>
-            <w:r>
-              <w:rPr>
-                <w:rFonts w:ascii="Arial" w:hAnsi="Arial" w:eastAsia="Arial" w:cs="Arial"/>
-                <w:color w:val="000000"/>
-                <w:sz w:val="24"/>
-              </w:rPr>
-              <w:t>Cumple</w:t>
-            </w:r>
-          </w:p>
-        </w:tc>
-      </w:tr>
-      <w:tr>
-        <w:trPr>
-          <w:cantSplit/>
-        </w:trPr>
-        <w:tc>
-          <w:tcPr>
-            <w:tcW w:type="dxa" w:w="2448"/>
-            <w:vAlign w:val="top"/>
-            <w:tcMar>
-              <w:top w:w="80" w:type="dxa"/>
-              <w:start w:w="110" w:type="dxa"/>
-              <w:bottom w:w="80" w:type="dxa"/>
-              <w:end w:w="110" w:type="dxa"/>
-            </w:tcMar>
-          </w:tcPr>
-          <w:p>
-            <w:pPr>
-              <w:spacing w:after="40"/>
-            </w:pPr>
-            <w:r>
-              <w:rPr>
-                <w:rFonts w:ascii="Arial" w:hAnsi="Arial" w:eastAsia="Arial" w:cs="Arial"/>
-                <w:color w:val="000000"/>
-                <w:sz w:val="24"/>
-              </w:rPr>
-              <w:t>Video</w:t>
-            </w:r>
-          </w:p>
-        </w:tc>
-        <w:tc>
-          <w:tcPr>
-            <w:tcW w:type="dxa" w:w="4608"/>
-            <w:vAlign w:val="top"/>
-            <w:tcMar>
-              <w:top w:w="80" w:type="dxa"/>
-              <w:start w:w="110" w:type="dxa"/>
-              <w:bottom w:w="80" w:type="dxa"/>
-              <w:end w:w="110" w:type="dxa"/>
-            </w:tcMar>
-          </w:tcPr>
-          <w:p>
-            <w:pPr>
-              <w:spacing w:after="40"/>
-            </w:pPr>
-            <w:r>
-              <w:rPr>
-                <w:rFonts w:ascii="Arial" w:hAnsi="Arial" w:eastAsia="Arial" w:cs="Arial"/>
-                <w:color w:val="000000"/>
-                <w:sz w:val="24"/>
-              </w:rPr>
-              <w:t>Guion 5:35, cuatro integrantes</w:t>
-            </w:r>
-          </w:p>
-        </w:tc>
-        <w:tc>
-          <w:tcPr>
-            <w:tcW w:type="dxa" w:w="2016"/>
-            <w:vAlign w:val="top"/>
-            <w:shd w:fill="E2F0D9"/>
-            <w:tcMar>
-              <w:top w:w="80" w:type="dxa"/>
-              <w:start w:w="110" w:type="dxa"/>
-              <w:bottom w:w="80" w:type="dxa"/>
-              <w:end w:w="110" w:type="dxa"/>
-            </w:tcMar>
-          </w:tcPr>
-          <w:p>
-            <w:pPr>
-              <w:spacing w:after="40"/>
-            </w:pPr>
-            <w:r>
-              <w:rPr>
-                <w:rFonts w:ascii="Arial" w:hAnsi="Arial" w:eastAsia="Arial" w:cs="Arial"/>
-                <w:color w:val="000000"/>
-                <w:sz w:val="24"/>
-              </w:rPr>
-              <w:t>Guion cumple; grabación pendiente</w:t>
-            </w:r>
-          </w:p>
-        </w:tc>
-      </w:tr>
-      <w:tr>
-        <w:trPr>
-          <w:cantSplit/>
-        </w:trPr>
-        <w:tc>
-          <w:tcPr>
-            <w:tcW w:type="dxa" w:w="2448"/>
-            <w:vAlign w:val="top"/>
-            <w:tcMar>
-              <w:top w:w="80" w:type="dxa"/>
-              <w:start w:w="110" w:type="dxa"/>
-              <w:bottom w:w="80" w:type="dxa"/>
-              <w:end w:w="110" w:type="dxa"/>
-            </w:tcMar>
-          </w:tcPr>
-          <w:p>
-            <w:pPr>
-              <w:spacing w:after="40"/>
-            </w:pPr>
-            <w:r>
-              <w:rPr>
-                <w:rFonts w:ascii="Arial" w:hAnsi="Arial" w:eastAsia="Arial" w:cs="Arial"/>
-                <w:color w:val="000000"/>
-                <w:sz w:val="24"/>
-              </w:rPr>
-              <w:t>YouTube</w:t>
-            </w:r>
-          </w:p>
-        </w:tc>
-        <w:tc>
-          <w:tcPr>
-            <w:tcW w:type="dxa" w:w="4608"/>
-            <w:vAlign w:val="top"/>
-            <w:tcMar>
-              <w:top w:w="80" w:type="dxa"/>
-              <w:start w:w="110" w:type="dxa"/>
-              <w:bottom w:w="80" w:type="dxa"/>
-              <w:end w:w="110" w:type="dxa"/>
-            </w:tcMar>
-          </w:tcPr>
-          <w:p>
-            <w:pPr>
-              <w:spacing w:after="40"/>
-            </w:pPr>
-            <w:r>
-              <w:rPr>
-                <w:rFonts w:ascii="Arial" w:hAnsi="Arial" w:eastAsia="Arial" w:cs="Arial"/>
-                <w:color w:val="000000"/>
-                <w:sz w:val="24"/>
-              </w:rPr>
-              <w:t>URL pública real</w:t>
-            </w:r>
-          </w:p>
-        </w:tc>
-        <w:tc>
-          <w:tcPr>
-            <w:tcW w:type="dxa" w:w="2016"/>
-            <w:vAlign w:val="top"/>
-            <w:shd w:fill="FFF2CC"/>
-            <w:tcMar>
-              <w:top w:w="80" w:type="dxa"/>
-              <w:start w:w="110" w:type="dxa"/>
-              <w:bottom w:w="80" w:type="dxa"/>
-              <w:end w:w="110" w:type="dxa"/>
-            </w:tcMar>
-          </w:tcPr>
-          <w:p>
-            <w:pPr>
-              <w:spacing w:after="40"/>
-            </w:pPr>
-            <w:r>
-              <w:rPr>
-                <w:rFonts w:ascii="Arial" w:hAnsi="Arial" w:eastAsia="Arial" w:cs="Arial"/>
-                <w:color w:val="000000"/>
-                <w:sz w:val="24"/>
-              </w:rPr>
-              <w:t>Pendiente de publicación</w:t>
-            </w:r>
-          </w:p>
-        </w:tc>
-      </w:tr>
-    </w:tbl>
-    <w:p>
-      <w:pPr>
-        <w:spacing w:after="0"/>
-      </w:pPr>
     </w:p>
     <w:p>
       <w:pPr>
@@ -7419,10 +5087,20 @@
         <w:br/>
         <w:t>WALL_PRESENT_DISTANCE_M = 3.7</w:t>
         <w:br/>
-        <w:t>WALL_TARGET_DISTANCE_M = 1.7</w:t>
+        <w:t>WALL_TARGET_DISTANCE_M = 1.0</w:t>
         <w:br/>
         <w:t>WALL_LOST_STEPS_REQUIRED = 12</w:t>
         <w:br/>
+        <w:t>BUS_PASS_TARGET_Y = 233.2</w:t>
+        <w:br/>
+        <w:t>BUS_SEPARATOR_GUARD_Y = 232.6</w:t>
+        <w:br/>
+        <w:t>BUS_NORMAL_LANE_Y = 236.4</w:t>
+        <w:br/>
+        <w:t>BUS_SEPARATION_STEERING_RAD = -0.24</w:t>
+        <w:br/>
+        <w:t>BUS_MAX_SEPARATION_HEADING_RAD = 0.30</w:t>
+        <w:br/>
         <w:t>MAX_STEERING_STEP_RAD = 0.035</w:t>
         <w:br/>
         <w:t>INFERENCE_INTERVAL_STEPS = 4</w:t>
@@ -7446,13 +5124,6 @@
         <w:t xml:space="preserve">    RECOVER_HEADING = "RECUPERA_ORIENTACION"</w:t>
         <w:br/>
         <w:t xml:space="preserve">    REJOIN = "REINCORPORACION"</w:t>
-        <w:br/>
-        <w:br/>
-        <w:br/>
-        <w:t>def clamp(value: float, minimum: float, maximum: float) -&gt; float:</w:t>
-        <w:br/>
-        <w:t xml:space="preserve">    return max(minimum, min(maximum, value))</w:t>
-        <w:br/>
         <w:br/>
       </w:r>
     </w:p>
@@ -7469,6 +5140,13 @@
           <w:color w:val="000000"/>
           <w:sz w:val="13"/>
         </w:rPr>
+        <w:br/>
+        <w:t>def clamp(value: float, minimum: float, maximum: float) -&gt; float:</w:t>
+        <w:br/>
+        <w:t xml:space="preserve">    return max(minimum, min(maximum, value))</w:t>
+        <w:br/>
+        <w:br/>
+        <w:br/>
         <w:t>def command_to_one_hot(command: int) -&gt; np.ndarray:</w:t>
         <w:br/>
         <w:t xml:space="preserve">    """Encode one validated command for the model's second input."""</w:t>
@@ -7516,16 +5194,6 @@
         <w:br/>
         <w:br/>
         <w:t>def adaptive_follow_speed(distance_m: float) -&gt; float:</w:t>
-        <w:br/>
-        <w:t xml:space="preserve">    """Map radar distance to a safe target speed with a 12 m stop threshold."""</w:t>
-        <w:br/>
-        <w:t xml:space="preserve">    if not math.isfinite(distance_m) or distance_m &gt;= FOLLOW_CONTROL_DISTANCE_M:</w:t>
-        <w:br/>
-        <w:t xml:space="preserve">        return EVALUATION_SPEED_KMH</w:t>
-        <w:br/>
-        <w:t xml:space="preserve">    if distance_m &lt;= FOLLOW_STOP_DISTANCE_M:</w:t>
-        <w:br/>
-        <w:t xml:space="preserve">        return 0.0</w:t>
       </w:r>
     </w:p>
     <w:p>
@@ -7541,6 +5209,16 @@
           <w:color w:val="000000"/>
           <w:sz w:val="13"/>
         </w:rPr>
+        <w:t xml:space="preserve">    """Map radar distance to a safe target speed with a 12 m stop threshold."""</w:t>
+        <w:br/>
+        <w:t xml:space="preserve">    if not math.isfinite(distance_m) or distance_m &gt;= FOLLOW_CONTROL_DISTANCE_M:</w:t>
+        <w:br/>
+        <w:t xml:space="preserve">        return EVALUATION_SPEED_KMH</w:t>
+        <w:br/>
+        <w:t xml:space="preserve">    if distance_m &lt;= FOLLOW_STOP_DISTANCE_M:</w:t>
+        <w:br/>
+        <w:t xml:space="preserve">        return 0.0</w:t>
+        <w:br/>
         <w:t xml:space="preserve">    ratio = (distance_m - FOLLOW_STOP_DISTANCE_M) / (</w:t>
         <w:br/>
         <w:t xml:space="preserve">        FOLLOW_CONTROL_DISTANCE_M - FOLLOW_STOP_DISTANCE_M</w:t>
@@ -7590,16 +5268,6 @@
         <w:t xml:space="preserve">    """Refuerza un único giro de ruta; fuera del cruce conserva la salida CIL."""</w:t>
         <w:br/>
         <w:t xml:space="preserve">    if completed:</w:t>
-        <w:br/>
-        <w:t xml:space="preserve">        return None, False, True, None</w:t>
-        <w:br/>
-        <w:t xml:space="preserve">    if route == "left":</w:t>
-        <w:br/>
-        <w:t xml:space="preserve">        # Enter deeper into the junction before steering so the exit arc lands</w:t>
-        <w:br/>
-        <w:t xml:space="preserve">        # in the eastbound right lane instead of the opposing westbound lane.</w:t>
-        <w:br/>
-        <w:t xml:space="preserve">        turning = turning or (y &lt;= 49.0 and x &lt; 5.0)</w:t>
       </w:r>
     </w:p>
     <w:p>
@@ -7615,6 +5283,16 @@
           <w:color w:val="000000"/>
           <w:sz w:val="13"/>
         </w:rPr>
+        <w:t xml:space="preserve">        return None, False, True, None</w:t>
+        <w:br/>
+        <w:t xml:space="preserve">    if route == "left":</w:t>
+        <w:br/>
+        <w:t xml:space="preserve">        # Enter deeper into the junction before steering so the exit arc lands</w:t>
+        <w:br/>
+        <w:t xml:space="preserve">        # in the eastbound right lane instead of the opposing westbound lane.</w:t>
+        <w:br/>
+        <w:t xml:space="preserve">        turning = turning or (y &lt;= 49.0 and x &lt; 5.0)</w:t>
+        <w:br/>
         <w:t xml:space="preserve">        if turning and heading &gt;= 1.30:</w:t>
         <w:br/>
         <w:t xml:space="preserve">            return None, False, True, STRAIGHT</w:t>
@@ -7664,16 +5342,6 @@
         <w:t xml:space="preserve">    if route != "straight" and not turn_completed:</w:t>
         <w:br/>
         <w:t xml:space="preserve">        return None</w:t>
-        <w:br/>
-        <w:t xml:space="preserve">    target = {</w:t>
-        <w:br/>
-        <w:t xml:space="preserve">        "straight": 0.0,</w:t>
-        <w:br/>
-        <w:t xml:space="preserve">        "left": math.pi / 2.0,</w:t>
-        <w:br/>
-        <w:t xml:space="preserve">        "right": -math.pi / 2.0,</w:t>
-        <w:br/>
-        <w:t xml:space="preserve">    }.get(route)</w:t>
       </w:r>
     </w:p>
     <w:p>
@@ -7689,6 +5357,16 @@
           <w:color w:val="000000"/>
           <w:sz w:val="13"/>
         </w:rPr>
+        <w:t xml:space="preserve">    target = {</w:t>
+        <w:br/>
+        <w:t xml:space="preserve">        "straight": 0.0,</w:t>
+        <w:br/>
+        <w:t xml:space="preserve">        "left": math.pi / 2.0,</w:t>
+        <w:br/>
+        <w:t xml:space="preserve">        "right": -math.pi / 2.0,</w:t>
+        <w:br/>
+        <w:t xml:space="preserve">    }.get(route)</w:t>
+        <w:br/>
         <w:t xml:space="preserve">    if target is None:</w:t>
         <w:br/>
         <w:t xml:space="preserve">        return None</w:t>
@@ -7721,23 +5399,7 @@
         <w:br/>
         <w:t xml:space="preserve">    if route == "straight":</w:t>
         <w:br/>
-        <w:t xml:space="preserve">        # Westbound right lane is north of the center line.  After passing the</w:t>
-        <w:br/>
-        <w:t xml:space="preserve">        # bus, actively return from the temporary opposing-lane excursion.</w:t>
-        <w:br/>
-        <w:t xml:space="preserve">        if y &lt; 235.8:</w:t>
-        <w:br/>
-        <w:t xml:space="preserve">            target_heading = -0.30</w:t>
-        <w:br/>
-        <w:t xml:space="preserve">        elif y &gt; 237.0:</w:t>
-        <w:br/>
-        <w:t xml:space="preserve">            target_heading = 0.20</w:t>
-        <w:br/>
-        <w:t xml:space="preserve">        else:</w:t>
-        <w:br/>
-        <w:t xml:space="preserve">            target_heading = 0.0</w:t>
-        <w:br/>
-        <w:t xml:space="preserve">        return clamp(0.90 * (heading - target_heading), -0.24, 0.24)</w:t>
+        <w:t xml:space="preserve">        return straight_lane_keeping_steering(y, heading)</w:t>
         <w:br/>
         <w:t xml:space="preserve">    if route == "left":</w:t>
         <w:br/>
@@ -7748,6 +5410,12 @@
         <w:br/>
         <w:br/>
         <w:t>def route_signal_stop_required(</w:t>
+        <w:br/>
+        <w:t xml:space="preserve">    route: str,</w:t>
+        <w:br/>
+        <w:t xml:space="preserve">    x: float,</w:t>
+        <w:br/>
+        <w:t xml:space="preserve">    y: float,</w:t>
       </w:r>
     </w:p>
     <w:p>
@@ -7763,65 +5431,65 @@
           <w:color w:val="000000"/>
           <w:sz w:val="13"/>
         </w:rPr>
+        <w:t xml:space="preserve">    turning: bool,</w:t>
+        <w:br/>
+        <w:t xml:space="preserve">    completed: bool,</w:t>
+        <w:br/>
+        <w:t xml:space="preserve">    released: bool,</w:t>
+        <w:br/>
+        <w:t>) -&gt; bool:</w:t>
+        <w:br/>
+        <w:t xml:space="preserve">    """Hold the right-route vehicle at its stop line before entering the junction."""</w:t>
+        <w:br/>
+        <w:t xml:space="preserve">    return (</w:t>
+        <w:br/>
+        <w:t xml:space="preserve">        route == "right"</w:t>
+        <w:br/>
+        <w:t xml:space="preserve">        and not turning</w:t>
+        <w:br/>
+        <w:t xml:space="preserve">        and not completed</w:t>
+        <w:br/>
+        <w:t xml:space="preserve">        and not released</w:t>
+        <w:br/>
+        <w:t xml:space="preserve">        and 35.0 &lt;= x &lt;= 45.0</w:t>
+        <w:br/>
+        <w:t xml:space="preserve">        and -40.0 &lt; y &lt;= -28.0</w:t>
+        <w:br/>
+        <w:t xml:space="preserve">    )</w:t>
+        <w:br/>
+        <w:br/>
+        <w:br/>
+        <w:t>def right_signal_is_green(simulation_time: float) -&gt; bool:</w:t>
+        <w:br/>
+        <w:t xml:space="preserve">    """Match the north/south straight-right phase of CrossRoadsTrafficLight."""</w:t>
+        <w:br/>
+        <w:t xml:space="preserve">    phase = simulation_time % RIGHT_SIGNAL_CYCLE_SECONDS</w:t>
+        <w:br/>
+        <w:t xml:space="preserve">    return 9.984 &lt;= phase &lt; 17.984</w:t>
+        <w:br/>
+        <w:br/>
+        <w:br/>
+        <w:t>def route_approach_assist(</w:t>
+        <w:br/>
         <w:t xml:space="preserve">    route: str,</w:t>
         <w:br/>
         <w:t xml:space="preserve">    x: float,</w:t>
         <w:br/>
         <w:t xml:space="preserve">    y: float,</w:t>
         <w:br/>
+        <w:t xml:space="preserve">    heading: float,</w:t>
+        <w:br/>
         <w:t xml:space="preserve">    turning: bool,</w:t>
         <w:br/>
         <w:t xml:space="preserve">    completed: bool,</w:t>
         <w:br/>
-        <w:t xml:space="preserve">    released: bool,</w:t>
-        <w:br/>
-        <w:t>) -&gt; bool:</w:t>
-        <w:br/>
-        <w:t xml:space="preserve">    """Hold the right-route vehicle at its stop line before entering the junction."""</w:t>
-        <w:br/>
-        <w:t xml:space="preserve">    return (</w:t>
-        <w:br/>
-        <w:t xml:space="preserve">        route == "right"</w:t>
-        <w:br/>
-        <w:t xml:space="preserve">        and not turning</w:t>
-        <w:br/>
-        <w:t xml:space="preserve">        and not completed</w:t>
-        <w:br/>
-        <w:t xml:space="preserve">        and not released</w:t>
-        <w:br/>
-        <w:t xml:space="preserve">        and 35.0 &lt;= x &lt;= 45.0</w:t>
-        <w:br/>
-        <w:t xml:space="preserve">        and -40.0 &lt; y &lt;= -28.0</w:t>
-        <w:br/>
-        <w:t xml:space="preserve">    )</w:t>
-        <w:br/>
-        <w:br/>
-        <w:br/>
-        <w:t>def right_signal_is_green(simulation_time: float) -&gt; bool:</w:t>
-        <w:br/>
-        <w:t xml:space="preserve">    """Match the north/south straight-right phase of CrossRoadsTrafficLight."""</w:t>
-        <w:br/>
-        <w:t xml:space="preserve">    phase = simulation_time % RIGHT_SIGNAL_CYCLE_SECONDS</w:t>
-        <w:br/>
-        <w:t xml:space="preserve">    return 9.984 &lt;= phase &lt; 17.984</w:t>
-        <w:br/>
-        <w:br/>
-        <w:br/>
-        <w:t>def route_approach_assist(</w:t>
-        <w:br/>
-        <w:t xml:space="preserve">    route: str,</w:t>
-        <w:br/>
-        <w:t xml:space="preserve">    x: float,</w:t>
-        <w:br/>
-        <w:t xml:space="preserve">    y: float,</w:t>
-        <w:br/>
-        <w:t xml:space="preserve">    heading: float,</w:t>
-        <w:br/>
-        <w:t xml:space="preserve">    turning: bool,</w:t>
-        <w:br/>
-        <w:t xml:space="preserve">    completed: bool,</w:t>
-        <w:br/>
         <w:t>) -&gt; float | None:</w:t>
+        <w:br/>
+        <w:t xml:space="preserve">    """Centra el auto en el carril antes del giro para entrar desde la geometria correcta."""</w:t>
+        <w:br/>
+        <w:t xml:space="preserve">    if turning or completed:</w:t>
+        <w:br/>
+        <w:t xml:space="preserve">        return None</w:t>
       </w:r>
     </w:p>
     <w:p>
@@ -7837,26 +5505,20 @@
           <w:color w:val="000000"/>
           <w:sz w:val="13"/>
         </w:rPr>
-        <w:t xml:space="preserve">    """Centra el auto en el carril antes del giro para entrar desde la geometria correcta."""</w:t>
-        <w:br/>
-        <w:t xml:space="preserve">    if turning or completed:</w:t>
+        <w:t xml:space="preserve">    target_x = None</w:t>
+        <w:br/>
+        <w:t xml:space="preserve">    if route == "right" and y &gt; -58.0:</w:t>
+        <w:br/>
+        <w:t xml:space="preserve">        target_x = 40.0</w:t>
+        <w:br/>
+        <w:t xml:space="preserve">    elif route == "left" and y &gt; 56.0:</w:t>
+        <w:br/>
+        <w:t xml:space="preserve">        target_x = -50.4</w:t>
+        <w:br/>
+        <w:t xml:space="preserve">    if target_x is None:</w:t>
         <w:br/>
         <w:t xml:space="preserve">        return None</w:t>
         <w:br/>
-        <w:t xml:space="preserve">    target_x = None</w:t>
-        <w:br/>
-        <w:t xml:space="preserve">    if route == "right" and y &gt; -58.0:</w:t>
-        <w:br/>
-        <w:t xml:space="preserve">        target_x = 40.0</w:t>
-        <w:br/>
-        <w:t xml:space="preserve">    elif route == "left" and y &gt; 56.0:</w:t>
-        <w:br/>
-        <w:t xml:space="preserve">        target_x = -50.4</w:t>
-        <w:br/>
-        <w:t xml:space="preserve">    if target_x is None:</w:t>
-        <w:br/>
-        <w:t xml:space="preserve">        return None</w:t>
-        <w:br/>
         <w:t xml:space="preserve">    lateral_error = x - target_x</w:t>
         <w:br/>
         <w:t xml:space="preserve">    return clamp(0.055 * lateral_error + 0.90 * heading, -0.22, 0.22)</w:t>
@@ -7896,6 +5558,12 @@
         <w:t xml:space="preserve">    """Return distance and radial speed of the nearest target within +/-17 deg."""</w:t>
         <w:br/>
         <w:t xml:space="preserve">    candidates = []</w:t>
+        <w:br/>
+        <w:t xml:space="preserve">    for target in radar.getTargets():</w:t>
+        <w:br/>
+        <w:t xml:space="preserve">        # The BmwX5 front slot can intermittently report a self-return near</w:t>
+        <w:br/>
+        <w:t xml:space="preserve">        # 2.45 m; LiDAR still protects the immediate zone, so ignore &lt;3 m.</w:t>
       </w:r>
     </w:p>
     <w:p>
@@ -7911,12 +5579,6 @@
           <w:color w:val="000000"/>
           <w:sz w:val="13"/>
         </w:rPr>
-        <w:t xml:space="preserve">    for target in radar.getTargets():</w:t>
-        <w:br/>
-        <w:t xml:space="preserve">        # The BmwX5 front slot can intermittently report a self-return near</w:t>
-        <w:br/>
-        <w:t xml:space="preserve">        # 2.45 m; LiDAR still protects the immediate zone, so ignore &lt;3 m.</w:t>
-        <w:br/>
         <w:t xml:space="preserve">        if abs(float(target.azimuth)) &lt;= 0.30 and float(target.distance) &gt;= 3.0:</w:t>
         <w:br/>
         <w:t xml:space="preserve">            candidates.append((float(target.distance), float(target.speed)))</w:t>
@@ -7970,6 +5632,10 @@
         <w:t xml:space="preserve">        result[name] = value if math.isfinite(value) and value &gt; 0.05 else float("inf")</w:t>
         <w:br/>
         <w:t xml:space="preserve">    return result</w:t>
+        <w:br/>
+        <w:br/>
+        <w:br/>
+        <w:t>def wall_present(distances: dict[str, float]) -&gt; bool:</w:t>
       </w:r>
     </w:p>
     <w:p>
@@ -7985,10 +5651,6 @@
           <w:color w:val="000000"/>
           <w:sz w:val="13"/>
         </w:rPr>
-        <w:br/>
-        <w:br/>
-        <w:t>def wall_present(distances: dict[str, float]) -&gt; bool:</w:t>
-        <w:br/>
         <w:t xml:space="preserve">    return any(value &lt; WALL_PRESENT_DISTANCE_M for value in distances.values())</w:t>
         <w:br/>
         <w:br/>
@@ -8025,21 +5687,27 @@
         <w:br/>
         <w:br/>
         <w:br/>
-        <w:t>def get_device(driver, name: str):</w:t>
-        <w:br/>
-        <w:t xml:space="preserve">    try:</w:t>
-        <w:br/>
-        <w:t xml:space="preserve">        return driver.getDevice(name)</w:t>
-        <w:br/>
-        <w:t xml:space="preserve">    except BaseException as exc:</w:t>
-        <w:br/>
-        <w:t xml:space="preserve">        raise RuntimeError(f"El mundo no contiene el dispositivo requerido: {name}") from exc</w:t>
-        <w:br/>
-        <w:br/>
-        <w:br/>
-        <w:t>def main() -&gt; None:</w:t>
-        <w:br/>
-        <w:t xml:space="preserve">    import tensorflow as tf</w:t>
+        <w:t>def bus_separation_complete(</w:t>
+        <w:br/>
+        <w:t xml:space="preserve">    y: float, heading: float, distances: dict[str, float]</w:t>
+        <w:br/>
+        <w:t>) -&gt; bool:</w:t>
+        <w:br/>
+        <w:t xml:space="preserve">    """Stop moving left once the legal passing corridor or bus side is reached."""</w:t>
+        <w:br/>
+        <w:t xml:space="preserve">    return (</w:t>
+        <w:br/>
+        <w:t xml:space="preserve">        y &lt;= BUS_PASS_TARGET_Y + 0.35</w:t>
+        <w:br/>
+        <w:t xml:space="preserve">        or heading &gt;= BUS_MAX_SEPARATION_HEADING_RAD</w:t>
+        <w:br/>
+        <w:t xml:space="preserve">        or wall_present(distances)</w:t>
+        <w:br/>
+        <w:t xml:space="preserve">    )</w:t>
+        <w:br/>
+        <w:br/>
+        <w:br/>
+        <w:t>def update_wall_tracking(</w:t>
       </w:r>
     </w:p>
     <w:p>
@@ -8055,65 +5723,65 @@
           <w:color w:val="000000"/>
           <w:sz w:val="13"/>
         </w:rPr>
-        <w:t xml:space="preserve">    from vehicle import Driver</w:t>
-        <w:br/>
-        <w:br/>
-        <w:t xml:space="preserve">    driver = Driver()</w:t>
-        <w:br/>
-        <w:t xml:space="preserve">    timestep = int(driver.getBasicTimeStep())</w:t>
-        <w:br/>
-        <w:t xml:space="preserve">    root = Path(__file__).resolve().parents[2]</w:t>
-        <w:br/>
-        <w:t xml:space="preserve">    model_path = Path(__file__).with_name("cil_model.h5")</w:t>
-        <w:br/>
-        <w:t xml:space="preserve">    metadata_path = Path(__file__).with_name("model_metadata.json")</w:t>
-        <w:br/>
-        <w:t xml:space="preserve">    if not model_path.exists() or not metadata_path.exists():</w:t>
-        <w:br/>
-        <w:t xml:space="preserve">        raise FileNotFoundError("Faltan cil_model.h5 o model_metadata.json junto al controlador")</w:t>
-        <w:br/>
-        <w:br/>
-        <w:t xml:space="preserve">    metadata = json.loads(metadata_path.read_text(encoding="utf-8"))</w:t>
-        <w:br/>
-        <w:t xml:space="preserve">    model = tf.keras.models.load_model(model_path, compile=False)</w:t>
-        <w:br/>
-        <w:br/>
-        <w:t xml:space="preserve">    camera = get_device(driver, "camera")</w:t>
-        <w:br/>
-        <w:t xml:space="preserve">    camera.enable(timestep)</w:t>
-        <w:br/>
-        <w:t xml:space="preserve">    camera.recognitionEnable(timestep)</w:t>
-        <w:br/>
-        <w:t xml:space="preserve">    lidar = get_device(driver, "Sick LMS 291")</w:t>
-        <w:br/>
-        <w:t xml:space="preserve">    lidar.enable(timestep)</w:t>
-        <w:br/>
-        <w:t xml:space="preserve">    radar = get_device(driver, "front_radar")</w:t>
-        <w:br/>
-        <w:t xml:space="preserve">    radar.enable(timestep)</w:t>
-        <w:br/>
-        <w:t xml:space="preserve">    gyro = get_device(driver, "gyro")</w:t>
-        <w:br/>
-        <w:t xml:space="preserve">    gyro.enable(timestep)</w:t>
-        <w:br/>
-        <w:t xml:space="preserve">    gps = get_device(driver, "gps")</w:t>
-        <w:br/>
-        <w:t xml:space="preserve">    gps.enable(timestep)</w:t>
-        <w:br/>
-        <w:t xml:space="preserve">    keyboard = driver.getKeyboard()</w:t>
-        <w:br/>
-        <w:t xml:space="preserve">    keyboard.enable(timestep)</w:t>
-        <w:br/>
-        <w:br/>
-        <w:t xml:space="preserve">    right_sensors = {</w:t>
-        <w:br/>
-        <w:t xml:space="preserve">        "front": get_device(driver, "ds_right_front"),</w:t>
-        <w:br/>
-        <w:t xml:space="preserve">        "middle": get_device(driver, "ds_right_middle"),</w:t>
-        <w:br/>
-        <w:t xml:space="preserve">        "rear": get_device(driver, "ds_right_rear"),</w:t>
-        <w:br/>
-        <w:t xml:space="preserve">    }</w:t>
+        <w:t xml:space="preserve">    present: bool, seen: bool, lost_steps: int</w:t>
+        <w:br/>
+        <w:t>) -&gt; tuple[bool, int, bool]:</w:t>
+        <w:br/>
+        <w:t xml:space="preserve">    """Count loss only after the right-side sensors have acquired the bus."""</w:t>
+        <w:br/>
+        <w:t xml:space="preserve">    if present:</w:t>
+        <w:br/>
+        <w:t xml:space="preserve">        return True, 0, False</w:t>
+        <w:br/>
+        <w:t xml:space="preserve">    if not seen:</w:t>
+        <w:br/>
+        <w:t xml:space="preserve">        return False, 0, False</w:t>
+        <w:br/>
+        <w:t xml:space="preserve">    lost_steps += 1</w:t>
+        <w:br/>
+        <w:t xml:space="preserve">    return True, lost_steps, lost_steps &gt;= WALL_LOST_STEPS_REQUIRED</w:t>
+        <w:br/>
+        <w:br/>
+        <w:br/>
+        <w:t>def straight_bus_corridor_steering(</w:t>
+        <w:br/>
+        <w:t xml:space="preserve">    proposed_steering: float,</w:t>
+        <w:br/>
+        <w:t xml:space="preserve">    y: float,</w:t>
+        <w:br/>
+        <w:t xml:space="preserve">    heading: float,</w:t>
+        <w:br/>
+        <w:t xml:space="preserve">    target_y: float = BUS_PASS_TARGET_Y,</w:t>
+        <w:br/>
+        <w:t>) -&gt; float:</w:t>
+        <w:br/>
+        <w:t xml:space="preserve">    """Blend bus clearance with a hard guard against the center separator."""</w:t>
+        <w:br/>
+        <w:t xml:space="preserve">    # GPS/heading establish the corridor; the side sensors only trim it.  This</w:t>
+        <w:br/>
+        <w:t xml:space="preserve">    # prevents an early long-range side return from pulling the car back toward</w:t>
+        <w:br/>
+        <w:t xml:space="preserve">    # the bus before enough lateral clearance exists.</w:t>
+        <w:br/>
+        <w:t xml:space="preserve">    corrected = 0.25 * proposed_steering + 0.55 * (target_y - y) + 1.10 * heading</w:t>
+        <w:br/>
+        <w:t xml:space="preserve">    if y &lt;= BUS_SEPARATOR_GUARD_Y + 0.20:</w:t>
+        <w:br/>
+        <w:t xml:space="preserve">        corrected = max(corrected, 0.30)</w:t>
+        <w:br/>
+        <w:t xml:space="preserve">    return clamp(corrected, -0.24, 0.34)</w:t>
+        <w:br/>
+        <w:br/>
+        <w:br/>
+        <w:t>def straight_bus_rejoin_steering(y: float, heading: float) -&gt; float:</w:t>
+        <w:br/>
+        <w:t xml:space="preserve">    """Return smoothly from the passing corridor to the normal right lane."""</w:t>
+        <w:br/>
+        <w:t xml:space="preserve">    lateral_error = BUS_NORMAL_LANE_Y - y</w:t>
+        <w:br/>
+        <w:t xml:space="preserve">    target_heading = clamp(-0.10 * lateral_error, -0.22, 0.22)</w:t>
+        <w:br/>
+        <w:t xml:space="preserve">    return clamp(heading - target_heading, -0.24, 0.24)</w:t>
       </w:r>
     </w:p>
     <w:p>
@@ -8129,66 +5797,60 @@
           <w:color w:val="000000"/>
           <w:sz w:val="13"/>
         </w:rPr>
-        <w:t xml:space="preserve">    for sensor in right_sensors.values():</w:t>
-        <w:br/>
-        <w:t xml:space="preserve">        sensor.enable(timestep)</w:t>
-        <w:br/>
-        <w:br/>
-        <w:t xml:space="preserve">    max_seconds = float(os.environ.get("CIL_MAX_SECONDS", "0") or 0)</w:t>
-        <w:br/>
-        <w:br/>
-        <w:t xml:space="preserve">    command = int(os.environ.get("CIL_INITIAL_COMMAND", STRAIGHT))</w:t>
-        <w:br/>
-        <w:t xml:space="preserve">    route = os.environ.get("CIL_ROUTE", "").strip().lower()</w:t>
-        <w:br/>
-        <w:t xml:space="preserve">    if command not in COMMAND_NAMES:</w:t>
-        <w:br/>
-        <w:t xml:space="preserve">        raise ValueError(f"CIL_INITIAL_COMMAND invalido: {command}")</w:t>
-        <w:br/>
-        <w:t xml:space="preserve">    state = AvoidanceState.DRIVE</w:t>
-        <w:br/>
-        <w:t xml:space="preserve">    state_started = driver.getTime()</w:t>
-        <w:br/>
-        <w:t xml:space="preserve">    heading = 0.0</w:t>
-        <w:br/>
-        <w:t xml:space="preserve">    previous_time = driver.getTime()</w:t>
-        <w:br/>
-        <w:t xml:space="preserve">    heading_before_avoidance = 0.0</w:t>
-        <w:br/>
-        <w:t xml:space="preserve">    wall_lost_steps = 0</w:t>
-        <w:br/>
-        <w:t xml:space="preserve">    steering_command = 0.0</w:t>
-        <w:br/>
-        <w:t xml:space="preserve">    cil_steering = 0.0</w:t>
-        <w:br/>
-        <w:t xml:space="preserve">    stopped_for_vehicle = False</w:t>
-        <w:br/>
-        <w:t xml:space="preserve">    route_turning = False</w:t>
-        <w:br/>
-        <w:t xml:space="preserve">    route_turn_completed = False</w:t>
-        <w:br/>
-        <w:t xml:space="preserve">    route_arrived = False</w:t>
-        <w:br/>
-        <w:t xml:space="preserve">    bus_avoidance_started = False</w:t>
-        <w:br/>
-        <w:t xml:space="preserve">    signal_stop_started = None</w:t>
-        <w:br/>
-        <w:t xml:space="preserve">    signal_released = False</w:t>
-        <w:br/>
-        <w:t xml:space="preserve">    frame = 0</w:t>
-        <w:br/>
-        <w:t xml:space="preserve">    wall_clock_started = time.monotonic()</w:t>
-        <w:br/>
-        <w:br/>
-        <w:t xml:space="preserve">    print("Control CIL + seguridad iniciado")</w:t>
-        <w:br/>
-        <w:t xml:space="preserve">    print("W=STRAIGHT | A=LEFT | D=RIGHT")</w:t>
-        <w:br/>
-        <w:t xml:space="preserve">    print(</w:t>
-        <w:br/>
-        <w:t xml:space="preserve">        "Umbrales: peaton=15 m, autobus=26 m, "</w:t>
-        <w:br/>
-        <w:t xml:space="preserve">        "seguimiento=25 m, parada de seguimiento=12 m"</w:t>
+        <w:br/>
+        <w:br/>
+        <w:t>def straight_lane_keeping_steering(y: float, heading: float) -&gt; float:</w:t>
+        <w:br/>
+        <w:t xml:space="preserve">    """Continuously hold the straight route at its original lane center."""</w:t>
+        <w:br/>
+        <w:t xml:space="preserve">    lateral_error = BUS_NORMAL_LANE_Y - y</w:t>
+        <w:br/>
+        <w:t xml:space="preserve">    target_heading = clamp(-0.08 * lateral_error, -0.12, 0.12)</w:t>
+        <w:br/>
+        <w:t xml:space="preserve">    return clamp(heading - target_heading, -0.18, 0.18)</w:t>
+        <w:br/>
+        <w:br/>
+        <w:br/>
+        <w:t>def get_device(driver, name: str):</w:t>
+        <w:br/>
+        <w:t xml:space="preserve">    try:</w:t>
+        <w:br/>
+        <w:t xml:space="preserve">        return driver.getDevice(name)</w:t>
+        <w:br/>
+        <w:t xml:space="preserve">    except BaseException as exc:</w:t>
+        <w:br/>
+        <w:t xml:space="preserve">        raise RuntimeError(f"El mundo no contiene el dispositivo requerido: {name}") from exc</w:t>
+        <w:br/>
+        <w:br/>
+        <w:br/>
+        <w:t>def main() -&gt; None:</w:t>
+        <w:br/>
+        <w:t xml:space="preserve">    import tensorflow as tf</w:t>
+        <w:br/>
+        <w:t xml:space="preserve">    from vehicle import Driver</w:t>
+        <w:br/>
+        <w:br/>
+        <w:t xml:space="preserve">    driver = Driver()</w:t>
+        <w:br/>
+        <w:t xml:space="preserve">    timestep = int(driver.getBasicTimeStep())</w:t>
+        <w:br/>
+        <w:t xml:space="preserve">    root = Path(__file__).resolve().parents[2]</w:t>
+        <w:br/>
+        <w:t xml:space="preserve">    model_path = Path(__file__).with_name("cil_model.h5")</w:t>
+        <w:br/>
+        <w:t xml:space="preserve">    metadata_path = Path(__file__).with_name("model_metadata.json")</w:t>
+        <w:br/>
+        <w:t xml:space="preserve">    if not model_path.exists() or not metadata_path.exists():</w:t>
+        <w:br/>
+        <w:t xml:space="preserve">        raise FileNotFoundError("Faltan cil_model.h5 o model_metadata.json junto al controlador")</w:t>
+        <w:br/>
+        <w:br/>
+        <w:t xml:space="preserve">    metadata = json.loads(metadata_path.read_text(encoding="utf-8"))</w:t>
+        <w:br/>
+        <w:t xml:space="preserve">    model = tf.keras.models.load_model(model_path, compile=False)</w:t>
+        <w:br/>
+        <w:br/>
+        <w:t xml:space="preserve">    camera = get_device(driver, "camera")</w:t>
       </w:r>
     </w:p>
     <w:p>
@@ -8204,6 +5866,118 @@
           <w:color w:val="000000"/>
           <w:sz w:val="13"/>
         </w:rPr>
+        <w:t xml:space="preserve">    camera.enable(timestep)</w:t>
+        <w:br/>
+        <w:t xml:space="preserve">    camera.recognitionEnable(timestep)</w:t>
+        <w:br/>
+        <w:t xml:space="preserve">    lidar = get_device(driver, "Sick LMS 291")</w:t>
+        <w:br/>
+        <w:t xml:space="preserve">    lidar.enable(timestep)</w:t>
+        <w:br/>
+        <w:t xml:space="preserve">    radar = get_device(driver, "front_radar")</w:t>
+        <w:br/>
+        <w:t xml:space="preserve">    radar.enable(timestep)</w:t>
+        <w:br/>
+        <w:t xml:space="preserve">    gyro = get_device(driver, "gyro")</w:t>
+        <w:br/>
+        <w:t xml:space="preserve">    gyro.enable(timestep)</w:t>
+        <w:br/>
+        <w:t xml:space="preserve">    gps = get_device(driver, "gps")</w:t>
+        <w:br/>
+        <w:t xml:space="preserve">    gps.enable(timestep)</w:t>
+        <w:br/>
+        <w:t xml:space="preserve">    keyboard = driver.getKeyboard()</w:t>
+        <w:br/>
+        <w:t xml:space="preserve">    keyboard.enable(timestep)</w:t>
+        <w:br/>
+        <w:br/>
+        <w:t xml:space="preserve">    right_sensors = {</w:t>
+        <w:br/>
+        <w:t xml:space="preserve">        "front": get_device(driver, "ds_right_front"),</w:t>
+        <w:br/>
+        <w:t xml:space="preserve">        "middle": get_device(driver, "ds_right_middle"),</w:t>
+        <w:br/>
+        <w:t xml:space="preserve">        "rear": get_device(driver, "ds_right_rear"),</w:t>
+        <w:br/>
+        <w:t xml:space="preserve">    }</w:t>
+        <w:br/>
+        <w:t xml:space="preserve">    for sensor in right_sensors.values():</w:t>
+        <w:br/>
+        <w:t xml:space="preserve">        sensor.enable(timestep)</w:t>
+        <w:br/>
+        <w:br/>
+        <w:t xml:space="preserve">    max_seconds = float(os.environ.get("CIL_MAX_SECONDS", "0") or 0)</w:t>
+        <w:br/>
+        <w:br/>
+        <w:t xml:space="preserve">    command = int(os.environ.get("CIL_INITIAL_COMMAND", STRAIGHT))</w:t>
+        <w:br/>
+        <w:t xml:space="preserve">    route = os.environ.get("CIL_ROUTE", "").strip().lower()</w:t>
+        <w:br/>
+        <w:t xml:space="preserve">    if command not in COMMAND_NAMES:</w:t>
+        <w:br/>
+        <w:t xml:space="preserve">        raise ValueError(f"CIL_INITIAL_COMMAND invalido: {command}")</w:t>
+        <w:br/>
+        <w:t xml:space="preserve">    state = AvoidanceState.DRIVE</w:t>
+        <w:br/>
+        <w:t xml:space="preserve">    state_started = driver.getTime()</w:t>
+        <w:br/>
+        <w:t xml:space="preserve">    heading = 0.0</w:t>
+        <w:br/>
+        <w:t xml:space="preserve">    previous_time = driver.getTime()</w:t>
+        <w:br/>
+        <w:t xml:space="preserve">    heading_before_avoidance = 0.0</w:t>
+      </w:r>
+    </w:p>
+    <w:p>
+      <w:pPr>
+        <w:keepLines w:val="0"/>
+        <w:spacing w:after="60" w:line="240" w:lineRule="auto"/>
+        <w:ind w:left="216" w:right="216"/>
+        <w:shd w:fill="F7F7F7"/>
+      </w:pPr>
+      <w:r>
+        <w:rPr>
+          <w:rFonts w:ascii="Menlo" w:hAnsi="Menlo" w:eastAsia="Menlo" w:cs="Menlo"/>
+          <w:color w:val="000000"/>
+          <w:sz w:val="13"/>
+        </w:rPr>
+        <w:t xml:space="preserve">    wall_lost_steps = 0</w:t>
+        <w:br/>
+        <w:t xml:space="preserve">    wall_seen = False</w:t>
+        <w:br/>
+        <w:t xml:space="preserve">    steering_command = 0.0</w:t>
+        <w:br/>
+        <w:t xml:space="preserve">    cil_steering = 0.0</w:t>
+        <w:br/>
+        <w:t xml:space="preserve">    stopped_for_vehicle = False</w:t>
+        <w:br/>
+        <w:t xml:space="preserve">    route_turning = False</w:t>
+        <w:br/>
+        <w:t xml:space="preserve">    route_turn_completed = False</w:t>
+        <w:br/>
+        <w:t xml:space="preserve">    route_arrived = False</w:t>
+        <w:br/>
+        <w:t xml:space="preserve">    bus_avoidance_started = False</w:t>
+        <w:br/>
+        <w:t xml:space="preserve">    signal_stop_started = None</w:t>
+        <w:br/>
+        <w:t xml:space="preserve">    signal_released = False</w:t>
+        <w:br/>
+        <w:t xml:space="preserve">    frame = 0</w:t>
+        <w:br/>
+        <w:t xml:space="preserve">    wall_clock_started = time.monotonic()</w:t>
+        <w:br/>
+        <w:br/>
+        <w:t xml:space="preserve">    print("Control CIL + seguridad iniciado")</w:t>
+        <w:br/>
+        <w:t xml:space="preserve">    print("W=STRAIGHT | A=LEFT | D=RIGHT")</w:t>
+        <w:br/>
+        <w:t xml:space="preserve">    print(</w:t>
+        <w:br/>
+        <w:t xml:space="preserve">        "Umbrales: peaton=15 m, autobus=26 m, "</w:t>
+        <w:br/>
+        <w:t xml:space="preserve">        "seguimiento=25 m, parada de seguimiento=12 m"</w:t>
+        <w:br/>
         <w:t xml:space="preserve">    )</w:t>
         <w:br/>
         <w:br/>
@@ -8227,7 +6001,21 @@
         <w:t xml:space="preserve">                command = STRAIGHT</w:t>
         <w:br/>
         <w:t xml:space="preserve">            elif key in (ord("A"), ord("a")):</w:t>
-        <w:br/>
+      </w:r>
+    </w:p>
+    <w:p>
+      <w:pPr>
+        <w:keepLines w:val="0"/>
+        <w:spacing w:after="60" w:line="240" w:lineRule="auto"/>
+        <w:ind w:left="216" w:right="216"/>
+        <w:shd w:fill="F7F7F7"/>
+      </w:pPr>
+      <w:r>
+        <w:rPr>
+          <w:rFonts w:ascii="Menlo" w:hAnsi="Menlo" w:eastAsia="Menlo" w:cs="Menlo"/>
+          <w:color w:val="000000"/>
+          <w:sz w:val="13"/>
+        </w:rPr>
         <w:t xml:space="preserve">                command = LEFT</w:t>
         <w:br/>
         <w:t xml:space="preserve">            elif key in (ord("D"), ord("d")):</w:t>
@@ -8264,6 +6052,416 @@
         <w:t xml:space="preserve">            predicted = model.predict(</w:t>
         <w:br/>
         <w:t xml:space="preserve">                [image_input, command_to_one_hot(command)], verbose=0</w:t>
+        <w:br/>
+        <w:t xml:space="preserve">            )</w:t>
+        <w:br/>
+        <w:t xml:space="preserve">            cil_steering = clamp(</w:t>
+        <w:br/>
+        <w:t xml:space="preserve">                float(predicted[0][0]), -MAX_STEERING_RAD, MAX_STEERING_RAD</w:t>
+        <w:br/>
+        <w:t xml:space="preserve">            )</w:t>
+        <w:br/>
+        <w:br/>
+        <w:t xml:space="preserve">        lidar_distance = front_lidar_distance(lidar)</w:t>
+        <w:br/>
+        <w:t xml:space="preserve">        pedestrian_distance = closest_recognized(camera, "pedestrian")</w:t>
+        <w:br/>
+        <w:t xml:space="preserve">        bus_distance = closest_recognized(camera, "bus")</w:t>
+        <w:br/>
+        <w:t xml:space="preserve">        radar_distance, radar_speed = closest_radar_target(radar)</w:t>
+        <w:br/>
+        <w:t xml:space="preserve">        side_distances = read_right_distances(right_sensors)</w:t>
+        <w:br/>
+        <w:t xml:space="preserve">        x, y, _ = (float(value) for value in gps.getValues())</w:t>
+        <w:br/>
+        <w:t xml:space="preserve">        signal_holding = False</w:t>
+        <w:br/>
+      </w:r>
+    </w:p>
+    <w:p>
+      <w:pPr>
+        <w:keepLines w:val="0"/>
+        <w:spacing w:after="60" w:line="240" w:lineRule="auto"/>
+        <w:ind w:left="216" w:right="216"/>
+        <w:shd w:fill="F7F7F7"/>
+      </w:pPr>
+      <w:r>
+        <w:rPr>
+          <w:rFonts w:ascii="Menlo" w:hAnsi="Menlo" w:eastAsia="Menlo" w:cs="Menlo"/>
+          <w:color w:val="000000"/>
+          <w:sz w:val="13"/>
+        </w:rPr>
+        <w:t xml:space="preserve">        pedestrian_emergency = (</w:t>
+        <w:br/>
+        <w:t xml:space="preserve">            pedestrian_distance &lt;= PEDESTRIAN_STOP_DISTANCE_M</w:t>
+        <w:br/>
+        <w:t xml:space="preserve">            and lidar_distance &lt;= PEDESTRIAN_STOP_DISTANCE_M</w:t>
+        <w:br/>
+        <w:t xml:space="preserve">        )</w:t>
+        <w:br/>
+        <w:t xml:space="preserve">        if pedestrian_emergency:</w:t>
+        <w:br/>
+        <w:t xml:space="preserve">            target_speed = 0.0</w:t>
+        <w:br/>
+        <w:t xml:space="preserve">            target_steering = steering_command</w:t>
+        <w:br/>
+        <w:t xml:space="preserve">            mode = "FRENO_PEATON"</w:t>
+        <w:br/>
+        <w:t xml:space="preserve">        else:</w:t>
+        <w:br/>
+        <w:t xml:space="preserve">            if (</w:t>
+        <w:br/>
+        <w:t xml:space="preserve">                state is AvoidanceState.DRIVE</w:t>
+        <w:br/>
+        <w:t xml:space="preserve">                and not bus_avoidance_started</w:t>
+        <w:br/>
+        <w:t xml:space="preserve">                and bus_distance &lt;= PARKED_BUS_TRIGGER_DISTANCE_M</w:t>
+        <w:br/>
+        <w:t xml:space="preserve">                and (not math.isfinite(radar_distance) or abs(radar_speed) &lt; 0.75)</w:t>
+        <w:br/>
+        <w:t xml:space="preserve">            ):</w:t>
+        <w:br/>
+        <w:t xml:space="preserve">                bus_avoidance_started = True</w:t>
+        <w:br/>
+        <w:t xml:space="preserve">                heading_before_avoidance = heading</w:t>
+        <w:br/>
+        <w:t xml:space="preserve">                wall_lost_steps = 0</w:t>
+        <w:br/>
+        <w:t xml:space="preserve">                wall_seen = False</w:t>
+        <w:br/>
+        <w:t xml:space="preserve">                state = AvoidanceState.SEPARATE_LEFT</w:t>
+        <w:br/>
+        <w:t xml:space="preserve">                state_started = now</w:t>
+        <w:br/>
+        <w:t xml:space="preserve">                print(f"&gt;&gt;&gt; EVASION: autobus a {lidar_distance:.2f} m")</w:t>
+        <w:br/>
+        <w:br/>
+        <w:t xml:space="preserve">            if state is AvoidanceState.SEPARATE_LEFT:</w:t>
+        <w:br/>
+        <w:t xml:space="preserve">                target_speed = AVOID_SPEED_KMH</w:t>
+        <w:br/>
+        <w:t xml:space="preserve">                target_steering = BUS_SEPARATION_STEERING_RAD</w:t>
+        <w:br/>
+        <w:t xml:space="preserve">                if route == "straight":</w:t>
+        <w:br/>
+        <w:t xml:space="preserve">                    target_steering = straight_bus_corridor_steering(</w:t>
+        <w:br/>
+        <w:t xml:space="preserve">                        target_steering, y, heading</w:t>
+        <w:br/>
+        <w:t xml:space="preserve">                    )</w:t>
+        <w:br/>
+        <w:t xml:space="preserve">                if bus_separation_complete(y, heading, side_distances):</w:t>
+        <w:br/>
+        <w:t xml:space="preserve">                    state = AvoidanceState.WALL_FOLLOW_RIGHT</w:t>
+      </w:r>
+    </w:p>
+    <w:p>
+      <w:pPr>
+        <w:keepLines w:val="0"/>
+        <w:spacing w:after="60" w:line="240" w:lineRule="auto"/>
+        <w:ind w:left="216" w:right="216"/>
+        <w:shd w:fill="F7F7F7"/>
+      </w:pPr>
+      <w:r>
+        <w:rPr>
+          <w:rFonts w:ascii="Menlo" w:hAnsi="Menlo" w:eastAsia="Menlo" w:cs="Menlo"/>
+          <w:color w:val="000000"/>
+          <w:sz w:val="13"/>
+        </w:rPr>
+        <w:t xml:space="preserve">                    state_started = now</w:t>
+        <w:br/>
+        <w:t xml:space="preserve">            elif state is AvoidanceState.WALL_FOLLOW_RIGHT:</w:t>
+        <w:br/>
+        <w:t xml:space="preserve">                target_speed = AVOID_SPEED_KMH</w:t>
+        <w:br/>
+        <w:t xml:space="preserve">                target_steering = wall_following_steering(side_distances)</w:t>
+        <w:br/>
+        <w:t xml:space="preserve">                if route == "straight":</w:t>
+        <w:br/>
+        <w:t xml:space="preserve">                    target_steering = straight_bus_corridor_steering(</w:t>
+        <w:br/>
+        <w:t xml:space="preserve">                        target_steering, y, heading</w:t>
+        <w:br/>
+        <w:t xml:space="preserve">                    )</w:t>
+        <w:br/>
+        <w:t xml:space="preserve">                wall_seen, wall_lost_steps, wall_cleared = update_wall_tracking(</w:t>
+        <w:br/>
+        <w:t xml:space="preserve">                    wall_present(side_distances), wall_seen, wall_lost_steps</w:t>
+        <w:br/>
+        <w:t xml:space="preserve">                )</w:t>
+        <w:br/>
+        <w:t xml:space="preserve">                if wall_cleared:</w:t>
+        <w:br/>
+        <w:t xml:space="preserve">                    state = AvoidanceState.RECOVER_HEADING</w:t>
+        <w:br/>
+        <w:t xml:space="preserve">                    state_started = now</w:t>
+        <w:br/>
+        <w:t xml:space="preserve">            elif state is AvoidanceState.RECOVER_HEADING:</w:t>
+        <w:br/>
+        <w:t xml:space="preserve">                heading_error = heading_before_avoidance - heading</w:t>
+        <w:br/>
+        <w:t xml:space="preserve">                target_speed = RECOVERY_SPEED_KMH</w:t>
+        <w:br/>
+        <w:t xml:space="preserve">                target_steering = clamp(-1.8 * heading_error, -0.38, 0.38)</w:t>
+        <w:br/>
+        <w:t xml:space="preserve">                if route == "straight":</w:t>
+        <w:br/>
+        <w:t xml:space="preserve">                    target_steering = straight_bus_rejoin_steering(y, heading)</w:t>
+        <w:br/>
+        <w:t xml:space="preserve">                if (</w:t>
+        <w:br/>
+        <w:t xml:space="preserve">                    abs(heading_error) &lt; 0.08</w:t>
+        <w:br/>
+        <w:t xml:space="preserve">                    and (route != "straight" or y &gt;= BUS_NORMAL_LANE_Y - 0.8)</w:t>
+        <w:br/>
+        <w:t xml:space="preserve">                ) or now - state_started &gt;= 6.0:</w:t>
+        <w:br/>
+        <w:t xml:space="preserve">                    state = AvoidanceState.REJOIN</w:t>
+        <w:br/>
+        <w:t xml:space="preserve">                    state_started = now</w:t>
+        <w:br/>
+        <w:t xml:space="preserve">            elif state is AvoidanceState.REJOIN:</w:t>
+        <w:br/>
+        <w:t xml:space="preserve">                target_speed = RECOVERY_SPEED_KMH</w:t>
+        <w:br/>
+        <w:t xml:space="preserve">                if route == "straight":</w:t>
+        <w:br/>
+        <w:t xml:space="preserve">                    target_steering = straight_bus_rejoin_steering(y, heading)</w:t>
+        <w:br/>
+        <w:t xml:space="preserve">                else:</w:t>
+        <w:br/>
+        <w:t xml:space="preserve">                    target_steering = cil_steering</w:t>
+      </w:r>
+    </w:p>
+    <w:p>
+      <w:pPr>
+        <w:keepLines w:val="0"/>
+        <w:spacing w:after="60" w:line="240" w:lineRule="auto"/>
+        <w:ind w:left="216" w:right="216"/>
+        <w:shd w:fill="F7F7F7"/>
+      </w:pPr>
+      <w:r>
+        <w:rPr>
+          <w:rFonts w:ascii="Menlo" w:hAnsi="Menlo" w:eastAsia="Menlo" w:cs="Menlo"/>
+          <w:color w:val="000000"/>
+          <w:sz w:val="13"/>
+        </w:rPr>
+        <w:t xml:space="preserve">                if route == "straight":</w:t>
+        <w:br/>
+        <w:t xml:space="preserve">                    rejoin_complete = (</w:t>
+        <w:br/>
+        <w:t xml:space="preserve">                        abs(y - BUS_NORMAL_LANE_Y) &lt;= 0.45 and abs(heading) &lt; 0.08</w:t>
+        <w:br/>
+        <w:t xml:space="preserve">                    )</w:t>
+        <w:br/>
+        <w:t xml:space="preserve">                else:</w:t>
+        <w:br/>
+        <w:t xml:space="preserve">                    rejoin_complete = now - state_started &gt;= 2.0</w:t>
+        <w:br/>
+        <w:t xml:space="preserve">                if rejoin_complete:</w:t>
+        <w:br/>
+        <w:t xml:space="preserve">                    state = AvoidanceState.DRIVE</w:t>
+        <w:br/>
+        <w:t xml:space="preserve">                    state_started = now</w:t>
+        <w:br/>
+        <w:t xml:space="preserve">            else:</w:t>
+        <w:br/>
+        <w:t xml:space="preserve">                target_speed, stopped_for_vehicle = adaptive_follow_speed_hysteresis(</w:t>
+        <w:br/>
+        <w:t xml:space="preserve">                    radar_distance, stopped_for_vehicle</w:t>
+        <w:br/>
+        <w:t xml:space="preserve">                )</w:t>
+        <w:br/>
+        <w:t xml:space="preserve">                target_steering = cil_steering</w:t>
+        <w:br/>
+        <w:t xml:space="preserve">                if route_signal_stop_required(</w:t>
+        <w:br/>
+        <w:t xml:space="preserve">                    route,</w:t>
+        <w:br/>
+        <w:t xml:space="preserve">                    x,</w:t>
+        <w:br/>
+        <w:t xml:space="preserve">                    y,</w:t>
+        <w:br/>
+        <w:t xml:space="preserve">                    route_turning,</w:t>
+        <w:br/>
+        <w:t xml:space="preserve">                    route_turn_completed,</w:t>
+        <w:br/>
+        <w:t xml:space="preserve">                    signal_released,</w:t>
+        <w:br/>
+        <w:t xml:space="preserve">                ):</w:t>
+        <w:br/>
+        <w:t xml:space="preserve">                    signal_holding = True</w:t>
+        <w:br/>
+        <w:t xml:space="preserve">                    target_speed = 0.0</w:t>
+        <w:br/>
+        <w:t xml:space="preserve">                    target_steering = route_approach_assist(</w:t>
+        <w:br/>
+        <w:t xml:space="preserve">                        route, x, y, heading, route_turning, route_turn_completed</w:t>
+        <w:br/>
+        <w:t xml:space="preserve">                    ) or 0.0</w:t>
+        <w:br/>
+        <w:t xml:space="preserve">                    if abs(driver.getCurrentSpeed()) &lt;= 0.5:</w:t>
+        <w:br/>
+        <w:t xml:space="preserve">                        if signal_stop_started is None:</w:t>
+        <w:br/>
+        <w:t xml:space="preserve">                            signal_stop_started = now</w:t>
+        <w:br/>
+        <w:t xml:space="preserve">                            print("&gt;&gt;&gt; ALTO_SEMAFORO: vehiculo detenido en la linea")</w:t>
+        <w:br/>
+        <w:t xml:space="preserve">                        elif (</w:t>
+      </w:r>
+    </w:p>
+    <w:p>
+      <w:pPr>
+        <w:keepLines w:val="0"/>
+        <w:spacing w:after="60" w:line="240" w:lineRule="auto"/>
+        <w:ind w:left="216" w:right="216"/>
+        <w:shd w:fill="F7F7F7"/>
+      </w:pPr>
+      <w:r>
+        <w:rPr>
+          <w:rFonts w:ascii="Menlo" w:hAnsi="Menlo" w:eastAsia="Menlo" w:cs="Menlo"/>
+          <w:color w:val="000000"/>
+          <w:sz w:val="13"/>
+        </w:rPr>
+        <w:t xml:space="preserve">                            now - signal_stop_started &gt;= SIGNAL_MIN_STOP_SECONDS</w:t>
+        <w:br/>
+        <w:t xml:space="preserve">                            and right_signal_is_green(now)</w:t>
+        <w:br/>
+        <w:t xml:space="preserve">                        ):</w:t>
+        <w:br/>
+        <w:t xml:space="preserve">                            signal_released = True</w:t>
+        <w:br/>
+        <w:t xml:space="preserve">                            print(</w:t>
+        <w:br/>
+        <w:t xml:space="preserve">                                f"&gt;&gt;&gt; SEMAFORO_VERDE: inicia cruce seguro a t={now:.2f} s"</w:t>
+        <w:br/>
+        <w:t xml:space="preserve">                            )</w:t>
+        <w:br/>
+        <w:t xml:space="preserve">                    mode = "ALTO_SEMAFORO"</w:t>
+        <w:br/>
+        <w:t xml:space="preserve">                else:</w:t>
+        <w:br/>
+        <w:t xml:space="preserve">                    assist, route_turning, route_turn_completed, next_command = route_turn_guidance(</w:t>
+        <w:br/>
+        <w:t xml:space="preserve">                        route, x, y, heading, route_turning, route_turn_completed</w:t>
+        <w:br/>
+        <w:t xml:space="preserve">                    )</w:t>
+        <w:br/>
+        <w:t xml:space="preserve">                    if assist is not None:</w:t>
+        <w:br/>
+        <w:t xml:space="preserve">                        target_speed = min(target_speed, ROUTE_TURN_SPEED_KMH)</w:t>
+        <w:br/>
+        <w:t xml:space="preserve">                        target_steering = assist</w:t>
+        <w:br/>
+        <w:t xml:space="preserve">                        mode = "GIRO_RUTA"</w:t>
+        <w:br/>
+        <w:t xml:space="preserve">                    if next_command is not None:</w:t>
+        <w:br/>
+        <w:t xml:space="preserve">                        command = next_command</w:t>
+        <w:br/>
+        <w:t xml:space="preserve">                        print(f"&gt;&gt;&gt; GIRO COMPLETO: continua {COMMAND_NAMES[command]}")</w:t>
+        <w:br/>
+        <w:t xml:space="preserve">                    corridor_assist = route_corridor_assist(</w:t>
+        <w:br/>
+        <w:t xml:space="preserve">                        route, x, y, heading, route_turn_completed</w:t>
+        <w:br/>
+        <w:t xml:space="preserve">                    )</w:t>
+        <w:br/>
+        <w:t xml:space="preserve">                    approach_assist = route_approach_assist(</w:t>
+        <w:br/>
+        <w:t xml:space="preserve">                        route, x, y, heading, route_turning, route_turn_completed</w:t>
+        <w:br/>
+        <w:t xml:space="preserve">                    )</w:t>
+        <w:br/>
+        <w:t xml:space="preserve">                    if assist is None and approach_assist is not None:</w:t>
+        <w:br/>
+        <w:t xml:space="preserve">                        target_speed = min(target_speed, 16.0)</w:t>
+        <w:br/>
+        <w:t xml:space="preserve">                        target_steering = approach_assist</w:t>
+        <w:br/>
+        <w:t xml:space="preserve">                        mode = "APROXIMACION_RUTA"</w:t>
+        <w:br/>
+        <w:t xml:space="preserve">                    elif assist is None and corridor_assist is not None:</w:t>
+        <w:br/>
+        <w:t xml:space="preserve">                        if route == "straight" and (</w:t>
+        <w:br/>
+        <w:t xml:space="preserve">                            abs(y - 236.4) &gt; 1.0 or abs(heading) &gt; 0.10</w:t>
+      </w:r>
+    </w:p>
+    <w:p>
+      <w:pPr>
+        <w:keepLines w:val="0"/>
+        <w:spacing w:after="60" w:line="240" w:lineRule="auto"/>
+        <w:ind w:left="216" w:right="216"/>
+        <w:shd w:fill="F7F7F7"/>
+      </w:pPr>
+      <w:r>
+        <w:rPr>
+          <w:rFonts w:ascii="Menlo" w:hAnsi="Menlo" w:eastAsia="Menlo" w:cs="Menlo"/>
+          <w:color w:val="000000"/>
+          <w:sz w:val="13"/>
+        </w:rPr>
+        <w:t xml:space="preserve">                        ):</w:t>
+        <w:br/>
+        <w:t xml:space="preserve">                            target_speed = min(target_speed, 10.0)</w:t>
+        <w:br/>
+        <w:t xml:space="preserve">                        target_steering = corridor_assist</w:t>
+        <w:br/>
+        <w:t xml:space="preserve">                        mode = "CORREDOR_RUTA"</w:t>
+        <w:br/>
+        <w:t xml:space="preserve">                if route_destination_reached(route, x, y):</w:t>
+        <w:br/>
+        <w:t xml:space="preserve">                    target_speed = 0.0</w:t>
+        <w:br/>
+        <w:t xml:space="preserve">                    mode = "RUTA_COMPLETA"</w:t>
+        <w:br/>
+        <w:t xml:space="preserve">                    route_arrived = True</w:t>
+        <w:br/>
+        <w:t xml:space="preserve">            mode = state.value</w:t>
+        <w:br/>
+        <w:br/>
+        <w:t xml:space="preserve">            if signal_holding and not signal_released and state is AvoidanceState.DRIVE:</w:t>
+        <w:br/>
+        <w:t xml:space="preserve">                mode = "ALTO_SEMAFORO"</w:t>
+        <w:br/>
+        <w:t xml:space="preserve">            elif route_turning and state is AvoidanceState.DRIVE:</w:t>
+        <w:br/>
+        <w:t xml:space="preserve">                mode = "GIRO_RUTA"</w:t>
+        <w:br/>
+        <w:t xml:space="preserve">            elif (route_turn_completed or route == "straight") and state is AvoidanceState.DRIVE:</w:t>
+        <w:br/>
+        <w:t xml:space="preserve">                mode = "CORREDOR_RUTA"</w:t>
+        <w:br/>
+        <w:t xml:space="preserve">            if route_arrived:</w:t>
+        <w:br/>
+        <w:t xml:space="preserve">                mode = "RUTA_COMPLETA"</w:t>
+        <w:br/>
+        <w:br/>
+        <w:t xml:space="preserve">        target_speed = clamp(target_speed, 0.0, MAX_SPEED_KMH)</w:t>
+        <w:br/>
+        <w:t xml:space="preserve">        steering_command = limit_steering_step(target_steering, steering_command)</w:t>
+        <w:br/>
+        <w:t xml:space="preserve">        driver.setCruisingSpeed(target_speed)</w:t>
+        <w:br/>
+        <w:t xml:space="preserve">        driver.setSteeringAngle(steering_command)</w:t>
+        <w:br/>
+        <w:br/>
+        <w:t xml:space="preserve">        if frame % 20 == 0:</w:t>
+        <w:br/>
+        <w:t xml:space="preserve">            print(</w:t>
+        <w:br/>
+        <w:t xml:space="preserve">                f"Modo={mode} | Cmd={COMMAND_NAMES[command]} | "</w:t>
+        <w:br/>
+        <w:t xml:space="preserve">                f"steer={steering_command:.3f} | speed={target_speed:.1f} | "</w:t>
+        <w:br/>
+        <w:t xml:space="preserve">                f"GPS=({x:.2f},{y:.2f}) | yaw={heading:.2f} | "</w:t>
+        <w:br/>
+        <w:t xml:space="preserve">                f"LiDAR={lidar_distance:.2f} m | Radar={radar_distance:.2f} m "</w:t>
+        <w:br/>
+        <w:t xml:space="preserve">                f"({radar_speed:.2f} m/s) | peaton={pedestrian_distance:.2f} m | "</w:t>
+        <w:br/>
+        <w:t xml:space="preserve">                f"bus={bus_distance:.2f} m"</w:t>
       </w:r>
     </w:p>
     <w:p>
@@ -8281,358 +6479,6 @@
         </w:rPr>
         <w:t xml:space="preserve">            )</w:t>
         <w:br/>
-        <w:t xml:space="preserve">            cil_steering = clamp(</w:t>
-        <w:br/>
-        <w:t xml:space="preserve">                float(predicted[0][0]), -MAX_STEERING_RAD, MAX_STEERING_RAD</w:t>
-        <w:br/>
-        <w:t xml:space="preserve">            )</w:t>
-        <w:br/>
-        <w:br/>
-        <w:t xml:space="preserve">        lidar_distance = front_lidar_distance(lidar)</w:t>
-        <w:br/>
-        <w:t xml:space="preserve">        pedestrian_distance = closest_recognized(camera, "pedestrian")</w:t>
-        <w:br/>
-        <w:t xml:space="preserve">        bus_distance = closest_recognized(camera, "bus")</w:t>
-        <w:br/>
-        <w:t xml:space="preserve">        radar_distance, radar_speed = closest_radar_target(radar)</w:t>
-        <w:br/>
-        <w:t xml:space="preserve">        side_distances = read_right_distances(right_sensors)</w:t>
-        <w:br/>
-        <w:t xml:space="preserve">        x, y, _ = (float(value) for value in gps.getValues())</w:t>
-        <w:br/>
-        <w:t xml:space="preserve">        signal_holding = False</w:t>
-        <w:br/>
-        <w:br/>
-        <w:t xml:space="preserve">        pedestrian_emergency = (</w:t>
-        <w:br/>
-        <w:t xml:space="preserve">            pedestrian_distance &lt;= PEDESTRIAN_STOP_DISTANCE_M</w:t>
-        <w:br/>
-        <w:t xml:space="preserve">            and lidar_distance &lt;= PEDESTRIAN_STOP_DISTANCE_M</w:t>
-        <w:br/>
-        <w:t xml:space="preserve">        )</w:t>
-        <w:br/>
-        <w:t xml:space="preserve">        if pedestrian_emergency:</w:t>
-        <w:br/>
-        <w:t xml:space="preserve">            target_speed = 0.0</w:t>
-        <w:br/>
-        <w:t xml:space="preserve">            target_steering = steering_command</w:t>
-        <w:br/>
-        <w:t xml:space="preserve">            mode = "FRENO_PEATON"</w:t>
-        <w:br/>
-        <w:t xml:space="preserve">        else:</w:t>
-        <w:br/>
-        <w:t xml:space="preserve">            if (</w:t>
-        <w:br/>
-        <w:t xml:space="preserve">                state is AvoidanceState.DRIVE</w:t>
-        <w:br/>
-        <w:t xml:space="preserve">                and not bus_avoidance_started</w:t>
-        <w:br/>
-        <w:t xml:space="preserve">                and bus_distance &lt;= PARKED_BUS_TRIGGER_DISTANCE_M</w:t>
-        <w:br/>
-        <w:t xml:space="preserve">                and (not math.isfinite(radar_distance) or abs(radar_speed) &lt; 0.75)</w:t>
-        <w:br/>
-        <w:t xml:space="preserve">            ):</w:t>
-        <w:br/>
-        <w:t xml:space="preserve">                bus_avoidance_started = True</w:t>
-        <w:br/>
-        <w:t xml:space="preserve">                heading_before_avoidance = heading</w:t>
-        <w:br/>
-        <w:t xml:space="preserve">                wall_lost_steps = 0</w:t>
-        <w:br/>
-        <w:t xml:space="preserve">                state = AvoidanceState.SEPARATE_LEFT</w:t>
-      </w:r>
-    </w:p>
-    <w:p>
-      <w:pPr>
-        <w:keepLines w:val="0"/>
-        <w:spacing w:after="60" w:line="240" w:lineRule="auto"/>
-        <w:ind w:left="216" w:right="216"/>
-        <w:shd w:fill="F7F7F7"/>
-      </w:pPr>
-      <w:r>
-        <w:rPr>
-          <w:rFonts w:ascii="Menlo" w:hAnsi="Menlo" w:eastAsia="Menlo" w:cs="Menlo"/>
-          <w:color w:val="000000"/>
-          <w:sz w:val="13"/>
-        </w:rPr>
-        <w:t xml:space="preserve">                state_started = now</w:t>
-        <w:br/>
-        <w:t xml:space="preserve">                print(f"&gt;&gt;&gt; EVASION: autobus a {lidar_distance:.2f} m")</w:t>
-        <w:br/>
-        <w:br/>
-        <w:t xml:space="preserve">            if state is AvoidanceState.SEPARATE_LEFT:</w:t>
-        <w:br/>
-        <w:t xml:space="preserve">                target_speed = AVOID_SPEED_KMH</w:t>
-        <w:br/>
-        <w:t xml:space="preserve">                target_steering = -0.38</w:t>
-        <w:br/>
-        <w:t xml:space="preserve">                if wall_present(side_distances) or now - state_started &gt;= 3.5:</w:t>
-        <w:br/>
-        <w:t xml:space="preserve">                    state = AvoidanceState.WALL_FOLLOW_RIGHT</w:t>
-        <w:br/>
-        <w:t xml:space="preserve">                    state_started = now</w:t>
-        <w:br/>
-        <w:t xml:space="preserve">            elif state is AvoidanceState.WALL_FOLLOW_RIGHT:</w:t>
-        <w:br/>
-        <w:t xml:space="preserve">                target_speed = AVOID_SPEED_KMH</w:t>
-        <w:br/>
-        <w:t xml:space="preserve">                target_steering = wall_following_steering(side_distances)</w:t>
-        <w:br/>
-        <w:t xml:space="preserve">                if wall_present(side_distances):</w:t>
-        <w:br/>
-        <w:t xml:space="preserve">                    wall_lost_steps = 0</w:t>
-        <w:br/>
-        <w:t xml:space="preserve">                else:</w:t>
-        <w:br/>
-        <w:t xml:space="preserve">                    wall_lost_steps += 1</w:t>
-        <w:br/>
-        <w:t xml:space="preserve">                if wall_lost_steps &gt;= WALL_LOST_STEPS_REQUIRED:</w:t>
-        <w:br/>
-        <w:t xml:space="preserve">                    state = AvoidanceState.RECOVER_HEADING</w:t>
-        <w:br/>
-        <w:t xml:space="preserve">                    state_started = now</w:t>
-        <w:br/>
-        <w:t xml:space="preserve">            elif state is AvoidanceState.RECOVER_HEADING:</w:t>
-        <w:br/>
-        <w:t xml:space="preserve">                heading_error = heading_before_avoidance - heading</w:t>
-        <w:br/>
-        <w:t xml:space="preserve">                target_speed = RECOVERY_SPEED_KMH</w:t>
-        <w:br/>
-        <w:t xml:space="preserve">                target_steering = clamp(-1.8 * heading_error, -0.38, 0.38)</w:t>
-        <w:br/>
-        <w:t xml:space="preserve">                if abs(heading_error) &lt; 0.08 or now - state_started &gt;= 6.0:</w:t>
-        <w:br/>
-        <w:t xml:space="preserve">                    state = AvoidanceState.REJOIN</w:t>
-        <w:br/>
-        <w:t xml:space="preserve">                    state_started = now</w:t>
-        <w:br/>
-        <w:t xml:space="preserve">            elif state is AvoidanceState.REJOIN:</w:t>
-        <w:br/>
-        <w:t xml:space="preserve">                target_speed = RECOVERY_SPEED_KMH</w:t>
-        <w:br/>
-        <w:t xml:space="preserve">                target_steering = cil_steering</w:t>
-        <w:br/>
-        <w:t xml:space="preserve">                if now - state_started &gt;= 2.0:</w:t>
-        <w:br/>
-        <w:t xml:space="preserve">                    state = AvoidanceState.DRIVE</w:t>
-        <w:br/>
-        <w:t xml:space="preserve">                    state_started = now</w:t>
-      </w:r>
-    </w:p>
-    <w:p>
-      <w:pPr>
-        <w:keepLines w:val="0"/>
-        <w:spacing w:after="60" w:line="240" w:lineRule="auto"/>
-        <w:ind w:left="216" w:right="216"/>
-        <w:shd w:fill="F7F7F7"/>
-      </w:pPr>
-      <w:r>
-        <w:rPr>
-          <w:rFonts w:ascii="Menlo" w:hAnsi="Menlo" w:eastAsia="Menlo" w:cs="Menlo"/>
-          <w:color w:val="000000"/>
-          <w:sz w:val="13"/>
-        </w:rPr>
-        <w:t xml:space="preserve">            else:</w:t>
-        <w:br/>
-        <w:t xml:space="preserve">                target_speed, stopped_for_vehicle = adaptive_follow_speed_hysteresis(</w:t>
-        <w:br/>
-        <w:t xml:space="preserve">                    radar_distance, stopped_for_vehicle</w:t>
-        <w:br/>
-        <w:t xml:space="preserve">                )</w:t>
-        <w:br/>
-        <w:t xml:space="preserve">                target_steering = cil_steering</w:t>
-        <w:br/>
-        <w:t xml:space="preserve">                if route_signal_stop_required(</w:t>
-        <w:br/>
-        <w:t xml:space="preserve">                    route,</w:t>
-        <w:br/>
-        <w:t xml:space="preserve">                    x,</w:t>
-        <w:br/>
-        <w:t xml:space="preserve">                    y,</w:t>
-        <w:br/>
-        <w:t xml:space="preserve">                    route_turning,</w:t>
-        <w:br/>
-        <w:t xml:space="preserve">                    route_turn_completed,</w:t>
-        <w:br/>
-        <w:t xml:space="preserve">                    signal_released,</w:t>
-        <w:br/>
-        <w:t xml:space="preserve">                ):</w:t>
-        <w:br/>
-        <w:t xml:space="preserve">                    signal_holding = True</w:t>
-        <w:br/>
-        <w:t xml:space="preserve">                    target_speed = 0.0</w:t>
-        <w:br/>
-        <w:t xml:space="preserve">                    target_steering = route_approach_assist(</w:t>
-        <w:br/>
-        <w:t xml:space="preserve">                        route, x, y, heading, route_turning, route_turn_completed</w:t>
-        <w:br/>
-        <w:t xml:space="preserve">                    ) or 0.0</w:t>
-        <w:br/>
-        <w:t xml:space="preserve">                    if abs(driver.getCurrentSpeed()) &lt;= 0.5:</w:t>
-        <w:br/>
-        <w:t xml:space="preserve">                        if signal_stop_started is None:</w:t>
-        <w:br/>
-        <w:t xml:space="preserve">                            signal_stop_started = now</w:t>
-        <w:br/>
-        <w:t xml:space="preserve">                            print("&gt;&gt;&gt; ALTO_SEMAFORO: vehiculo detenido en la linea")</w:t>
-        <w:br/>
-        <w:t xml:space="preserve">                        elif (</w:t>
-        <w:br/>
-        <w:t xml:space="preserve">                            now - signal_stop_started &gt;= SIGNAL_MIN_STOP_SECONDS</w:t>
-        <w:br/>
-        <w:t xml:space="preserve">                            and right_signal_is_green(now)</w:t>
-        <w:br/>
-        <w:t xml:space="preserve">                        ):</w:t>
-        <w:br/>
-        <w:t xml:space="preserve">                            signal_released = True</w:t>
-        <w:br/>
-        <w:t xml:space="preserve">                            print(</w:t>
-        <w:br/>
-        <w:t xml:space="preserve">                                f"&gt;&gt;&gt; SEMAFORO_VERDE: inicia cruce seguro a t={now:.2f} s"</w:t>
-        <w:br/>
-        <w:t xml:space="preserve">                            )</w:t>
-        <w:br/>
-        <w:t xml:space="preserve">                    mode = "ALTO_SEMAFORO"</w:t>
-        <w:br/>
-        <w:t xml:space="preserve">                else:</w:t>
-      </w:r>
-    </w:p>
-    <w:p>
-      <w:pPr>
-        <w:keepLines w:val="0"/>
-        <w:spacing w:after="60" w:line="240" w:lineRule="auto"/>
-        <w:ind w:left="216" w:right="216"/>
-        <w:shd w:fill="F7F7F7"/>
-      </w:pPr>
-      <w:r>
-        <w:rPr>
-          <w:rFonts w:ascii="Menlo" w:hAnsi="Menlo" w:eastAsia="Menlo" w:cs="Menlo"/>
-          <w:color w:val="000000"/>
-          <w:sz w:val="13"/>
-        </w:rPr>
-        <w:t xml:space="preserve">                    assist, route_turning, route_turn_completed, next_command = route_turn_guidance(</w:t>
-        <w:br/>
-        <w:t xml:space="preserve">                        route, x, y, heading, route_turning, route_turn_completed</w:t>
-        <w:br/>
-        <w:t xml:space="preserve">                    )</w:t>
-        <w:br/>
-        <w:t xml:space="preserve">                    if assist is not None:</w:t>
-        <w:br/>
-        <w:t xml:space="preserve">                        target_speed = min(target_speed, ROUTE_TURN_SPEED_KMH)</w:t>
-        <w:br/>
-        <w:t xml:space="preserve">                        target_steering = assist</w:t>
-        <w:br/>
-        <w:t xml:space="preserve">                        mode = "GIRO_RUTA"</w:t>
-        <w:br/>
-        <w:t xml:space="preserve">                    if next_command is not None:</w:t>
-        <w:br/>
-        <w:t xml:space="preserve">                        command = next_command</w:t>
-        <w:br/>
-        <w:t xml:space="preserve">                        print(f"&gt;&gt;&gt; GIRO COMPLETO: continua {COMMAND_NAMES[command]}")</w:t>
-        <w:br/>
-        <w:t xml:space="preserve">                    corridor_assist = route_corridor_assist(</w:t>
-        <w:br/>
-        <w:t xml:space="preserve">                        route, x, y, heading, route_turn_completed</w:t>
-        <w:br/>
-        <w:t xml:space="preserve">                    )</w:t>
-        <w:br/>
-        <w:t xml:space="preserve">                    approach_assist = route_approach_assist(</w:t>
-        <w:br/>
-        <w:t xml:space="preserve">                        route, x, y, heading, route_turning, route_turn_completed</w:t>
-        <w:br/>
-        <w:t xml:space="preserve">                    )</w:t>
-        <w:br/>
-        <w:t xml:space="preserve">                    if assist is None and approach_assist is not None:</w:t>
-        <w:br/>
-        <w:t xml:space="preserve">                        target_speed = min(target_speed, 16.0)</w:t>
-        <w:br/>
-        <w:t xml:space="preserve">                        target_steering = approach_assist</w:t>
-        <w:br/>
-        <w:t xml:space="preserve">                        mode = "APROXIMACION_RUTA"</w:t>
-        <w:br/>
-        <w:t xml:space="preserve">                    elif assist is None and corridor_assist is not None:</w:t>
-        <w:br/>
-        <w:t xml:space="preserve">                        if route == "straight" and (</w:t>
-        <w:br/>
-        <w:t xml:space="preserve">                            abs(y - 236.4) &gt; 1.0 or abs(heading) &gt; 0.10</w:t>
-        <w:br/>
-        <w:t xml:space="preserve">                        ):</w:t>
-        <w:br/>
-        <w:t xml:space="preserve">                            target_speed = min(target_speed, 10.0)</w:t>
-        <w:br/>
-        <w:t xml:space="preserve">                        target_steering = corridor_assist</w:t>
-        <w:br/>
-        <w:t xml:space="preserve">                        mode = "CORREDOR_RUTA"</w:t>
-        <w:br/>
-        <w:t xml:space="preserve">                if route_destination_reached(route, x, y):</w:t>
-        <w:br/>
-        <w:t xml:space="preserve">                    target_speed = 0.0</w:t>
-        <w:br/>
-        <w:t xml:space="preserve">                    mode = "RUTA_COMPLETA"</w:t>
-        <w:br/>
-        <w:t xml:space="preserve">                    route_arrived = True</w:t>
-        <w:br/>
-        <w:t xml:space="preserve">            mode = state.value</w:t>
-      </w:r>
-    </w:p>
-    <w:p>
-      <w:pPr>
-        <w:keepLines w:val="0"/>
-        <w:spacing w:after="60" w:line="240" w:lineRule="auto"/>
-        <w:ind w:left="216" w:right="216"/>
-        <w:shd w:fill="F7F7F7"/>
-      </w:pPr>
-      <w:r>
-        <w:rPr>
-          <w:rFonts w:ascii="Menlo" w:hAnsi="Menlo" w:eastAsia="Menlo" w:cs="Menlo"/>
-          <w:color w:val="000000"/>
-          <w:sz w:val="13"/>
-        </w:rPr>
-        <w:br/>
-        <w:t xml:space="preserve">            if signal_holding and not signal_released and state is AvoidanceState.DRIVE:</w:t>
-        <w:br/>
-        <w:t xml:space="preserve">                mode = "ALTO_SEMAFORO"</w:t>
-        <w:br/>
-        <w:t xml:space="preserve">            elif route_turning and state is AvoidanceState.DRIVE:</w:t>
-        <w:br/>
-        <w:t xml:space="preserve">                mode = "GIRO_RUTA"</w:t>
-        <w:br/>
-        <w:t xml:space="preserve">            elif (route_turn_completed or route == "straight") and state is AvoidanceState.DRIVE:</w:t>
-        <w:br/>
-        <w:t xml:space="preserve">                mode = "CORREDOR_RUTA"</w:t>
-        <w:br/>
-        <w:t xml:space="preserve">            if route_arrived:</w:t>
-        <w:br/>
-        <w:t xml:space="preserve">                mode = "RUTA_COMPLETA"</w:t>
-        <w:br/>
-        <w:br/>
-        <w:t xml:space="preserve">        target_speed = clamp(target_speed, 0.0, MAX_SPEED_KMH)</w:t>
-        <w:br/>
-        <w:t xml:space="preserve">        steering_command = limit_steering_step(target_steering, steering_command)</w:t>
-        <w:br/>
-        <w:t xml:space="preserve">        driver.setCruisingSpeed(target_speed)</w:t>
-        <w:br/>
-        <w:t xml:space="preserve">        driver.setSteeringAngle(steering_command)</w:t>
-        <w:br/>
-        <w:br/>
-        <w:t xml:space="preserve">        if frame % 20 == 0:</w:t>
-        <w:br/>
-        <w:t xml:space="preserve">            print(</w:t>
-        <w:br/>
-        <w:t xml:space="preserve">                f"Modo={mode} | Cmd={COMMAND_NAMES[command]} | "</w:t>
-        <w:br/>
-        <w:t xml:space="preserve">                f"steer={steering_command:.3f} | speed={target_speed:.1f} | "</w:t>
-        <w:br/>
-        <w:t xml:space="preserve">                f"GPS=({x:.2f},{y:.2f}) | yaw={heading:.2f} | "</w:t>
-        <w:br/>
-        <w:t xml:space="preserve">                f"LiDAR={lidar_distance:.2f} m | Radar={radar_distance:.2f} m "</w:t>
-        <w:br/>
-        <w:t xml:space="preserve">                f"({radar_speed:.2f} m/s) | peaton={pedestrian_distance:.2f} m | "</w:t>
-        <w:br/>
-        <w:t xml:space="preserve">                f"bus={bus_distance:.2f} m"</w:t>
-        <w:br/>
-        <w:t xml:space="preserve">            )</w:t>
-        <w:br/>
         <w:t xml:space="preserve">        frame += 1</w:t>
         <w:br/>
         <w:t xml:space="preserve">        if max_seconds &gt; 0 and now &gt;= max_seconds:</w:t>
@@ -8648,21 +6494,7 @@
         <w:t xml:space="preserve">            break</w:t>
         <w:br/>
         <w:t xml:space="preserve">        if max_seconds &gt; 0 and time.monotonic() - wall_clock_started &gt;= max(60.0, max_seconds * 5.0):</w:t>
-      </w:r>
-    </w:p>
-    <w:p>
-      <w:pPr>
-        <w:keepLines w:val="0"/>
-        <w:spacing w:after="60" w:line="240" w:lineRule="auto"/>
-        <w:ind w:left="216" w:right="216"/>
-        <w:shd w:fill="F7F7F7"/>
-      </w:pPr>
-      <w:r>
-        <w:rPr>
-          <w:rFonts w:ascii="Menlo" w:hAnsi="Menlo" w:eastAsia="Menlo" w:cs="Menlo"/>
-          <w:color w:val="000000"/>
-          <w:sz w:val="13"/>
-        </w:rPr>
+        <w:br/>
         <w:t xml:space="preserve">            print("Fin de seguridad por limite de tiempo de reloj")</w:t>
         <w:br/>
         <w:t xml:space="preserve">            break</w:t>
@@ -9528,7 +7360,7 @@
           <w:color w:val="000000"/>
           <w:sz w:val="24"/>
         </w:rPr>
-        <w:t>El guion dura aproximadamente 5:35, distribuye la participación entre los cuatro integrantes y evita superar los seis minutos. La URL de YouTube se incorporará sólo después de su publicación.</w:t>
+        <w:t>El guion dura aproximadamente 5:35 y distribuye la participación del equipo. Video final publicado en YouTube: https://youtu.be/YObQTAm8_VM</w:t>
       </w:r>
     </w:p>
     <w:p>
@@ -9559,105 +7391,231 @@
         </w:rPr>
         <w:t># Guion del video demostrativo - Equipo 19</w:t>
         <w:br/>
+        <w:t>Video final publicado: https://youtu.be/YObQTAm8_VM</w:t>
+        <w:br/>
         <w:t>Duracion objetivo: **5:35**. El video final debe conservar la participacion</w:t>
         <w:br/>
-        <w:t>visible o audible de los cuatro integrantes y mostrar Optional Rendering para</w:t>
+        <w:t>visible o audible de los tres integrantes y mostrar Optional Rendering para</w:t>
         <w:br/>
         <w:t>camara, LiDAR, radar y sensores de distancia.</w:t>
         <w:br/>
+        <w:t>Integrantes y reparto:</w:t>
+        <w:br/>
+        <w:t>- **Jose Antonio Fernandez Perez** - Apertura (0:00) y Ruta izquierda (3:40).</w:t>
+        <w:br/>
+        <w:t>- **Demenard Gardy Armand** - Dataset y red (0:35) e Integracion (4:35).</w:t>
+        <w:br/>
+        <w:t>- **Raul Adrian Delgado Rodriguez** - Ruta recta (1:35) y Ruta derecha (2:40).</w:t>
+        <w:br/>
+        <w:t>Cada bloque incluye las senales visuales (**En pantalla**) y el texto a decir</w:t>
+        <w:br/>
+        <w:t>(**Locucion**). El texto esta pensado para leerse a ritmo natural dentro del</w:t>
+        <w:br/>
+        <w:t>tiempo indicado.</w:t>
+        <w:br/>
+        <w:t>---</w:t>
+        <w:br/>
         <w:t>## 0:00-0:35 - Apertura - Jose Antonio Fernandez Perez</w:t>
         <w:br/>
-        <w:t>- Presentar objetivo: conduccion CIL con comandos recto, izquierda y derecha.</w:t>
-        <w:br/>
-        <w:t>- Mostrar brevemente World 1 y World 2.</w:t>
-        <w:br/>
-        <w:t>- Indicar que la velocidad de captura fue 30 km/h y que World 2 se evalua a</w:t>
-        <w:br/>
-        <w:t xml:space="preserve">  22 km/h para dar margen a los mecanismos de seguridad.</w:t>
+        <w:t>**En pantalla:** titulo del proyecto y nombres del equipo; corte rapido a World 1</w:t>
+        <w:br/>
+        <w:t>y World 2 con el vehiculo en marcha.</w:t>
+        <w:br/>
+        <w:t>**Locucion:**</w:t>
+        <w:br/>
+        <w:t>&gt; Hola, somos el Equipo 19. En este video mostramos un sistema de conduccion</w:t>
+        <w:br/>
+        <w:t>&gt; autonoma basado en aprendizaje por imitacion, o CIL, que responde a tres</w:t>
+        <w:br/>
+        <w:t>&gt; comandos de navegacion: seguir recto, girar a la izquierda y girar a la</w:t>
+        <w:br/>
+        <w:t>&gt; derecha. Trabajamos sobre dos escenarios de Webots: World 1, donde capturamos</w:t>
+        <w:br/>
+        <w:t>&gt; los datos, y World 2, donde validamos el modelo. La velocidad de captura fue de</w:t>
+        <w:br/>
+        <w:t>&gt; 30 kilometros por hora, y en World 2 evaluamos a 22 kilometros por hora para</w:t>
+        <w:br/>
+        <w:t>&gt; dar margen a los mecanismos de seguridad. A continuacion les mostramos como se</w:t>
+        <w:br/>
+        <w:t>&gt; construyo el conjunto de datos y la red.</w:t>
+        <w:br/>
+        <w:t>---</w:t>
         <w:br/>
         <w:t>## 0:35-1:35 - Dataset y red - Demenard Gardy Armand</w:t>
         <w:br/>
-        <w:t>- Mostrar 6,129 imagenes originales y 12,956 muestras finales aumentadas.</w:t>
-        <w:br/>
-        <w:t>- Explicar el aumento: reflejo horizontal con inversion del signo del angulo e</w:t>
-        <w:br/>
-        <w:t xml:space="preserve">  intercambio de comando IZQUIERDA&lt;-&gt;DERECHA. La division por `source_id` ocurre</w:t>
-        <w:br/>
-        <w:t xml:space="preserve">  antes de aumentar, por lo que no hay fuga entre entrenamiento y validacion.</w:t>
-        <w:br/>
-        <w:t>- Mostrar la CNN: cinco convoluciones, comando one-hot, capas densas y salida</w:t>
-        <w:br/>
-        <w:t xml:space="preserve">  del angulo de direccion.</w:t>
-        <w:br/>
-        <w:t>- Indicar los parametros de entrenamiento: optimizador Adam (lr 1e-4), perdida</w:t>
-        <w:br/>
-        <w:t xml:space="preserve">  MSE y metrica MAE, 12 epocas, batch 32, callbacks EarlyStopping y</w:t>
-        <w:br/>
-        <w:t xml:space="preserve">  ReduceLROnPlateau (factor 0.5, paciencia 2), semilla 19 y entrada 160x80x3 con</w:t>
-        <w:br/>
-        <w:t xml:space="preserve">  recorte superior del 25 %.</w:t>
-        <w:br/>
-        <w:t>- Mostrar curvas de MSE/MAE y leer el MAE de validacion: global 0.022 rad</w:t>
-        <w:br/>
-        <w:t xml:space="preserve">  (STRAIGHT 0.015, LEFT 0.024, RIGHT 0.023; objetivo &lt;= 0.05 rad).</w:t>
-        <w:br/>
-        <w:t>## 1:35-2:40 - Ruta recta - Luis Daniel Castillo Alegria</w:t>
-        <w:br/>
-        <w:t>- Origen: torres residenciales del noreste. Destino: silos.</w:t>
-        <w:br/>
-        <w:t>- Mostrar `Cmd=STRAIGHT` en consola.</w:t>
-        <w:br/>
-        <w:t>- Indicar los umbrales de radar: regulacion desde 25 m, parada a 12 m y</w:t>
-        <w:br/>
-        <w:t xml:space="preserve">  reanudacion a 15 m.</w:t>
-        <w:br/>
-        <w:t>- Indicar que el umbral de evasión está configurado a 26 m; en la corrida el</w:t>
-        <w:br/>
-        <w:t xml:space="preserve">  autobús se reconoció a 23.74 m y la maniobra inició con 16.62 m por LiDAR.</w:t>
-        <w:br/>
-        <w:t>- Mostrar el seguimiento de pared derecha y la reincorporacion al carril derecho.</w:t>
+        <w:t>**En pantalla:** mosaico de imagenes del dataset; diagrama de la CNN; curvas de</w:t>
+        <w:br/>
+        <w:t>MSE y MAE de entrenamiento y validacion.</w:t>
+        <w:br/>
+        <w:t>**Locucion:**</w:t>
+        <w:br/>
+        <w:t>&gt; Partimos de 6,129 imagenes originales y, tras el aumento de datos, llegamos a</w:t>
+        <w:br/>
+        <w:t>&gt; 12,956 muestras finales. El aumento consiste en un reflejo horizontal de la</w:t>
+        <w:br/>
+        <w:t>&gt; imagen: invertimos el signo del angulo de direccion e intercambiamos el comando</w:t>
+        <w:br/>
+        <w:t>&gt; izquierda por derecha. Es importante senalar que la division por identificador</w:t>
+        <w:br/>
+        <w:t>&gt; de origen se hace antes de aumentar, asi que no hay fuga de informacion entre</w:t>
+        <w:br/>
+        <w:t>&gt; entrenamiento y validacion. La red es una CNN con cinco capas convolucionales;</w:t>
+        <w:br/>
+        <w:t>&gt; el comando se inyecta como vector one-hot y se combina con capas densas que</w:t>
+        <w:br/>
+        <w:t>&gt; producen el angulo de direccion. El entrenamiento usa el optimizador Adam con</w:t>
+        <w:br/>
+        <w:t>&gt; tasa de aprendizaje de 1 por 10 a la menos 4, perdida MSE y metrica MAE, 12</w:t>
+        <w:br/>
+        <w:t>&gt; epocas, lotes de 32, y los callbacks EarlyStopping y ReduceLROnPlateau con</w:t>
+        <w:br/>
+        <w:t>&gt; factor 0.5 y paciencia 2. Fijamos la semilla en 19 y la entrada es de 160 por</w:t>
+        <w:br/>
+        <w:t>&gt; 80 por 3, con un recorte del 25 por ciento superior. El resultado: un MAE de</w:t>
+        <w:br/>
+        <w:t>&gt; validacion global de 0.022 radianes; por comando, 0.015 en recto, 0.024 en</w:t>
+        <w:br/>
+        <w:t>&gt; izquierda y 0.023 en derecha, todos por debajo del objetivo de 0.05 radianes.</w:t>
+        <w:br/>
+        <w:t>---</w:t>
+        <w:br/>
+        <w:t>## 1:35-2:40 - Ruta recta - Raul Adrian Delgado Rodriguez</w:t>
+        <w:br/>
+        <w:t>**En pantalla:** consola con `Cmd=STRAIGHT`; vista de radar y LiDAR; overlay del</w:t>
+        <w:br/>
+        <w:t>GPS y del limite `y=232.60`.</w:t>
+        <w:br/>
+        <w:t>**Locucion:**</w:t>
+        <w:br/>
+        <w:t>&gt; Esta es la ruta recta. Salimos de las torres residenciales del noreste con</w:t>
+        <w:br/>
+        <w:t>&gt; destino a los silos, y en consola se mantiene el comando STRAIGHT. La gestion</w:t>
+        <w:br/>
+        <w:t>&gt; de obstaculos frontales usa el radar con tres umbrales: empieza a regular la</w:t>
+        <w:br/>
+        <w:t>&gt; velocidad desde 25 metros, se detiene por completo a 12 metros y reanuda la</w:t>
+        <w:br/>
+        <w:t>&gt; marcha a 15 metros. Para evasion lateral el umbral esta configurado en 26</w:t>
+        <w:br/>
+        <w:t>&gt; metros; en esta corrida el autobus se reconocio a 23.74 metros y la maniobra</w:t>
+        <w:br/>
+        <w:t>&gt; inicio con 16.62 metros medidos por LiDAR. Observen el seguimiento de la pared</w:t>
+        <w:br/>
+        <w:t>&gt; derecha: esta contenido por el limite y igual a 232.60, y el minimo que</w:t>
+        <w:br/>
+        <w:t>&gt; registramos fue 232.77, sin tocar ni cruzar la doble linea. Despues de</w:t>
+        <w:br/>
+        <w:t>&gt; rebasar, el vehiculo se reincorpora y permanece en el centro del carril</w:t>
+        <w:br/>
+        <w:t>&gt; original, en y igual a 236.40, hasta llegar al destino con GPS en menos 188.06,</w:t>
+        <w:br/>
+        <w:t>&gt; 236.40.</w:t>
+        <w:br/>
+        <w:t>---</w:t>
         <w:br/>
         <w:t>## 2:40-3:40 - Ruta derecha y peaton - Raul Adrian Delgado Rodriguez</w:t>
         <w:br/>
-        <w:t>- Origen: Subway norte. Destino: iglesia.</w:t>
-        <w:br/>
-        <w:t>- Mostrar `Cmd=RIGHT` y el giro a la derecha sin U-turn.</w:t>
-        <w:br/>
-        <w:t>- Mostrar el peaton reconocido por la camara y la distancia frontal del LiDAR.</w:t>
-        <w:br/>
-        <w:t>- Indicar el umbral de 15 m y mostrar velocidad 0 km/h antes del cruce.</w:t>
-        <w:br/>
-        <w:t>- Mostrar el alto antes de la interseccion y la espera hasta la fase verde.</w:t>
-        <w:br/>
-        <w:t>- Continuar cuando el peaton deje la trayectoria y el semaforo habilite el cruce.</w:t>
+        <w:t>**En pantalla:** consola con `Cmd=RIGHT`; giro a la derecha; camara detectando al</w:t>
+        <w:br/>
+        <w:t>peaton; distancia frontal del LiDAR y velocidad.</w:t>
+        <w:br/>
+        <w:t>**Locucion:**</w:t>
+        <w:br/>
+        <w:t>&gt; Seguimos con la ruta a la derecha. Salimos del Subway norte hacia la iglesia, y</w:t>
+        <w:br/>
+        <w:t>&gt; el comando RIGHT genera un giro limpio a la derecha, sin vuelta en U. En esta</w:t>
+        <w:br/>
+        <w:t>&gt; ruta aparece un peaton: la camara lo reconoce y el LiDAR mide la distancia</w:t>
+        <w:br/>
+        <w:t>&gt; frontal. Con el umbral de 15 metros, el vehiculo baja a 0 kilometros por hora</w:t>
+        <w:br/>
+        <w:t>&gt; antes del cruce. Hace el alto antes de la interseccion y espera la fase verde</w:t>
+        <w:br/>
+        <w:t>&gt; del semaforo. Solo continua cuando el peaton deja la trayectoria y el semaforo</w:t>
+        <w:br/>
+        <w:t>&gt; habilita el cruce; en ese momento la navegacion retoma el control.</w:t>
+        <w:br/>
+        <w:t>---</w:t>
         <w:br/>
         <w:t>## 3:40-4:35 - Ruta izquierda - Jose Antonio Fernandez Perez</w:t>
         <w:br/>
-        <w:t>- Origen: parque infantil. Destino: Subway norte.</w:t>
-        <w:br/>
-        <w:t>- Mostrar `Cmd=LEFT`, el giro y la permanencia en el carril derecho.</w:t>
-        <w:br/>
-        <w:t>- Señalar que la CNN sigue controlando el volante cuando no hay una anulacion</w:t>
-        <w:br/>
-        <w:t xml:space="preserve">  temporal del arbitro de seguridad.</w:t>
+        <w:t>**En pantalla:** consola con `Cmd=LEFT`; giro a la izquierda; permanencia en el</w:t>
+        <w:br/>
+        <w:t>carril derecho con el volante controlado por la CNN.</w:t>
+        <w:br/>
+        <w:t>**Locucion:**</w:t>
+        <w:br/>
+        <w:t>&gt; Esta es la ruta a la izquierda. Salimos del parque infantil hacia el Subway</w:t>
+        <w:br/>
+        <w:t>&gt; norte; el comando LEFT ejecuta el giro y el vehiculo se mantiene en el carril</w:t>
+        <w:br/>
+        <w:t>&gt; derecho. Quiero destacar un punto de diseno: el volante lo sigue controlando la</w:t>
+        <w:br/>
+        <w:t>&gt; CNN en todo momento, salvo cuando el arbitro de seguridad necesita una anulacion</w:t>
+        <w:br/>
+        <w:t>&gt; temporal. Es decir, el modelo aprendido conduce, y la seguridad solo interviene</w:t>
+        <w:br/>
+        <w:t>&gt; cuando hace falta.</w:t>
+        <w:br/>
+        <w:t>---</w:t>
         <w:br/>
         <w:t>## 4:35-5:15 - Integracion y prioridades - Demenard Gardy Armand</w:t>
         <w:br/>
-        <w:t>- Mostrar el diagrama del arbitro: peaton, autobus, radar y CIL.</w:t>
-        <w:br/>
-        <w:t>- Explicar que la seguridad solo sustituye temporalmente velocidad/direccion;</w:t>
-        <w:br/>
-        <w:t xml:space="preserve">  el comando de navegacion se conserva.</w:t>
-        <w:br/>
-        <w:t>- Mostrar que SUMO esta limitado a 30 vehiculos, no menos de lo solicitado.</w:t>
-        <w:br/>
-        <w:t>## 5:15-5:35 - Cierre - todos</w:t>
-        <w:br/>
-        <w:t>- Cada integrante aparece en pantalla o confirma su participacion.</w:t>
-        <w:br/>
-        <w:t>- Mostrar enlace del repositorio y conclusiones.</w:t>
-        <w:br/>
-        <w:t>- Cerrar antes de 6:00.</w:t>
+        <w:t>**En pantalla:** diagrama del arbitro de seguridad con sus entradas (peaton,</w:t>
+        <w:br/>
+        <w:t>autobus, radar, CIL); panel de SUMO con el trafico.</w:t>
+        <w:br/>
+        <w:t>**Locucion:**</w:t>
+        <w:br/>
+        <w:t>&gt; Veamos como se integra todo. Este es el arbitro de seguridad, que prioriza</w:t>
+        <w:br/>
+        <w:t>&gt; cuatro entradas: peaton, autobus, radar y el comando CIL. La idea central es</w:t>
+        <w:br/>
+        <w:t>&gt; que la seguridad solo sustituye temporalmente la velocidad o la direccion; el</w:t>
+        <w:br/>
+        <w:t>&gt; comando de navegacion nunca se pierde, siempre se conserva. Asi combinamos un</w:t>
+        <w:br/>
+        <w:t>&gt; control aprendido con reglas de seguridad explicitas. Ademas, el trafico de</w:t>
+        <w:br/>
+        <w:t>&gt; SUMO esta configurado con 30 vehiculos, que no es menos de lo solicitado para</w:t>
+        <w:br/>
+        <w:t>&gt; la evaluacion.</w:t>
+        <w:br/>
+        <w:t>---</w:t>
+        <w:br/>
+        <w:t>## 5:15-5:35 - Cierre - Jose Antonio Fernandez Perez</w:t>
+        <w:br/>
+        <w:t>**En pantalla:** los tres integrantes en pantalla o en cuadro; enlace del</w:t>
+        <w:br/>
+        <w:t>repositorio y conclusiones.</w:t>
+      </w:r>
+    </w:p>
+    <w:p>
+      <w:pPr>
+        <w:keepLines w:val="0"/>
+        <w:spacing w:after="60" w:line="240" w:lineRule="auto"/>
+        <w:ind w:left="216" w:right="216"/>
+        <w:shd w:fill="F7F7F7"/>
+      </w:pPr>
+      <w:r>
+        <w:rPr>
+          <w:rFonts w:ascii="Menlo" w:hAnsi="Menlo" w:eastAsia="Menlo" w:cs="Menlo"/>
+          <w:color w:val="000000"/>
+          <w:sz w:val="10"/>
+        </w:rPr>
+        <w:t>**Locucion:**</w:t>
+        <w:br/>
+        <w:t>&gt; En resumen, logramos una conduccion autonoma por imitacion que responde a tres</w:t>
+        <w:br/>
+        <w:t>&gt; comandos y respeta los limites del carril, con un MAE de validacion de 0.022</w:t>
+        <w:br/>
+        <w:t>&gt; radianes y un arbitro de seguridad que protege sin perder la navegacion.</w:t>
+        <w:br/>
+        <w:t>&gt; Gracias por su atencion; el codigo esta disponible en el repositorio que</w:t>
+        <w:br/>
+        <w:t>&gt; aparece en pantalla.</w:t>
+        <w:br/>
+        <w:t>Cerrar antes de 6:00.</w:t>
       </w:r>
     </w:p>
     <w:sectPr>

</xml_diff>